<commit_message>
docs(dev-log): Group A entry — s3Dgraphy 0.1.30 → 0.1.40 vendor swap
Documents the runtime-install policy correction (ext_libs/ stays
gitignored; requirements.txt is the source-controlled record); records
the new __version__ 0.1.40 / __datamodel_version__ 1.5.4 and the
canonical JSON filenames now in place. DOCX re-rendered from markdown.

Co-Authored-By: Claude Opus 4.7 (1M context) <noreply@anthropic.com>
</commit_message>
<xml_diff>
--- a/docs/superpowers/dev-log/T5.4_PyArchInit_Dev_Log.docx
+++ b/docs/superpowers/dev-log/T5.4_PyArchInit_Dev_Log.docx
@@ -656,7 +656,17 @@
               <w:pStyle w:val="Compact"/>
             </w:pPr>
             <w:r>
-              <w:t xml:space="preserve">Pending</w:t>
+              <w:rPr>
+                <w:b/>
+                <w:bCs/>
+              </w:rPr>
+              <w:t xml:space="preserve">Done</w:t>
+            </w:r>
+            <w:r>
+              <w:t xml:space="preserve"> </w:t>
+            </w:r>
+            <w:r>
+              <w:t xml:space="preserve">(2026-05-06)</w:t>
             </w:r>
           </w:p>
         </w:tc>
@@ -1631,8 +1641,879 @@
         <w:t xml:space="preserve">s3Dgraphy 0.1.30→0.1.40 vendor swap and Phase 1 refactor.”</w:t>
       </w:r>
     </w:p>
+    <w:p>
+      <w:r>
+        <w:pict>
+          <v:rect style="width:0;height:1.5pt" o:hralign="center" o:hrstd="t" o:hr="t"/>
+        </w:pict>
+      </w:r>
+    </w:p>
     <w:bookmarkEnd w:id="13"/>
     <w:bookmarkEnd w:id="14"/>
+    <w:bookmarkStart w:id="18" w:name="group-a-vendor-s3dgraphy-0.1.30-0.1.40"/>
+    <w:p>
+      <w:pPr>
+        <w:pStyle w:val="Heading1"/>
+      </w:pPr>
+      <w:r>
+        <w:t xml:space="preserve">Group A — Vendor s3Dgraphy 0.1.30 → 0.1.40</w:t>
+      </w:r>
+    </w:p>
+    <w:p>
+      <w:pPr>
+        <w:pStyle w:val="FirstParagraph"/>
+      </w:pPr>
+      <w:r>
+        <w:rPr>
+          <w:b/>
+          <w:bCs/>
+        </w:rPr>
+        <w:t xml:space="preserve">Date:</w:t>
+      </w:r>
+      <w:r>
+        <w:t xml:space="preserve"> </w:t>
+      </w:r>
+      <w:r>
+        <w:t xml:space="preserve">6 May 2026 ·</w:t>
+      </w:r>
+      <w:r>
+        <w:t xml:space="preserve"> </w:t>
+      </w:r>
+      <w:r>
+        <w:rPr>
+          <w:b/>
+          <w:bCs/>
+        </w:rPr>
+        <w:t xml:space="preserve">Status:</w:t>
+      </w:r>
+      <w:r>
+        <w:t xml:space="preserve"> </w:t>
+      </w:r>
+      <w:r>
+        <w:t xml:space="preserve">Done ·</w:t>
+      </w:r>
+      <w:r>
+        <w:t xml:space="preserve"> </w:t>
+      </w:r>
+      <w:r>
+        <w:rPr>
+          <w:b/>
+          <w:bCs/>
+        </w:rPr>
+        <w:t xml:space="preserve">Commit:</w:t>
+      </w:r>
+      <w:r>
+        <w:t xml:space="preserve"> </w:t>
+      </w:r>
+      <w:r>
+        <w:rPr>
+          <w:rStyle w:val="VerbatimChar"/>
+        </w:rPr>
+        <w:t xml:space="preserve">5988ed4a</w:t>
+      </w:r>
+    </w:p>
+    <w:bookmarkStart w:id="15" w:name="what-was-built-1"/>
+    <w:p>
+      <w:pPr>
+        <w:pStyle w:val="Heading2"/>
+      </w:pPr>
+      <w:r>
+        <w:t xml:space="preserve">What was built</w:t>
+      </w:r>
+    </w:p>
+    <w:p>
+      <w:pPr>
+        <w:pStyle w:val="Compact"/>
+        <w:numPr>
+          <w:ilvl w:val="0"/>
+          <w:numId w:val="1006"/>
+        </w:numPr>
+      </w:pPr>
+      <w:r>
+        <w:t xml:space="preserve">The vendored s3Dgraphy was upgraded in place:</w:t>
+      </w:r>
+      <w:r>
+        <w:t xml:space="preserve"> </w:t>
+      </w:r>
+      <w:r>
+        <w:rPr>
+          <w:rStyle w:val="VerbatimChar"/>
+        </w:rPr>
+        <w:t xml:space="preserve">ext_libs/s3dgraphy-0.1.30.dist-info</w:t>
+      </w:r>
+      <w:r>
+        <w:t xml:space="preserve"> </w:t>
+      </w:r>
+      <w:r>
+        <w:t xml:space="preserve">removed,</w:t>
+      </w:r>
+      <w:r>
+        <w:t xml:space="preserve"> </w:t>
+      </w:r>
+      <w:r>
+        <w:rPr>
+          <w:rStyle w:val="VerbatimChar"/>
+        </w:rPr>
+        <w:t xml:space="preserve">pip install --target ext_libs/ --no-deps s3dgraphy==0.1.40</w:t>
+      </w:r>
+      <w:r>
+        <w:t xml:space="preserve"> </w:t>
+      </w:r>
+      <w:r>
+        <w:t xml:space="preserve">installed the new 194-file payload (3.3 MB) cleanly with no transitive</w:t>
+      </w:r>
+      <w:r>
+        <w:t xml:space="preserve"> </w:t>
+      </w:r>
+      <w:r>
+        <w:t xml:space="preserve">dependencies. The new</w:t>
+      </w:r>
+      <w:r>
+        <w:t xml:space="preserve"> </w:t>
+      </w:r>
+      <w:r>
+        <w:rPr>
+          <w:rStyle w:val="VerbatimChar"/>
+        </w:rPr>
+        <w:t xml:space="preserve">ext_libs/s3dgraphy/__init__.py</w:t>
+      </w:r>
+      <w:r>
+        <w:t xml:space="preserve"> </w:t>
+      </w:r>
+      <w:r>
+        <w:t xml:space="preserve">reports</w:t>
+      </w:r>
+      <w:r>
+        <w:t xml:space="preserve"> </w:t>
+      </w:r>
+      <w:r>
+        <w:rPr>
+          <w:rStyle w:val="VerbatimChar"/>
+        </w:rPr>
+        <w:t xml:space="preserve">__version__ = "0.1.40"</w:t>
+      </w:r>
+      <w:r>
+        <w:t xml:space="preserve"> </w:t>
+      </w:r>
+      <w:r>
+        <w:t xml:space="preserve">and</w:t>
+      </w:r>
+      <w:r>
+        <w:t xml:space="preserve"> </w:t>
+      </w:r>
+      <w:r>
+        <w:rPr>
+          <w:rStyle w:val="VerbatimChar"/>
+        </w:rPr>
+        <w:t xml:space="preserve">__datamodel_version__ = "1.5.4"</w:t>
+      </w:r>
+      <w:r>
+        <w:t xml:space="preserve">.</w:t>
+      </w:r>
+    </w:p>
+    <w:p>
+      <w:pPr>
+        <w:pStyle w:val="Compact"/>
+        <w:numPr>
+          <w:ilvl w:val="0"/>
+          <w:numId w:val="1006"/>
+        </w:numPr>
+      </w:pPr>
+      <w:r>
+        <w:rPr>
+          <w:rStyle w:val="VerbatimChar"/>
+        </w:rPr>
+        <w:t xml:space="preserve">requirements.txt</w:t>
+      </w:r>
+      <w:r>
+        <w:t xml:space="preserve"> </w:t>
+      </w:r>
+      <w:r>
+        <w:t xml:space="preserve">floor for s3Dgraphy bumped from</w:t>
+      </w:r>
+      <w:r>
+        <w:t xml:space="preserve"> </w:t>
+      </w:r>
+      <w:r>
+        <w:rPr>
+          <w:rStyle w:val="VerbatimChar"/>
+        </w:rPr>
+        <w:t xml:space="preserve">&gt;=0.1.20</w:t>
+      </w:r>
+      <w:r>
+        <w:t xml:space="preserve"> </w:t>
+      </w:r>
+      <w:r>
+        <w:t xml:space="preserve">to</w:t>
+      </w:r>
+      <w:r>
+        <w:t xml:space="preserve"> </w:t>
+      </w:r>
+      <w:r>
+        <w:rPr>
+          <w:rStyle w:val="VerbatimChar"/>
+        </w:rPr>
+        <w:t xml:space="preserve">&gt;=0.1.40</w:t>
+      </w:r>
+      <w:r>
+        <w:t xml:space="preserve">,</w:t>
+      </w:r>
+      <w:r>
+        <w:t xml:space="preserve"> </w:t>
+      </w:r>
+      <w:r>
+        <w:t xml:space="preserve">which is the source-controlled record of the vendor swap. End-users who run</w:t>
+      </w:r>
+      <w:r>
+        <w:t xml:space="preserve"> </w:t>
+      </w:r>
+      <w:r>
+        <w:rPr>
+          <w:rStyle w:val="VerbatimChar"/>
+        </w:rPr>
+        <w:t xml:space="preserve">scripts/modules_installer.py</w:t>
+      </w:r>
+      <w:r>
+        <w:t xml:space="preserve"> </w:t>
+      </w:r>
+      <w:r>
+        <w:t xml:space="preserve">get 0.1.40 from this commit forward.</w:t>
+      </w:r>
+    </w:p>
+    <w:p>
+      <w:pPr>
+        <w:pStyle w:val="Compact"/>
+        <w:numPr>
+          <w:ilvl w:val="0"/>
+          <w:numId w:val="1006"/>
+        </w:numPr>
+      </w:pPr>
+      <w:r>
+        <w:t xml:space="preserve">The bundled</w:t>
+      </w:r>
+      <w:r>
+        <w:t xml:space="preserve"> </w:t>
+      </w:r>
+      <w:r>
+        <w:rPr>
+          <w:rStyle w:val="VerbatimChar"/>
+        </w:rPr>
+        <w:t xml:space="preserve">JSON_config/</w:t>
+      </w:r>
+      <w:r>
+        <w:t xml:space="preserve"> </w:t>
+      </w:r>
+      <w:r>
+        <w:t xml:space="preserve">now contains the canonical filenames</w:t>
+      </w:r>
+      <w:r>
+        <w:t xml:space="preserve"> </w:t>
+      </w:r>
+      <w:r>
+        <w:t xml:space="preserve">(</w:t>
+      </w:r>
+      <w:r>
+        <w:rPr>
+          <w:rStyle w:val="VerbatimChar"/>
+        </w:rPr>
+        <w:t xml:space="preserve">s3Dgraphy_node_datamodel.json</w:t>
+      </w:r>
+      <w:r>
+        <w:t xml:space="preserve"> </w:t>
+      </w:r>
+      <w:r>
+        <w:t xml:space="preserve">with no trailing space — the 0.1.30 typo is</w:t>
+      </w:r>
+      <w:r>
+        <w:t xml:space="preserve"> </w:t>
+      </w:r>
+      <w:r>
+        <w:t xml:space="preserve">fixed in 0.1.40). Other files present:</w:t>
+      </w:r>
+      <w:r>
+        <w:t xml:space="preserve"> </w:t>
+      </w:r>
+      <w:r>
+        <w:rPr>
+          <w:rStyle w:val="VerbatimChar"/>
+        </w:rPr>
+        <w:t xml:space="preserve">s3Dgraphy_connections_datamodel.json</w:t>
+      </w:r>
+      <w:r>
+        <w:t xml:space="preserve">,</w:t>
+      </w:r>
+      <w:r>
+        <w:t xml:space="preserve"> </w:t>
+      </w:r>
+      <w:r>
+        <w:rPr>
+          <w:rStyle w:val="VerbatimChar"/>
+        </w:rPr>
+        <w:t xml:space="preserve">em_visual_rules.json</w:t>
+      </w:r>
+      <w:r>
+        <w:t xml:space="preserve">,</w:t>
+      </w:r>
+      <w:r>
+        <w:t xml:space="preserve"> </w:t>
+      </w:r>
+      <w:r>
+        <w:rPr>
+          <w:rStyle w:val="VerbatimChar"/>
+        </w:rPr>
+        <w:t xml:space="preserve">em_palette_icons.json</w:t>
+      </w:r>
+      <w:r>
+        <w:t xml:space="preserve">,</w:t>
+      </w:r>
+      <w:r>
+        <w:t xml:space="preserve"> </w:t>
+      </w:r>
+      <w:r>
+        <w:rPr>
+          <w:rStyle w:val="VerbatimChar"/>
+        </w:rPr>
+        <w:t xml:space="preserve">em_qualia_types.json</w:t>
+      </w:r>
+      <w:r>
+        <w:t xml:space="preserve"> </w:t>
+      </w:r>
+      <w:r>
+        <w:t xml:space="preserve">(+</w:t>
+      </w:r>
+      <w:r>
+        <w:t xml:space="preserve"> </w:t>
+      </w:r>
+      <w:r>
+        <w:rPr>
+          <w:rStyle w:val="VerbatimChar"/>
+        </w:rPr>
+        <w:t xml:space="preserve">_additions</w:t>
+      </w:r>
+      <w:r>
+        <w:t xml:space="preserve">),</w:t>
+      </w:r>
+      <w:r>
+        <w:t xml:space="preserve"> </w:t>
+      </w:r>
+      <w:r>
+        <w:rPr>
+          <w:rStyle w:val="VerbatimChar"/>
+        </w:rPr>
+        <w:t xml:space="preserve">em_extractor_types.json</w:t>
+      </w:r>
+      <w:r>
+        <w:t xml:space="preserve">,</w:t>
+      </w:r>
+      <w:r>
+        <w:t xml:space="preserve"> </w:t>
+      </w:r>
+      <w:r>
+        <w:rPr>
+          <w:rStyle w:val="VerbatimChar"/>
+        </w:rPr>
+        <w:t xml:space="preserve">em_document_types.json</w:t>
+      </w:r>
+      <w:r>
+        <w:t xml:space="preserve">,</w:t>
+      </w:r>
+      <w:r>
+        <w:t xml:space="preserve"> </w:t>
+      </w:r>
+      <w:r>
+        <w:rPr>
+          <w:rStyle w:val="VerbatimChar"/>
+        </w:rPr>
+        <w:t xml:space="preserve">new_qualia_template.json</w:t>
+      </w:r>
+      <w:r>
+        <w:t xml:space="preserve">,</w:t>
+      </w:r>
+      <w:r>
+        <w:t xml:space="preserve"> </w:t>
+      </w:r>
+      <w:r>
+        <w:t xml:space="preserve">and two outdated</w:t>
+      </w:r>
+      <w:r>
+        <w:t xml:space="preserve"> </w:t>
+      </w:r>
+      <w:r>
+        <w:rPr>
+          <w:rStyle w:val="VerbatimChar"/>
+        </w:rPr>
+        <w:t xml:space="preserve">.ttl</w:t>
+      </w:r>
+      <w:r>
+        <w:t xml:space="preserve"> </w:t>
+      </w:r>
+      <w:r>
+        <w:t xml:space="preserve">files preserved by upstream for reference.</w:t>
+      </w:r>
+    </w:p>
+    <w:p>
+      <w:pPr>
+        <w:pStyle w:val="Compact"/>
+        <w:numPr>
+          <w:ilvl w:val="0"/>
+          <w:numId w:val="1006"/>
+        </w:numPr>
+      </w:pPr>
+      <w:r>
+        <w:t xml:space="preserve">New 0.1.40 modules confirmed present (consumed by later Groups):</w:t>
+      </w:r>
+      <w:r>
+        <w:t xml:space="preserve"> </w:t>
+      </w:r>
+      <w:r>
+        <w:rPr>
+          <w:rStyle w:val="VerbatimChar"/>
+        </w:rPr>
+        <w:t xml:space="preserve">merge/graph_merger.py</w:t>
+      </w:r>
+      <w:r>
+        <w:t xml:space="preserve"> </w:t>
+      </w:r>
+      <w:r>
+        <w:t xml:space="preserve">(</w:t>
+      </w:r>
+      <w:r>
+        <w:rPr>
+          <w:rStyle w:val="VerbatimChar"/>
+        </w:rPr>
+        <w:t xml:space="preserve">GraphMerger</w:t>
+      </w:r>
+      <w:r>
+        <w:t xml:space="preserve">),</w:t>
+      </w:r>
+      <w:r>
+        <w:t xml:space="preserve"> </w:t>
+      </w:r>
+      <w:r>
+        <w:rPr>
+          <w:rStyle w:val="VerbatimChar"/>
+        </w:rPr>
+        <w:t xml:space="preserve">exporter/graphml/graphml_patcher.py</w:t>
+      </w:r>
+      <w:r>
+        <w:t xml:space="preserve"> </w:t>
+      </w:r>
+      <w:r>
+        <w:t xml:space="preserve">(</w:t>
+      </w:r>
+      <w:r>
+        <w:rPr>
+          <w:rStyle w:val="VerbatimChar"/>
+        </w:rPr>
+        <w:t xml:space="preserve">GraphMLPatcher</w:t>
+      </w:r>
+      <w:r>
+        <w:t xml:space="preserve">),</w:t>
+      </w:r>
+      <w:r>
+        <w:t xml:space="preserve"> </w:t>
+      </w:r>
+      <w:r>
+        <w:rPr>
+          <w:rStyle w:val="VerbatimChar"/>
+        </w:rPr>
+        <w:t xml:space="preserve">nodes/stratigraphic_node.py</w:t>
+      </w:r>
+      <w:r>
+        <w:t xml:space="preserve"> </w:t>
+      </w:r>
+      <w:r>
+        <w:t xml:space="preserve">(with</w:t>
+      </w:r>
+      <w:r>
+        <w:t xml:space="preserve"> </w:t>
+      </w:r>
+      <w:r>
+        <w:rPr>
+          <w:rStyle w:val="VerbatimChar"/>
+        </w:rPr>
+        <w:t xml:space="preserve">NegativeStratigraphicUnit</w:t>
+      </w:r>
+      <w:r>
+        <w:t xml:space="preserve"> </w:t>
+      </w:r>
+      <w:r>
+        <w:t xml:space="preserve">and</w:t>
+      </w:r>
+      <w:r>
+        <w:t xml:space="preserve"> </w:t>
+      </w:r>
+      <w:r>
+        <w:rPr>
+          <w:rStyle w:val="VerbatimChar"/>
+        </w:rPr>
+        <w:t xml:space="preserve">WorkingUnit</w:t>
+      </w:r>
+      <w:r>
+        <w:t xml:space="preserve">).</w:t>
+      </w:r>
+    </w:p>
+    <w:bookmarkEnd w:id="15"/>
+    <w:bookmarkStart w:id="16" w:name="what-was-tested-1"/>
+    <w:p>
+      <w:pPr>
+        <w:pStyle w:val="Heading2"/>
+      </w:pPr>
+      <w:r>
+        <w:t xml:space="preserve">What was tested</w:t>
+      </w:r>
+    </w:p>
+    <w:p>
+      <w:pPr>
+        <w:pStyle w:val="Compact"/>
+        <w:numPr>
+          <w:ilvl w:val="0"/>
+          <w:numId w:val="1007"/>
+        </w:numPr>
+      </w:pPr>
+      <w:r>
+        <w:t xml:space="preserve">s3Dgraphy package imports cleanly from</w:t>
+      </w:r>
+      <w:r>
+        <w:t xml:space="preserve"> </w:t>
+      </w:r>
+      <w:r>
+        <w:rPr>
+          <w:rStyle w:val="VerbatimChar"/>
+        </w:rPr>
+        <w:t xml:space="preserve">ext_libs/</w:t>
+      </w:r>
+      <w:r>
+        <w:t xml:space="preserve">:</w:t>
+      </w:r>
+      <w:r>
+        <w:t xml:space="preserve"> </w:t>
+      </w:r>
+      <w:r>
+        <w:rPr>
+          <w:rStyle w:val="VerbatimChar"/>
+        </w:rPr>
+        <w:t xml:space="preserve">python3 -c "import sys; sys.path.insert(0, 'ext_libs'); import s3dgraphy; print(s3dgraphy.__version__)"</w:t>
+      </w:r>
+      <w:r>
+        <w:t xml:space="preserve"> </w:t>
+      </w:r>
+      <w:r>
+        <w:t xml:space="preserve">→</w:t>
+      </w:r>
+      <w:r>
+        <w:t xml:space="preserve"> </w:t>
+      </w:r>
+      <w:r>
+        <w:rPr>
+          <w:rStyle w:val="VerbatimChar"/>
+        </w:rPr>
+        <w:t xml:space="preserve">0.1.40</w:t>
+      </w:r>
+      <w:r>
+        <w:t xml:space="preserve">.</w:t>
+      </w:r>
+    </w:p>
+    <w:p>
+      <w:pPr>
+        <w:pStyle w:val="Compact"/>
+        <w:numPr>
+          <w:ilvl w:val="0"/>
+          <w:numId w:val="1007"/>
+        </w:numPr>
+      </w:pPr>
+      <w:r>
+        <w:t xml:space="preserve">All s3Dgraphy 0.1.40 core modules byte-compile via</w:t>
+      </w:r>
+      <w:r>
+        <w:t xml:space="preserve"> </w:t>
+      </w:r>
+      <w:r>
+        <w:rPr>
+          <w:rStyle w:val="VerbatimChar"/>
+        </w:rPr>
+        <w:t xml:space="preserve">py_compile</w:t>
+      </w:r>
+      <w:r>
+        <w:t xml:space="preserve">.</w:t>
+      </w:r>
+    </w:p>
+    <w:p>
+      <w:pPr>
+        <w:pStyle w:val="Compact"/>
+        <w:numPr>
+          <w:ilvl w:val="0"/>
+          <w:numId w:val="1007"/>
+        </w:numPr>
+      </w:pPr>
+      <w:r>
+        <w:t xml:space="preserve">Manual QGIS smoke test (US form, Harris matrix, log inspection) is deferred</w:t>
+      </w:r>
+      <w:r>
+        <w:t xml:space="preserve"> </w:t>
+      </w:r>
+      <w:r>
+        <w:t xml:space="preserve">to Group G.4 — the gate that must pass before tagging the</w:t>
+      </w:r>
+      <w:r>
+        <w:t xml:space="preserve"> </w:t>
+      </w:r>
+      <w:r>
+        <w:rPr>
+          <w:rStyle w:val="VerbatimChar"/>
+        </w:rPr>
+        <w:t xml:space="preserve">phase1-foundation-5.1.0-alpha</w:t>
+      </w:r>
+      <w:r>
+        <w:t xml:space="preserve"> </w:t>
+      </w:r>
+      <w:r>
+        <w:t xml:space="preserve">release.</w:t>
+      </w:r>
+    </w:p>
+    <w:bookmarkEnd w:id="16"/>
+    <w:bookmarkStart w:id="17" w:name="decisions-taken-1"/>
+    <w:p>
+      <w:pPr>
+        <w:pStyle w:val="Heading2"/>
+      </w:pPr>
+      <w:r>
+        <w:t xml:space="preserve">Decisions taken</w:t>
+      </w:r>
+    </w:p>
+    <w:p>
+      <w:pPr>
+        <w:pStyle w:val="Compact"/>
+        <w:numPr>
+          <w:ilvl w:val="0"/>
+          <w:numId w:val="1008"/>
+        </w:numPr>
+      </w:pPr>
+      <w:r>
+        <w:rPr>
+          <w:rStyle w:val="VerbatimChar"/>
+          <w:b/>
+          <w:bCs/>
+        </w:rPr>
+        <w:t xml:space="preserve">ext_libs/</w:t>
+      </w:r>
+      <w:r>
+        <w:rPr>
+          <w:b/>
+          <w:bCs/>
+        </w:rPr>
+        <w:t xml:space="preserve"> </w:t>
+      </w:r>
+      <w:r>
+        <w:rPr>
+          <w:b/>
+          <w:bCs/>
+        </w:rPr>
+        <w:t xml:space="preserve">stays gitignored</w:t>
+      </w:r>
+      <w:r>
+        <w:t xml:space="preserve"> </w:t>
+      </w:r>
+      <w:r>
+        <w:t xml:space="preserve">(line 43 of</w:t>
+      </w:r>
+      <w:r>
+        <w:t xml:space="preserve"> </w:t>
+      </w:r>
+      <w:r>
+        <w:rPr>
+          <w:rStyle w:val="VerbatimChar"/>
+        </w:rPr>
+        <w:t xml:space="preserve">.gitignore</w:t>
+      </w:r>
+      <w:r>
+        <w:t xml:space="preserve">). PyArchInit</w:t>
+      </w:r>
+      <w:r>
+        <w:t xml:space="preserve"> </w:t>
+      </w:r>
+      <w:r>
+        <w:t xml:space="preserve">follows a</w:t>
+      </w:r>
+      <w:r>
+        <w:t xml:space="preserve"> </w:t>
+      </w:r>
+      <w:r>
+        <w:rPr>
+          <w:i/>
+          <w:iCs/>
+        </w:rPr>
+        <w:t xml:space="preserve">runtime install</w:t>
+      </w:r>
+      <w:r>
+        <w:t xml:space="preserve"> </w:t>
+      </w:r>
+      <w:r>
+        <w:t xml:space="preserve">policy — the plugin’s</w:t>
+      </w:r>
+      <w:r>
+        <w:t xml:space="preserve"> </w:t>
+      </w:r>
+      <w:r>
+        <w:rPr>
+          <w:rStyle w:val="VerbatimChar"/>
+        </w:rPr>
+        <w:t xml:space="preserve">scripts/modules_installer.py</w:t>
+      </w:r>
+      <w:r>
+        <w:t xml:space="preserve"> </w:t>
+      </w:r>
+      <w:r>
+        <w:t xml:space="preserve">pip-installs ext_libs at first launch, and</w:t>
+      </w:r>
+      <w:r>
+        <w:t xml:space="preserve"> </w:t>
+      </w:r>
+      <w:r>
+        <w:rPr>
+          <w:rStyle w:val="VerbatimChar"/>
+        </w:rPr>
+        <w:t xml:space="preserve">requirements.txt</w:t>
+      </w:r>
+      <w:r>
+        <w:t xml:space="preserve"> </w:t>
+      </w:r>
+      <w:r>
+        <w:t xml:space="preserve">is the</w:t>
+      </w:r>
+      <w:r>
+        <w:t xml:space="preserve"> </w:t>
+      </w:r>
+      <w:r>
+        <w:t xml:space="preserve">authoritative version pin. The original plan called for</w:t>
+      </w:r>
+      <w:r>
+        <w:t xml:space="preserve"> </w:t>
+      </w:r>
+      <w:r>
+        <w:rPr>
+          <w:rStyle w:val="VerbatimChar"/>
+        </w:rPr>
+        <w:t xml:space="preserve">git add ext_libs/</w:t>
+      </w:r>
+      <w:r>
+        <w:t xml:space="preserve"> </w:t>
+      </w:r>
+      <w:r>
+        <w:t xml:space="preserve">but that would have changed long-standing repo policy and added 3.3 MB of</w:t>
+      </w:r>
+      <w:r>
+        <w:t xml:space="preserve"> </w:t>
+      </w:r>
+      <w:r>
+        <w:t xml:space="preserve">vendored bytes to the repository. Group A’s actual git artefact is the</w:t>
+      </w:r>
+      <w:r>
+        <w:t xml:space="preserve"> </w:t>
+      </w:r>
+      <w:r>
+        <w:t xml:space="preserve">one-line</w:t>
+      </w:r>
+      <w:r>
+        <w:t xml:space="preserve"> </w:t>
+      </w:r>
+      <w:r>
+        <w:rPr>
+          <w:rStyle w:val="VerbatimChar"/>
+        </w:rPr>
+        <w:t xml:space="preserve">requirements.txt</w:t>
+      </w:r>
+      <w:r>
+        <w:t xml:space="preserve"> </w:t>
+      </w:r>
+      <w:r>
+        <w:t xml:space="preserve">bump; the 0.1.40 vendor lives only on each</w:t>
+      </w:r>
+      <w:r>
+        <w:t xml:space="preserve"> </w:t>
+      </w:r>
+      <w:r>
+        <w:t xml:space="preserve">developer/user’s local install. The plan was updated mid-execution to</w:t>
+      </w:r>
+      <w:r>
+        <w:t xml:space="preserve"> </w:t>
+      </w:r>
+      <w:r>
+        <w:t xml:space="preserve">document this correction (the</w:t>
+      </w:r>
+      <w:r>
+        <w:t xml:space="preserve"> </w:t>
+      </w:r>
+      <w:r>
+        <w:rPr>
+          <w:rStyle w:val="VerbatimChar"/>
+        </w:rPr>
+        <w:t xml:space="preserve">pre-s3dgraphy-040</w:t>
+      </w:r>
+      <w:r>
+        <w:t xml:space="preserve"> </w:t>
+      </w:r>
+      <w:r>
+        <w:t xml:space="preserve">tag still marks the</w:t>
+      </w:r>
+      <w:r>
+        <w:t xml:space="preserve"> </w:t>
+      </w:r>
+      <w:r>
+        <w:t xml:space="preserve">pre-Phase-1 commit hash but does NOT snapshot the ext_libs bytes).</w:t>
+      </w:r>
+    </w:p>
+    <w:p>
+      <w:pPr>
+        <w:pStyle w:val="Compact"/>
+        <w:numPr>
+          <w:ilvl w:val="0"/>
+          <w:numId w:val="1008"/>
+        </w:numPr>
+      </w:pPr>
+      <w:r>
+        <w:rPr>
+          <w:b/>
+          <w:bCs/>
+        </w:rPr>
+        <w:t xml:space="preserve">Rollback procedure now reads:</w:t>
+      </w:r>
+      <w:r>
+        <w:t xml:space="preserve"> </w:t>
+      </w:r>
+      <w:r>
+        <w:rPr>
+          <w:rStyle w:val="VerbatimChar"/>
+        </w:rPr>
+        <w:t xml:space="preserve">pip install s3dgraphy==0.1.30 --target ext_libs/ --no-deps</w:t>
+      </w:r>
+      <w:r>
+        <w:t xml:space="preserve">. Combined with</w:t>
+      </w:r>
+      <w:r>
+        <w:t xml:space="preserve"> </w:t>
+      </w:r>
+      <w:r>
+        <w:rPr>
+          <w:rStyle w:val="VerbatimChar"/>
+        </w:rPr>
+        <w:t xml:space="preserve">git checkout pre-s3dgraphy-040</w:t>
+      </w:r>
+      <w:r>
+        <w:t xml:space="preserve"> </w:t>
+      </w:r>
+      <w:r>
+        <w:t xml:space="preserve">for</w:t>
+      </w:r>
+      <w:r>
+        <w:t xml:space="preserve"> </w:t>
+      </w:r>
+      <w:r>
+        <w:t xml:space="preserve">source-controlled state.</w:t>
+      </w:r>
+    </w:p>
+    <w:bookmarkEnd w:id="17"/>
+    <w:bookmarkEnd w:id="18"/>
     <w:sectPr>
       <w:footnotePr>
         <w:numRestart w:val="eachSect"/>
@@ -1974,6 +2855,15 @@
     <w:abstractNumId w:val="991"/>
   </w:num>
   <w:num w:numId="1005">
+    <w:abstractNumId w:val="991"/>
+  </w:num>
+  <w:num w:numId="1006">
+    <w:abstractNumId w:val="991"/>
+  </w:num>
+  <w:num w:numId="1007">
+    <w:abstractNumId w:val="991"/>
+  </w:num>
+  <w:num w:numId="1008">
     <w:abstractNumId w:val="991"/>
   </w:num>
 </w:numbering>

</xml_diff>

<commit_message>
docs(dev-log): Group B entry — VocabProvider (Option B per-tool JSON parsing)
11 commits (02d59b07 → 88e70498), 19 passing tests in tests/sync/.
Pure-Python core + Qt wrapper split, three JSON pillars consumed
directly per Reference Doc v0.1 §4.5. DOCX re-rendered.
</commit_message>
<xml_diff>
--- a/docs/superpowers/dev-log/T5.4_PyArchInit_Dev_Log.docx
+++ b/docs/superpowers/dev-log/T5.4_PyArchInit_Dev_Log.docx
@@ -535,7 +535,8 @@
     <w:tbl>
       <w:tblPr>
         <w:tblStyle w:val="Table"/>
-        <w:tblW w:type="auto" w:w="0"/>
+        <w:tblW w:type="pct" w:w="5000"/>
+        <w:tblLayout w:type="fixed"/>
         <w:tblLook w:firstRow="1" w:lastRow="0" w:firstColumn="0" w:lastColumn="0" w:noHBand="0" w:noVBand="0" w:val="0020"/>
       </w:tblPr>
       <w:tblGrid>
@@ -701,7 +702,17 @@
               <w:pStyle w:val="Compact"/>
             </w:pPr>
             <w:r>
-              <w:t xml:space="preserve">Pending</w:t>
+              <w:rPr>
+                <w:b/>
+                <w:bCs/>
+              </w:rPr>
+              <w:t xml:space="preserve">Done</w:t>
+            </w:r>
+            <w:r>
+              <w:t xml:space="preserve"> </w:t>
+            </w:r>
+            <w:r>
+              <w:t xml:space="preserve">(2026-05-07)</w:t>
             </w:r>
           </w:p>
         </w:tc>
@@ -2512,8 +2523,1746 @@
         <w:t xml:space="preserve">source-controlled state.</w:t>
       </w:r>
     </w:p>
+    <w:p>
+      <w:r>
+        <w:pict>
+          <v:rect style="width:0;height:1.5pt" o:hralign="center" o:hrstd="t" o:hr="t"/>
+        </w:pict>
+      </w:r>
+    </w:p>
     <w:bookmarkEnd w:id="17"/>
     <w:bookmarkEnd w:id="18"/>
+    <w:bookmarkStart w:id="23" w:name="X4a56f6117a8d931e7854f467d6d40e0c2bf901d"/>
+    <w:p>
+      <w:pPr>
+        <w:pStyle w:val="Heading1"/>
+      </w:pPr>
+      <w:r>
+        <w:t xml:space="preserve">Group B — VocabProvider (Option B per-tool JSON parsing)</w:t>
+      </w:r>
+    </w:p>
+    <w:p>
+      <w:pPr>
+        <w:pStyle w:val="FirstParagraph"/>
+      </w:pPr>
+      <w:r>
+        <w:rPr>
+          <w:b/>
+          <w:bCs/>
+        </w:rPr>
+        <w:t xml:space="preserve">Date:</w:t>
+      </w:r>
+      <w:r>
+        <w:t xml:space="preserve"> </w:t>
+      </w:r>
+      <w:r>
+        <w:t xml:space="preserve">6–7 May 2026 ·</w:t>
+      </w:r>
+      <w:r>
+        <w:t xml:space="preserve"> </w:t>
+      </w:r>
+      <w:r>
+        <w:rPr>
+          <w:b/>
+          <w:bCs/>
+        </w:rPr>
+        <w:t xml:space="preserve">Status:</w:t>
+      </w:r>
+      <w:r>
+        <w:t xml:space="preserve"> </w:t>
+      </w:r>
+      <w:r>
+        <w:t xml:space="preserve">Done ·</w:t>
+      </w:r>
+      <w:r>
+        <w:t xml:space="preserve"> </w:t>
+      </w:r>
+      <w:r>
+        <w:rPr>
+          <w:b/>
+          <w:bCs/>
+        </w:rPr>
+        <w:t xml:space="preserve">Commits:</w:t>
+      </w:r>
+      <w:r>
+        <w:t xml:space="preserve"> </w:t>
+      </w:r>
+      <w:r>
+        <w:t xml:space="preserve">11 (</w:t>
+      </w:r>
+      <w:r>
+        <w:rPr>
+          <w:rStyle w:val="VerbatimChar"/>
+        </w:rPr>
+        <w:t xml:space="preserve">02d59b07</w:t>
+      </w:r>
+      <w:r>
+        <w:t xml:space="preserve"> </w:t>
+      </w:r>
+      <w:r>
+        <w:t xml:space="preserve">→</w:t>
+      </w:r>
+      <w:r>
+        <w:t xml:space="preserve"> </w:t>
+      </w:r>
+      <w:r>
+        <w:rPr>
+          <w:rStyle w:val="VerbatimChar"/>
+        </w:rPr>
+        <w:t xml:space="preserve">88e70498</w:t>
+      </w:r>
+      <w:r>
+        <w:t xml:space="preserve">)</w:t>
+      </w:r>
+    </w:p>
+    <w:bookmarkStart w:id="19" w:name="what-was-built-2"/>
+    <w:p>
+      <w:pPr>
+        <w:pStyle w:val="Heading2"/>
+      </w:pPr>
+      <w:r>
+        <w:t xml:space="preserve">What was built</w:t>
+      </w:r>
+    </w:p>
+    <w:p>
+      <w:pPr>
+        <w:pStyle w:val="FirstParagraph"/>
+      </w:pPr>
+      <w:r>
+        <w:t xml:space="preserve">The</w:t>
+      </w:r>
+      <w:r>
+        <w:t xml:space="preserve"> </w:t>
+      </w:r>
+      <w:r>
+        <w:rPr>
+          <w:rStyle w:val="VerbatimChar"/>
+        </w:rPr>
+        <w:t xml:space="preserve">modules/s3dgraphy/sync/</w:t>
+      </w:r>
+      <w:r>
+        <w:t xml:space="preserve"> </w:t>
+      </w:r>
+      <w:r>
+        <w:t xml:space="preserve">package was created from scratch. It is the</w:t>
+      </w:r>
+      <w:r>
+        <w:t xml:space="preserve"> </w:t>
+      </w:r>
+      <w:r>
+        <w:t xml:space="preserve">PyArchInit-side adapter that consumes s3Dgraphy’s three JSON pillars</w:t>
+      </w:r>
+      <w:r>
+        <w:t xml:space="preserve"> </w:t>
+      </w:r>
+      <w:r>
+        <w:t xml:space="preserve">directly, per the Option B preference declared in Reference Document v0.1</w:t>
+      </w:r>
+      <w:r>
+        <w:t xml:space="preserve"> </w:t>
+      </w:r>
+      <w:r>
+        <w:t xml:space="preserve">§4.5 (per-tool parsing rather than wrapping a typed s3Dgraphy Python API).</w:t>
+      </w:r>
+      <w:r>
+        <w:t xml:space="preserve"> </w:t>
+      </w:r>
+      <w:r>
+        <w:t xml:space="preserve">Every consuming surface in PyArchInit — combo boxes, validation hints,</w:t>
+      </w:r>
+      <w:r>
+        <w:t xml:space="preserve"> </w:t>
+      </w:r>
+      <w:r>
+        <w:t xml:space="preserve">visual rendering — will read from this single provider in subsequent</w:t>
+      </w:r>
+      <w:r>
+        <w:t xml:space="preserve"> </w:t>
+      </w:r>
+      <w:r>
+        <w:t xml:space="preserve">Groups; the pure-Python core can be unit-tested without QGIS, while the</w:t>
+      </w:r>
+      <w:r>
+        <w:t xml:space="preserve"> </w:t>
+      </w:r>
+      <w:r>
+        <w:t xml:space="preserve">Qt-aware wrapper integrates with the QGIS event loop only when needed.</w:t>
+      </w:r>
+    </w:p>
+    <w:p>
+      <w:pPr>
+        <w:pStyle w:val="BodyText"/>
+      </w:pPr>
+      <w:r>
+        <w:t xml:space="preserve">The package layout:</w:t>
+      </w:r>
+    </w:p>
+    <w:tbl>
+      <w:tblPr>
+        <w:tblStyle w:val="Table"/>
+        <w:tblW w:type="pct" w:w="5000"/>
+        <w:tblLayout w:type="fixed"/>
+        <w:tblLook w:firstRow="1" w:lastRow="0" w:firstColumn="0" w:lastColumn="0" w:noHBand="0" w:noVBand="0" w:val="0020"/>
+      </w:tblPr>
+      <w:tblGrid>
+        <w:gridCol w:w="3960"/>
+        <w:gridCol w:w="3960"/>
+      </w:tblGrid>
+      <w:tr>
+        <w:trPr>
+          <w:tblHeader w:val="on"/>
+        </w:trPr>
+        <w:tc>
+          <w:tcPr/>
+          <w:p>
+            <w:pPr>
+              <w:pStyle w:val="Compact"/>
+            </w:pPr>
+            <w:r>
+              <w:t xml:space="preserve">File</w:t>
+            </w:r>
+          </w:p>
+        </w:tc>
+        <w:tc>
+          <w:tcPr/>
+          <w:p>
+            <w:pPr>
+              <w:pStyle w:val="Compact"/>
+            </w:pPr>
+            <w:r>
+              <w:t xml:space="preserve">Responsibility</w:t>
+            </w:r>
+          </w:p>
+        </w:tc>
+      </w:tr>
+      <w:tr>
+        <w:tc>
+          <w:tcPr/>
+          <w:p>
+            <w:pPr>
+              <w:pStyle w:val="Compact"/>
+            </w:pPr>
+            <w:r>
+              <w:rPr>
+                <w:rStyle w:val="VerbatimChar"/>
+              </w:rPr>
+              <w:t xml:space="preserve">modules/s3dgraphy/sync/__init__.py</w:t>
+            </w:r>
+          </w:p>
+        </w:tc>
+        <w:tc>
+          <w:tcPr/>
+          <w:p>
+            <w:pPr>
+              <w:pStyle w:val="Compact"/>
+            </w:pPr>
+            <w:r>
+              <w:t xml:space="preserve">Public API surface; re-exports the typed dataclasses and the pure-Python core; provides a lazy accessor</w:t>
+            </w:r>
+            <w:r>
+              <w:t xml:space="preserve"> </w:t>
+            </w:r>
+            <w:r>
+              <w:rPr>
+                <w:rStyle w:val="VerbatimChar"/>
+              </w:rPr>
+              <w:t xml:space="preserve">get_vocab_provider()</w:t>
+            </w:r>
+            <w:r>
+              <w:t xml:space="preserve"> </w:t>
+            </w:r>
+            <w:r>
+              <w:t xml:space="preserve">for the Qt wrapper so non-Qt callers (tests, CLI scripts) never pull in PyQt at import time.</w:t>
+            </w:r>
+          </w:p>
+        </w:tc>
+      </w:tr>
+      <w:tr>
+        <w:tc>
+          <w:tcPr/>
+          <w:p>
+            <w:pPr>
+              <w:pStyle w:val="Compact"/>
+            </w:pPr>
+            <w:r>
+              <w:rPr>
+                <w:rStyle w:val="VerbatimChar"/>
+              </w:rPr>
+              <w:t xml:space="preserve">modules/s3dgraphy/sync/vocab_types.py</w:t>
+            </w:r>
+          </w:p>
+        </w:tc>
+        <w:tc>
+          <w:tcPr/>
+          <w:p>
+            <w:pPr>
+              <w:pStyle w:val="Compact"/>
+            </w:pPr>
+            <w:r>
+              <w:t xml:space="preserve">Five frozen dataclasses (</w:t>
+            </w:r>
+            <w:r>
+              <w:rPr>
+                <w:rStyle w:val="VerbatimChar"/>
+              </w:rPr>
+              <w:t xml:space="preserve">UnitType</w:t>
+            </w:r>
+            <w:r>
+              <w:t xml:space="preserve">,</w:t>
+            </w:r>
+            <w:r>
+              <w:t xml:space="preserve"> </w:t>
+            </w:r>
+            <w:r>
+              <w:rPr>
+                <w:rStyle w:val="VerbatimChar"/>
+              </w:rPr>
+              <w:t xml:space="preserve">EdgeType</w:t>
+            </w:r>
+            <w:r>
+              <w:t xml:space="preserve">,</w:t>
+            </w:r>
+            <w:r>
+              <w:t xml:space="preserve"> </w:t>
+            </w:r>
+            <w:r>
+              <w:rPr>
+                <w:rStyle w:val="VerbatimChar"/>
+              </w:rPr>
+              <w:t xml:space="preserve">VisualRule</w:t>
+            </w:r>
+            <w:r>
+              <w:t xml:space="preserve">,</w:t>
+            </w:r>
+            <w:r>
+              <w:t xml:space="preserve"> </w:t>
+            </w:r>
+            <w:r>
+              <w:rPr>
+                <w:rStyle w:val="VerbatimChar"/>
+              </w:rPr>
+              <w:t xml:space="preserve">ParadataType</w:t>
+            </w:r>
+            <w:r>
+              <w:t xml:space="preserve">,</w:t>
+            </w:r>
+            <w:r>
+              <w:t xml:space="preserve"> </w:t>
+            </w:r>
+            <w:r>
+              <w:rPr>
+                <w:rStyle w:val="VerbatimChar"/>
+              </w:rPr>
+              <w:t xml:space="preserve">VocabularyVersion</w:t>
+            </w:r>
+            <w:r>
+              <w:t xml:space="preserve">) plus a</w:t>
+            </w:r>
+            <w:r>
+              <w:t xml:space="preserve"> </w:t>
+            </w:r>
+            <w:r>
+              <w:rPr>
+                <w:rStyle w:val="VerbatimChar"/>
+              </w:rPr>
+              <w:t xml:space="preserve">Family(str, Enum)</w:t>
+            </w:r>
+            <w:r>
+              <w:t xml:space="preserve"> </w:t>
+            </w:r>
+            <w:r>
+              <w:t xml:space="preserve">whose values mirror the JSON top-level keys (</w:t>
+            </w:r>
+            <w:r>
+              <w:rPr>
+                <w:rStyle w:val="VerbatimChar"/>
+              </w:rPr>
+              <w:t xml:space="preserve">stratigraphic_nodes</w:t>
+            </w:r>
+            <w:r>
+              <w:t xml:space="preserve">,</w:t>
+            </w:r>
+            <w:r>
+              <w:t xml:space="preserve"> </w:t>
+            </w:r>
+            <w:r>
+              <w:rPr>
+                <w:rStyle w:val="VerbatimChar"/>
+              </w:rPr>
+              <w:t xml:space="preserve">paradata_nodes</w:t>
+            </w:r>
+            <w:r>
+              <w:t xml:space="preserve">,</w:t>
+            </w:r>
+            <w:r>
+              <w:t xml:space="preserve"> </w:t>
+            </w:r>
+            <w:r>
+              <w:rPr>
+                <w:rStyle w:val="VerbatimChar"/>
+              </w:rPr>
+              <w:t xml:space="preserve">group_nodes</w:t>
+            </w:r>
+            <w:r>
+              <w:t xml:space="preserve">, …).</w:t>
+            </w:r>
+          </w:p>
+        </w:tc>
+      </w:tr>
+      <w:tr>
+        <w:tc>
+          <w:tcPr/>
+          <w:p>
+            <w:pPr>
+              <w:pStyle w:val="Compact"/>
+            </w:pPr>
+            <w:r>
+              <w:rPr>
+                <w:rStyle w:val="VerbatimChar"/>
+              </w:rPr>
+              <w:t xml:space="preserve">modules/s3dgraphy/sync/vocab_provider_core.py</w:t>
+            </w:r>
+          </w:p>
+        </w:tc>
+        <w:tc>
+          <w:tcPr/>
+          <w:p>
+            <w:pPr>
+              <w:pStyle w:val="Compact"/>
+            </w:pPr>
+            <w:r>
+              <w:rPr>
+                <w:rStyle w:val="VerbatimChar"/>
+              </w:rPr>
+              <w:t xml:space="preserve">VocabProviderCore</w:t>
+            </w:r>
+            <w:r>
+              <w:t xml:space="preserve"> </w:t>
+            </w:r>
+            <w:r>
+              <w:t xml:space="preserve">— pure-Python loader/queryer. Reads the three pillars from</w:t>
+            </w:r>
+            <w:r>
+              <w:t xml:space="preserve"> </w:t>
+            </w:r>
+            <w:r>
+              <w:rPr>
+                <w:rStyle w:val="VerbatimChar"/>
+              </w:rPr>
+              <w:t xml:space="preserve">bundled_dir</w:t>
+            </w:r>
+            <w:r>
+              <w:t xml:space="preserve">, optionally merges overrides from</w:t>
+            </w:r>
+            <w:r>
+              <w:t xml:space="preserve"> </w:t>
+            </w:r>
+            <w:r>
+              <w:rPr>
+                <w:rStyle w:val="VerbatimChar"/>
+              </w:rPr>
+              <w:t xml:space="preserve">overrides_dir</w:t>
+            </w:r>
+            <w:r>
+              <w:t xml:space="preserve"> </w:t>
+            </w:r>
+            <w:r>
+              <w:t xml:space="preserve">per top-level key, and exposes the query API:</w:t>
+            </w:r>
+            <w:r>
+              <w:t xml:space="preserve"> </w:t>
+            </w:r>
+            <w:r>
+              <w:rPr>
+                <w:rStyle w:val="VerbatimChar"/>
+              </w:rPr>
+              <w:t xml:space="preserve">get_unit_types(family=...)</w:t>
+            </w:r>
+            <w:r>
+              <w:t xml:space="preserve">,</w:t>
+            </w:r>
+            <w:r>
+              <w:t xml:space="preserve"> </w:t>
+            </w:r>
+            <w:r>
+              <w:rPr>
+                <w:rStyle w:val="VerbatimChar"/>
+              </w:rPr>
+              <w:t xml:space="preserve">get_edge_types()</w:t>
+            </w:r>
+            <w:r>
+              <w:t xml:space="preserve">,</w:t>
+            </w:r>
+            <w:r>
+              <w:t xml:space="preserve"> </w:t>
+            </w:r>
+            <w:r>
+              <w:rPr>
+                <w:rStyle w:val="VerbatimChar"/>
+              </w:rPr>
+              <w:t xml:space="preserve">get_legal_targets_for(...)</w:t>
+            </w:r>
+            <w:r>
+              <w:t xml:space="preserve">,</w:t>
+            </w:r>
+            <w:r>
+              <w:t xml:space="preserve"> </w:t>
+            </w:r>
+            <w:r>
+              <w:rPr>
+                <w:rStyle w:val="VerbatimChar"/>
+              </w:rPr>
+              <w:t xml:space="preserve">get_paradata_types()</w:t>
+            </w:r>
+            <w:r>
+              <w:t xml:space="preserve">,</w:t>
+            </w:r>
+            <w:r>
+              <w:t xml:space="preserve"> </w:t>
+            </w:r>
+            <w:r>
+              <w:rPr>
+                <w:rStyle w:val="VerbatimChar"/>
+              </w:rPr>
+              <w:t xml:space="preserve">get_visual_rule(...)</w:t>
+            </w:r>
+            <w:r>
+              <w:t xml:space="preserve">,</w:t>
+            </w:r>
+            <w:r>
+              <w:t xml:space="preserve"> </w:t>
+            </w:r>
+            <w:r>
+              <w:rPr>
+                <w:rStyle w:val="VerbatimChar"/>
+              </w:rPr>
+              <w:t xml:space="preserve">get_cidoc_mapping(...)</w:t>
+            </w:r>
+            <w:r>
+              <w:t xml:space="preserve">,</w:t>
+            </w:r>
+            <w:r>
+              <w:t xml:space="preserve"> </w:t>
+            </w:r>
+            <w:r>
+              <w:rPr>
+                <w:rStyle w:val="VerbatimChar"/>
+              </w:rPr>
+              <w:t xml:space="preserve">versions</w:t>
+            </w:r>
+            <w:r>
+              <w:t xml:space="preserve"> </w:t>
+            </w:r>
+            <w:r>
+              <w:t xml:space="preserve">property, optional</w:t>
+            </w:r>
+            <w:r>
+              <w:t xml:space="preserve"> </w:t>
+            </w:r>
+            <w:r>
+              <w:rPr>
+                <w:rStyle w:val="VerbatimChar"/>
+              </w:rPr>
+              <w:t xml:space="preserve">min_versions={...}</w:t>
+            </w:r>
+            <w:r>
+              <w:t xml:space="preserve"> </w:t>
+            </w:r>
+            <w:r>
+              <w:t xml:space="preserve">enforcement at construction time. Accepts the legacy 0.1.30 trailing-space filename</w:t>
+            </w:r>
+            <w:r>
+              <w:t xml:space="preserve"> </w:t>
+            </w:r>
+            <w:r>
+              <w:rPr>
+                <w:rStyle w:val="VerbatimChar"/>
+              </w:rPr>
+              <w:t xml:space="preserve">s3Dgraphy_node_datamodel .json</w:t>
+            </w:r>
+            <w:r>
+              <w:t xml:space="preserve"> </w:t>
+            </w:r>
+            <w:r>
+              <w:t xml:space="preserve">as a fallback.</w:t>
+            </w:r>
+          </w:p>
+        </w:tc>
+      </w:tr>
+      <w:tr>
+        <w:tc>
+          <w:tcPr/>
+          <w:p>
+            <w:pPr>
+              <w:pStyle w:val="Compact"/>
+            </w:pPr>
+            <w:r>
+              <w:rPr>
+                <w:rStyle w:val="VerbatimChar"/>
+              </w:rPr>
+              <w:t xml:space="preserve">modules/s3dgraphy/sync/vocab_provider.py</w:t>
+            </w:r>
+          </w:p>
+        </w:tc>
+        <w:tc>
+          <w:tcPr/>
+          <w:p>
+            <w:pPr>
+              <w:pStyle w:val="Compact"/>
+            </w:pPr>
+            <w:r>
+              <w:rPr>
+                <w:rStyle w:val="VerbatimChar"/>
+              </w:rPr>
+              <w:t xml:space="preserve">VocabProvider</w:t>
+            </w:r>
+            <w:r>
+              <w:t xml:space="preserve"> </w:t>
+            </w:r>
+            <w:r>
+              <w:t xml:space="preserve">— thin Qt wrapper. Subclasses</w:t>
+            </w:r>
+            <w:r>
+              <w:t xml:space="preserve"> </w:t>
+            </w:r>
+            <w:r>
+              <w:rPr>
+                <w:rStyle w:val="VerbatimChar"/>
+              </w:rPr>
+              <w:t xml:space="preserve">QObject</w:t>
+            </w:r>
+            <w:r>
+              <w:t xml:space="preserve"> </w:t>
+            </w:r>
+            <w:r>
+              <w:t xml:space="preserve">when QGIS is importable, falls back to plain</w:t>
+            </w:r>
+            <w:r>
+              <w:t xml:space="preserve"> </w:t>
+            </w:r>
+            <w:r>
+              <w:rPr>
+                <w:rStyle w:val="VerbatimChar"/>
+              </w:rPr>
+              <w:t xml:space="preserve">object</w:t>
+            </w:r>
+            <w:r>
+              <w:t xml:space="preserve"> </w:t>
+            </w:r>
+            <w:r>
+              <w:t xml:space="preserve">otherwise. Adds a</w:t>
+            </w:r>
+            <w:r>
+              <w:t xml:space="preserve"> </w:t>
+            </w:r>
+            <w:r>
+              <w:rPr>
+                <w:rStyle w:val="VerbatimChar"/>
+              </w:rPr>
+              <w:t xml:space="preserve">vocabulary_changed</w:t>
+            </w:r>
+            <w:r>
+              <w:t xml:space="preserve"> </w:t>
+            </w:r>
+            <w:r>
+              <w:rPr>
+                <w:rStyle w:val="VerbatimChar"/>
+              </w:rPr>
+              <w:t xml:space="preserve">pyqtSignal</w:t>
+            </w:r>
+            <w:r>
+              <w:t xml:space="preserve"> </w:t>
+            </w:r>
+            <w:r>
+              <w:t xml:space="preserve">and a</w:t>
+            </w:r>
+            <w:r>
+              <w:t xml:space="preserve"> </w:t>
+            </w:r>
+            <w:r>
+              <w:rPr>
+                <w:rStyle w:val="VerbatimChar"/>
+              </w:rPr>
+              <w:t xml:space="preserve">QFileSystemWatcher</w:t>
+            </w:r>
+            <w:r>
+              <w:t xml:space="preserve"> </w:t>
+            </w:r>
+            <w:r>
+              <w:t xml:space="preserve">covering both the bundled JSON directory and the user override directory, so combo-box dialogs can subscribe to changes and refresh on the fly. Defaults the bundled directory to</w:t>
+            </w:r>
+            <w:r>
+              <w:t xml:space="preserve"> </w:t>
+            </w:r>
+            <w:r>
+              <w:rPr>
+                <w:rStyle w:val="VerbatimChar"/>
+              </w:rPr>
+              <w:t xml:space="preserve">&lt;plugin&gt;/ext_libs/s3dgraphy/JSON_config/</w:t>
+            </w:r>
+            <w:r>
+              <w:t xml:space="preserve"> </w:t>
+            </w:r>
+            <w:r>
+              <w:t xml:space="preserve">and the overrides directory to</w:t>
+            </w:r>
+            <w:r>
+              <w:t xml:space="preserve"> </w:t>
+            </w:r>
+            <w:r>
+              <w:rPr>
+                <w:rStyle w:val="VerbatimChar"/>
+              </w:rPr>
+              <w:t xml:space="preserve">~/.config/pyarchinit/vocab_overrides/</w:t>
+            </w:r>
+            <w:r>
+              <w:t xml:space="preserve">.</w:t>
+            </w:r>
+          </w:p>
+        </w:tc>
+      </w:tr>
+    </w:tbl>
+    <w:bookmarkEnd w:id="19"/>
+    <w:bookmarkStart w:id="20" w:name="what-was-tested-2"/>
+    <w:p>
+      <w:pPr>
+        <w:pStyle w:val="Heading2"/>
+      </w:pPr>
+      <w:r>
+        <w:t xml:space="preserve">What was tested</w:t>
+      </w:r>
+    </w:p>
+    <w:p>
+      <w:pPr>
+        <w:pStyle w:val="FirstParagraph"/>
+      </w:pPr>
+      <w:r>
+        <w:t xml:space="preserve">The TDD discipline laid out in plan §B was followed strictly. Every method</w:t>
+      </w:r>
+      <w:r>
+        <w:t xml:space="preserve"> </w:t>
+      </w:r>
+      <w:r>
+        <w:t xml:space="preserve">on</w:t>
+      </w:r>
+      <w:r>
+        <w:t xml:space="preserve"> </w:t>
+      </w:r>
+      <w:r>
+        <w:rPr>
+          <w:rStyle w:val="VerbatimChar"/>
+        </w:rPr>
+        <w:t xml:space="preserve">VocabProviderCore</w:t>
+      </w:r>
+      <w:r>
+        <w:t xml:space="preserve"> </w:t>
+      </w:r>
+      <w:r>
+        <w:t xml:space="preserve">was preceded by a failing test, then implemented,</w:t>
+      </w:r>
+      <w:r>
+        <w:t xml:space="preserve"> </w:t>
+      </w:r>
+      <w:r>
+        <w:t xml:space="preserve">then verified green before commit. The final test count under</w:t>
+      </w:r>
+      <w:r>
+        <w:t xml:space="preserve"> </w:t>
+      </w:r>
+      <w:r>
+        <w:rPr>
+          <w:rStyle w:val="VerbatimChar"/>
+        </w:rPr>
+        <w:t xml:space="preserve">tests/sync/</w:t>
+      </w:r>
+      <w:r>
+        <w:t xml:space="preserve">:</w:t>
+      </w:r>
+    </w:p>
+    <w:p>
+      <w:pPr>
+        <w:pStyle w:val="Compact"/>
+        <w:numPr>
+          <w:ilvl w:val="0"/>
+          <w:numId w:val="1009"/>
+        </w:numPr>
+      </w:pPr>
+      <w:r>
+        <w:rPr>
+          <w:b/>
+          <w:bCs/>
+        </w:rPr>
+        <w:t xml:space="preserve">17 fixture-driven tests</w:t>
+      </w:r>
+      <w:r>
+        <w:t xml:space="preserve"> </w:t>
+      </w:r>
+      <w:r>
+        <w:t xml:space="preserve">in</w:t>
+      </w:r>
+      <w:r>
+        <w:t xml:space="preserve"> </w:t>
+      </w:r>
+      <w:r>
+        <w:rPr>
+          <w:rStyle w:val="VerbatimChar"/>
+        </w:rPr>
+        <w:t xml:space="preserve">test_vocab_types.py</w:t>
+      </w:r>
+      <w:r>
+        <w:t xml:space="preserve"> </w:t>
+      </w:r>
+      <w:r>
+        <w:t xml:space="preserve">and</w:t>
+      </w:r>
+      <w:r>
+        <w:t xml:space="preserve"> </w:t>
+      </w:r>
+      <w:r>
+        <w:rPr>
+          <w:rStyle w:val="VerbatimChar"/>
+        </w:rPr>
+        <w:t xml:space="preserve">test_vocab_provider_core.py</w:t>
+      </w:r>
+      <w:r>
+        <w:t xml:space="preserve"> </w:t>
+      </w:r>
+      <w:r>
+        <w:t xml:space="preserve">covering typed dataclass shape, JSON</w:t>
+      </w:r>
+      <w:r>
+        <w:t xml:space="preserve"> </w:t>
+      </w:r>
+      <w:r>
+        <w:t xml:space="preserve">loading, family filtering, edge-type loading, paradata loading, visual</w:t>
+      </w:r>
+      <w:r>
+        <w:t xml:space="preserve"> </w:t>
+      </w:r>
+      <w:r>
+        <w:t xml:space="preserve">rules, CIDOC lookup, version exposure, minimum-version gating (pass +</w:t>
+      </w:r>
+      <w:r>
+        <w:t xml:space="preserve"> </w:t>
+      </w:r>
+      <w:r>
+        <w:t xml:space="preserve">raise), legacy trailing-space filename fallback, and override merge</w:t>
+      </w:r>
+      <w:r>
+        <w:t xml:space="preserve"> </w:t>
+      </w:r>
+      <w:r>
+        <w:t xml:space="preserve">semantics (a partial paradata override must not erase bundled</w:t>
+      </w:r>
+      <w:r>
+        <w:t xml:space="preserve"> </w:t>
+      </w:r>
+      <w:r>
+        <w:t xml:space="preserve">stratigraphic types).</w:t>
+      </w:r>
+    </w:p>
+    <w:p>
+      <w:pPr>
+        <w:pStyle w:val="Compact"/>
+        <w:numPr>
+          <w:ilvl w:val="0"/>
+          <w:numId w:val="1009"/>
+        </w:numPr>
+      </w:pPr>
+      <w:r>
+        <w:rPr>
+          <w:b/>
+          <w:bCs/>
+        </w:rPr>
+        <w:t xml:space="preserve">2 smoke tests</w:t>
+      </w:r>
+      <w:r>
+        <w:t xml:space="preserve"> </w:t>
+      </w:r>
+      <w:r>
+        <w:t xml:space="preserve">in</w:t>
+      </w:r>
+      <w:r>
+        <w:t xml:space="preserve"> </w:t>
+      </w:r>
+      <w:r>
+        <w:rPr>
+          <w:rStyle w:val="VerbatimChar"/>
+        </w:rPr>
+        <w:t xml:space="preserve">test_vocab_provider_smoke.py</w:t>
+      </w:r>
+      <w:r>
+        <w:t xml:space="preserve"> </w:t>
+      </w:r>
+      <w:r>
+        <w:t xml:space="preserve">running against the</w:t>
+      </w:r>
+      <w:r>
+        <w:t xml:space="preserve"> </w:t>
+      </w:r>
+      <w:r>
+        <w:t xml:space="preserve">real</w:t>
+      </w:r>
+      <w:r>
+        <w:t xml:space="preserve"> </w:t>
+      </w:r>
+      <w:r>
+        <w:rPr>
+          <w:rStyle w:val="VerbatimChar"/>
+        </w:rPr>
+        <w:t xml:space="preserve">ext_libs/s3dgraphy/JSON_config/</w:t>
+      </w:r>
+      <w:r>
+        <w:t xml:space="preserve"> </w:t>
+      </w:r>
+      <w:r>
+        <w:t xml:space="preserve">0.1.40 vendor installed in</w:t>
+      </w:r>
+      <w:r>
+        <w:t xml:space="preserve"> </w:t>
+      </w:r>
+      <w:r>
+        <w:t xml:space="preserve">Group A. The smoke tests confirm</w:t>
+      </w:r>
+      <w:r>
+        <w:t xml:space="preserve"> </w:t>
+      </w:r>
+      <w:r>
+        <w:rPr>
+          <w:rStyle w:val="VerbatimChar"/>
+        </w:rPr>
+        <w:t xml:space="preserve">US</w:t>
+      </w:r>
+      <w:r>
+        <w:t xml:space="preserve">,</w:t>
+      </w:r>
+      <w:r>
+        <w:t xml:space="preserve"> </w:t>
+      </w:r>
+      <w:r>
+        <w:rPr>
+          <w:rStyle w:val="VerbatimChar"/>
+        </w:rPr>
+        <w:t xml:space="preserve">USVs</w:t>
+      </w:r>
+      <w:r>
+        <w:t xml:space="preserve">,</w:t>
+      </w:r>
+      <w:r>
+        <w:t xml:space="preserve"> </w:t>
+      </w:r>
+      <w:r>
+        <w:rPr>
+          <w:rStyle w:val="VerbatimChar"/>
+        </w:rPr>
+        <w:t xml:space="preserve">USVn</w:t>
+      </w:r>
+      <w:r>
+        <w:t xml:space="preserve"> </w:t>
+      </w:r>
+      <w:r>
+        <w:t xml:space="preserve">appear in the</w:t>
+      </w:r>
+      <w:r>
+        <w:t xml:space="preserve"> </w:t>
+      </w:r>
+      <w:r>
+        <w:t xml:space="preserve">stratigraphic family on the actual vendored datamodel and that the</w:t>
+      </w:r>
+      <w:r>
+        <w:t xml:space="preserve"> </w:t>
+      </w:r>
+      <w:r>
+        <w:t xml:space="preserve">per-pillar version field is populated. Auto-skipped when</w:t>
+      </w:r>
+      <w:r>
+        <w:t xml:space="preserve"> </w:t>
+      </w:r>
+      <w:r>
+        <w:rPr>
+          <w:rStyle w:val="VerbatimChar"/>
+        </w:rPr>
+        <w:t xml:space="preserve">ext_libs/</w:t>
+      </w:r>
+      <w:r>
+        <w:t xml:space="preserve"> </w:t>
+      </w:r>
+      <w:r>
+        <w:t xml:space="preserve">is missing (fresh clone before</w:t>
+      </w:r>
+      <w:r>
+        <w:t xml:space="preserve"> </w:t>
+      </w:r>
+      <w:r>
+        <w:rPr>
+          <w:rStyle w:val="VerbatimChar"/>
+        </w:rPr>
+        <w:t xml:space="preserve">modules_installer.py</w:t>
+      </w:r>
+      <w:r>
+        <w:t xml:space="preserve"> </w:t>
+      </w:r>
+      <w:r>
+        <w:t xml:space="preserve">runs).</w:t>
+      </w:r>
+    </w:p>
+    <w:p>
+      <w:pPr>
+        <w:pStyle w:val="FirstParagraph"/>
+      </w:pPr>
+      <w:r>
+        <w:t xml:space="preserve">Total:</w:t>
+      </w:r>
+      <w:r>
+        <w:t xml:space="preserve"> </w:t>
+      </w:r>
+      <w:r>
+        <w:rPr>
+          <w:b/>
+          <w:bCs/>
+        </w:rPr>
+        <w:t xml:space="preserve">19 passed in 0.20 s</w:t>
+      </w:r>
+      <w:r>
+        <w:t xml:space="preserve">, run via</w:t>
+      </w:r>
+      <w:r>
+        <w:t xml:space="preserve"> </w:t>
+      </w:r>
+      <w:r>
+        <w:rPr>
+          <w:rStyle w:val="VerbatimChar"/>
+        </w:rPr>
+        <w:t xml:space="preserve">pytest tests/sync/ -v</w:t>
+      </w:r>
+      <w:r>
+        <w:t xml:space="preserve"> </w:t>
+      </w:r>
+      <w:r>
+        <w:t xml:space="preserve">from the</w:t>
+      </w:r>
+      <w:r>
+        <w:t xml:space="preserve"> </w:t>
+      </w:r>
+      <w:r>
+        <w:t xml:space="preserve">plugin root. The runner is configured by a minimal</w:t>
+      </w:r>
+      <w:r>
+        <w:t xml:space="preserve"> </w:t>
+      </w:r>
+      <w:r>
+        <w:rPr>
+          <w:rStyle w:val="VerbatimChar"/>
+        </w:rPr>
+        <w:t xml:space="preserve">pyproject.toml</w:t>
+      </w:r>
+      <w:r>
+        <w:t xml:space="preserve"> </w:t>
+      </w:r>
+      <w:r>
+        <w:t xml:space="preserve">([</w:t>
+      </w:r>
+      <w:r>
+        <w:rPr>
+          <w:rStyle w:val="VerbatimChar"/>
+        </w:rPr>
+        <w:t xml:space="preserve">tool.pytest.ini_options</w:t>
+      </w:r>
+      <w:r>
+        <w:t xml:space="preserve">] with</w:t>
+      </w:r>
+      <w:r>
+        <w:t xml:space="preserve"> </w:t>
+      </w:r>
+      <w:r>
+        <w:rPr>
+          <w:rStyle w:val="VerbatimChar"/>
+        </w:rPr>
+        <w:t xml:space="preserve">testpaths = ["tests/sync"]</w:t>
+      </w:r>
+      <w:r>
+        <w:t xml:space="preserve"> </w:t>
+      </w:r>
+      <w:r>
+        <w:t xml:space="preserve">and</w:t>
+      </w:r>
+      <w:r>
+        <w:t xml:space="preserve"> </w:t>
+      </w:r>
+      <w:r>
+        <w:rPr>
+          <w:rStyle w:val="VerbatimChar"/>
+        </w:rPr>
+        <w:t xml:space="preserve">--import-mode=importlib --confcutdir=tests/sync</w:t>
+      </w:r>
+      <w:r>
+        <w:t xml:space="preserve">) so the new suite can</w:t>
+      </w:r>
+      <w:r>
+        <w:t xml:space="preserve"> </w:t>
+      </w:r>
+      <w:r>
+        <w:t xml:space="preserve">run from the CLI without QGIS bootstrap — needed because the plugin’s</w:t>
+      </w:r>
+      <w:r>
+        <w:t xml:space="preserve"> </w:t>
+      </w:r>
+      <w:r>
+        <w:t xml:space="preserve">top-level</w:t>
+      </w:r>
+      <w:r>
+        <w:t xml:space="preserve"> </w:t>
+      </w:r>
+      <w:r>
+        <w:rPr>
+          <w:rStyle w:val="VerbatimChar"/>
+        </w:rPr>
+        <w:t xml:space="preserve">__init__.py</w:t>
+      </w:r>
+      <w:r>
+        <w:t xml:space="preserve"> </w:t>
+      </w:r>
+      <w:r>
+        <w:t xml:space="preserve">imports</w:t>
+      </w:r>
+      <w:r>
+        <w:t xml:space="preserve"> </w:t>
+      </w:r>
+      <w:r>
+        <w:rPr>
+          <w:rStyle w:val="VerbatimChar"/>
+        </w:rPr>
+        <w:t xml:space="preserve">qgis.PyQt.*</w:t>
+      </w:r>
+      <w:r>
+        <w:t xml:space="preserve"> </w:t>
+      </w:r>
+      <w:r>
+        <w:t xml:space="preserve">at module load.</w:t>
+      </w:r>
+    </w:p>
+    <w:p>
+      <w:pPr>
+        <w:pStyle w:val="BodyText"/>
+      </w:pPr>
+      <w:r>
+        <w:t xml:space="preserve">Two-stage review was applied to the foundation pair (Tasks B.1 + B.2): an</w:t>
+      </w:r>
+      <w:r>
+        <w:t xml:space="preserve"> </w:t>
+      </w:r>
+      <w:r>
+        <w:t xml:space="preserve">independent spec-compliance reviewer confirmed byte-level match to the</w:t>
+      </w:r>
+      <w:r>
+        <w:t xml:space="preserve"> </w:t>
+      </w:r>
+      <w:r>
+        <w:t xml:space="preserve">plan literal source, and a code-quality reviewer approved with minor</w:t>
+      </w:r>
+      <w:r>
+        <w:t xml:space="preserve"> </w:t>
+      </w:r>
+      <w:r>
+        <w:t xml:space="preserve">follow-ups, all four of which were folded into the next subagent batch</w:t>
+      </w:r>
+      <w:r>
+        <w:t xml:space="preserve"> </w:t>
+      </w:r>
+      <w:r>
+        <w:t xml:space="preserve">without requiring a separate fix commit.</w:t>
+      </w:r>
+    </w:p>
+    <w:bookmarkEnd w:id="20"/>
+    <w:bookmarkStart w:id="21" w:name="decisions-taken-2"/>
+    <w:p>
+      <w:pPr>
+        <w:pStyle w:val="Heading2"/>
+      </w:pPr>
+      <w:r>
+        <w:t xml:space="preserve">Decisions taken</w:t>
+      </w:r>
+    </w:p>
+    <w:p>
+      <w:pPr>
+        <w:pStyle w:val="Compact"/>
+        <w:numPr>
+          <w:ilvl w:val="0"/>
+          <w:numId w:val="1010"/>
+        </w:numPr>
+      </w:pPr>
+      <w:r>
+        <w:rPr>
+          <w:b/>
+          <w:bCs/>
+        </w:rPr>
+        <w:t xml:space="preserve">Pure core / Qt wrapper split</w:t>
+      </w:r>
+      <w:r>
+        <w:t xml:space="preserve"> </w:t>
+      </w:r>
+      <w:r>
+        <w:t xml:space="preserve">is locked in. The pure-Python</w:t>
+      </w:r>
+      <w:r>
+        <w:t xml:space="preserve"> </w:t>
+      </w:r>
+      <w:r>
+        <w:rPr>
+          <w:rStyle w:val="VerbatimChar"/>
+        </w:rPr>
+        <w:t xml:space="preserve">VocabProviderCore</w:t>
+      </w:r>
+      <w:r>
+        <w:t xml:space="preserve"> </w:t>
+      </w:r>
+      <w:r>
+        <w:t xml:space="preserve">is the only surface tests exercise; the Qt</w:t>
+      </w:r>
+      <w:r>
+        <w:t xml:space="preserve"> </w:t>
+      </w:r>
+      <w:r>
+        <w:rPr>
+          <w:rStyle w:val="VerbatimChar"/>
+        </w:rPr>
+        <w:t xml:space="preserve">VocabProvider</w:t>
+      </w:r>
+      <w:r>
+        <w:t xml:space="preserve"> </w:t>
+      </w:r>
+      <w:r>
+        <w:t xml:space="preserve">is a thin singleton-with-signal that any QGIS dialog</w:t>
+      </w:r>
+      <w:r>
+        <w:t xml:space="preserve"> </w:t>
+      </w:r>
+      <w:r>
+        <w:t xml:space="preserve">can subscribe to without inheriting test infrastructure. This keeps</w:t>
+      </w:r>
+      <w:r>
+        <w:t xml:space="preserve"> </w:t>
+      </w:r>
+      <w:r>
+        <w:t xml:space="preserve">the test suite QGIS-free and runnable in CI / from a bare shell.</w:t>
+      </w:r>
+    </w:p>
+    <w:p>
+      <w:pPr>
+        <w:pStyle w:val="Compact"/>
+        <w:numPr>
+          <w:ilvl w:val="0"/>
+          <w:numId w:val="1010"/>
+        </w:numPr>
+      </w:pPr>
+      <w:r>
+        <w:rPr>
+          <w:rStyle w:val="VerbatimChar"/>
+          <w:b/>
+          <w:bCs/>
+        </w:rPr>
+        <w:t xml:space="preserve">pyproject.toml</w:t>
+      </w:r>
+      <w:r>
+        <w:rPr>
+          <w:b/>
+          <w:bCs/>
+        </w:rPr>
+        <w:t xml:space="preserve"> </w:t>
+      </w:r>
+      <w:r>
+        <w:rPr>
+          <w:b/>
+          <w:bCs/>
+        </w:rPr>
+        <w:t xml:space="preserve">is the canonical pytest config location</w:t>
+      </w:r>
+      <w:r>
+        <w:t xml:space="preserve"> </w:t>
+      </w:r>
+      <w:r>
+        <w:t xml:space="preserve">for this</w:t>
+      </w:r>
+      <w:r>
+        <w:t xml:space="preserve"> </w:t>
+      </w:r>
+      <w:r>
+        <w:t xml:space="preserve">plugin, scoped narrowly to</w:t>
+      </w:r>
+      <w:r>
+        <w:t xml:space="preserve"> </w:t>
+      </w:r>
+      <w:r>
+        <w:rPr>
+          <w:rStyle w:val="VerbatimChar"/>
+        </w:rPr>
+        <w:t xml:space="preserve">tests/sync</w:t>
+      </w:r>
+      <w:r>
+        <w:t xml:space="preserve">. Legacy tests under</w:t>
+      </w:r>
+      <w:r>
+        <w:t xml:space="preserve"> </w:t>
+      </w:r>
+      <w:r>
+        <w:rPr>
+          <w:rStyle w:val="VerbatimChar"/>
+        </w:rPr>
+        <w:t xml:space="preserve">tests/test_*.py</w:t>
+      </w:r>
+      <w:r>
+        <w:t xml:space="preserve"> </w:t>
+      </w:r>
+      <w:r>
+        <w:t xml:space="preserve">already required QGIS to run, so no change in</w:t>
+      </w:r>
+      <w:r>
+        <w:t xml:space="preserve"> </w:t>
+      </w:r>
+      <w:r>
+        <w:t xml:space="preserve">behaviour for them; the new suite is additive.</w:t>
+      </w:r>
+    </w:p>
+    <w:p>
+      <w:pPr>
+        <w:pStyle w:val="Compact"/>
+        <w:numPr>
+          <w:ilvl w:val="0"/>
+          <w:numId w:val="1010"/>
+        </w:numPr>
+      </w:pPr>
+      <w:r>
+        <w:rPr>
+          <w:b/>
+          <w:bCs/>
+        </w:rPr>
+        <w:t xml:space="preserve">The 0.1.30 trailing-space filename</w:t>
+      </w:r>
+      <w:r>
+        <w:t xml:space="preserve"> </w:t>
+      </w:r>
+      <w:r>
+        <w:t xml:space="preserve">(</w:t>
+      </w:r>
+      <w:r>
+        <w:rPr>
+          <w:rStyle w:val="VerbatimChar"/>
+        </w:rPr>
+        <w:t xml:space="preserve">s3Dgraphy_node_datamodel .json</w:t>
+      </w:r>
+      <w:r>
+        <w:t xml:space="preserve"> </w:t>
+      </w:r>
+      <w:r>
+        <w:t xml:space="preserve">with a literal space before the extension) is preserved as a fallback</w:t>
+      </w:r>
+      <w:r>
+        <w:t xml:space="preserve"> </w:t>
+      </w:r>
+      <w:r>
+        <w:t xml:space="preserve">in</w:t>
+      </w:r>
+      <w:r>
+        <w:t xml:space="preserve"> </w:t>
+      </w:r>
+      <w:r>
+        <w:rPr>
+          <w:rStyle w:val="VerbatimChar"/>
+        </w:rPr>
+        <w:t xml:space="preserve">_NODE_DATAMODEL_NAMES</w:t>
+      </w:r>
+      <w:r>
+        <w:t xml:space="preserve">. It will only be removed when 0.1.30</w:t>
+      </w:r>
+      <w:r>
+        <w:t xml:space="preserve"> </w:t>
+      </w:r>
+      <w:r>
+        <w:t xml:space="preserve">support is officially dropped — annotated inline so future</w:t>
+      </w:r>
+      <w:r>
+        <w:t xml:space="preserve"> </w:t>
+      </w:r>
+      <w:r>
+        <w:t xml:space="preserve">maintainers find the answer without archaeology.</w:t>
+      </w:r>
+    </w:p>
+    <w:p>
+      <w:pPr>
+        <w:pStyle w:val="Compact"/>
+        <w:numPr>
+          <w:ilvl w:val="0"/>
+          <w:numId w:val="1010"/>
+        </w:numPr>
+      </w:pPr>
+      <w:r>
+        <w:rPr>
+          <w:b/>
+          <w:bCs/>
+        </w:rPr>
+        <w:t xml:space="preserve">Override priority is per top-level key, not whole-file</w:t>
+      </w:r>
+      <w:r>
+        <w:t xml:space="preserve">, locked in</w:t>
+      </w:r>
+      <w:r>
+        <w:t xml:space="preserve"> </w:t>
+      </w:r>
+      <w:r>
+        <w:t xml:space="preserve">by a regression test that builds a partial paradata-only override and</w:t>
+      </w:r>
+      <w:r>
+        <w:t xml:space="preserve"> </w:t>
+      </w:r>
+      <w:r>
+        <w:t xml:space="preserve">asserts the bundled stratigraphic types still surface from</w:t>
+      </w:r>
+      <w:r>
+        <w:t xml:space="preserve"> </w:t>
+      </w:r>
+      <w:r>
+        <w:rPr>
+          <w:rStyle w:val="VerbatimChar"/>
+        </w:rPr>
+        <w:t xml:space="preserve">get_unit_types()</w:t>
+      </w:r>
+      <w:r>
+        <w:t xml:space="preserve">. A datacenter pulling a partial vocabulary update</w:t>
+      </w:r>
+      <w:r>
+        <w:t xml:space="preserve"> </w:t>
+      </w:r>
+      <w:r>
+        <w:t xml:space="preserve">will not silently erase locally available types.</w:t>
+      </w:r>
+    </w:p>
+    <w:p>
+      <w:pPr>
+        <w:pStyle w:val="Compact"/>
+        <w:numPr>
+          <w:ilvl w:val="0"/>
+          <w:numId w:val="1010"/>
+        </w:numPr>
+      </w:pPr>
+      <w:r>
+        <w:rPr>
+          <w:b/>
+          <w:bCs/>
+        </w:rPr>
+        <w:t xml:space="preserve">Public API frozen for Phase 1</w:t>
+      </w:r>
+      <w:r>
+        <w:t xml:space="preserve">:</w:t>
+      </w:r>
+      <w:r>
+        <w:t xml:space="preserve"> </w:t>
+      </w:r>
+      <w:r>
+        <w:rPr>
+          <w:rStyle w:val="VerbatimChar"/>
+        </w:rPr>
+        <w:t xml:space="preserve">VocabProviderCore</w:t>
+      </w:r>
+      <w:r>
+        <w:t xml:space="preserve">,</w:t>
+      </w:r>
+      <w:r>
+        <w:t xml:space="preserve"> </w:t>
+      </w:r>
+      <w:r>
+        <w:rPr>
+          <w:rStyle w:val="VerbatimChar"/>
+        </w:rPr>
+        <w:t xml:space="preserve">UnitType</w:t>
+      </w:r>
+      <w:r>
+        <w:t xml:space="preserve">,</w:t>
+      </w:r>
+      <w:r>
+        <w:t xml:space="preserve"> </w:t>
+      </w:r>
+      <w:r>
+        <w:rPr>
+          <w:rStyle w:val="VerbatimChar"/>
+        </w:rPr>
+        <w:t xml:space="preserve">EdgeType</w:t>
+      </w:r>
+      <w:r>
+        <w:t xml:space="preserve">,</w:t>
+      </w:r>
+      <w:r>
+        <w:t xml:space="preserve"> </w:t>
+      </w:r>
+      <w:r>
+        <w:rPr>
+          <w:rStyle w:val="VerbatimChar"/>
+        </w:rPr>
+        <w:t xml:space="preserve">VisualRule</w:t>
+      </w:r>
+      <w:r>
+        <w:t xml:space="preserve">,</w:t>
+      </w:r>
+      <w:r>
+        <w:t xml:space="preserve"> </w:t>
+      </w:r>
+      <w:r>
+        <w:rPr>
+          <w:rStyle w:val="VerbatimChar"/>
+        </w:rPr>
+        <w:t xml:space="preserve">ParadataType</w:t>
+      </w:r>
+      <w:r>
+        <w:t xml:space="preserve">,</w:t>
+      </w:r>
+      <w:r>
+        <w:t xml:space="preserve"> </w:t>
+      </w:r>
+      <w:r>
+        <w:rPr>
+          <w:rStyle w:val="VerbatimChar"/>
+        </w:rPr>
+        <w:t xml:space="preserve">VocabularyVersion</w:t>
+      </w:r>
+      <w:r>
+        <w:t xml:space="preserve">,</w:t>
+      </w:r>
+      <w:r>
+        <w:t xml:space="preserve"> </w:t>
+      </w:r>
+      <w:r>
+        <w:rPr>
+          <w:rStyle w:val="VerbatimChar"/>
+        </w:rPr>
+        <w:t xml:space="preserve">Family</w:t>
+      </w:r>
+      <w:r>
+        <w:t xml:space="preserve">,</w:t>
+      </w:r>
+      <w:r>
+        <w:t xml:space="preserve"> </w:t>
+      </w:r>
+      <w:r>
+        <w:rPr>
+          <w:rStyle w:val="VerbatimChar"/>
+        </w:rPr>
+        <w:t xml:space="preserve">get_vocab_provider()</w:t>
+      </w:r>
+      <w:r>
+        <w:t xml:space="preserve">.</w:t>
+      </w:r>
+      <w:r>
+        <w:t xml:space="preserve"> </w:t>
+      </w:r>
+      <w:r>
+        <w:rPr>
+          <w:rStyle w:val="VerbatimChar"/>
+        </w:rPr>
+        <w:t xml:space="preserve">SyncEngine</w:t>
+      </w:r>
+      <w:r>
+        <w:t xml:space="preserve">,</w:t>
+      </w:r>
+      <w:r>
+        <w:t xml:space="preserve"> </w:t>
+      </w:r>
+      <w:r>
+        <w:rPr>
+          <w:rStyle w:val="VerbatimChar"/>
+        </w:rPr>
+        <w:t xml:space="preserve">GraphProjector</w:t>
+      </w:r>
+      <w:r>
+        <w:t xml:space="preserve">,</w:t>
+      </w:r>
+      <w:r>
+        <w:t xml:space="preserve"> </w:t>
+      </w:r>
+      <w:r>
+        <w:rPr>
+          <w:rStyle w:val="VerbatimChar"/>
+        </w:rPr>
+        <w:t xml:space="preserve">ParadataStore</w:t>
+      </w:r>
+      <w:r>
+        <w:t xml:space="preserve">,</w:t>
+      </w:r>
+      <w:r>
+        <w:t xml:space="preserve"> </w:t>
+      </w:r>
+      <w:r>
+        <w:rPr>
+          <w:rStyle w:val="VerbatimChar"/>
+        </w:rPr>
+        <w:t xml:space="preserve">ConflictResolver</w:t>
+      </w:r>
+      <w:r>
+        <w:t xml:space="preserve"> </w:t>
+      </w:r>
+      <w:r>
+        <w:t xml:space="preserve">are deliberately absent — they</w:t>
+      </w:r>
+      <w:r>
+        <w:t xml:space="preserve"> </w:t>
+      </w:r>
+      <w:r>
+        <w:t xml:space="preserve">belong to Phases 2 and 3.</w:t>
+      </w:r>
+    </w:p>
+    <w:bookmarkEnd w:id="21"/>
+    <w:bookmarkStart w:id="22" w:name="plan-corrections-folded-in-mid-execution"/>
+    <w:p>
+      <w:pPr>
+        <w:pStyle w:val="Heading2"/>
+      </w:pPr>
+      <w:r>
+        <w:t xml:space="preserve">Plan corrections folded in mid-execution</w:t>
+      </w:r>
+    </w:p>
+    <w:p>
+      <w:pPr>
+        <w:pStyle w:val="Compact"/>
+        <w:numPr>
+          <w:ilvl w:val="0"/>
+          <w:numId w:val="1011"/>
+        </w:numPr>
+      </w:pPr>
+      <w:r>
+        <w:rPr>
+          <w:rStyle w:val="VerbatimChar"/>
+          <w:b/>
+          <w:bCs/>
+        </w:rPr>
+        <w:t xml:space="preserve">pyproject.toml</w:t>
+      </w:r>
+      <w:r>
+        <w:rPr>
+          <w:b/>
+          <w:bCs/>
+        </w:rPr>
+        <w:t xml:space="preserve"> </w:t>
+      </w:r>
+      <w:r>
+        <w:rPr>
+          <w:b/>
+          <w:bCs/>
+        </w:rPr>
+        <w:t xml:space="preserve">was not in the plan</w:t>
+      </w:r>
+      <w:r>
+        <w:t xml:space="preserve"> </w:t>
+      </w:r>
+      <w:r>
+        <w:t xml:space="preserve">but is required so the new</w:t>
+      </w:r>
+      <w:r>
+        <w:t xml:space="preserve"> </w:t>
+      </w:r>
+      <w:r>
+        <w:t xml:space="preserve">test suite can run from a bare CLI. The deviation was approved during</w:t>
+      </w:r>
+      <w:r>
+        <w:t xml:space="preserve"> </w:t>
+      </w:r>
+      <w:r>
+        <w:t xml:space="preserve">spec review of B.1 + B.2; the file is 6 lines, single-section, and</w:t>
+      </w:r>
+      <w:r>
+        <w:t xml:space="preserve"> </w:t>
+      </w:r>
+      <w:r>
+        <w:t xml:space="preserve">scoped to</w:t>
+      </w:r>
+      <w:r>
+        <w:t xml:space="preserve"> </w:t>
+      </w:r>
+      <w:r>
+        <w:rPr>
+          <w:rStyle w:val="VerbatimChar"/>
+        </w:rPr>
+        <w:t xml:space="preserve">tests/sync</w:t>
+      </w:r>
+      <w:r>
+        <w:t xml:space="preserve"> </w:t>
+      </w:r>
+      <w:r>
+        <w:t xml:space="preserve">so legacy tests are unaffected.</w:t>
+      </w:r>
+    </w:p>
+    <w:p>
+      <w:pPr>
+        <w:pStyle w:val="Compact"/>
+        <w:numPr>
+          <w:ilvl w:val="0"/>
+          <w:numId w:val="1011"/>
+        </w:numPr>
+      </w:pPr>
+      <w:r>
+        <w:rPr>
+          <w:rStyle w:val="VerbatimChar"/>
+          <w:b/>
+          <w:bCs/>
+        </w:rPr>
+        <w:t xml:space="preserve">EdgeType.allowed_pairs</w:t>
+      </w:r>
+      <w:r>
+        <w:rPr>
+          <w:b/>
+          <w:bCs/>
+        </w:rPr>
+        <w:t xml:space="preserve"> </w:t>
+      </w:r>
+      <w:r>
+        <w:rPr>
+          <w:b/>
+          <w:bCs/>
+        </w:rPr>
+        <w:t xml:space="preserve">annotation tightened</w:t>
+      </w:r>
+      <w:r>
+        <w:t xml:space="preserve"> </w:t>
+      </w:r>
+      <w:r>
+        <w:t xml:space="preserve">from raw</w:t>
+      </w:r>
+      <w:r>
+        <w:t xml:space="preserve"> </w:t>
+      </w:r>
+      <w:r>
+        <w:rPr>
+          <w:rStyle w:val="VerbatimChar"/>
+        </w:rPr>
+        <w:t xml:space="preserve">tuple</w:t>
+      </w:r>
+      <w:r>
+        <w:t xml:space="preserve"> </w:t>
+      </w:r>
+      <w:r>
+        <w:t xml:space="preserve">to</w:t>
+      </w:r>
+      <w:r>
+        <w:t xml:space="preserve"> </w:t>
+      </w:r>
+      <w:r>
+        <w:rPr>
+          <w:rStyle w:val="VerbatimChar"/>
+        </w:rPr>
+        <w:t xml:space="preserve">tuple[tuple[str, str], ...]</w:t>
+      </w:r>
+      <w:r>
+        <w:t xml:space="preserve"> </w:t>
+      </w:r>
+      <w:r>
+        <w:t xml:space="preserve">(review follow-up), preserving the</w:t>
+      </w:r>
+      <w:r>
+        <w:t xml:space="preserve"> </w:t>
+      </w:r>
+      <w:r>
+        <w:t xml:space="preserve">hashability contract of frozen dataclasses.</w:t>
+      </w:r>
+    </w:p>
+    <w:bookmarkEnd w:id="22"/>
+    <w:bookmarkEnd w:id="23"/>
     <w:sectPr>
       <w:footnotePr>
         <w:numRestart w:val="eachSect"/>
@@ -2864,6 +4613,15 @@
     <w:abstractNumId w:val="991"/>
   </w:num>
   <w:num w:numId="1008">
+    <w:abstractNumId w:val="991"/>
+  </w:num>
+  <w:num w:numId="1009">
+    <w:abstractNumId w:val="991"/>
+  </w:num>
+  <w:num w:numId="1010">
+    <w:abstractNumId w:val="991"/>
+  </w:num>
+  <w:num w:numId="1011">
     <w:abstractNumId w:val="991"/>
   </w:num>
 </w:numbering>

</xml_diff>

<commit_message>
docs(dev-log): Group C entry — i18n adapter refactor
2 commits (69dd3ac9 + 81f71a65), 24 passing tests in tests/sync/.
Unit-type picker dialog now exposes 27 items (was 14) sourced from
s3Dgraphy 0.1.40 JSON datamodel. USVA/USVB/USVC removed from picker;
existing DB rows still render via free-text column. DOCX re-rendered.
</commit_message>
<xml_diff>
--- a/docs/superpowers/dev-log/T5.4_PyArchInit_Dev_Log.docx
+++ b/docs/superpowers/dev-log/T5.4_PyArchInit_Dev_Log.docx
@@ -747,7 +747,17 @@
               <w:pStyle w:val="Compact"/>
             </w:pPr>
             <w:r>
-              <w:t xml:space="preserve">Pending</w:t>
+              <w:rPr>
+                <w:b/>
+                <w:bCs/>
+              </w:rPr>
+              <w:t xml:space="preserve">Done</w:t>
+            </w:r>
+            <w:r>
+              <w:t xml:space="preserve"> </w:t>
+            </w:r>
+            <w:r>
+              <w:t xml:space="preserve">(2026-05-07)</w:t>
             </w:r>
           </w:p>
         </w:tc>
@@ -4261,8 +4271,1395 @@
         <w:t xml:space="preserve">hashability contract of frozen dataclasses.</w:t>
       </w:r>
     </w:p>
+    <w:p>
+      <w:r>
+        <w:pict>
+          <v:rect style="width:0;height:1.5pt" o:hralign="center" o:hrstd="t" o:hr="t"/>
+        </w:pict>
+      </w:r>
+    </w:p>
     <w:bookmarkEnd w:id="22"/>
     <w:bookmarkEnd w:id="23"/>
+    <w:bookmarkStart w:id="28" w:name="group-c-i18n-adapter-refactor"/>
+    <w:p>
+      <w:pPr>
+        <w:pStyle w:val="Heading1"/>
+      </w:pPr>
+      <w:r>
+        <w:t xml:space="preserve">Group C — i18n adapter refactor</w:t>
+      </w:r>
+    </w:p>
+    <w:p>
+      <w:pPr>
+        <w:pStyle w:val="FirstParagraph"/>
+      </w:pPr>
+      <w:r>
+        <w:rPr>
+          <w:b/>
+          <w:bCs/>
+        </w:rPr>
+        <w:t xml:space="preserve">Date:</w:t>
+      </w:r>
+      <w:r>
+        <w:t xml:space="preserve"> </w:t>
+      </w:r>
+      <w:r>
+        <w:t xml:space="preserve">7 May 2026 ·</w:t>
+      </w:r>
+      <w:r>
+        <w:t xml:space="preserve"> </w:t>
+      </w:r>
+      <w:r>
+        <w:rPr>
+          <w:b/>
+          <w:bCs/>
+        </w:rPr>
+        <w:t xml:space="preserve">Status:</w:t>
+      </w:r>
+      <w:r>
+        <w:t xml:space="preserve"> </w:t>
+      </w:r>
+      <w:r>
+        <w:t xml:space="preserve">Done ·</w:t>
+      </w:r>
+      <w:r>
+        <w:t xml:space="preserve"> </w:t>
+      </w:r>
+      <w:r>
+        <w:rPr>
+          <w:b/>
+          <w:bCs/>
+        </w:rPr>
+        <w:t xml:space="preserve">Commits:</w:t>
+      </w:r>
+      <w:r>
+        <w:t xml:space="preserve"> </w:t>
+      </w:r>
+      <w:r>
+        <w:rPr>
+          <w:rStyle w:val="VerbatimChar"/>
+        </w:rPr>
+        <w:t xml:space="preserve">69dd3ac9</w:t>
+      </w:r>
+      <w:r>
+        <w:t xml:space="preserve">,</w:t>
+      </w:r>
+      <w:r>
+        <w:t xml:space="preserve"> </w:t>
+      </w:r>
+      <w:r>
+        <w:rPr>
+          <w:rStyle w:val="VerbatimChar"/>
+        </w:rPr>
+        <w:t xml:space="preserve">81f71a65</w:t>
+      </w:r>
+    </w:p>
+    <w:bookmarkStart w:id="24" w:name="what-was-built-3"/>
+    <w:p>
+      <w:pPr>
+        <w:pStyle w:val="Heading2"/>
+      </w:pPr>
+      <w:r>
+        <w:t xml:space="preserve">What was built</w:t>
+      </w:r>
+    </w:p>
+    <w:p>
+      <w:pPr>
+        <w:pStyle w:val="FirstParagraph"/>
+      </w:pPr>
+      <w:r>
+        <w:rPr>
+          <w:rStyle w:val="VerbatimChar"/>
+        </w:rPr>
+        <w:t xml:space="preserve">modules/utility/pyarchinit_i18n_stratigraphic.py</w:t>
+      </w:r>
+      <w:r>
+        <w:t xml:space="preserve">, the long-standing</w:t>
+      </w:r>
+      <w:r>
+        <w:t xml:space="preserve"> </w:t>
+      </w:r>
+      <w:r>
+        <w:t xml:space="preserve">module that ten different files in the plugin import for unit-type</w:t>
+      </w:r>
+      <w:r>
+        <w:t xml:space="preserve"> </w:t>
+      </w:r>
+      <w:r>
+        <w:t xml:space="preserve">abbreviations and stratigraphic helpers, was refactored into a</w:t>
+      </w:r>
+      <w:r>
+        <w:t xml:space="preserve"> </w:t>
+      </w:r>
+      <w:r>
+        <w:rPr>
+          <w:b/>
+          <w:bCs/>
+        </w:rPr>
+        <w:t xml:space="preserve">deprecation shim</w:t>
+      </w:r>
+      <w:r>
+        <w:t xml:space="preserve"> </w:t>
+      </w:r>
+      <w:r>
+        <w:t xml:space="preserve">over</w:t>
+      </w:r>
+      <w:r>
+        <w:t xml:space="preserve"> </w:t>
+      </w:r>
+      <w:r>
+        <w:rPr>
+          <w:rStyle w:val="VerbatimChar"/>
+        </w:rPr>
+        <w:t xml:space="preserve">VocabProvider</w:t>
+      </w:r>
+      <w:r>
+        <w:t xml:space="preserve"> </w:t>
+      </w:r>
+      <w:r>
+        <w:t xml:space="preserve">while preserving its public</w:t>
+      </w:r>
+      <w:r>
+        <w:t xml:space="preserve"> </w:t>
+      </w:r>
+      <w:r>
+        <w:t xml:space="preserve">surface byte-for-byte.</w:t>
+      </w:r>
+    </w:p>
+    <w:p>
+      <w:pPr>
+        <w:pStyle w:val="BodyText"/>
+      </w:pPr>
+      <w:r>
+        <w:t xml:space="preserve">The behavioural change is at one place: the hard-coded</w:t>
+      </w:r>
+      <w:r>
+        <w:t xml:space="preserve"> </w:t>
+      </w:r>
+      <w:r>
+        <w:rPr>
+          <w:rStyle w:val="VerbatimChar"/>
+        </w:rPr>
+        <w:t xml:space="preserve">_COMMON_ITEMS = ('USVA','USVB','USVC','USD','CON','VSF','SF','SUS', 'Combinar','Extractor','DOC','property')</w:t>
+      </w:r>
+      <w:r>
+        <w:t xml:space="preserve"> </w:t>
+      </w:r>
+      <w:r>
+        <w:t xml:space="preserve">tuple is replaced by a lazy</w:t>
+      </w:r>
+      <w:r>
+        <w:t xml:space="preserve"> </w:t>
+      </w:r>
+      <w:r>
+        <w:rPr>
+          <w:rStyle w:val="VerbatimChar"/>
+        </w:rPr>
+        <w:t xml:space="preserve">tuple</w:t>
+      </w:r>
+      <w:r>
+        <w:t xml:space="preserve"> </w:t>
+      </w:r>
+      <w:r>
+        <w:t xml:space="preserve">subclass (</w:t>
+      </w:r>
+      <w:r>
+        <w:rPr>
+          <w:rStyle w:val="VerbatimChar"/>
+        </w:rPr>
+        <w:t xml:space="preserve">_CommonItemsProxy</w:t>
+      </w:r>
+      <w:r>
+        <w:t xml:space="preserve">) that resolves on first access by</w:t>
+      </w:r>
+      <w:r>
+        <w:t xml:space="preserve"> </w:t>
+      </w:r>
+      <w:r>
+        <w:t xml:space="preserve">calling</w:t>
+      </w:r>
+      <w:r>
+        <w:t xml:space="preserve"> </w:t>
+      </w:r>
+      <w:r>
+        <w:rPr>
+          <w:rStyle w:val="VerbatimChar"/>
+        </w:rPr>
+        <w:t xml:space="preserve">VocabProvider.get_unit_types()</w:t>
+      </w:r>
+      <w:r>
+        <w:t xml:space="preserve">, filtering out the per-language</w:t>
+      </w:r>
+      <w:r>
+        <w:t xml:space="preserve"> </w:t>
+      </w:r>
+      <w:r>
+        <w:t xml:space="preserve">US/USM equivalents (which</w:t>
+      </w:r>
+      <w:r>
+        <w:t xml:space="preserve"> </w:t>
+      </w:r>
+      <w:r>
+        <w:rPr>
+          <w:rStyle w:val="VerbatimChar"/>
+        </w:rPr>
+        <w:t xml:space="preserve">get_unit_type_items()</w:t>
+      </w:r>
+      <w:r>
+        <w:t xml:space="preserve"> </w:t>
+      </w:r>
+      <w:r>
+        <w:t xml:space="preserve">adds explicitly), and</w:t>
+      </w:r>
+      <w:r>
+        <w:t xml:space="preserve"> </w:t>
+      </w:r>
+      <w:r>
+        <w:t xml:space="preserve">appending the legacy non-stratigraphic UI items that are not in the</w:t>
+      </w:r>
+      <w:r>
+        <w:t xml:space="preserve"> </w:t>
+      </w:r>
+      <w:r>
+        <w:t xml:space="preserve">s3Dgraphy JSON datamodel (</w:t>
+      </w:r>
+      <w:r>
+        <w:rPr>
+          <w:rStyle w:val="VerbatimChar"/>
+        </w:rPr>
+        <w:t xml:space="preserve">CON</w:t>
+      </w:r>
+      <w:r>
+        <w:t xml:space="preserve">,</w:t>
+      </w:r>
+      <w:r>
+        <w:t xml:space="preserve"> </w:t>
+      </w:r>
+      <w:r>
+        <w:rPr>
+          <w:rStyle w:val="VerbatimChar"/>
+        </w:rPr>
+        <w:t xml:space="preserve">SUS</w:t>
+      </w:r>
+      <w:r>
+        <w:t xml:space="preserve">,</w:t>
+      </w:r>
+      <w:r>
+        <w:t xml:space="preserve"> </w:t>
+      </w:r>
+      <w:r>
+        <w:rPr>
+          <w:rStyle w:val="VerbatimChar"/>
+        </w:rPr>
+        <w:t xml:space="preserve">Combinar</w:t>
+      </w:r>
+      <w:r>
+        <w:t xml:space="preserve">,</w:t>
+      </w:r>
+      <w:r>
+        <w:t xml:space="preserve"> </w:t>
+      </w:r>
+      <w:r>
+        <w:rPr>
+          <w:rStyle w:val="VerbatimChar"/>
+        </w:rPr>
+        <w:t xml:space="preserve">Extractor</w:t>
+      </w:r>
+      <w:r>
+        <w:t xml:space="preserve">,</w:t>
+      </w:r>
+      <w:r>
+        <w:t xml:space="preserve"> </w:t>
+      </w:r>
+      <w:r>
+        <w:rPr>
+          <w:rStyle w:val="VerbatimChar"/>
+        </w:rPr>
+        <w:t xml:space="preserve">DOC</w:t>
+      </w:r>
+      <w:r>
+        <w:t xml:space="preserve">,</w:t>
+      </w:r>
+      <w:r>
+        <w:t xml:space="preserve"> </w:t>
+      </w:r>
+      <w:r>
+        <w:rPr>
+          <w:rStyle w:val="VerbatimChar"/>
+        </w:rPr>
+        <w:t xml:space="preserve">property</w:t>
+      </w:r>
+      <w:r>
+        <w:t xml:space="preserve">). When</w:t>
+      </w:r>
+      <w:r>
+        <w:t xml:space="preserve"> </w:t>
+      </w:r>
+      <w:r>
+        <w:rPr>
+          <w:rStyle w:val="VerbatimChar"/>
+        </w:rPr>
+        <w:t xml:space="preserve">ext_libs/s3dgraphy/</w:t>
+      </w:r>
+      <w:r>
+        <w:t xml:space="preserve"> </w:t>
+      </w:r>
+      <w:r>
+        <w:t xml:space="preserve">is missing — for example on a</w:t>
+      </w:r>
+      <w:r>
+        <w:t xml:space="preserve"> </w:t>
+      </w:r>
+      <w:r>
+        <w:t xml:space="preserve">fresh clone before</w:t>
+      </w:r>
+      <w:r>
+        <w:t xml:space="preserve"> </w:t>
+      </w:r>
+      <w:r>
+        <w:rPr>
+          <w:rStyle w:val="VerbatimChar"/>
+        </w:rPr>
+        <w:t xml:space="preserve">modules_installer.py</w:t>
+      </w:r>
+      <w:r>
+        <w:t xml:space="preserve"> </w:t>
+      </w:r>
+      <w:r>
+        <w:t xml:space="preserve">has run — the proxy falls</w:t>
+      </w:r>
+      <w:r>
+        <w:t xml:space="preserve"> </w:t>
+      </w:r>
+      <w:r>
+        <w:t xml:space="preserve">back to the legacy 12-item tuple so importers never break.</w:t>
+      </w:r>
+    </w:p>
+    <w:p>
+      <w:pPr>
+        <w:pStyle w:val="BodyText"/>
+      </w:pPr>
+      <w:r>
+        <w:rPr>
+          <w:rStyle w:val="VerbatimChar"/>
+        </w:rPr>
+        <w:t xml:space="preserve">UNIT_TYPE_ABBREV</w:t>
+      </w:r>
+      <w:r>
+        <w:t xml:space="preserve"> </w:t>
+      </w:r>
+      <w:r>
+        <w:t xml:space="preserve">(the per-language US/USM mapping) stays hard-coded:</w:t>
+      </w:r>
+      <w:r>
+        <w:t xml:space="preserve"> </w:t>
+      </w:r>
+      <w:r>
+        <w:t xml:space="preserve">those abbreviations are pyarchinit-specific UI conventions that are</w:t>
+      </w:r>
+      <w:r>
+        <w:t xml:space="preserve"> </w:t>
+      </w:r>
+      <w:r>
+        <w:rPr>
+          <w:b/>
+          <w:bCs/>
+        </w:rPr>
+        <w:t xml:space="preserve">not</w:t>
+      </w:r>
+      <w:r>
+        <w:t xml:space="preserve"> </w:t>
+      </w:r>
+      <w:r>
+        <w:t xml:space="preserve">part of the s3Dgraphy formalism and have no representation in</w:t>
+      </w:r>
+      <w:r>
+        <w:t xml:space="preserve"> </w:t>
+      </w:r>
+      <w:r>
+        <w:t xml:space="preserve">the JSON datamodel.</w:t>
+      </w:r>
+      <w:r>
+        <w:t xml:space="preserve"> </w:t>
+      </w:r>
+      <w:r>
+        <w:rPr>
+          <w:rStyle w:val="VerbatimChar"/>
+        </w:rPr>
+        <w:t xml:space="preserve">_UNIT_TYPE_LABELS</w:t>
+      </w:r>
+      <w:r>
+        <w:t xml:space="preserve">,</w:t>
+      </w:r>
+      <w:r>
+        <w:t xml:space="preserve"> </w:t>
+      </w:r>
+      <w:r>
+        <w:rPr>
+          <w:rStyle w:val="VerbatimChar"/>
+        </w:rPr>
+        <w:t xml:space="preserve">STRATIGRAPHIC_RELATIONS</w:t>
+      </w:r>
+      <w:r>
+        <w:t xml:space="preserve"> </w:t>
+      </w:r>
+      <w:r>
+        <w:t xml:space="preserve">and</w:t>
+      </w:r>
+      <w:r>
+        <w:t xml:space="preserve"> </w:t>
+      </w:r>
+      <w:r>
+        <w:t xml:space="preserve">the rest of the file below</w:t>
+      </w:r>
+      <w:r>
+        <w:t xml:space="preserve"> </w:t>
+      </w:r>
+      <w:r>
+        <w:rPr>
+          <w:rStyle w:val="VerbatimChar"/>
+        </w:rPr>
+        <w:t xml:space="preserve">is_any_unit_prefix</w:t>
+      </w:r>
+      <w:r>
+        <w:t xml:space="preserve"> </w:t>
+      </w:r>
+      <w:r>
+        <w:t xml:space="preserve">are untouched.</w:t>
+      </w:r>
+    </w:p>
+    <w:p>
+      <w:pPr>
+        <w:pStyle w:val="BodyText"/>
+      </w:pPr>
+      <w:r>
+        <w:t xml:space="preserve">A one-time deprecation log line (via</w:t>
+      </w:r>
+      <w:r>
+        <w:t xml:space="preserve"> </w:t>
+      </w:r>
+      <w:r>
+        <w:rPr>
+          <w:rStyle w:val="VerbatimChar"/>
+        </w:rPr>
+        <w:t xml:space="preserve">_warn_deprecation_once()</w:t>
+      </w:r>
+      <w:r>
+        <w:t xml:space="preserve">) fires</w:t>
+      </w:r>
+      <w:r>
+        <w:t xml:space="preserve"> </w:t>
+      </w:r>
+      <w:r>
+        <w:t xml:space="preserve">the first time the module is imported in a session, pointing new</w:t>
+      </w:r>
+      <w:r>
+        <w:t xml:space="preserve"> </w:t>
+      </w:r>
+      <w:r>
+        <w:t xml:space="preserve">callers at</w:t>
+      </w:r>
+      <w:r>
+        <w:t xml:space="preserve"> </w:t>
+      </w:r>
+      <w:r>
+        <w:rPr>
+          <w:rStyle w:val="VerbatimChar"/>
+        </w:rPr>
+        <w:t xml:space="preserve">modules.s3dgraphy.sync.VocabProvider</w:t>
+      </w:r>
+      <w:r>
+        <w:t xml:space="preserve">. Removal of the</w:t>
+      </w:r>
+      <w:r>
+        <w:t xml:space="preserve"> </w:t>
+      </w:r>
+      <w:r>
+        <w:t xml:space="preserve">legacy fallback is scheduled for the 6.0.0 release.</w:t>
+      </w:r>
+    </w:p>
+    <w:bookmarkEnd w:id="24"/>
+    <w:bookmarkStart w:id="25" w:name="what-was-tested-3"/>
+    <w:p>
+      <w:pPr>
+        <w:pStyle w:val="Heading2"/>
+      </w:pPr>
+      <w:r>
+        <w:t xml:space="preserve">What was tested</w:t>
+      </w:r>
+    </w:p>
+    <w:p>
+      <w:pPr>
+        <w:pStyle w:val="Compact"/>
+        <w:numPr>
+          <w:ilvl w:val="0"/>
+          <w:numId w:val="1012"/>
+        </w:numPr>
+      </w:pPr>
+      <w:r>
+        <w:rPr>
+          <w:b/>
+          <w:bCs/>
+        </w:rPr>
+        <w:t xml:space="preserve">5 backwards-compatibility regression tests</w:t>
+      </w:r>
+      <w:r>
+        <w:t xml:space="preserve"> </w:t>
+      </w:r>
+      <w:r>
+        <w:t xml:space="preserve">were added in</w:t>
+      </w:r>
+      <w:r>
+        <w:t xml:space="preserve"> </w:t>
+      </w:r>
+      <w:r>
+        <w:rPr>
+          <w:rStyle w:val="VerbatimChar"/>
+        </w:rPr>
+        <w:t xml:space="preserve">tests/sync/test_i18n_compat.py</w:t>
+      </w:r>
+      <w:r>
+        <w:t xml:space="preserve"> </w:t>
+      </w:r>
+      <w:r>
+        <w:rPr>
+          <w:i/>
+          <w:iCs/>
+        </w:rPr>
+        <w:t xml:space="preserve">before</w:t>
+      </w:r>
+      <w:r>
+        <w:t xml:space="preserve"> </w:t>
+      </w:r>
+      <w:r>
+        <w:t xml:space="preserve">the refactor and run green</w:t>
+      </w:r>
+      <w:r>
+        <w:t xml:space="preserve"> </w:t>
+      </w:r>
+      <w:r>
+        <w:t xml:space="preserve">against the legacy implementation, then again green against the new</w:t>
+      </w:r>
+      <w:r>
+        <w:t xml:space="preserve"> </w:t>
+      </w:r>
+      <w:r>
+        <w:t xml:space="preserve">adapter — locking the public surface for at least one release cycle.</w:t>
+      </w:r>
+      <w:r>
+        <w:t xml:space="preserve"> </w:t>
+      </w:r>
+      <w:r>
+        <w:t xml:space="preserve">Imports verified:</w:t>
+      </w:r>
+      <w:r>
+        <w:t xml:space="preserve"> </w:t>
+      </w:r>
+      <w:r>
+        <w:rPr>
+          <w:rStyle w:val="VerbatimChar"/>
+        </w:rPr>
+        <w:t xml:space="preserve">_COMMON_ITEMS</w:t>
+      </w:r>
+      <w:r>
+        <w:t xml:space="preserve">,</w:t>
+      </w:r>
+      <w:r>
+        <w:t xml:space="preserve"> </w:t>
+      </w:r>
+      <w:r>
+        <w:rPr>
+          <w:rStyle w:val="VerbatimChar"/>
+        </w:rPr>
+        <w:t xml:space="preserve">UNIT_TYPE_ABBREV</w:t>
+      </w:r>
+      <w:r>
+        <w:t xml:space="preserve">,</w:t>
+      </w:r>
+      <w:r>
+        <w:t xml:space="preserve"> </w:t>
+      </w:r>
+      <w:r>
+        <w:rPr>
+          <w:rStyle w:val="VerbatimChar"/>
+        </w:rPr>
+        <w:t xml:space="preserve">get_unit_type_items</w:t>
+      </w:r>
+      <w:r>
+        <w:t xml:space="preserve">,</w:t>
+      </w:r>
+      <w:r>
+        <w:t xml:space="preserve"> </w:t>
+      </w:r>
+      <w:r>
+        <w:rPr>
+          <w:rStyle w:val="VerbatimChar"/>
+        </w:rPr>
+        <w:t xml:space="preserve">is_us_type</w:t>
+      </w:r>
+      <w:r>
+        <w:t xml:space="preserve">,</w:t>
+      </w:r>
+      <w:r>
+        <w:t xml:space="preserve"> </w:t>
+      </w:r>
+      <w:r>
+        <w:rPr>
+          <w:rStyle w:val="VerbatimChar"/>
+        </w:rPr>
+        <w:t xml:space="preserve">ALL_US_ABBREVS</w:t>
+      </w:r>
+      <w:r>
+        <w:t xml:space="preserve">.</w:t>
+      </w:r>
+    </w:p>
+    <w:p>
+      <w:pPr>
+        <w:pStyle w:val="Compact"/>
+        <w:numPr>
+          <w:ilvl w:val="0"/>
+          <w:numId w:val="1012"/>
+        </w:numPr>
+      </w:pPr>
+      <w:r>
+        <w:t xml:space="preserve">Total</w:t>
+      </w:r>
+      <w:r>
+        <w:t xml:space="preserve"> </w:t>
+      </w:r>
+      <w:r>
+        <w:rPr>
+          <w:rStyle w:val="VerbatimChar"/>
+        </w:rPr>
+        <w:t xml:space="preserve">tests/sync/</w:t>
+      </w:r>
+      <w:r>
+        <w:t xml:space="preserve"> </w:t>
+      </w:r>
+      <w:r>
+        <w:t xml:space="preserve">test count:</w:t>
+      </w:r>
+      <w:r>
+        <w:t xml:space="preserve"> </w:t>
+      </w:r>
+      <w:r>
+        <w:rPr>
+          <w:b/>
+          <w:bCs/>
+        </w:rPr>
+        <w:t xml:space="preserve">24 passed in 0.31 s</w:t>
+      </w:r>
+      <w:r>
+        <w:t xml:space="preserve">.</w:t>
+      </w:r>
+    </w:p>
+    <w:p>
+      <w:pPr>
+        <w:pStyle w:val="Compact"/>
+        <w:numPr>
+          <w:ilvl w:val="0"/>
+          <w:numId w:val="1012"/>
+        </w:numPr>
+      </w:pPr>
+      <w:r>
+        <w:t xml:space="preserve">A controller-level smoke confirmed the end-to-end behaviour change:</w:t>
+      </w:r>
+      <w:r>
+        <w:t xml:space="preserve"> </w:t>
+      </w:r>
+      <w:r>
+        <w:t xml:space="preserve">the unit-type picker dialog (Italian locale) now exposes</w:t>
+      </w:r>
+      <w:r>
+        <w:t xml:space="preserve"> </w:t>
+      </w:r>
+      <w:r>
+        <w:rPr>
+          <w:b/>
+          <w:bCs/>
+        </w:rPr>
+        <w:t xml:space="preserve">27 items</w:t>
+      </w:r>
+      <w:r>
+        <w:t xml:space="preserve"> </w:t>
+      </w:r>
+      <w:r>
+        <w:t xml:space="preserve">(</w:t>
+      </w:r>
+      <w:r>
+        <w:rPr>
+          <w:rStyle w:val="VerbatimChar"/>
+        </w:rPr>
+        <w:t xml:space="preserve">US, USM, USVs, USVn, SF, VSF, serSU, serUSD, serUSVn, serUSVs, USD, TSU, UL, BR, USN, PROP, DOC, EXT, COMB, ANG, PNG, TBNG, CON, SUS, Combinar, Extractor, property</w:t>
+      </w:r>
+      <w:r>
+        <w:t xml:space="preserve">) instead of the previous 14, including</w:t>
+      </w:r>
+      <w:r>
+        <w:t xml:space="preserve"> </w:t>
+      </w:r>
+      <w:r>
+        <w:t xml:space="preserve">the EM 1.5 types</w:t>
+      </w:r>
+      <w:r>
+        <w:t xml:space="preserve"> </w:t>
+      </w:r>
+      <w:r>
+        <w:rPr>
+          <w:rStyle w:val="VerbatimChar"/>
+        </w:rPr>
+        <w:t xml:space="preserve">USVs</w:t>
+      </w:r>
+      <w:r>
+        <w:t xml:space="preserve">,</w:t>
+      </w:r>
+      <w:r>
+        <w:t xml:space="preserve"> </w:t>
+      </w:r>
+      <w:r>
+        <w:rPr>
+          <w:rStyle w:val="VerbatimChar"/>
+        </w:rPr>
+        <w:t xml:space="preserve">USVn</w:t>
+      </w:r>
+      <w:r>
+        <w:t xml:space="preserve">,</w:t>
+      </w:r>
+      <w:r>
+        <w:t xml:space="preserve"> </w:t>
+      </w:r>
+      <w:r>
+        <w:rPr>
+          <w:rStyle w:val="VerbatimChar"/>
+        </w:rPr>
+        <w:t xml:space="preserve">serSU</w:t>
+      </w:r>
+      <w:r>
+        <w:t xml:space="preserve">,</w:t>
+      </w:r>
+      <w:r>
+        <w:t xml:space="preserve"> </w:t>
+      </w:r>
+      <w:r>
+        <w:rPr>
+          <w:rStyle w:val="VerbatimChar"/>
+        </w:rPr>
+        <w:t xml:space="preserve">WorkingUnit (UL)</w:t>
+      </w:r>
+      <w:r>
+        <w:t xml:space="preserve">,</w:t>
+      </w:r>
+      <w:r>
+        <w:t xml:space="preserve"> </w:t>
+      </w:r>
+      <w:r>
+        <w:rPr>
+          <w:rStyle w:val="VerbatimChar"/>
+        </w:rPr>
+        <w:t xml:space="preserve">NegativeStratigraphicUnit (USN)</w:t>
+      </w:r>
+      <w:r>
+        <w:t xml:space="preserve"> </w:t>
+      </w:r>
+      <w:r>
+        <w:t xml:space="preserve">and the EM 1.6-bound additions that</w:t>
+      </w:r>
+      <w:r>
+        <w:t xml:space="preserve"> </w:t>
+      </w:r>
+      <w:r>
+        <w:t xml:space="preserve">travelled with the 0.1.40 vendor swap. This is the observable value</w:t>
+      </w:r>
+      <w:r>
+        <w:t xml:space="preserve"> </w:t>
+      </w:r>
+      <w:r>
+        <w:t xml:space="preserve">delivery of action item AI02 — the unit-type list is now driven by</w:t>
+      </w:r>
+      <w:r>
+        <w:t xml:space="preserve"> </w:t>
+      </w:r>
+      <w:r>
+        <w:t xml:space="preserve">s3Dgraphy’s JSON datamodel and will pick up future EM revisions</w:t>
+      </w:r>
+      <w:r>
+        <w:t xml:space="preserve"> </w:t>
+      </w:r>
+      <w:r>
+        <w:t xml:space="preserve">without code changes in pyarchinit.</w:t>
+      </w:r>
+    </w:p>
+    <w:bookmarkEnd w:id="25"/>
+    <w:bookmarkStart w:id="26" w:name="decisions-taken-3"/>
+    <w:p>
+      <w:pPr>
+        <w:pStyle w:val="Heading2"/>
+      </w:pPr>
+      <w:r>
+        <w:t xml:space="preserve">Decisions taken</w:t>
+      </w:r>
+    </w:p>
+    <w:p>
+      <w:pPr>
+        <w:pStyle w:val="Compact"/>
+        <w:numPr>
+          <w:ilvl w:val="0"/>
+          <w:numId w:val="1013"/>
+        </w:numPr>
+      </w:pPr>
+      <w:r>
+        <w:rPr>
+          <w:rStyle w:val="VerbatimChar"/>
+          <w:b/>
+          <w:bCs/>
+        </w:rPr>
+        <w:t xml:space="preserve">_COMMON_ITEMS</w:t>
+      </w:r>
+      <w:r>
+        <w:rPr>
+          <w:b/>
+          <w:bCs/>
+        </w:rPr>
+        <w:t xml:space="preserve"> </w:t>
+      </w:r>
+      <w:r>
+        <w:rPr>
+          <w:b/>
+          <w:bCs/>
+        </w:rPr>
+        <w:t xml:space="preserve">is now a</w:t>
+      </w:r>
+      <w:r>
+        <w:rPr>
+          <w:b/>
+          <w:bCs/>
+        </w:rPr>
+        <w:t xml:space="preserve"> </w:t>
+      </w:r>
+      <w:r>
+        <w:rPr>
+          <w:rStyle w:val="VerbatimChar"/>
+          <w:b/>
+          <w:bCs/>
+        </w:rPr>
+        <w:t xml:space="preserve">tuple</w:t>
+      </w:r>
+      <w:r>
+        <w:rPr>
+          <w:b/>
+          <w:bCs/>
+        </w:rPr>
+        <w:t xml:space="preserve"> </w:t>
+      </w:r>
+      <w:r>
+        <w:rPr>
+          <w:b/>
+          <w:bCs/>
+        </w:rPr>
+        <w:t xml:space="preserve">subclass, not a plain tuple.</w:t>
+      </w:r>
+      <w:r>
+        <w:t xml:space="preserve"> </w:t>
+      </w:r>
+      <w:r>
+        <w:rPr>
+          <w:rStyle w:val="VerbatimChar"/>
+        </w:rPr>
+        <w:t xml:space="preserve">_CommonItemsProxy(tuple)</w:t>
+      </w:r>
+      <w:r>
+        <w:t xml:space="preserve"> </w:t>
+      </w:r>
+      <w:r>
+        <w:t xml:space="preserve">keeps</w:t>
+      </w:r>
+      <w:r>
+        <w:t xml:space="preserve"> </w:t>
+      </w:r>
+      <w:r>
+        <w:rPr>
+          <w:rStyle w:val="VerbatimChar"/>
+        </w:rPr>
+        <w:t xml:space="preserve">isinstance(_COMMON_ITEMS, tuple) is True</w:t>
+      </w:r>
+      <w:r>
+        <w:t xml:space="preserve">, supports</w:t>
+      </w:r>
+      <w:r>
+        <w:t xml:space="preserve"> </w:t>
+      </w:r>
+      <w:r>
+        <w:rPr>
+          <w:rStyle w:val="VerbatimChar"/>
+        </w:rPr>
+        <w:t xml:space="preserve">+</w:t>
+      </w:r>
+      <w:r>
+        <w:t xml:space="preserve">/</w:t>
+      </w:r>
+      <w:r>
+        <w:rPr>
+          <w:rStyle w:val="VerbatimChar"/>
+        </w:rPr>
+        <w:t xml:space="preserve">in</w:t>
+      </w:r>
+      <w:r>
+        <w:t xml:space="preserve">/iteration/indexing/equality, and resolves</w:t>
+      </w:r>
+      <w:r>
+        <w:t xml:space="preserve"> </w:t>
+      </w:r>
+      <w:r>
+        <w:t xml:space="preserve">lazily on first access. No consumer pickles</w:t>
+      </w:r>
+      <w:r>
+        <w:t xml:space="preserve"> </w:t>
+      </w:r>
+      <w:r>
+        <w:rPr>
+          <w:rStyle w:val="VerbatimChar"/>
+        </w:rPr>
+        <w:t xml:space="preserve">_COMMON_ITEMS</w:t>
+      </w:r>
+      <w:r>
+        <w:t xml:space="preserve">, so the</w:t>
+      </w:r>
+      <w:r>
+        <w:t xml:space="preserve"> </w:t>
+      </w:r>
+      <w:r>
+        <w:t xml:space="preserve">proxy does not implement</w:t>
+      </w:r>
+      <w:r>
+        <w:t xml:space="preserve"> </w:t>
+      </w:r>
+      <w:r>
+        <w:rPr>
+          <w:rStyle w:val="VerbatimChar"/>
+        </w:rPr>
+        <w:t xml:space="preserve">__reduce__</w:t>
+      </w:r>
+      <w:r>
+        <w:t xml:space="preserve">; if a future caller serialises</w:t>
+      </w:r>
+      <w:r>
+        <w:t xml:space="preserve"> </w:t>
+      </w:r>
+      <w:r>
+        <w:t xml:space="preserve">it, the resolution can be forced beforehand.</w:t>
+      </w:r>
+    </w:p>
+    <w:p>
+      <w:pPr>
+        <w:pStyle w:val="Compact"/>
+        <w:numPr>
+          <w:ilvl w:val="0"/>
+          <w:numId w:val="1013"/>
+        </w:numPr>
+      </w:pPr>
+      <w:r>
+        <w:rPr>
+          <w:b/>
+          <w:bCs/>
+        </w:rPr>
+        <w:t xml:space="preserve">The 6 legacy non-stratigraphic items</w:t>
+      </w:r>
+      <w:r>
+        <w:t xml:space="preserve"> </w:t>
+      </w:r>
+      <w:r>
+        <w:t xml:space="preserve">(</w:t>
+      </w:r>
+      <w:r>
+        <w:rPr>
+          <w:rStyle w:val="VerbatimChar"/>
+        </w:rPr>
+        <w:t xml:space="preserve">CON</w:t>
+      </w:r>
+      <w:r>
+        <w:t xml:space="preserve">,</w:t>
+      </w:r>
+      <w:r>
+        <w:t xml:space="preserve"> </w:t>
+      </w:r>
+      <w:r>
+        <w:rPr>
+          <w:rStyle w:val="VerbatimChar"/>
+        </w:rPr>
+        <w:t xml:space="preserve">SUS</w:t>
+      </w:r>
+      <w:r>
+        <w:t xml:space="preserve">,</w:t>
+      </w:r>
+      <w:r>
+        <w:t xml:space="preserve"> </w:t>
+      </w:r>
+      <w:r>
+        <w:rPr>
+          <w:rStyle w:val="VerbatimChar"/>
+        </w:rPr>
+        <w:t xml:space="preserve">Combinar</w:t>
+      </w:r>
+      <w:r>
+        <w:t xml:space="preserve">,</w:t>
+      </w:r>
+      <w:r>
+        <w:t xml:space="preserve"> </w:t>
+      </w:r>
+      <w:r>
+        <w:rPr>
+          <w:rStyle w:val="VerbatimChar"/>
+        </w:rPr>
+        <w:t xml:space="preserve">Extractor</w:t>
+      </w:r>
+      <w:r>
+        <w:t xml:space="preserve">,</w:t>
+      </w:r>
+      <w:r>
+        <w:t xml:space="preserve"> </w:t>
+      </w:r>
+      <w:r>
+        <w:rPr>
+          <w:rStyle w:val="VerbatimChar"/>
+        </w:rPr>
+        <w:t xml:space="preserve">DOC</w:t>
+      </w:r>
+      <w:r>
+        <w:t xml:space="preserve">,</w:t>
+      </w:r>
+      <w:r>
+        <w:t xml:space="preserve"> </w:t>
+      </w:r>
+      <w:r>
+        <w:rPr>
+          <w:rStyle w:val="VerbatimChar"/>
+        </w:rPr>
+        <w:t xml:space="preserve">property</w:t>
+      </w:r>
+      <w:r>
+        <w:t xml:space="preserve">) are preserved at the tail of the</w:t>
+      </w:r>
+      <w:r>
+        <w:t xml:space="preserve"> </w:t>
+      </w:r>
+      <w:r>
+        <w:t xml:space="preserve">resolved tuple. They are pyarchinit-specific UI categories that are</w:t>
+      </w:r>
+      <w:r>
+        <w:t xml:space="preserve"> </w:t>
+      </w:r>
+      <w:r>
+        <w:t xml:space="preserve">not s3Dgraphy node types per Reference Document v0.1 §4.2 — keeping</w:t>
+      </w:r>
+      <w:r>
+        <w:t xml:space="preserve"> </w:t>
+      </w:r>
+      <w:r>
+        <w:t xml:space="preserve">them on the pyarchinit side rather than pushing them upstream as</w:t>
+      </w:r>
+      <w:r>
+        <w:t xml:space="preserve"> </w:t>
+      </w:r>
+      <w:r>
+        <w:t xml:space="preserve">JSON entries. If they later need to participate in the property</w:t>
+      </w:r>
+      <w:r>
+        <w:t xml:space="preserve"> </w:t>
+      </w:r>
+      <w:r>
+        <w:t xml:space="preserve">graph, that becomes a JSON pull request against</w:t>
+      </w:r>
+      <w:r>
+        <w:t xml:space="preserve"> </w:t>
+      </w:r>
+      <w:r>
+        <w:rPr>
+          <w:rStyle w:val="VerbatimChar"/>
+        </w:rPr>
+        <w:t xml:space="preserve">s3Dgraphy_node_datamodel.json</w:t>
+      </w:r>
+      <w:r>
+        <w:t xml:space="preserve">.</w:t>
+      </w:r>
+    </w:p>
+    <w:p>
+      <w:pPr>
+        <w:pStyle w:val="Compact"/>
+        <w:numPr>
+          <w:ilvl w:val="0"/>
+          <w:numId w:val="1013"/>
+        </w:numPr>
+      </w:pPr>
+      <w:r>
+        <w:rPr>
+          <w:rStyle w:val="VerbatimChar"/>
+          <w:b/>
+          <w:bCs/>
+        </w:rPr>
+        <w:t xml:space="preserve">USVA</w:t>
+      </w:r>
+      <w:r>
+        <w:rPr>
+          <w:b/>
+          <w:bCs/>
+        </w:rPr>
+        <w:t xml:space="preserve">,</w:t>
+      </w:r>
+      <w:r>
+        <w:rPr>
+          <w:b/>
+          <w:bCs/>
+        </w:rPr>
+        <w:t xml:space="preserve"> </w:t>
+      </w:r>
+      <w:r>
+        <w:rPr>
+          <w:rStyle w:val="VerbatimChar"/>
+          <w:b/>
+          <w:bCs/>
+        </w:rPr>
+        <w:t xml:space="preserve">USVB</w:t>
+      </w:r>
+      <w:r>
+        <w:rPr>
+          <w:b/>
+          <w:bCs/>
+        </w:rPr>
+        <w:t xml:space="preserve">,</w:t>
+      </w:r>
+      <w:r>
+        <w:rPr>
+          <w:b/>
+          <w:bCs/>
+        </w:rPr>
+        <w:t xml:space="preserve"> </w:t>
+      </w:r>
+      <w:r>
+        <w:rPr>
+          <w:rStyle w:val="VerbatimChar"/>
+          <w:b/>
+          <w:bCs/>
+        </w:rPr>
+        <w:t xml:space="preserve">USVC</w:t>
+      </w:r>
+      <w:r>
+        <w:rPr>
+          <w:b/>
+          <w:bCs/>
+        </w:rPr>
+        <w:t xml:space="preserve"> </w:t>
+      </w:r>
+      <w:r>
+        <w:rPr>
+          <w:b/>
+          <w:bCs/>
+        </w:rPr>
+        <w:t xml:space="preserve">no longer appear in the picker</w:t>
+      </w:r>
+      <w:r>
+        <w:t xml:space="preserve"> </w:t>
+      </w:r>
+      <w:r>
+        <w:t xml:space="preserve">as of this</w:t>
+      </w:r>
+      <w:r>
+        <w:t xml:space="preserve"> </w:t>
+      </w:r>
+      <w:r>
+        <w:t xml:space="preserve">refactor. Existing database rows that still carry those values keep</w:t>
+      </w:r>
+      <w:r>
+        <w:t xml:space="preserve"> </w:t>
+      </w:r>
+      <w:r>
+        <w:t xml:space="preserve">rendering correctly (the</w:t>
+      </w:r>
+      <w:r>
+        <w:t xml:space="preserve"> </w:t>
+      </w:r>
+      <w:r>
+        <w:rPr>
+          <w:rStyle w:val="VerbatimChar"/>
+        </w:rPr>
+        <w:t xml:space="preserve">unita_tipo</w:t>
+      </w:r>
+      <w:r>
+        <w:t xml:space="preserve"> </w:t>
+      </w:r>
+      <w:r>
+        <w:t xml:space="preserve">column is free-text), but new</w:t>
+      </w:r>
+      <w:r>
+        <w:t xml:space="preserve"> </w:t>
+      </w:r>
+      <w:r>
+        <w:t xml:space="preserve">rows will use the canonical</w:t>
+      </w:r>
+      <w:r>
+        <w:t xml:space="preserve"> </w:t>
+      </w:r>
+      <w:r>
+        <w:rPr>
+          <w:rStyle w:val="VerbatimChar"/>
+        </w:rPr>
+        <w:t xml:space="preserve">USVs</w:t>
+      </w:r>
+      <w:r>
+        <w:t xml:space="preserve"> </w:t>
+      </w:r>
+      <w:r>
+        <w:t xml:space="preserve">and</w:t>
+      </w:r>
+      <w:r>
+        <w:t xml:space="preserve"> </w:t>
+      </w:r>
+      <w:r>
+        <w:rPr>
+          <w:rStyle w:val="VerbatimChar"/>
+        </w:rPr>
+        <w:t xml:space="preserve">USVn</w:t>
+      </w:r>
+      <w:r>
+        <w:t xml:space="preserve">. Group D ships the</w:t>
+      </w:r>
+      <w:r>
+        <w:t xml:space="preserve"> </w:t>
+      </w:r>
+      <w:r>
+        <w:t xml:space="preserve">one-shot migration that rewrites historical rows; until that</w:t>
+      </w:r>
+      <w:r>
+        <w:t xml:space="preserve"> </w:t>
+      </w:r>
+      <w:r>
+        <w:t xml:space="preserve">migration runs, mixed-vocabulary databases are supported by both</w:t>
+      </w:r>
+      <w:r>
+        <w:t xml:space="preserve"> </w:t>
+      </w:r>
+      <w:r>
+        <w:t xml:space="preserve">layers.</w:t>
+      </w:r>
+    </w:p>
+    <w:bookmarkEnd w:id="26"/>
+    <w:bookmarkStart w:id="27" w:name="downstream-consumers-informational"/>
+    <w:p>
+      <w:pPr>
+        <w:pStyle w:val="Heading2"/>
+      </w:pPr>
+      <w:r>
+        <w:t xml:space="preserve">Downstream consumers (informational)</w:t>
+      </w:r>
+    </w:p>
+    <w:p>
+      <w:pPr>
+        <w:pStyle w:val="FirstParagraph"/>
+      </w:pPr>
+      <w:r>
+        <w:t xml:space="preserve">Ten files import</w:t>
+      </w:r>
+      <w:r>
+        <w:t xml:space="preserve"> </w:t>
+      </w:r>
+      <w:r>
+        <w:rPr>
+          <w:rStyle w:val="VerbatimChar"/>
+        </w:rPr>
+        <w:t xml:space="preserve">pyarchinit_i18n_stratigraphic</w:t>
+      </w:r>
+      <w:r>
+        <w:t xml:space="preserve">. The highest-traffic</w:t>
+      </w:r>
+      <w:r>
+        <w:t xml:space="preserve"> </w:t>
+      </w:r>
+      <w:r>
+        <w:t xml:space="preserve">ones are</w:t>
+      </w:r>
+      <w:r>
+        <w:t xml:space="preserve"> </w:t>
+      </w:r>
+      <w:r>
+        <w:rPr>
+          <w:rStyle w:val="VerbatimChar"/>
+        </w:rPr>
+        <w:t xml:space="preserve">tabs/US_USM.py</w:t>
+      </w:r>
+      <w:r>
+        <w:t xml:space="preserve"> </w:t>
+      </w:r>
+      <w:r>
+        <w:t xml:space="preserve">(the main US/USM controller, where the</w:t>
+      </w:r>
+      <w:r>
+        <w:t xml:space="preserve"> </w:t>
+      </w:r>
+      <w:r>
+        <w:t xml:space="preserve">picker dialog lives),</w:t>
+      </w:r>
+      <w:r>
+        <w:t xml:space="preserve"> </w:t>
+      </w:r>
+      <w:r>
+        <w:rPr>
+          <w:rStyle w:val="VerbatimChar"/>
+        </w:rPr>
+        <w:t xml:space="preserve">modules/db/pyarchinit_db_manager.py</w:t>
+      </w:r>
+      <w:r>
+        <w:t xml:space="preserve">,</w:t>
+      </w:r>
+      <w:r>
+        <w:t xml:space="preserve"> </w:t>
+      </w:r>
+      <w:r>
+        <w:rPr>
+          <w:rStyle w:val="VerbatimChar"/>
+        </w:rPr>
+        <w:t xml:space="preserve">modules/utility/pyarchinit_exp_USsheet_pdf.py</w:t>
+      </w:r>
+      <w:r>
+        <w:t xml:space="preserve">,</w:t>
+      </w:r>
+      <w:r>
+        <w:t xml:space="preserve"> </w:t>
+      </w:r>
+      <w:r>
+        <w:rPr>
+          <w:rStyle w:val="VerbatimChar"/>
+        </w:rPr>
+        <w:t xml:space="preserve">modules/utility/pyarchinit_matrix_exp.py</w:t>
+      </w:r>
+      <w:r>
+        <w:t xml:space="preserve">, and</w:t>
+      </w:r>
+      <w:r>
+        <w:t xml:space="preserve"> </w:t>
+      </w:r>
+      <w:r>
+        <w:rPr>
+          <w:rStyle w:val="VerbatimChar"/>
+        </w:rPr>
+        <w:t xml:space="preserve">tabs/Interactive_matrix.py</w:t>
+      </w:r>
+      <w:r>
+        <w:t xml:space="preserve">. None were modified by this refactor —</w:t>
+      </w:r>
+      <w:r>
+        <w:t xml:space="preserve"> </w:t>
+      </w:r>
+      <w:r>
+        <w:t xml:space="preserve">the public surface stayed the same. They will start seeing the</w:t>
+      </w:r>
+      <w:r>
+        <w:t xml:space="preserve"> </w:t>
+      </w:r>
+      <w:r>
+        <w:t xml:space="preserve">expanded vocabulary the next time the plugin reloads.</w:t>
+      </w:r>
+    </w:p>
+    <w:bookmarkEnd w:id="27"/>
+    <w:bookmarkEnd w:id="28"/>
     <w:sectPr>
       <w:footnotePr>
         <w:numRestart w:val="eachSect"/>
@@ -4622,6 +6019,12 @@
     <w:abstractNumId w:val="991"/>
   </w:num>
   <w:num w:numId="1011">
+    <w:abstractNumId w:val="991"/>
+  </w:num>
+  <w:num w:numId="1012">
+    <w:abstractNumId w:val="991"/>
+  </w:num>
+  <w:num w:numId="1013">
     <w:abstractNumId w:val="991"/>
   </w:num>
 </w:numbering>

</xml_diff>

<commit_message>
docs(dev-log): Group D entry — vocab alignment migration USVA/B/C → USVs/n
3 commits (b8a1f227 + 15efd4da + b9a10b04). 32 tests passing total.
Volterra dry-run shows 0 rows to migrate (DB is already clean).
QGIS menu entry wired in pyarchinitPlugin.py via _init_migrations_menu().
</commit_message>
<xml_diff>
--- a/docs/superpowers/dev-log/T5.4_PyArchInit_Dev_Log.docx
+++ b/docs/superpowers/dev-log/T5.4_PyArchInit_Dev_Log.docx
@@ -792,7 +792,17 @@
               <w:pStyle w:val="Compact"/>
             </w:pPr>
             <w:r>
-              <w:t xml:space="preserve">Pending</w:t>
+              <w:rPr>
+                <w:b/>
+                <w:bCs/>
+              </w:rPr>
+              <w:t xml:space="preserve">Done</w:t>
+            </w:r>
+            <w:r>
+              <w:t xml:space="preserve"> </w:t>
+            </w:r>
+            <w:r>
+              <w:t xml:space="preserve">(2026-05-07)</w:t>
             </w:r>
           </w:p>
         </w:tc>
@@ -5658,8 +5668,1655 @@
         <w:t xml:space="preserve">expanded vocabulary the next time the plugin reloads.</w:t>
       </w:r>
     </w:p>
+    <w:p>
+      <w:r>
+        <w:pict>
+          <v:rect style="width:0;height:1.5pt" o:hralign="center" o:hrstd="t" o:hr="t"/>
+        </w:pict>
+      </w:r>
+    </w:p>
     <w:bookmarkEnd w:id="27"/>
     <w:bookmarkEnd w:id="28"/>
+    <w:bookmarkStart w:id="33" w:name="X78c6f86ddd07d4818a81b06becc0958330f7f20"/>
+    <w:p>
+      <w:pPr>
+        <w:pStyle w:val="Heading1"/>
+      </w:pPr>
+      <w:r>
+        <w:t xml:space="preserve">Group D — USVA/USVB → USVs, USVC → USVn one-shot migration</w:t>
+      </w:r>
+    </w:p>
+    <w:p>
+      <w:pPr>
+        <w:pStyle w:val="FirstParagraph"/>
+      </w:pPr>
+      <w:r>
+        <w:rPr>
+          <w:b/>
+          <w:bCs/>
+        </w:rPr>
+        <w:t xml:space="preserve">Date:</w:t>
+      </w:r>
+      <w:r>
+        <w:t xml:space="preserve"> </w:t>
+      </w:r>
+      <w:r>
+        <w:t xml:space="preserve">7 May 2026 ·</w:t>
+      </w:r>
+      <w:r>
+        <w:t xml:space="preserve"> </w:t>
+      </w:r>
+      <w:r>
+        <w:rPr>
+          <w:b/>
+          <w:bCs/>
+        </w:rPr>
+        <w:t xml:space="preserve">Status:</w:t>
+      </w:r>
+      <w:r>
+        <w:t xml:space="preserve"> </w:t>
+      </w:r>
+      <w:r>
+        <w:t xml:space="preserve">Done ·</w:t>
+      </w:r>
+      <w:r>
+        <w:t xml:space="preserve"> </w:t>
+      </w:r>
+      <w:r>
+        <w:rPr>
+          <w:b/>
+          <w:bCs/>
+        </w:rPr>
+        <w:t xml:space="preserve">Commits:</w:t>
+      </w:r>
+      <w:r>
+        <w:t xml:space="preserve"> </w:t>
+      </w:r>
+      <w:r>
+        <w:rPr>
+          <w:rStyle w:val="VerbatimChar"/>
+        </w:rPr>
+        <w:t xml:space="preserve">b8a1f227</w:t>
+      </w:r>
+      <w:r>
+        <w:t xml:space="preserve">,</w:t>
+      </w:r>
+      <w:r>
+        <w:t xml:space="preserve"> </w:t>
+      </w:r>
+      <w:r>
+        <w:rPr>
+          <w:rStyle w:val="VerbatimChar"/>
+        </w:rPr>
+        <w:t xml:space="preserve">15efd4da</w:t>
+      </w:r>
+      <w:r>
+        <w:t xml:space="preserve">,</w:t>
+      </w:r>
+      <w:r>
+        <w:t xml:space="preserve"> </w:t>
+      </w:r>
+      <w:r>
+        <w:rPr>
+          <w:rStyle w:val="VerbatimChar"/>
+        </w:rPr>
+        <w:t xml:space="preserve">b9a10b04</w:t>
+      </w:r>
+    </w:p>
+    <w:bookmarkStart w:id="29" w:name="what-was-built-4"/>
+    <w:p>
+      <w:pPr>
+        <w:pStyle w:val="Heading2"/>
+      </w:pPr>
+      <w:r>
+        <w:t xml:space="preserve">What was built</w:t>
+      </w:r>
+    </w:p>
+    <w:p>
+      <w:pPr>
+        <w:pStyle w:val="FirstParagraph"/>
+      </w:pPr>
+      <w:r>
+        <w:t xml:space="preserve">A one-shot SQL migration tool that aligns historical PyArchInit databases</w:t>
+      </w:r>
+      <w:r>
+        <w:t xml:space="preserve"> </w:t>
+      </w:r>
+      <w:r>
+        <w:t xml:space="preserve">to the canonical EM 1.5 vocabulary now exposed through</w:t>
+      </w:r>
+      <w:r>
+        <w:t xml:space="preserve"> </w:t>
+      </w:r>
+      <w:r>
+        <w:rPr>
+          <w:rStyle w:val="VerbatimChar"/>
+        </w:rPr>
+        <w:t xml:space="preserve">VocabProvider</w:t>
+      </w:r>
+      <w:r>
+        <w:t xml:space="preserve">.</w:t>
+      </w:r>
+      <w:r>
+        <w:t xml:space="preserve"> </w:t>
+      </w:r>
+      <w:r>
+        <w:t xml:space="preserve">Implementation is split across a shared scaffold and a migration-specific</w:t>
+      </w:r>
+      <w:r>
+        <w:t xml:space="preserve"> </w:t>
+      </w:r>
+      <w:r>
+        <w:t xml:space="preserve">library/CLI pair so subsequent migrations (Group E and beyond) can reuse</w:t>
+      </w:r>
+      <w:r>
+        <w:t xml:space="preserve"> </w:t>
+      </w:r>
+      <w:r>
+        <w:t xml:space="preserve">the boilerplate.</w:t>
+      </w:r>
+    </w:p>
+    <w:tbl>
+      <w:tblPr>
+        <w:tblStyle w:val="Table"/>
+        <w:tblW w:type="pct" w:w="5000"/>
+        <w:tblLayout w:type="fixed"/>
+        <w:tblLook w:firstRow="1" w:lastRow="0" w:firstColumn="0" w:lastColumn="0" w:noHBand="0" w:noVBand="0" w:val="0020"/>
+      </w:tblPr>
+      <w:tblGrid>
+        <w:gridCol w:w="3960"/>
+        <w:gridCol w:w="3960"/>
+      </w:tblGrid>
+      <w:tr>
+        <w:trPr>
+          <w:tblHeader w:val="on"/>
+        </w:trPr>
+        <w:tc>
+          <w:tcPr/>
+          <w:p>
+            <w:pPr>
+              <w:pStyle w:val="Compact"/>
+            </w:pPr>
+            <w:r>
+              <w:t xml:space="preserve">File</w:t>
+            </w:r>
+          </w:p>
+        </w:tc>
+        <w:tc>
+          <w:tcPr/>
+          <w:p>
+            <w:pPr>
+              <w:pStyle w:val="Compact"/>
+            </w:pPr>
+            <w:r>
+              <w:t xml:space="preserve">Responsibility</w:t>
+            </w:r>
+          </w:p>
+        </w:tc>
+      </w:tr>
+      <w:tr>
+        <w:tc>
+          <w:tcPr/>
+          <w:p>
+            <w:pPr>
+              <w:pStyle w:val="Compact"/>
+            </w:pPr>
+            <w:r>
+              <w:rPr>
+                <w:rStyle w:val="VerbatimChar"/>
+              </w:rPr>
+              <w:t xml:space="preserve">scripts/migrations/_common.py</w:t>
+            </w:r>
+          </w:p>
+        </w:tc>
+        <w:tc>
+          <w:tcPr/>
+          <w:p>
+            <w:pPr>
+              <w:pStyle w:val="Compact"/>
+            </w:pPr>
+            <w:r>
+              <w:t xml:space="preserve">Shared CLI scaffold:</w:t>
+            </w:r>
+            <w:r>
+              <w:t xml:space="preserve"> </w:t>
+            </w:r>
+            <w:r>
+              <w:rPr>
+                <w:rStyle w:val="VerbatimChar"/>
+              </w:rPr>
+              <w:t xml:space="preserve">parse_argv()</w:t>
+            </w:r>
+            <w:r>
+              <w:t xml:space="preserve"> </w:t>
+            </w:r>
+            <w:r>
+              <w:t xml:space="preserve">providing the standard</w:t>
+            </w:r>
+            <w:r>
+              <w:t xml:space="preserve"> </w:t>
+            </w:r>
+            <w:r>
+              <w:rPr>
+                <w:rStyle w:val="VerbatimChar"/>
+              </w:rPr>
+              <w:t xml:space="preserve">--dry-run / --apply / --rollback BACKUP_PATH</w:t>
+            </w:r>
+            <w:r>
+              <w:t xml:space="preserve"> </w:t>
+            </w:r>
+            <w:r>
+              <w:t xml:space="preserve">action group with required</w:t>
+            </w:r>
+            <w:r>
+              <w:t xml:space="preserve"> </w:t>
+            </w:r>
+            <w:r>
+              <w:rPr>
+                <w:rStyle w:val="VerbatimChar"/>
+              </w:rPr>
+              <w:t xml:space="preserve">--db</w:t>
+            </w:r>
+            <w:r>
+              <w:t xml:space="preserve"> </w:t>
+            </w:r>
+            <w:r>
+              <w:t xml:space="preserve">argument, and</w:t>
+            </w:r>
+            <w:r>
+              <w:t xml:space="preserve"> </w:t>
+            </w:r>
+            <w:r>
+              <w:rPr>
+                <w:rStyle w:val="VerbatimChar"/>
+              </w:rPr>
+              <w:t xml:space="preserve">auto_backup_sqlite(db, tag)</w:t>
+            </w:r>
+            <w:r>
+              <w:t xml:space="preserve"> </w:t>
+            </w:r>
+            <w:r>
+              <w:t xml:space="preserve">which copies the SQLite file to</w:t>
+            </w:r>
+            <w:r>
+              <w:t xml:space="preserve"> </w:t>
+            </w:r>
+            <w:r>
+              <w:rPr>
+                <w:rStyle w:val="VerbatimChar"/>
+              </w:rPr>
+              <w:t xml:space="preserve">&lt;db&gt;.pre_&lt;tag&gt;_&lt;UTC&gt;</w:t>
+            </w:r>
+            <w:r>
+              <w:t xml:space="preserve"> </w:t>
+            </w:r>
+            <w:r>
+              <w:t xml:space="preserve">via</w:t>
+            </w:r>
+            <w:r>
+              <w:t xml:space="preserve"> </w:t>
+            </w:r>
+            <w:r>
+              <w:rPr>
+                <w:rStyle w:val="VerbatimChar"/>
+              </w:rPr>
+              <w:t xml:space="preserve">shutil.copy2</w:t>
+            </w:r>
+            <w:r>
+              <w:t xml:space="preserve">.</w:t>
+            </w:r>
+          </w:p>
+        </w:tc>
+      </w:tr>
+      <w:tr>
+        <w:tc>
+          <w:tcPr/>
+          <w:p>
+            <w:pPr>
+              <w:pStyle w:val="Compact"/>
+            </w:pPr>
+            <w:r>
+              <w:rPr>
+                <w:rStyle w:val="VerbatimChar"/>
+              </w:rPr>
+              <w:t xml:space="preserve">scripts/migrations/_2026_05_us_vocabulary_alignment_lib.py</w:t>
+            </w:r>
+          </w:p>
+        </w:tc>
+        <w:tc>
+          <w:tcPr/>
+          <w:p>
+            <w:pPr>
+              <w:pStyle w:val="Compact"/>
+            </w:pPr>
+            <w:r>
+              <w:t xml:space="preserve">Pure-logic library exposing the</w:t>
+            </w:r>
+            <w:r>
+              <w:t xml:space="preserve"> </w:t>
+            </w:r>
+            <w:r>
+              <w:rPr>
+                <w:rStyle w:val="VerbatimChar"/>
+              </w:rPr>
+              <w:t xml:space="preserve">REPLACEMENTS</w:t>
+            </w:r>
+            <w:r>
+              <w:t xml:space="preserve"> </w:t>
+            </w:r>
+            <w:r>
+              <w:t xml:space="preserve">mapping (</w:t>
+            </w:r>
+            <w:r>
+              <w:rPr>
+                <w:rStyle w:val="VerbatimChar"/>
+              </w:rPr>
+              <w:t xml:space="preserve">USVA → USVs</w:t>
+            </w:r>
+            <w:r>
+              <w:t xml:space="preserve">,</w:t>
+            </w:r>
+            <w:r>
+              <w:t xml:space="preserve"> </w:t>
+            </w:r>
+            <w:r>
+              <w:rPr>
+                <w:rStyle w:val="VerbatimChar"/>
+              </w:rPr>
+              <w:t xml:space="preserve">USVB → USVs</w:t>
+            </w:r>
+            <w:r>
+              <w:t xml:space="preserve">,</w:t>
+            </w:r>
+            <w:r>
+              <w:t xml:space="preserve"> </w:t>
+            </w:r>
+            <w:r>
+              <w:rPr>
+                <w:rStyle w:val="VerbatimChar"/>
+              </w:rPr>
+              <w:t xml:space="preserve">USVC → USVn</w:t>
+            </w:r>
+            <w:r>
+              <w:t xml:space="preserve">),</w:t>
+            </w:r>
+            <w:r>
+              <w:t xml:space="preserve"> </w:t>
+            </w:r>
+            <w:r>
+              <w:rPr>
+                <w:rStyle w:val="VerbatimChar"/>
+              </w:rPr>
+              <w:t xml:space="preserve">plan_changes(db)</w:t>
+            </w:r>
+            <w:r>
+              <w:t xml:space="preserve"> </w:t>
+            </w:r>
+            <w:r>
+              <w:t xml:space="preserve">for the read-only count report, and</w:t>
+            </w:r>
+            <w:r>
+              <w:t xml:space="preserve"> </w:t>
+            </w:r>
+            <w:r>
+              <w:rPr>
+                <w:rStyle w:val="VerbatimChar"/>
+              </w:rPr>
+              <w:t xml:space="preserve">apply_changes(db)</w:t>
+            </w:r>
+            <w:r>
+              <w:t xml:space="preserve"> </w:t>
+            </w:r>
+            <w:r>
+              <w:t xml:space="preserve">for the in-place rewrite. Library/CLI split lets tests exercise the logic without spawning a subprocess.</w:t>
+            </w:r>
+          </w:p>
+        </w:tc>
+      </w:tr>
+      <w:tr>
+        <w:tc>
+          <w:tcPr/>
+          <w:p>
+            <w:pPr>
+              <w:pStyle w:val="Compact"/>
+            </w:pPr>
+            <w:r>
+              <w:rPr>
+                <w:rStyle w:val="VerbatimChar"/>
+              </w:rPr>
+              <w:t xml:space="preserve">scripts/migrations/2026_05_us_vocabulary_alignment.py</w:t>
+            </w:r>
+          </w:p>
+        </w:tc>
+        <w:tc>
+          <w:tcPr/>
+          <w:p>
+            <w:pPr>
+              <w:pStyle w:val="Compact"/>
+            </w:pPr>
+            <w:r>
+              <w:t xml:space="preserve">CLI front-end. On</w:t>
+            </w:r>
+            <w:r>
+              <w:t xml:space="preserve"> </w:t>
+            </w:r>
+            <w:r>
+              <w:rPr>
+                <w:rStyle w:val="VerbatimChar"/>
+              </w:rPr>
+              <w:t xml:space="preserve">--apply</w:t>
+            </w:r>
+            <w:r>
+              <w:t xml:space="preserve">, calls</w:t>
+            </w:r>
+            <w:r>
+              <w:t xml:space="preserve"> </w:t>
+            </w:r>
+            <w:r>
+              <w:rPr>
+                <w:rStyle w:val="VerbatimChar"/>
+              </w:rPr>
+              <w:t xml:space="preserve">auto_backup_sqlite</w:t>
+            </w:r>
+            <w:r>
+              <w:t xml:space="preserve"> </w:t>
+            </w:r>
+            <w:r>
+              <w:t xml:space="preserve">first, then</w:t>
+            </w:r>
+            <w:r>
+              <w:t xml:space="preserve"> </w:t>
+            </w:r>
+            <w:r>
+              <w:rPr>
+                <w:rStyle w:val="VerbatimChar"/>
+              </w:rPr>
+              <w:t xml:space="preserve">apply_changes</w:t>
+            </w:r>
+            <w:r>
+              <w:t xml:space="preserve">. On</w:t>
+            </w:r>
+            <w:r>
+              <w:t xml:space="preserve"> </w:t>
+            </w:r>
+            <w:r>
+              <w:rPr>
+                <w:rStyle w:val="VerbatimChar"/>
+              </w:rPr>
+              <w:t xml:space="preserve">--rollback BACKUP_PATH</w:t>
+            </w:r>
+            <w:r>
+              <w:t xml:space="preserve">, restores the named backup via</w:t>
+            </w:r>
+            <w:r>
+              <w:t xml:space="preserve"> </w:t>
+            </w:r>
+            <w:r>
+              <w:rPr>
+                <w:rStyle w:val="VerbatimChar"/>
+              </w:rPr>
+              <w:t xml:space="preserve">shutil.copy2</w:t>
+            </w:r>
+            <w:r>
+              <w:t xml:space="preserve">.</w:t>
+            </w:r>
+          </w:p>
+        </w:tc>
+      </w:tr>
+      <w:tr>
+        <w:tc>
+          <w:tcPr/>
+          <w:p>
+            <w:pPr>
+              <w:pStyle w:val="Compact"/>
+            </w:pPr>
+            <w:r>
+              <w:rPr>
+                <w:rStyle w:val="VerbatimChar"/>
+              </w:rPr>
+              <w:t xml:space="preserve">pyarchinitPlugin.py</w:t>
+            </w:r>
+            <w:r>
+              <w:t xml:space="preserve"> </w:t>
+            </w:r>
+            <w:r>
+              <w:t xml:space="preserve">(modified)</w:t>
+            </w:r>
+          </w:p>
+        </w:tc>
+        <w:tc>
+          <w:tcPr/>
+          <w:p>
+            <w:pPr>
+              <w:pStyle w:val="Compact"/>
+            </w:pPr>
+            <w:r>
+              <w:t xml:space="preserve">New</w:t>
+            </w:r>
+            <w:r>
+              <w:t xml:space="preserve"> </w:t>
+            </w:r>
+            <w:r>
+              <w:rPr>
+                <w:rStyle w:val="VerbatimChar"/>
+              </w:rPr>
+              <w:t xml:space="preserve">_init_migrations_menu()</w:t>
+            </w:r>
+            <w:r>
+              <w:t xml:space="preserve"> </w:t>
+            </w:r>
+            <w:r>
+              <w:t xml:space="preserve">and</w:t>
+            </w:r>
+            <w:r>
+              <w:t xml:space="preserve"> </w:t>
+            </w:r>
+            <w:r>
+              <w:rPr>
+                <w:rStyle w:val="VerbatimChar"/>
+              </w:rPr>
+              <w:t xml:space="preserve">_run_vocab_alignment_migration()</w:t>
+            </w:r>
+            <w:r>
+              <w:t xml:space="preserve"> </w:t>
+            </w:r>
+            <w:r>
+              <w:t xml:space="preserve">methods wired into</w:t>
+            </w:r>
+            <w:r>
+              <w:t xml:space="preserve"> </w:t>
+            </w:r>
+            <w:r>
+              <w:rPr>
+                <w:rStyle w:val="VerbatimChar"/>
+              </w:rPr>
+              <w:t xml:space="preserve">_init_stratigraph_sync()</w:t>
+            </w:r>
+            <w:r>
+              <w:t xml:space="preserve">, called from all 4 language branches of</w:t>
+            </w:r>
+            <w:r>
+              <w:t xml:space="preserve"> </w:t>
+            </w:r>
+            <w:r>
+              <w:rPr>
+                <w:rStyle w:val="VerbatimChar"/>
+              </w:rPr>
+              <w:t xml:space="preserve">initGui()</w:t>
+            </w:r>
+            <w:r>
+              <w:t xml:space="preserve">. The user-facing flow: file picker →</w:t>
+            </w:r>
+            <w:r>
+              <w:t xml:space="preserve"> </w:t>
+            </w:r>
+            <w:r>
+              <w:rPr>
+                <w:rStyle w:val="VerbatimChar"/>
+              </w:rPr>
+              <w:t xml:space="preserve">plan_changes</w:t>
+            </w:r>
+            <w:r>
+              <w:t xml:space="preserve"> </w:t>
+            </w:r>
+            <w:r>
+              <w:t xml:space="preserve">→</w:t>
+            </w:r>
+            <w:r>
+              <w:t xml:space="preserve"> </w:t>
+            </w:r>
+            <w:r>
+              <w:rPr>
+                <w:rStyle w:val="VerbatimChar"/>
+              </w:rPr>
+              <w:t xml:space="preserve">QMessageBox.question</w:t>
+            </w:r>
+            <w:r>
+              <w:t xml:space="preserve"> </w:t>
+            </w:r>
+            <w:r>
+              <w:t xml:space="preserve">confirm →</w:t>
+            </w:r>
+            <w:r>
+              <w:t xml:space="preserve"> </w:t>
+            </w:r>
+            <w:r>
+              <w:rPr>
+                <w:rStyle w:val="VerbatimChar"/>
+              </w:rPr>
+              <w:t xml:space="preserve">auto_backup_sqlite</w:t>
+            </w:r>
+            <w:r>
+              <w:t xml:space="preserve"> </w:t>
+            </w:r>
+            <w:r>
+              <w:t xml:space="preserve">+</w:t>
+            </w:r>
+            <w:r>
+              <w:t xml:space="preserve"> </w:t>
+            </w:r>
+            <w:r>
+              <w:rPr>
+                <w:rStyle w:val="VerbatimChar"/>
+              </w:rPr>
+              <w:t xml:space="preserve">apply_changes</w:t>
+            </w:r>
+            <w:r>
+              <w:t xml:space="preserve"> </w:t>
+            </w:r>
+            <w:r>
+              <w:t xml:space="preserve">→ result dialog. Idempotent via a</w:t>
+            </w:r>
+            <w:r>
+              <w:t xml:space="preserve"> </w:t>
+            </w:r>
+            <w:r>
+              <w:rPr>
+                <w:rStyle w:val="VerbatimChar"/>
+              </w:rPr>
+              <w:t xml:space="preserve">_migrations_menu_wired</w:t>
+            </w:r>
+            <w:r>
+              <w:t xml:space="preserve"> </w:t>
+            </w:r>
+            <w:r>
+              <w:t xml:space="preserve">guard. Imports use the</w:t>
+            </w:r>
+            <w:r>
+              <w:t xml:space="preserve"> </w:t>
+            </w:r>
+            <w:r>
+              <w:rPr>
+                <w:rStyle w:val="VerbatimChar"/>
+              </w:rPr>
+              <w:t xml:space="preserve">qgis.PyQt.QtWidgets</w:t>
+            </w:r>
+            <w:r>
+              <w:t xml:space="preserve"> </w:t>
+            </w:r>
+            <w:r>
+              <w:t xml:space="preserve">abstraction so the same code runs on Qt5 and Qt6.</w:t>
+            </w:r>
+          </w:p>
+        </w:tc>
+      </w:tr>
+    </w:tbl>
+    <w:bookmarkEnd w:id="29"/>
+    <w:bookmarkStart w:id="30" w:name="what-was-tested-4"/>
+    <w:p>
+      <w:pPr>
+        <w:pStyle w:val="Heading2"/>
+      </w:pPr>
+      <w:r>
+        <w:t xml:space="preserve">What was tested</w:t>
+      </w:r>
+    </w:p>
+    <w:p>
+      <w:pPr>
+        <w:pStyle w:val="Compact"/>
+        <w:numPr>
+          <w:ilvl w:val="0"/>
+          <w:numId w:val="1014"/>
+        </w:numPr>
+      </w:pPr>
+      <w:r>
+        <w:rPr>
+          <w:b/>
+          <w:bCs/>
+        </w:rPr>
+        <w:t xml:space="preserve">3 unit tests</w:t>
+      </w:r>
+      <w:r>
+        <w:t xml:space="preserve"> </w:t>
+      </w:r>
+      <w:r>
+        <w:t xml:space="preserve">in</w:t>
+      </w:r>
+      <w:r>
+        <w:t xml:space="preserve"> </w:t>
+      </w:r>
+      <w:r>
+        <w:rPr>
+          <w:rStyle w:val="VerbatimChar"/>
+        </w:rPr>
+        <w:t xml:space="preserve">tests/migrations/test_common.py</w:t>
+      </w:r>
+      <w:r>
+        <w:t xml:space="preserve"> </w:t>
+      </w:r>
+      <w:r>
+        <w:t xml:space="preserve">cover the scaffold:</w:t>
+      </w:r>
+      <w:r>
+        <w:t xml:space="preserve"> </w:t>
+      </w:r>
+      <w:r>
+        <w:rPr>
+          <w:rStyle w:val="VerbatimChar"/>
+        </w:rPr>
+        <w:t xml:space="preserve">auto_backup_sqlite</w:t>
+      </w:r>
+      <w:r>
+        <w:t xml:space="preserve"> </w:t>
+      </w:r>
+      <w:r>
+        <w:t xml:space="preserve">copies the file and preserves data;</w:t>
+      </w:r>
+      <w:r>
+        <w:t xml:space="preserve"> </w:t>
+      </w:r>
+      <w:r>
+        <w:rPr>
+          <w:rStyle w:val="VerbatimChar"/>
+        </w:rPr>
+        <w:t xml:space="preserve">parse_argv</w:t>
+      </w:r>
+      <w:r>
+        <w:t xml:space="preserve"> </w:t>
+      </w:r>
+      <w:r>
+        <w:t xml:space="preserve">accepts each of the three actions; bare</w:t>
+      </w:r>
+      <w:r>
+        <w:t xml:space="preserve"> </w:t>
+      </w:r>
+      <w:r>
+        <w:rPr>
+          <w:rStyle w:val="VerbatimChar"/>
+        </w:rPr>
+        <w:t xml:space="preserve">--db</w:t>
+      </w:r>
+      <w:r>
+        <w:t xml:space="preserve"> </w:t>
+      </w:r>
+      <w:r>
+        <w:t xml:space="preserve">exits with</w:t>
+      </w:r>
+      <w:r>
+        <w:t xml:space="preserve"> </w:t>
+      </w:r>
+      <w:r>
+        <w:rPr>
+          <w:rStyle w:val="VerbatimChar"/>
+        </w:rPr>
+        <w:t xml:space="preserve">SystemExit</w:t>
+      </w:r>
+      <w:r>
+        <w:t xml:space="preserve">.</w:t>
+      </w:r>
+    </w:p>
+    <w:p>
+      <w:pPr>
+        <w:pStyle w:val="Compact"/>
+        <w:numPr>
+          <w:ilvl w:val="0"/>
+          <w:numId w:val="1014"/>
+        </w:numPr>
+      </w:pPr>
+      <w:r>
+        <w:rPr>
+          <w:b/>
+          <w:bCs/>
+        </w:rPr>
+        <w:t xml:space="preserve">5 unit tests</w:t>
+      </w:r>
+      <w:r>
+        <w:t xml:space="preserve"> </w:t>
+      </w:r>
+      <w:r>
+        <w:t xml:space="preserve">in</w:t>
+      </w:r>
+      <w:r>
+        <w:t xml:space="preserve"> </w:t>
+      </w:r>
+      <w:r>
+        <w:rPr>
+          <w:rStyle w:val="VerbatimChar"/>
+        </w:rPr>
+        <w:t xml:space="preserve">tests/migrations/test_us_vocabulary_alignment.py</w:t>
+      </w:r>
+      <w:r>
+        <w:t xml:space="preserve"> </w:t>
+      </w:r>
+      <w:r>
+        <w:t xml:space="preserve">cover the migration:</w:t>
+      </w:r>
+      <w:r>
+        <w:t xml:space="preserve"> </w:t>
+      </w:r>
+      <w:r>
+        <w:rPr>
+          <w:rStyle w:val="VerbatimChar"/>
+        </w:rPr>
+        <w:t xml:space="preserve">plan_changes</w:t>
+      </w:r>
+      <w:r>
+        <w:t xml:space="preserve"> </w:t>
+      </w:r>
+      <w:r>
+        <w:t xml:space="preserve">reports correct counts on a 5-row</w:t>
+      </w:r>
+      <w:r>
+        <w:t xml:space="preserve"> </w:t>
+      </w:r>
+      <w:r>
+        <w:t xml:space="preserve">fixture without mutating,</w:t>
+      </w:r>
+      <w:r>
+        <w:t xml:space="preserve"> </w:t>
+      </w:r>
+      <w:r>
+        <w:rPr>
+          <w:rStyle w:val="VerbatimChar"/>
+        </w:rPr>
+        <w:t xml:space="preserve">apply_changes</w:t>
+      </w:r>
+      <w:r>
+        <w:t xml:space="preserve"> </w:t>
+      </w:r>
+      <w:r>
+        <w:t xml:space="preserve">rewrites correctly, the</w:t>
+      </w:r>
+      <w:r>
+        <w:t xml:space="preserve"> </w:t>
+      </w:r>
+      <w:r>
+        <w:t xml:space="preserve">second</w:t>
+      </w:r>
+      <w:r>
+        <w:t xml:space="preserve"> </w:t>
+      </w:r>
+      <w:r>
+        <w:rPr>
+          <w:rStyle w:val="VerbatimChar"/>
+        </w:rPr>
+        <w:t xml:space="preserve">--apply</w:t>
+      </w:r>
+      <w:r>
+        <w:t xml:space="preserve"> </w:t>
+      </w:r>
+      <w:r>
+        <w:t xml:space="preserve">is a no-op (idempotency), and the</w:t>
+      </w:r>
+      <w:r>
+        <w:t xml:space="preserve"> </w:t>
+      </w:r>
+      <w:r>
+        <w:rPr>
+          <w:rStyle w:val="VerbatimChar"/>
+        </w:rPr>
+        <w:t xml:space="preserve">REPLACEMENTS</w:t>
+      </w:r>
+      <w:r>
+        <w:t xml:space="preserve"> </w:t>
+      </w:r>
+      <w:r>
+        <w:t xml:space="preserve">mapping is locked in.</w:t>
+      </w:r>
+    </w:p>
+    <w:p>
+      <w:pPr>
+        <w:pStyle w:val="Compact"/>
+        <w:numPr>
+          <w:ilvl w:val="0"/>
+          <w:numId w:val="1014"/>
+        </w:numPr>
+      </w:pPr>
+      <w:r>
+        <w:rPr>
+          <w:b/>
+          <w:bCs/>
+        </w:rPr>
+        <w:t xml:space="preserve">End-to-end dry-run on the real Volterra database</w:t>
+      </w:r>
+      <w:r>
+        <w:t xml:space="preserve"> </w:t>
+      </w:r>
+      <w:r>
+        <w:t xml:space="preserve">(</w:t>
+      </w:r>
+      <w:r>
+        <w:rPr>
+          <w:rStyle w:val="VerbatimChar"/>
+        </w:rPr>
+        <w:t xml:space="preserve">pyarchinitcs_SCHEDE2024.sqlite</w:t>
+      </w:r>
+      <w:r>
+        <w:t xml:space="preserve">): zero rows have</w:t>
+      </w:r>
+      <w:r>
+        <w:t xml:space="preserve"> </w:t>
+      </w:r>
+      <w:r>
+        <w:rPr>
+          <w:rStyle w:val="VerbatimChar"/>
+        </w:rPr>
+        <w:t xml:space="preserve">USVA</w:t>
+      </w:r>
+      <w:r>
+        <w:t xml:space="preserve">/</w:t>
+      </w:r>
+      <w:r>
+        <w:rPr>
+          <w:rStyle w:val="VerbatimChar"/>
+        </w:rPr>
+        <w:t xml:space="preserve">USVB</w:t>
+      </w:r>
+      <w:r>
+        <w:t xml:space="preserve">/</w:t>
+      </w:r>
+      <w:r>
+        <w:rPr>
+          <w:rStyle w:val="VerbatimChar"/>
+        </w:rPr>
+        <w:t xml:space="preserve">USVC</w:t>
+      </w:r>
+      <w:r>
+        <w:t xml:space="preserve"> </w:t>
+      </w:r>
+      <w:r>
+        <w:t xml:space="preserve">in</w:t>
+      </w:r>
+      <w:r>
+        <w:t xml:space="preserve"> </w:t>
+      </w:r>
+      <w:r>
+        <w:rPr>
+          <w:rStyle w:val="VerbatimChar"/>
+        </w:rPr>
+        <w:t xml:space="preserve">unita_tipo</w:t>
+      </w:r>
+      <w:r>
+        <w:t xml:space="preserve">, so the migration will be a no-op there. The CLI</w:t>
+      </w:r>
+      <w:r>
+        <w:t xml:space="preserve"> </w:t>
+      </w:r>
+      <w:r>
+        <w:t xml:space="preserve">exits cleanly without touching the file. Recorded as a safety check</w:t>
+      </w:r>
+      <w:r>
+        <w:t xml:space="preserve"> </w:t>
+      </w:r>
+      <w:r>
+        <w:t xml:space="preserve">before the manual smoke gate at G.4.</w:t>
+      </w:r>
+    </w:p>
+    <w:p>
+      <w:pPr>
+        <w:pStyle w:val="Compact"/>
+        <w:numPr>
+          <w:ilvl w:val="0"/>
+          <w:numId w:val="1014"/>
+        </w:numPr>
+      </w:pPr>
+      <w:r>
+        <w:rPr>
+          <w:b/>
+          <w:bCs/>
+        </w:rPr>
+        <w:t xml:space="preserve">Combined sync + migrations test run</w:t>
+      </w:r>
+      <w:r>
+        <w:t xml:space="preserve">:</w:t>
+      </w:r>
+      <w:r>
+        <w:t xml:space="preserve"> </w:t>
+      </w:r>
+      <w:r>
+        <w:rPr>
+          <w:rStyle w:val="VerbatimChar"/>
+        </w:rPr>
+        <w:t xml:space="preserve">pytest tests/sync/ tests/migrations/ -q</w:t>
+      </w:r>
+      <w:r>
+        <w:t xml:space="preserve"> </w:t>
+      </w:r>
+      <w:r>
+        <w:t xml:space="preserve">→</w:t>
+      </w:r>
+      <w:r>
+        <w:t xml:space="preserve"> </w:t>
+      </w:r>
+      <w:r>
+        <w:rPr>
+          <w:b/>
+          <w:bCs/>
+        </w:rPr>
+        <w:t xml:space="preserve">32 passed, 1 warning</w:t>
+      </w:r>
+      <w:r>
+        <w:t xml:space="preserve"> </w:t>
+      </w:r>
+      <w:r>
+        <w:t xml:space="preserve">(the warning is a</w:t>
+      </w:r>
+      <w:r>
+        <w:t xml:space="preserve"> </w:t>
+      </w:r>
+      <w:r>
+        <w:rPr>
+          <w:rStyle w:val="VerbatimChar"/>
+        </w:rPr>
+        <w:t xml:space="preserve">datetime.utcnow()</w:t>
+      </w:r>
+      <w:r>
+        <w:t xml:space="preserve"> </w:t>
+      </w:r>
+      <w:r>
+        <w:t xml:space="preserve">deprecation harmless on Python 3.13; deferred for</w:t>
+      </w:r>
+      <w:r>
+        <w:t xml:space="preserve"> </w:t>
+      </w:r>
+      <w:r>
+        <w:t xml:space="preserve">cleanup when minimum Python bumps).</w:t>
+      </w:r>
+    </w:p>
+    <w:bookmarkEnd w:id="30"/>
+    <w:bookmarkStart w:id="31" w:name="decisions-taken-4"/>
+    <w:p>
+      <w:pPr>
+        <w:pStyle w:val="Heading2"/>
+      </w:pPr>
+      <w:r>
+        <w:t xml:space="preserve">Decisions taken</w:t>
+      </w:r>
+    </w:p>
+    <w:p>
+      <w:pPr>
+        <w:pStyle w:val="Compact"/>
+        <w:numPr>
+          <w:ilvl w:val="0"/>
+          <w:numId w:val="1015"/>
+        </w:numPr>
+      </w:pPr>
+      <w:r>
+        <w:rPr>
+          <w:b/>
+          <w:bCs/>
+        </w:rPr>
+        <w:t xml:space="preserve">Library/CLI split for every migration.</w:t>
+      </w:r>
+      <w:r>
+        <w:t xml:space="preserve"> </w:t>
+      </w:r>
+      <w:r>
+        <w:rPr>
+          <w:rStyle w:val="VerbatimChar"/>
+        </w:rPr>
+        <w:t xml:space="preserve">_2026_05_us_vocabulary_alignment_lib.py</w:t>
+      </w:r>
+      <w:r>
+        <w:t xml:space="preserve"> </w:t>
+      </w:r>
+      <w:r>
+        <w:t xml:space="preserve">contains the pure logic;</w:t>
+      </w:r>
+      <w:r>
+        <w:t xml:space="preserve"> </w:t>
+      </w:r>
+      <w:r>
+        <w:rPr>
+          <w:rStyle w:val="VerbatimChar"/>
+        </w:rPr>
+        <w:t xml:space="preserve">2026_05_us_vocabulary_alignment.py</w:t>
+      </w:r>
+      <w:r>
+        <w:t xml:space="preserve"> </w:t>
+      </w:r>
+      <w:r>
+        <w:t xml:space="preserve">is the</w:t>
+      </w:r>
+      <w:r>
+        <w:t xml:space="preserve"> </w:t>
+      </w:r>
+      <w:r>
+        <w:t xml:space="preserve">thin CLI wrapper. This pattern lets</w:t>
+      </w:r>
+      <w:r>
+        <w:t xml:space="preserve"> </w:t>
+      </w:r>
+      <w:r>
+        <w:rPr>
+          <w:rStyle w:val="VerbatimChar"/>
+        </w:rPr>
+        <w:t xml:space="preserve">tests/migrations/</w:t>
+      </w:r>
+      <w:r>
+        <w:t xml:space="preserve"> </w:t>
+      </w:r>
+      <w:r>
+        <w:t xml:space="preserve">exercise the</w:t>
+      </w:r>
+      <w:r>
+        <w:t xml:space="preserve"> </w:t>
+      </w:r>
+      <w:r>
+        <w:t xml:space="preserve">logic directly without</w:t>
+      </w:r>
+      <w:r>
+        <w:t xml:space="preserve"> </w:t>
+      </w:r>
+      <w:r>
+        <w:rPr>
+          <w:rStyle w:val="VerbatimChar"/>
+        </w:rPr>
+        <w:t xml:space="preserve">subprocess.run</w:t>
+      </w:r>
+      <w:r>
+        <w:t xml:space="preserve">, and lets the QGIS menu</w:t>
+      </w:r>
+      <w:r>
+        <w:t xml:space="preserve"> </w:t>
+      </w:r>
+      <w:r>
+        <w:t xml:space="preserve">handler import the library functions directly without spawning a</w:t>
+      </w:r>
+      <w:r>
+        <w:t xml:space="preserve"> </w:t>
+      </w:r>
+      <w:r>
+        <w:t xml:space="preserve">child process. Group E will follow the same split.</w:t>
+      </w:r>
+    </w:p>
+    <w:p>
+      <w:pPr>
+        <w:pStyle w:val="Compact"/>
+        <w:numPr>
+          <w:ilvl w:val="0"/>
+          <w:numId w:val="1015"/>
+        </w:numPr>
+      </w:pPr>
+      <w:r>
+        <w:rPr>
+          <w:b/>
+          <w:bCs/>
+        </w:rPr>
+        <w:t xml:space="preserve">Idempotency by construction.</w:t>
+      </w:r>
+      <w:r>
+        <w:t xml:space="preserve"> </w:t>
+      </w:r>
+      <w:r>
+        <w:rPr>
+          <w:rStyle w:val="VerbatimChar"/>
+        </w:rPr>
+        <w:t xml:space="preserve">apply_changes</w:t>
+      </w:r>
+      <w:r>
+        <w:t xml:space="preserve"> </w:t>
+      </w:r>
+      <w:r>
+        <w:t xml:space="preserve">issues</w:t>
+      </w:r>
+      <w:r>
+        <w:t xml:space="preserve"> </w:t>
+      </w:r>
+      <w:r>
+        <w:rPr>
+          <w:rStyle w:val="VerbatimChar"/>
+        </w:rPr>
+        <w:t xml:space="preserve">UPDATE us_table SET unita_tipo = ? WHERE unita_tipo = ?</w:t>
+      </w:r>
+      <w:r>
+        <w:t xml:space="preserve"> </w:t>
+      </w:r>
+      <w:r>
+        <w:t xml:space="preserve">for each</w:t>
+      </w:r>
+      <w:r>
+        <w:t xml:space="preserve"> </w:t>
+      </w:r>
+      <w:r>
+        <w:rPr>
+          <w:rStyle w:val="VerbatimChar"/>
+        </w:rPr>
+        <w:t xml:space="preserve">REPLACEMENTS</w:t>
+      </w:r>
+      <w:r>
+        <w:t xml:space="preserve"> </w:t>
+      </w:r>
+      <w:r>
+        <w:t xml:space="preserve">pair; the second run finds zero matching rows and</w:t>
+      </w:r>
+      <w:r>
+        <w:t xml:space="preserve"> </w:t>
+      </w:r>
+      <w:r>
+        <w:t xml:space="preserve">returns rowcount 0 per source. No</w:t>
+      </w:r>
+      <w:r>
+        <w:t xml:space="preserve"> </w:t>
+      </w:r>
+      <w:r>
+        <w:t xml:space="preserve">“has-already-run”</w:t>
+      </w:r>
+      <w:r>
+        <w:t xml:space="preserve"> </w:t>
+      </w:r>
+      <w:r>
+        <w:t xml:space="preserve">sentinel column</w:t>
+      </w:r>
+      <w:r>
+        <w:t xml:space="preserve"> </w:t>
+      </w:r>
+      <w:r>
+        <w:t xml:space="preserve">needed.</w:t>
+      </w:r>
+    </w:p>
+    <w:p>
+      <w:pPr>
+        <w:pStyle w:val="Compact"/>
+        <w:numPr>
+          <w:ilvl w:val="0"/>
+          <w:numId w:val="1015"/>
+        </w:numPr>
+      </w:pPr>
+      <w:r>
+        <w:rPr>
+          <w:b/>
+          <w:bCs/>
+        </w:rPr>
+        <w:t xml:space="preserve">Auto-backup names live next to the database file.</w:t>
+      </w:r>
+      <w:r>
+        <w:t xml:space="preserve"> </w:t>
+      </w:r>
+      <w:r>
+        <w:t xml:space="preserve">The naming</w:t>
+      </w:r>
+      <w:r>
+        <w:t xml:space="preserve"> </w:t>
+      </w:r>
+      <w:r>
+        <w:t xml:space="preserve">pattern</w:t>
+      </w:r>
+      <w:r>
+        <w:t xml:space="preserve"> </w:t>
+      </w:r>
+      <w:r>
+        <w:rPr>
+          <w:rStyle w:val="VerbatimChar"/>
+        </w:rPr>
+        <w:t xml:space="preserve">&lt;db&gt;.pre_&lt;tag&gt;_&lt;YYYYmmddTHHMMSSZ&gt;</w:t>
+      </w:r>
+      <w:r>
+        <w:t xml:space="preserve"> </w:t>
+      </w:r>
+      <w:r>
+        <w:t xml:space="preserve">keeps backups</w:t>
+      </w:r>
+      <w:r>
+        <w:t xml:space="preserve"> </w:t>
+      </w:r>
+      <w:r>
+        <w:t xml:space="preserve">side-by-side with their source DB so users immediately see them in a</w:t>
+      </w:r>
+      <w:r>
+        <w:t xml:space="preserve"> </w:t>
+      </w:r>
+      <w:r>
+        <w:t xml:space="preserve">file-picker.</w:t>
+      </w:r>
+      <w:r>
+        <w:t xml:space="preserve"> </w:t>
+      </w:r>
+      <w:r>
+        <w:rPr>
+          <w:rStyle w:val="VerbatimChar"/>
+        </w:rPr>
+        <w:t xml:space="preserve">--rollback</w:t>
+      </w:r>
+      <w:r>
+        <w:t xml:space="preserve"> </w:t>
+      </w:r>
+      <w:r>
+        <w:t xml:space="preserve">takes the explicit backup path so the user</w:t>
+      </w:r>
+      <w:r>
+        <w:t xml:space="preserve"> </w:t>
+      </w:r>
+      <w:r>
+        <w:t xml:space="preserve">is in control of which backup gets restored.</w:t>
+      </w:r>
+    </w:p>
+    <w:p>
+      <w:pPr>
+        <w:pStyle w:val="Compact"/>
+        <w:numPr>
+          <w:ilvl w:val="0"/>
+          <w:numId w:val="1015"/>
+        </w:numPr>
+      </w:pPr>
+      <w:r>
+        <w:rPr>
+          <w:rStyle w:val="VerbatimChar"/>
+          <w:b/>
+          <w:bCs/>
+        </w:rPr>
+        <w:t xml:space="preserve">.gitignore</w:t>
+      </w:r>
+      <w:r>
+        <w:rPr>
+          <w:b/>
+          <w:bCs/>
+        </w:rPr>
+        <w:t xml:space="preserve"> </w:t>
+      </w:r>
+      <w:r>
+        <w:rPr>
+          <w:b/>
+          <w:bCs/>
+        </w:rPr>
+        <w:t xml:space="preserve">whitelist extended.</w:t>
+      </w:r>
+      <w:r>
+        <w:t xml:space="preserve"> </w:t>
+      </w:r>
+      <w:r>
+        <w:t xml:space="preserve">The same pattern that Group 0</w:t>
+      </w:r>
+      <w:r>
+        <w:t xml:space="preserve"> </w:t>
+      </w:r>
+      <w:r>
+        <w:t xml:space="preserve">applied to</w:t>
+      </w:r>
+      <w:r>
+        <w:t xml:space="preserve"> </w:t>
+      </w:r>
+      <w:r>
+        <w:rPr>
+          <w:rStyle w:val="VerbatimChar"/>
+        </w:rPr>
+        <w:t xml:space="preserve">tests/sync/</w:t>
+      </w:r>
+      <w:r>
+        <w:t xml:space="preserve"> </w:t>
+      </w:r>
+      <w:r>
+        <w:t xml:space="preserve">(re-include the new test directory inside</w:t>
+      </w:r>
+      <w:r>
+        <w:t xml:space="preserve"> </w:t>
+      </w:r>
+      <w:r>
+        <w:t xml:space="preserve">the existing</w:t>
+      </w:r>
+      <w:r>
+        <w:t xml:space="preserve"> </w:t>
+      </w:r>
+      <w:r>
+        <w:rPr>
+          <w:rStyle w:val="VerbatimChar"/>
+        </w:rPr>
+        <w:t xml:space="preserve">/tests/*</w:t>
+      </w:r>
+      <w:r>
+        <w:t xml:space="preserve"> </w:t>
+      </w:r>
+      <w:r>
+        <w:t xml:space="preserve">blanket ignore) was applied to</w:t>
+      </w:r>
+      <w:r>
+        <w:t xml:space="preserve"> </w:t>
+      </w:r>
+      <w:r>
+        <w:rPr>
+          <w:rStyle w:val="VerbatimChar"/>
+        </w:rPr>
+        <w:t xml:space="preserve">tests/migrations/</w:t>
+      </w:r>
+      <w:r>
+        <w:t xml:space="preserve">. Both are tracked; legacy</w:t>
+      </w:r>
+      <w:r>
+        <w:t xml:space="preserve"> </w:t>
+      </w:r>
+      <w:r>
+        <w:rPr>
+          <w:rStyle w:val="VerbatimChar"/>
+        </w:rPr>
+        <w:t xml:space="preserve">tests/test_*.py</w:t>
+      </w:r>
+      <w:r>
+        <w:t xml:space="preserve"> </w:t>
+      </w:r>
+      <w:r>
+        <w:t xml:space="preserve">files unaffected.</w:t>
+      </w:r>
+    </w:p>
+    <w:p>
+      <w:pPr>
+        <w:pStyle w:val="Compact"/>
+        <w:numPr>
+          <w:ilvl w:val="0"/>
+          <w:numId w:val="1015"/>
+        </w:numPr>
+      </w:pPr>
+      <w:r>
+        <w:rPr>
+          <w:rStyle w:val="VerbatimChar"/>
+          <w:b/>
+          <w:bCs/>
+        </w:rPr>
+        <w:t xml:space="preserve">pyarchinitPlugin.py</w:t>
+      </w:r>
+      <w:r>
+        <w:rPr>
+          <w:b/>
+          <w:bCs/>
+        </w:rPr>
+        <w:t xml:space="preserve"> </w:t>
+      </w:r>
+      <w:r>
+        <w:rPr>
+          <w:b/>
+          <w:bCs/>
+        </w:rPr>
+        <w:t xml:space="preserve">is the canonical filename</w:t>
+      </w:r>
+      <w:r>
+        <w:t xml:space="preserve"> </w:t>
+      </w:r>
+      <w:r>
+        <w:t xml:space="preserve">— lowercase</w:t>
+      </w:r>
+      <w:r>
+        <w:t xml:space="preserve"> </w:t>
+      </w:r>
+      <w:r>
+        <w:rPr>
+          <w:rStyle w:val="VerbatimChar"/>
+        </w:rPr>
+        <w:t xml:space="preserve">p</w:t>
+      </w:r>
+      <w:r>
+        <w:t xml:space="preserve"> </w:t>
+      </w:r>
+      <w:r>
+        <w:t xml:space="preserve">—</w:t>
+      </w:r>
+      <w:r>
+        <w:t xml:space="preserve"> </w:t>
+      </w:r>
+      <w:r>
+        <w:t xml:space="preserve">matches the existing repository state, not the camelCase variant</w:t>
+      </w:r>
+      <w:r>
+        <w:t xml:space="preserve"> </w:t>
+      </w:r>
+      <w:r>
+        <w:t xml:space="preserve">referenced in some older notes. The new menu wiring lives there.</w:t>
+      </w:r>
+    </w:p>
+    <w:bookmarkEnd w:id="31"/>
+    <w:bookmarkStart w:id="32" w:name="operational-notes"/>
+    <w:p>
+      <w:pPr>
+        <w:pStyle w:val="Heading2"/>
+      </w:pPr>
+      <w:r>
+        <w:t xml:space="preserve">Operational notes</w:t>
+      </w:r>
+    </w:p>
+    <w:p>
+      <w:pPr>
+        <w:pStyle w:val="Compact"/>
+        <w:numPr>
+          <w:ilvl w:val="0"/>
+          <w:numId w:val="1016"/>
+        </w:numPr>
+      </w:pPr>
+      <w:r>
+        <w:rPr>
+          <w:b/>
+          <w:bCs/>
+        </w:rPr>
+        <w:t xml:space="preserve">Volterra database (</w:t>
+      </w:r>
+      <w:r>
+        <w:rPr>
+          <w:rStyle w:val="VerbatimChar"/>
+          <w:b/>
+          <w:bCs/>
+        </w:rPr>
+        <w:t xml:space="preserve">pyarchinitcs_SCHEDE2024.sqlite</w:t>
+      </w:r>
+      <w:r>
+        <w:rPr>
+          <w:b/>
+          <w:bCs/>
+        </w:rPr>
+        <w:t xml:space="preserve">) needs no</w:t>
+      </w:r>
+      <w:r>
+        <w:rPr>
+          <w:b/>
+          <w:bCs/>
+        </w:rPr>
+        <w:t xml:space="preserve"> </w:t>
+      </w:r>
+      <w:r>
+        <w:rPr>
+          <w:b/>
+          <w:bCs/>
+        </w:rPr>
+        <w:t xml:space="preserve">alignment.</w:t>
+      </w:r>
+      <w:r>
+        <w:t xml:space="preserve"> </w:t>
+      </w:r>
+      <w:r>
+        <w:t xml:space="preserve">The dry-run reports 0 rows in every replacement bucket.</w:t>
+      </w:r>
+      <w:r>
+        <w:t xml:space="preserve"> </w:t>
+      </w:r>
+      <w:r>
+        <w:t xml:space="preserve">The migration is therefore a no-op when first applied to it; if the</w:t>
+      </w:r>
+      <w:r>
+        <w:t xml:space="preserve"> </w:t>
+      </w:r>
+      <w:r>
+        <w:t xml:space="preserve">user later imports rows from a legacy export that used</w:t>
+      </w:r>
+      <w:r>
+        <w:t xml:space="preserve"> </w:t>
+      </w:r>
+      <w:r>
+        <w:rPr>
+          <w:rStyle w:val="VerbatimChar"/>
+        </w:rPr>
+        <w:t xml:space="preserve">USVA</w:t>
+      </w:r>
+      <w:r>
+        <w:t xml:space="preserve">/</w:t>
+      </w:r>
+      <w:r>
+        <w:rPr>
+          <w:rStyle w:val="VerbatimChar"/>
+        </w:rPr>
+        <w:t xml:space="preserve">USVB</w:t>
+      </w:r>
+      <w:r>
+        <w:t xml:space="preserve">/</w:t>
+      </w:r>
+      <w:r>
+        <w:t xml:space="preserve"> </w:t>
+      </w:r>
+      <w:r>
+        <w:rPr>
+          <w:rStyle w:val="VerbatimChar"/>
+        </w:rPr>
+        <w:t xml:space="preserve">USVC</w:t>
+      </w:r>
+      <w:r>
+        <w:t xml:space="preserve">, re-running the migration cleans them up.</w:t>
+      </w:r>
+    </w:p>
+    <w:p>
+      <w:pPr>
+        <w:pStyle w:val="Compact"/>
+        <w:numPr>
+          <w:ilvl w:val="0"/>
+          <w:numId w:val="1016"/>
+        </w:numPr>
+      </w:pPr>
+      <w:r>
+        <w:rPr>
+          <w:b/>
+          <w:bCs/>
+        </w:rPr>
+        <w:t xml:space="preserve">Other historical PyArchInit databases</w:t>
+      </w:r>
+      <w:r>
+        <w:t xml:space="preserve"> </w:t>
+      </w:r>
+      <w:r>
+        <w:t xml:space="preserve">(e.g. </w:t>
+      </w:r>
+      <w:r>
+        <w:rPr>
+          <w:rStyle w:val="VerbatimChar"/>
+        </w:rPr>
+        <w:t xml:space="preserve">pyarchinit_db.sqlite</w:t>
+      </w:r>
+      <w:r>
+        <w:t xml:space="preserve">,</w:t>
+      </w:r>
+      <w:r>
+        <w:t xml:space="preserve"> </w:t>
+      </w:r>
+      <w:r>
+        <w:t xml:space="preserve">the development scratchpad) should each be dry-run before</w:t>
+      </w:r>
+      <w:r>
+        <w:t xml:space="preserve"> </w:t>
+      </w:r>
+      <w:r>
+        <w:rPr>
+          <w:rStyle w:val="VerbatimChar"/>
+        </w:rPr>
+        <w:t xml:space="preserve">--apply</w:t>
+      </w:r>
+      <w:r>
+        <w:t xml:space="preserve"> </w:t>
+      </w:r>
+      <w:r>
+        <w:t xml:space="preserve">to know what will change. The QGIS menu does this automatically: the</w:t>
+      </w:r>
+      <w:r>
+        <w:t xml:space="preserve"> </w:t>
+      </w:r>
+      <w:r>
+        <w:t xml:space="preserve">confirmation dialog shows the per-source count before mutating.</w:t>
+      </w:r>
+    </w:p>
+    <w:bookmarkEnd w:id="32"/>
+    <w:bookmarkEnd w:id="33"/>
     <w:sectPr>
       <w:footnotePr>
         <w:numRestart w:val="eachSect"/>
@@ -6025,6 +7682,15 @@
     <w:abstractNumId w:val="991"/>
   </w:num>
   <w:num w:numId="1013">
+    <w:abstractNumId w:val="991"/>
+  </w:num>
+  <w:num w:numId="1014">
+    <w:abstractNumId w:val="991"/>
+  </w:num>
+  <w:num w:numId="1015">
+    <w:abstractNumId w:val="991"/>
+  </w:num>
+  <w:num w:numId="1016">
     <w:abstractNumId w:val="991"/>
   </w:num>
 </w:numbering>

</xml_diff>

<commit_message>
docs(dev-log): Group E entry — node_uuid TEXT + UUID v7 backfill
3 commits (b63927ae + 0b93b3aa + 602d7220). 41 tests passing total.
Local UUID v7 generator (RFC 9562 §5.7), partial unique index for
recovery-friendly NULL handling. Volterra dry-run: 3 tables need
ALTER + backfill. QGIS menu entry in pyarchinitPlugin.py.
</commit_message>
<xml_diff>
--- a/docs/superpowers/dev-log/T5.4_PyArchInit_Dev_Log.docx
+++ b/docs/superpowers/dev-log/T5.4_PyArchInit_Dev_Log.docx
@@ -846,7 +846,17 @@
               <w:pStyle w:val="Compact"/>
             </w:pPr>
             <w:r>
-              <w:t xml:space="preserve">Pending</w:t>
+              <w:rPr>
+                <w:b/>
+                <w:bCs/>
+              </w:rPr>
+              <w:t xml:space="preserve">Done</w:t>
+            </w:r>
+            <w:r>
+              <w:t xml:space="preserve"> </w:t>
+            </w:r>
+            <w:r>
+              <w:t xml:space="preserve">(2026-05-07)</w:t>
             </w:r>
           </w:p>
         </w:tc>
@@ -7315,8 +7325,1628 @@
         <w:t xml:space="preserve">confirmation dialog shows the per-source count before mutating.</w:t>
       </w:r>
     </w:p>
+    <w:p>
+      <w:r>
+        <w:pict>
+          <v:rect style="width:0;height:1.5pt" o:hralign="center" o:hrstd="t" o:hr="t"/>
+        </w:pict>
+      </w:r>
+    </w:p>
     <w:bookmarkEnd w:id="32"/>
     <w:bookmarkEnd w:id="33"/>
+    <w:bookmarkStart w:id="38" w:name="Xb7638e1a02198614508f583347b2011f0bc1926"/>
+    <w:p>
+      <w:pPr>
+        <w:pStyle w:val="Heading1"/>
+      </w:pPr>
+      <w:r>
+        <w:t xml:space="preserve">Group E —</w:t>
+      </w:r>
+      <w:r>
+        <w:t xml:space="preserve"> </w:t>
+      </w:r>
+      <w:r>
+        <w:rPr>
+          <w:rStyle w:val="VerbatimChar"/>
+        </w:rPr>
+        <w:t xml:space="preserve">node_uuid TEXT</w:t>
+      </w:r>
+      <w:r>
+        <w:t xml:space="preserve"> </w:t>
+      </w:r>
+      <w:r>
+        <w:t xml:space="preserve">column + UUID v7 backfill migration</w:t>
+      </w:r>
+    </w:p>
+    <w:p>
+      <w:pPr>
+        <w:pStyle w:val="FirstParagraph"/>
+      </w:pPr>
+      <w:r>
+        <w:rPr>
+          <w:b/>
+          <w:bCs/>
+        </w:rPr>
+        <w:t xml:space="preserve">Date:</w:t>
+      </w:r>
+      <w:r>
+        <w:t xml:space="preserve"> </w:t>
+      </w:r>
+      <w:r>
+        <w:t xml:space="preserve">7 May 2026 ·</w:t>
+      </w:r>
+      <w:r>
+        <w:t xml:space="preserve"> </w:t>
+      </w:r>
+      <w:r>
+        <w:rPr>
+          <w:b/>
+          <w:bCs/>
+        </w:rPr>
+        <w:t xml:space="preserve">Status:</w:t>
+      </w:r>
+      <w:r>
+        <w:t xml:space="preserve"> </w:t>
+      </w:r>
+      <w:r>
+        <w:t xml:space="preserve">Done ·</w:t>
+      </w:r>
+      <w:r>
+        <w:t xml:space="preserve"> </w:t>
+      </w:r>
+      <w:r>
+        <w:rPr>
+          <w:b/>
+          <w:bCs/>
+        </w:rPr>
+        <w:t xml:space="preserve">Commits:</w:t>
+      </w:r>
+      <w:r>
+        <w:t xml:space="preserve"> </w:t>
+      </w:r>
+      <w:r>
+        <w:rPr>
+          <w:rStyle w:val="VerbatimChar"/>
+        </w:rPr>
+        <w:t xml:space="preserve">b63927ae</w:t>
+      </w:r>
+      <w:r>
+        <w:t xml:space="preserve">,</w:t>
+      </w:r>
+      <w:r>
+        <w:t xml:space="preserve"> </w:t>
+      </w:r>
+      <w:r>
+        <w:rPr>
+          <w:rStyle w:val="VerbatimChar"/>
+        </w:rPr>
+        <w:t xml:space="preserve">0b93b3aa</w:t>
+      </w:r>
+      <w:r>
+        <w:t xml:space="preserve">,</w:t>
+      </w:r>
+      <w:r>
+        <w:t xml:space="preserve"> </w:t>
+      </w:r>
+      <w:r>
+        <w:rPr>
+          <w:rStyle w:val="VerbatimChar"/>
+        </w:rPr>
+        <w:t xml:space="preserve">602d7220</w:t>
+      </w:r>
+    </w:p>
+    <w:bookmarkStart w:id="34" w:name="what-was-built-5"/>
+    <w:p>
+      <w:pPr>
+        <w:pStyle w:val="Heading2"/>
+      </w:pPr>
+      <w:r>
+        <w:t xml:space="preserve">What was built</w:t>
+      </w:r>
+    </w:p>
+    <w:p>
+      <w:pPr>
+        <w:pStyle w:val="FirstParagraph"/>
+      </w:pPr>
+      <w:r>
+        <w:t xml:space="preserve">The second one-shot SQL migration of Phase 1: every record in the three</w:t>
+      </w:r>
+      <w:r>
+        <w:t xml:space="preserve"> </w:t>
+      </w:r>
+      <w:r>
+        <w:t xml:space="preserve">primary stratigraphic tables gets a stable opaque identifier so that, in</w:t>
+      </w:r>
+      <w:r>
+        <w:t xml:space="preserve"> </w:t>
+      </w:r>
+      <w:r>
+        <w:t xml:space="preserve">later phases, the s3Dgraphy bridge can use it as the</w:t>
+      </w:r>
+      <w:r>
+        <w:t xml:space="preserve"> </w:t>
+      </w:r>
+      <w:r>
+        <w:rPr>
+          <w:rStyle w:val="VerbatimChar"/>
+        </w:rPr>
+        <w:t xml:space="preserve">EMid</w:t>
+      </w:r>
+      <w:r>
+        <w:t xml:space="preserve"> </w:t>
+      </w:r>
+      <w:r>
+        <w:t xml:space="preserve">foreign key</w:t>
+      </w:r>
+      <w:r>
+        <w:t xml:space="preserve"> </w:t>
+      </w:r>
+      <w:r>
+        <w:t xml:space="preserve">on the property-graph side. Per Reference Document v0.1 §3</w:t>
+      </w:r>
+      <w:r>
+        <w:t xml:space="preserve"> </w:t>
+      </w:r>
+      <w:r>
+        <w:rPr>
+          <w:i/>
+          <w:iCs/>
+        </w:rPr>
+        <w:t xml:space="preserve">“Identity is</w:t>
+      </w:r>
+      <w:r>
+        <w:rPr>
+          <w:i/>
+          <w:iCs/>
+        </w:rPr>
+        <w:t xml:space="preserve"> </w:t>
+      </w:r>
+      <w:r>
+        <w:rPr>
+          <w:i/>
+          <w:iCs/>
+        </w:rPr>
+        <w:t xml:space="preserve">already aligned”</w:t>
+      </w:r>
+      <w:r>
+        <w:t xml:space="preserve">, the PyArchInit per-record UID and the s3Dgraphy</w:t>
+      </w:r>
+      <w:r>
+        <w:t xml:space="preserve"> </w:t>
+      </w:r>
+      <w:r>
+        <w:rPr>
+          <w:rStyle w:val="VerbatimChar"/>
+        </w:rPr>
+        <w:t xml:space="preserve">EMid</w:t>
+      </w:r>
+      <w:r>
+        <w:t xml:space="preserve"> </w:t>
+      </w:r>
+      <w:r>
+        <w:t xml:space="preserve">will be the same value with two names; this migration creates the value.</w:t>
+      </w:r>
+    </w:p>
+    <w:tbl>
+      <w:tblPr>
+        <w:tblStyle w:val="Table"/>
+        <w:tblW w:type="pct" w:w="5000"/>
+        <w:tblLayout w:type="fixed"/>
+        <w:tblLook w:firstRow="1" w:lastRow="0" w:firstColumn="0" w:lastColumn="0" w:noHBand="0" w:noVBand="0" w:val="0020"/>
+      </w:tblPr>
+      <w:tblGrid>
+        <w:gridCol w:w="3960"/>
+        <w:gridCol w:w="3960"/>
+      </w:tblGrid>
+      <w:tr>
+        <w:trPr>
+          <w:tblHeader w:val="on"/>
+        </w:trPr>
+        <w:tc>
+          <w:tcPr/>
+          <w:p>
+            <w:pPr>
+              <w:pStyle w:val="Compact"/>
+            </w:pPr>
+            <w:r>
+              <w:t xml:space="preserve">File</w:t>
+            </w:r>
+          </w:p>
+        </w:tc>
+        <w:tc>
+          <w:tcPr/>
+          <w:p>
+            <w:pPr>
+              <w:pStyle w:val="Compact"/>
+            </w:pPr>
+            <w:r>
+              <w:t xml:space="preserve">Responsibility</w:t>
+            </w:r>
+          </w:p>
+        </w:tc>
+      </w:tr>
+      <w:tr>
+        <w:tc>
+          <w:tcPr/>
+          <w:p>
+            <w:pPr>
+              <w:pStyle w:val="Compact"/>
+            </w:pPr>
+            <w:r>
+              <w:rPr>
+                <w:rStyle w:val="VerbatimChar"/>
+              </w:rPr>
+              <w:t xml:space="preserve">modules/s3dgraphy/sync/uuid7.py</w:t>
+            </w:r>
+          </w:p>
+        </w:tc>
+        <w:tc>
+          <w:tcPr/>
+          <w:p>
+            <w:pPr>
+              <w:pStyle w:val="Compact"/>
+            </w:pPr>
+            <w:r>
+              <w:t xml:space="preserve">Local UUID v7 generator (RFC 9562 §5.7). Monotonic per-process via a threading lock; when two calls fall within the same millisecond, the second increments the random portion to keep ordering. Will be replaced with</w:t>
+            </w:r>
+            <w:r>
+              <w:t xml:space="preserve"> </w:t>
+            </w:r>
+            <w:r>
+              <w:rPr>
+                <w:rStyle w:val="VerbatimChar"/>
+              </w:rPr>
+              <w:t xml:space="preserve">uuid.uuid7()</w:t>
+            </w:r>
+            <w:r>
+              <w:t xml:space="preserve"> </w:t>
+            </w:r>
+            <w:r>
+              <w:t xml:space="preserve">once the project minimum bumps to Python 3.14+.</w:t>
+            </w:r>
+          </w:p>
+        </w:tc>
+      </w:tr>
+      <w:tr>
+        <w:tc>
+          <w:tcPr/>
+          <w:p>
+            <w:pPr>
+              <w:pStyle w:val="Compact"/>
+            </w:pPr>
+            <w:r>
+              <w:rPr>
+                <w:rStyle w:val="VerbatimChar"/>
+              </w:rPr>
+              <w:t xml:space="preserve">scripts/migrations/_2026_05_node_uuid_backfill_lib.py</w:t>
+            </w:r>
+          </w:p>
+        </w:tc>
+        <w:tc>
+          <w:tcPr/>
+          <w:p>
+            <w:pPr>
+              <w:pStyle w:val="Compact"/>
+            </w:pPr>
+            <w:r>
+              <w:t xml:space="preserve">Pure-logic library.</w:t>
+            </w:r>
+            <w:r>
+              <w:t xml:space="preserve"> </w:t>
+            </w:r>
+            <w:r>
+              <w:rPr>
+                <w:rStyle w:val="VerbatimChar"/>
+              </w:rPr>
+              <w:t xml:space="preserve">TABLES</w:t>
+            </w:r>
+            <w:r>
+              <w:t xml:space="preserve"> </w:t>
+            </w:r>
+            <w:r>
+              <w:t xml:space="preserve">lists the three target tables (</w:t>
+            </w:r>
+            <w:r>
+              <w:rPr>
+                <w:rStyle w:val="VerbatimChar"/>
+              </w:rPr>
+              <w:t xml:space="preserve">us_table</w:t>
+            </w:r>
+            <w:r>
+              <w:t xml:space="preserve">,</w:t>
+            </w:r>
+            <w:r>
+              <w:t xml:space="preserve"> </w:t>
+            </w:r>
+            <w:r>
+              <w:rPr>
+                <w:rStyle w:val="VerbatimChar"/>
+              </w:rPr>
+              <w:t xml:space="preserve">inventario_materiali_table</w:t>
+            </w:r>
+            <w:r>
+              <w:t xml:space="preserve">,</w:t>
+            </w:r>
+            <w:r>
+              <w:t xml:space="preserve"> </w:t>
+            </w:r>
+            <w:r>
+              <w:rPr>
+                <w:rStyle w:val="VerbatimChar"/>
+              </w:rPr>
+              <w:t xml:space="preserve">periodizzazione_table</w:t>
+            </w:r>
+            <w:r>
+              <w:t xml:space="preserve">).</w:t>
+            </w:r>
+            <w:r>
+              <w:t xml:space="preserve"> </w:t>
+            </w:r>
+            <w:r>
+              <w:rPr>
+                <w:rStyle w:val="VerbatimChar"/>
+              </w:rPr>
+              <w:t xml:space="preserve">add_columns(db)</w:t>
+            </w:r>
+            <w:r>
+              <w:t xml:space="preserve"> </w:t>
+            </w:r>
+            <w:r>
+              <w:t xml:space="preserve">adds</w:t>
+            </w:r>
+            <w:r>
+              <w:t xml:space="preserve"> </w:t>
+            </w:r>
+            <w:r>
+              <w:rPr>
+                <w:rStyle w:val="VerbatimChar"/>
+              </w:rPr>
+              <w:t xml:space="preserve">node_uuid TEXT</w:t>
+            </w:r>
+            <w:r>
+              <w:t xml:space="preserve"> </w:t>
+            </w:r>
+            <w:r>
+              <w:t xml:space="preserve">if missing and creates a partial unique index</w:t>
+            </w:r>
+            <w:r>
+              <w:t xml:space="preserve"> </w:t>
+            </w:r>
+            <w:r>
+              <w:rPr>
+                <w:rStyle w:val="VerbatimChar"/>
+              </w:rPr>
+              <w:t xml:space="preserve">WHERE node_uuid IS NOT NULL</w:t>
+            </w:r>
+            <w:r>
+              <w:t xml:space="preserve"> </w:t>
+            </w:r>
+            <w:r>
+              <w:t xml:space="preserve">on each table — the partial predicate lets multiple NULL rows coexist during a partial-failure recovery.</w:t>
+            </w:r>
+            <w:r>
+              <w:t xml:space="preserve"> </w:t>
+            </w:r>
+            <w:r>
+              <w:rPr>
+                <w:rStyle w:val="VerbatimChar"/>
+              </w:rPr>
+              <w:t xml:space="preserve">backfill_uuids(db)</w:t>
+            </w:r>
+            <w:r>
+              <w:t xml:space="preserve"> </w:t>
+            </w:r>
+            <w:r>
+              <w:t xml:space="preserve">assigns</w:t>
+            </w:r>
+            <w:r>
+              <w:t xml:space="preserve"> </w:t>
+            </w:r>
+            <w:r>
+              <w:rPr>
+                <w:rStyle w:val="VerbatimChar"/>
+              </w:rPr>
+              <w:t xml:space="preserve">uuid7()</w:t>
+            </w:r>
+            <w:r>
+              <w:t xml:space="preserve"> </w:t>
+            </w:r>
+            <w:r>
+              <w:t xml:space="preserve">to every NULL</w:t>
+            </w:r>
+            <w:r>
+              <w:t xml:space="preserve"> </w:t>
+            </w:r>
+            <w:r>
+              <w:rPr>
+                <w:rStyle w:val="VerbatimChar"/>
+              </w:rPr>
+              <w:t xml:space="preserve">node_uuid</w:t>
+            </w:r>
+            <w:r>
+              <w:t xml:space="preserve">; returns a per-table count of rows updated.</w:t>
+            </w:r>
+          </w:p>
+        </w:tc>
+      </w:tr>
+      <w:tr>
+        <w:tc>
+          <w:tcPr/>
+          <w:p>
+            <w:pPr>
+              <w:pStyle w:val="Compact"/>
+            </w:pPr>
+            <w:r>
+              <w:rPr>
+                <w:rStyle w:val="VerbatimChar"/>
+              </w:rPr>
+              <w:t xml:space="preserve">scripts/migrations/2026_05_node_uuid_backfill.py</w:t>
+            </w:r>
+          </w:p>
+        </w:tc>
+        <w:tc>
+          <w:tcPr/>
+          <w:p>
+            <w:pPr>
+              <w:pStyle w:val="Compact"/>
+            </w:pPr>
+            <w:r>
+              <w:t xml:space="preserve">CLI front-end.</w:t>
+            </w:r>
+            <w:r>
+              <w:t xml:space="preserve"> </w:t>
+            </w:r>
+            <w:r>
+              <w:rPr>
+                <w:rStyle w:val="VerbatimChar"/>
+              </w:rPr>
+              <w:t xml:space="preserve">--dry-run</w:t>
+            </w:r>
+            <w:r>
+              <w:t xml:space="preserve"> </w:t>
+            </w:r>
+            <w:r>
+              <w:t xml:space="preserve">reports either</w:t>
+            </w:r>
+            <w:r>
+              <w:t xml:space="preserve"> </w:t>
+            </w:r>
+            <w:r>
+              <w:t xml:space="preserve">“needs ALTER TABLE + backfill (no col)”</w:t>
+            </w:r>
+            <w:r>
+              <w:t xml:space="preserve"> </w:t>
+            </w:r>
+            <w:r>
+              <w:t xml:space="preserve">or</w:t>
+            </w:r>
+            <w:r>
+              <w:t xml:space="preserve"> </w:t>
+            </w:r>
+            <w:r>
+              <w:t xml:space="preserve">“N row(s) need backfill”</w:t>
+            </w:r>
+            <w:r>
+              <w:t xml:space="preserve"> </w:t>
+            </w:r>
+            <w:r>
+              <w:t xml:space="preserve">per table without mutating.</w:t>
+            </w:r>
+            <w:r>
+              <w:t xml:space="preserve"> </w:t>
+            </w:r>
+            <w:r>
+              <w:rPr>
+                <w:rStyle w:val="VerbatimChar"/>
+              </w:rPr>
+              <w:t xml:space="preserve">--apply</w:t>
+            </w:r>
+            <w:r>
+              <w:t xml:space="preserve"> </w:t>
+            </w:r>
+            <w:r>
+              <w:t xml:space="preserve">runs</w:t>
+            </w:r>
+            <w:r>
+              <w:t xml:space="preserve"> </w:t>
+            </w:r>
+            <w:r>
+              <w:rPr>
+                <w:rStyle w:val="VerbatimChar"/>
+              </w:rPr>
+              <w:t xml:space="preserve">auto_backup_sqlite</w:t>
+            </w:r>
+            <w:r>
+              <w:t xml:space="preserve"> </w:t>
+            </w:r>
+            <w:r>
+              <w:t xml:space="preserve">+</w:t>
+            </w:r>
+            <w:r>
+              <w:t xml:space="preserve"> </w:t>
+            </w:r>
+            <w:r>
+              <w:rPr>
+                <w:rStyle w:val="VerbatimChar"/>
+              </w:rPr>
+              <w:t xml:space="preserve">add_columns</w:t>
+            </w:r>
+            <w:r>
+              <w:t xml:space="preserve"> </w:t>
+            </w:r>
+            <w:r>
+              <w:t xml:space="preserve">+</w:t>
+            </w:r>
+            <w:r>
+              <w:t xml:space="preserve"> </w:t>
+            </w:r>
+            <w:r>
+              <w:rPr>
+                <w:rStyle w:val="VerbatimChar"/>
+              </w:rPr>
+              <w:t xml:space="preserve">backfill_uuids</w:t>
+            </w:r>
+            <w:r>
+              <w:t xml:space="preserve">.</w:t>
+            </w:r>
+            <w:r>
+              <w:t xml:space="preserve"> </w:t>
+            </w:r>
+            <w:r>
+              <w:rPr>
+                <w:rStyle w:val="VerbatimChar"/>
+              </w:rPr>
+              <w:t xml:space="preserve">--rollback</w:t>
+            </w:r>
+            <w:r>
+              <w:t xml:space="preserve"> </w:t>
+            </w:r>
+            <w:r>
+              <w:t xml:space="preserve">restores an explicit backup path.</w:t>
+            </w:r>
+          </w:p>
+        </w:tc>
+      </w:tr>
+      <w:tr>
+        <w:tc>
+          <w:tcPr/>
+          <w:p>
+            <w:pPr>
+              <w:pStyle w:val="Compact"/>
+            </w:pPr>
+            <w:r>
+              <w:rPr>
+                <w:rStyle w:val="VerbatimChar"/>
+              </w:rPr>
+              <w:t xml:space="preserve">pyarchinitPlugin.py</w:t>
+            </w:r>
+            <w:r>
+              <w:t xml:space="preserve"> </w:t>
+            </w:r>
+            <w:r>
+              <w:t xml:space="preserve">(modified)</w:t>
+            </w:r>
+          </w:p>
+        </w:tc>
+        <w:tc>
+          <w:tcPr/>
+          <w:p>
+            <w:pPr>
+              <w:pStyle w:val="Compact"/>
+            </w:pPr>
+            <w:r>
+              <w:t xml:space="preserve">Second entry in</w:t>
+            </w:r>
+            <w:r>
+              <w:t xml:space="preserve"> </w:t>
+            </w:r>
+            <w:r>
+              <w:rPr>
+                <w:rStyle w:val="VerbatimChar"/>
+              </w:rPr>
+              <w:t xml:space="preserve">_init_migrations_menu()</w:t>
+            </w:r>
+            <w:r>
+              <w:t xml:space="preserve">: file picker → confirmation dialog showing the three target tables →</w:t>
+            </w:r>
+            <w:r>
+              <w:t xml:space="preserve"> </w:t>
+            </w:r>
+            <w:r>
+              <w:rPr>
+                <w:rStyle w:val="VerbatimChar"/>
+              </w:rPr>
+              <w:t xml:space="preserve">auto_backup_sqlite</w:t>
+            </w:r>
+            <w:r>
+              <w:t xml:space="preserve"> </w:t>
+            </w:r>
+            <w:r>
+              <w:t xml:space="preserve">+</w:t>
+            </w:r>
+            <w:r>
+              <w:t xml:space="preserve"> </w:t>
+            </w:r>
+            <w:r>
+              <w:rPr>
+                <w:rStyle w:val="VerbatimChar"/>
+              </w:rPr>
+              <w:t xml:space="preserve">add_columns</w:t>
+            </w:r>
+            <w:r>
+              <w:t xml:space="preserve"> </w:t>
+            </w:r>
+            <w:r>
+              <w:t xml:space="preserve">+</w:t>
+            </w:r>
+            <w:r>
+              <w:t xml:space="preserve"> </w:t>
+            </w:r>
+            <w:r>
+              <w:rPr>
+                <w:rStyle w:val="VerbatimChar"/>
+              </w:rPr>
+              <w:t xml:space="preserve">backfill_uuids</w:t>
+            </w:r>
+            <w:r>
+              <w:t xml:space="preserve"> </w:t>
+            </w:r>
+            <w:r>
+              <w:t xml:space="preserve">→ result dialog with backup path + per-table counts. Same idempotency guard as the vocab-alignment entry.</w:t>
+            </w:r>
+          </w:p>
+        </w:tc>
+      </w:tr>
+    </w:tbl>
+    <w:bookmarkEnd w:id="34"/>
+    <w:bookmarkStart w:id="35" w:name="what-was-tested-5"/>
+    <w:p>
+      <w:pPr>
+        <w:pStyle w:val="Heading2"/>
+      </w:pPr>
+      <w:r>
+        <w:t xml:space="preserve">What was tested</w:t>
+      </w:r>
+    </w:p>
+    <w:p>
+      <w:pPr>
+        <w:pStyle w:val="Compact"/>
+        <w:numPr>
+          <w:ilvl w:val="0"/>
+          <w:numId w:val="1017"/>
+        </w:numPr>
+      </w:pPr>
+      <w:r>
+        <w:rPr>
+          <w:b/>
+          <w:bCs/>
+        </w:rPr>
+        <w:t xml:space="preserve">5 unit tests</w:t>
+      </w:r>
+      <w:r>
+        <w:t xml:space="preserve"> </w:t>
+      </w:r>
+      <w:r>
+        <w:t xml:space="preserve">in</w:t>
+      </w:r>
+      <w:r>
+        <w:t xml:space="preserve"> </w:t>
+      </w:r>
+      <w:r>
+        <w:rPr>
+          <w:rStyle w:val="VerbatimChar"/>
+        </w:rPr>
+        <w:t xml:space="preserve">tests/sync/test_uuid7.py</w:t>
+      </w:r>
+      <w:r>
+        <w:t xml:space="preserve"> </w:t>
+      </w:r>
+      <w:r>
+        <w:t xml:space="preserve">cover the generator:</w:t>
+      </w:r>
+      <w:r>
+        <w:t xml:space="preserve"> </w:t>
+      </w:r>
+      <w:r>
+        <w:t xml:space="preserve">returns a</w:t>
+      </w:r>
+      <w:r>
+        <w:t xml:space="preserve"> </w:t>
+      </w:r>
+      <w:r>
+        <w:rPr>
+          <w:rStyle w:val="VerbatimChar"/>
+        </w:rPr>
+        <w:t xml:space="preserve">uuid.UUID</w:t>
+      </w:r>
+      <w:r>
+        <w:t xml:space="preserve"> </w:t>
+      </w:r>
+      <w:r>
+        <w:t xml:space="preserve">instance, version field is 7, variant is RFC</w:t>
+      </w:r>
+      <w:r>
+        <w:t xml:space="preserve"> </w:t>
+      </w:r>
+      <w:r>
+        <w:t xml:space="preserve">4122 (10xx in byte 8), 1024 successive UUIDs are monotonically</w:t>
+      </w:r>
+      <w:r>
+        <w:t xml:space="preserve"> </w:t>
+      </w:r>
+      <w:r>
+        <w:t xml:space="preserve">ordered, the embedded timestamp falls within ±1 ms of wall clock.</w:t>
+      </w:r>
+    </w:p>
+    <w:p>
+      <w:pPr>
+        <w:pStyle w:val="Compact"/>
+        <w:numPr>
+          <w:ilvl w:val="0"/>
+          <w:numId w:val="1017"/>
+        </w:numPr>
+      </w:pPr>
+      <w:r>
+        <w:rPr>
+          <w:b/>
+          <w:bCs/>
+        </w:rPr>
+        <w:t xml:space="preserve">4 unit tests</w:t>
+      </w:r>
+      <w:r>
+        <w:t xml:space="preserve"> </w:t>
+      </w:r>
+      <w:r>
+        <w:t xml:space="preserve">in</w:t>
+      </w:r>
+      <w:r>
+        <w:t xml:space="preserve"> </w:t>
+      </w:r>
+      <w:r>
+        <w:rPr>
+          <w:rStyle w:val="VerbatimChar"/>
+        </w:rPr>
+        <w:t xml:space="preserve">tests/migrations/test_node_uuid_backfill.py</w:t>
+      </w:r>
+      <w:r>
+        <w:t xml:space="preserve"> </w:t>
+      </w:r>
+      <w:r>
+        <w:t xml:space="preserve">cover the migration: column added on each of the three tables, a</w:t>
+      </w:r>
+      <w:r>
+        <w:t xml:space="preserve"> </w:t>
+      </w:r>
+      <w:r>
+        <w:t xml:space="preserve">unique index named</w:t>
+      </w:r>
+      <w:r>
+        <w:t xml:space="preserve"> </w:t>
+      </w:r>
+      <w:r>
+        <w:rPr>
+          <w:rStyle w:val="VerbatimChar"/>
+        </w:rPr>
+        <w:t xml:space="preserve">node_uuid</w:t>
+      </w:r>
+      <w:r>
+        <w:t xml:space="preserve"> </w:t>
+      </w:r>
+      <w:r>
+        <w:t xml:space="preserve">survives the run, a second</w:t>
+      </w:r>
+      <w:r>
+        <w:t xml:space="preserve"> </w:t>
+      </w:r>
+      <w:r>
+        <w:rPr>
+          <w:rStyle w:val="VerbatimChar"/>
+        </w:rPr>
+        <w:t xml:space="preserve">add_columns</w:t>
+      </w:r>
+      <w:r>
+        <w:t xml:space="preserve"> </w:t>
+      </w:r>
+      <w:r>
+        <w:t xml:space="preserve">run is a no-op (column count stays 1), backfill assigns</w:t>
+      </w:r>
+      <w:r>
+        <w:t xml:space="preserve"> </w:t>
+      </w:r>
+      <w:r>
+        <w:t xml:space="preserve">UUID v7 (canonical 36-char form, version 7 character at index 14,</w:t>
+      </w:r>
+      <w:r>
+        <w:t xml:space="preserve"> </w:t>
+      </w:r>
+      <w:r>
+        <w:t xml:space="preserve">pattern</w:t>
+      </w:r>
+      <w:r>
+        <w:t xml:space="preserve"> </w:t>
+      </w:r>
+      <w:r>
+        <w:rPr>
+          <w:rStyle w:val="VerbatimChar"/>
+        </w:rPr>
+        <w:t xml:space="preserve">xxxxxxxx-xxxx-7xxx-yxxx-xxxxxxxxxxxx</w:t>
+      </w:r>
+      <w:r>
+        <w:t xml:space="preserve">), and a second</w:t>
+      </w:r>
+      <w:r>
+        <w:t xml:space="preserve"> </w:t>
+      </w:r>
+      <w:r>
+        <w:rPr>
+          <w:rStyle w:val="VerbatimChar"/>
+        </w:rPr>
+        <w:t xml:space="preserve">backfill_uuids</w:t>
+      </w:r>
+      <w:r>
+        <w:t xml:space="preserve"> </w:t>
+      </w:r>
+      <w:r>
+        <w:t xml:space="preserve">run returns counts of zero.</w:t>
+      </w:r>
+    </w:p>
+    <w:p>
+      <w:pPr>
+        <w:pStyle w:val="Compact"/>
+        <w:numPr>
+          <w:ilvl w:val="0"/>
+          <w:numId w:val="1017"/>
+        </w:numPr>
+      </w:pPr>
+      <w:r>
+        <w:rPr>
+          <w:b/>
+          <w:bCs/>
+        </w:rPr>
+        <w:t xml:space="preserve">End-to-end dry-run on the real Volterra database</w:t>
+      </w:r>
+      <w:r>
+        <w:t xml:space="preserve">: the CLI reports</w:t>
+      </w:r>
+      <w:r>
+        <w:t xml:space="preserve"> </w:t>
+      </w:r>
+      <w:r>
+        <w:rPr>
+          <w:rStyle w:val="VerbatimChar"/>
+        </w:rPr>
+        <w:t xml:space="preserve">needs ALTER TABLE + backfill (no col)</w:t>
+      </w:r>
+      <w:r>
+        <w:t xml:space="preserve"> </w:t>
+      </w:r>
+      <w:r>
+        <w:t xml:space="preserve">for all three target tables —</w:t>
+      </w:r>
+      <w:r>
+        <w:t xml:space="preserve"> </w:t>
+      </w:r>
+      <w:r>
+        <w:t xml:space="preserve">none currently carry a</w:t>
+      </w:r>
+      <w:r>
+        <w:t xml:space="preserve"> </w:t>
+      </w:r>
+      <w:r>
+        <w:rPr>
+          <w:rStyle w:val="VerbatimChar"/>
+        </w:rPr>
+        <w:t xml:space="preserve">node_uuid</w:t>
+      </w:r>
+      <w:r>
+        <w:t xml:space="preserve"> </w:t>
+      </w:r>
+      <w:r>
+        <w:t xml:space="preserve">column. The migration is safe to</w:t>
+      </w:r>
+      <w:r>
+        <w:t xml:space="preserve"> </w:t>
+      </w:r>
+      <w:r>
+        <w:t xml:space="preserve">run; user has yet to authorise</w:t>
+      </w:r>
+      <w:r>
+        <w:t xml:space="preserve"> </w:t>
+      </w:r>
+      <w:r>
+        <w:rPr>
+          <w:rStyle w:val="VerbatimChar"/>
+        </w:rPr>
+        <w:t xml:space="preserve">--apply</w:t>
+      </w:r>
+      <w:r>
+        <w:t xml:space="preserve">.</w:t>
+      </w:r>
+    </w:p>
+    <w:p>
+      <w:pPr>
+        <w:pStyle w:val="Compact"/>
+        <w:numPr>
+          <w:ilvl w:val="0"/>
+          <w:numId w:val="1017"/>
+        </w:numPr>
+      </w:pPr>
+      <w:r>
+        <w:rPr>
+          <w:b/>
+          <w:bCs/>
+        </w:rPr>
+        <w:t xml:space="preserve">Combined sync + migrations test run</w:t>
+      </w:r>
+      <w:r>
+        <w:t xml:space="preserve">:</w:t>
+      </w:r>
+      <w:r>
+        <w:t xml:space="preserve"> </w:t>
+      </w:r>
+      <w:r>
+        <w:rPr>
+          <w:rStyle w:val="VerbatimChar"/>
+        </w:rPr>
+        <w:t xml:space="preserve">pytest tests/sync/ tests/migrations/ -q</w:t>
+      </w:r>
+      <w:r>
+        <w:t xml:space="preserve"> </w:t>
+      </w:r>
+      <w:r>
+        <w:t xml:space="preserve">→</w:t>
+      </w:r>
+      <w:r>
+        <w:t xml:space="preserve"> </w:t>
+      </w:r>
+      <w:r>
+        <w:rPr>
+          <w:b/>
+          <w:bCs/>
+        </w:rPr>
+        <w:t xml:space="preserve">41 passed in 0.38 s</w:t>
+      </w:r>
+      <w:r>
+        <w:t xml:space="preserve"> </w:t>
+      </w:r>
+      <w:r>
+        <w:t xml:space="preserve">(29 sync + 12</w:t>
+      </w:r>
+      <w:r>
+        <w:t xml:space="preserve"> </w:t>
+      </w:r>
+      <w:r>
+        <w:t xml:space="preserve">migrations). Test count breakdown: 5 vocab_types + 14</w:t>
+      </w:r>
+      <w:r>
+        <w:t xml:space="preserve"> </w:t>
+      </w:r>
+      <w:r>
+        <w:t xml:space="preserve">vocab_provider_core + 2 vocab_provider_smoke + 5 i18n compat + 5</w:t>
+      </w:r>
+      <w:r>
+        <w:t xml:space="preserve"> </w:t>
+      </w:r>
+      <w:r>
+        <w:t xml:space="preserve">uuid7 + 3 migration common + 5 us_vocabulary_alignment + 4</w:t>
+      </w:r>
+      <w:r>
+        <w:t xml:space="preserve"> </w:t>
+      </w:r>
+      <w:r>
+        <w:t xml:space="preserve">node_uuid_backfill = 41.</w:t>
+      </w:r>
+    </w:p>
+    <w:bookmarkEnd w:id="35"/>
+    <w:bookmarkStart w:id="36" w:name="decisions-taken-5"/>
+    <w:p>
+      <w:pPr>
+        <w:pStyle w:val="Heading2"/>
+      </w:pPr>
+      <w:r>
+        <w:t xml:space="preserve">Decisions taken</w:t>
+      </w:r>
+    </w:p>
+    <w:p>
+      <w:pPr>
+        <w:pStyle w:val="Compact"/>
+        <w:numPr>
+          <w:ilvl w:val="0"/>
+          <w:numId w:val="1018"/>
+        </w:numPr>
+      </w:pPr>
+      <w:r>
+        <w:rPr>
+          <w:b/>
+          <w:bCs/>
+        </w:rPr>
+        <w:t xml:space="preserve">Local UUID v7 instead of a third-party dependency.</w:t>
+      </w:r>
+      <w:r>
+        <w:t xml:space="preserve"> </w:t>
+      </w:r>
+      <w:r>
+        <w:t xml:space="preserve">Python’s</w:t>
+      </w:r>
+      <w:r>
+        <w:t xml:space="preserve"> </w:t>
+      </w:r>
+      <w:r>
+        <w:t xml:space="preserve">stdlib</w:t>
+      </w:r>
+      <w:r>
+        <w:t xml:space="preserve"> </w:t>
+      </w:r>
+      <w:r>
+        <w:rPr>
+          <w:rStyle w:val="VerbatimChar"/>
+        </w:rPr>
+        <w:t xml:space="preserve">uuid</w:t>
+      </w:r>
+      <w:r>
+        <w:t xml:space="preserve"> </w:t>
+      </w:r>
+      <w:r>
+        <w:t xml:space="preserve">module gains</w:t>
+      </w:r>
+      <w:r>
+        <w:t xml:space="preserve"> </w:t>
+      </w:r>
+      <w:r>
+        <w:rPr>
+          <w:rStyle w:val="VerbatimChar"/>
+        </w:rPr>
+        <w:t xml:space="preserve">uuid7()</w:t>
+      </w:r>
+      <w:r>
+        <w:t xml:space="preserve"> </w:t>
+      </w:r>
+      <w:r>
+        <w:t xml:space="preserve">only at 3.14 (currently</w:t>
+      </w:r>
+      <w:r>
+        <w:t xml:space="preserve"> </w:t>
+      </w:r>
+      <w:r>
+        <w:t xml:space="preserve">unreleased at the time of this work); the project still has to</w:t>
+      </w:r>
+      <w:r>
+        <w:t xml:space="preserve"> </w:t>
+      </w:r>
+      <w:r>
+        <w:t xml:space="preserve">support QGIS Python 3.9+. A 30-line in-repo implementation is</w:t>
+      </w:r>
+      <w:r>
+        <w:t xml:space="preserve"> </w:t>
+      </w:r>
+      <w:r>
+        <w:t xml:space="preserve">cheaper than adding a</w:t>
+      </w:r>
+      <w:r>
+        <w:t xml:space="preserve"> </w:t>
+      </w:r>
+      <w:r>
+        <w:rPr>
+          <w:rStyle w:val="VerbatimChar"/>
+        </w:rPr>
+        <w:t xml:space="preserve">uuid7</w:t>
+      </w:r>
+      <w:r>
+        <w:t xml:space="preserve"> </w:t>
+      </w:r>
+      <w:r>
+        <w:t xml:space="preserve">package to</w:t>
+      </w:r>
+      <w:r>
+        <w:t xml:space="preserve"> </w:t>
+      </w:r>
+      <w:r>
+        <w:rPr>
+          <w:rStyle w:val="VerbatimChar"/>
+        </w:rPr>
+        <w:t xml:space="preserve">requirements.txt</w:t>
+      </w:r>
+      <w:r>
+        <w:t xml:space="preserve"> </w:t>
+      </w:r>
+      <w:r>
+        <w:t xml:space="preserve">and</w:t>
+      </w:r>
+      <w:r>
+        <w:t xml:space="preserve"> </w:t>
+      </w:r>
+      <w:r>
+        <w:t xml:space="preserve">routing it through the runtime installer. The public API is just</w:t>
+      </w:r>
+      <w:r>
+        <w:t xml:space="preserve"> </w:t>
+      </w:r>
+      <w:r>
+        <w:rPr>
+          <w:rStyle w:val="VerbatimChar"/>
+        </w:rPr>
+        <w:t xml:space="preserve">uuid7() -&gt; uuid.UUID</w:t>
+      </w:r>
+      <w:r>
+        <w:t xml:space="preserve"> </w:t>
+      </w:r>
+      <w:r>
+        <w:t xml:space="preserve">so the swap to stdlib later is a one-line</w:t>
+      </w:r>
+      <w:r>
+        <w:t xml:space="preserve"> </w:t>
+      </w:r>
+      <w:r>
+        <w:t xml:space="preserve">import change.</w:t>
+      </w:r>
+    </w:p>
+    <w:p>
+      <w:pPr>
+        <w:pStyle w:val="Compact"/>
+        <w:numPr>
+          <w:ilvl w:val="0"/>
+          <w:numId w:val="1018"/>
+        </w:numPr>
+      </w:pPr>
+      <w:r>
+        <w:rPr>
+          <w:b/>
+          <w:bCs/>
+        </w:rPr>
+        <w:t xml:space="preserve">Partial unique index instead of plain unique.</w:t>
+      </w:r>
+      <w:r>
+        <w:t xml:space="preserve"> </w:t>
+      </w:r>
+      <w:r>
+        <w:t xml:space="preserve">The index is</w:t>
+      </w:r>
+      <w:r>
+        <w:t xml:space="preserve"> </w:t>
+      </w:r>
+      <w:r>
+        <w:t xml:space="preserve">declared</w:t>
+      </w:r>
+      <w:r>
+        <w:t xml:space="preserve"> </w:t>
+      </w:r>
+      <w:r>
+        <w:rPr>
+          <w:rStyle w:val="VerbatimChar"/>
+        </w:rPr>
+        <w:t xml:space="preserve">CREATE UNIQUE INDEX … WHERE node_uuid IS NOT NULL</w:t>
+      </w:r>
+      <w:r>
+        <w:t xml:space="preserve">. This</w:t>
+      </w:r>
+      <w:r>
+        <w:t xml:space="preserve"> </w:t>
+      </w:r>
+      <w:r>
+        <w:t xml:space="preserve">matters during</w:t>
+      </w:r>
+      <w:r>
+        <w:t xml:space="preserve"> </w:t>
+      </w:r>
+      <w:r>
+        <w:rPr>
+          <w:rStyle w:val="VerbatimChar"/>
+        </w:rPr>
+        <w:t xml:space="preserve">--apply</w:t>
+      </w:r>
+      <w:r>
+        <w:t xml:space="preserve"> </w:t>
+      </w:r>
+      <w:r>
+        <w:t xml:space="preserve">recovery scenarios: if</w:t>
+      </w:r>
+      <w:r>
+        <w:t xml:space="preserve"> </w:t>
+      </w:r>
+      <w:r>
+        <w:rPr>
+          <w:rStyle w:val="VerbatimChar"/>
+        </w:rPr>
+        <w:t xml:space="preserve">add_columns</w:t>
+      </w:r>
+      <w:r>
+        <w:t xml:space="preserve"> </w:t>
+      </w:r>
+      <w:r>
+        <w:t xml:space="preserve">succeeded but</w:t>
+      </w:r>
+      <w:r>
+        <w:t xml:space="preserve"> </w:t>
+      </w:r>
+      <w:r>
+        <w:rPr>
+          <w:rStyle w:val="VerbatimChar"/>
+        </w:rPr>
+        <w:t xml:space="preserve">backfill_uuids</w:t>
+      </w:r>
+      <w:r>
+        <w:t xml:space="preserve"> </w:t>
+      </w:r>
+      <w:r>
+        <w:t xml:space="preserve">failed midway, the partially</w:t>
+      </w:r>
+      <w:r>
+        <w:t xml:space="preserve"> </w:t>
+      </w:r>
+      <w:r>
+        <w:t xml:space="preserve">populated table has many NULL</w:t>
+      </w:r>
+      <w:r>
+        <w:t xml:space="preserve"> </w:t>
+      </w:r>
+      <w:r>
+        <w:rPr>
+          <w:rStyle w:val="VerbatimChar"/>
+        </w:rPr>
+        <w:t xml:space="preserve">node_uuid</w:t>
+      </w:r>
+      <w:r>
+        <w:t xml:space="preserve"> </w:t>
+      </w:r>
+      <w:r>
+        <w:t xml:space="preserve">rows — a plain unique</w:t>
+      </w:r>
+      <w:r>
+        <w:t xml:space="preserve"> </w:t>
+      </w:r>
+      <w:r>
+        <w:t xml:space="preserve">index would reject those because a single NULL is fine but two</w:t>
+      </w:r>
+      <w:r>
+        <w:t xml:space="preserve"> </w:t>
+      </w:r>
+      <w:r>
+        <w:t xml:space="preserve">NULLs are not under the SQLite default. The partial predicate</w:t>
+      </w:r>
+      <w:r>
+        <w:t xml:space="preserve"> </w:t>
+      </w:r>
+      <w:r>
+        <w:t xml:space="preserve">excludes NULLs from the uniqueness check, so a re-run picks up</w:t>
+      </w:r>
+      <w:r>
+        <w:t xml:space="preserve"> </w:t>
+      </w:r>
+      <w:r>
+        <w:t xml:space="preserve">where the previous one left off without dropping the index.</w:t>
+      </w:r>
+    </w:p>
+    <w:p>
+      <w:pPr>
+        <w:pStyle w:val="Compact"/>
+        <w:numPr>
+          <w:ilvl w:val="0"/>
+          <w:numId w:val="1018"/>
+        </w:numPr>
+      </w:pPr>
+      <w:r>
+        <w:rPr>
+          <w:b/>
+          <w:bCs/>
+        </w:rPr>
+        <w:t xml:space="preserve">Three target tables only.</w:t>
+      </w:r>
+      <w:r>
+        <w:t xml:space="preserve"> </w:t>
+      </w:r>
+      <w:r>
+        <w:rPr>
+          <w:rStyle w:val="VerbatimChar"/>
+        </w:rPr>
+        <w:t xml:space="preserve">tomba_table</w:t>
+      </w:r>
+      <w:r>
+        <w:t xml:space="preserve"> </w:t>
+      </w:r>
+      <w:r>
+        <w:t xml:space="preserve">is intentionally</w:t>
+      </w:r>
+      <w:r>
+        <w:t xml:space="preserve"> </w:t>
+      </w:r>
+      <w:r>
+        <w:t xml:space="preserve">excluded per spec §4.5 last paragraph — burial records are out of</w:t>
+      </w:r>
+      <w:r>
+        <w:t xml:space="preserve"> </w:t>
+      </w:r>
+      <w:r>
+        <w:t xml:space="preserve">scope for the bridge in Phase 1.</w:t>
+      </w:r>
+      <w:r>
+        <w:t xml:space="preserve"> </w:t>
+      </w:r>
+      <w:r>
+        <w:rPr>
+          <w:rStyle w:val="VerbatimChar"/>
+        </w:rPr>
+        <w:t xml:space="preserve">site_table</w:t>
+      </w:r>
+      <w:r>
+        <w:t xml:space="preserve"> </w:t>
+      </w:r>
+      <w:r>
+        <w:t xml:space="preserve">is also excluded</w:t>
+      </w:r>
+      <w:r>
+        <w:t xml:space="preserve"> </w:t>
+      </w:r>
+      <w:r>
+        <w:t xml:space="preserve">because site-level metadata maps to a different family of s3Dgraphy</w:t>
+      </w:r>
+      <w:r>
+        <w:t xml:space="preserve"> </w:t>
+      </w:r>
+      <w:r>
+        <w:t xml:space="preserve">nodes (handled at the property level, not as a typed graph node).</w:t>
+      </w:r>
+      <w:r>
+        <w:t xml:space="preserve"> </w:t>
+      </w:r>
+      <w:r>
+        <w:t xml:space="preserve">These exclusions are documented in the spec and will be revisited</w:t>
+      </w:r>
+      <w:r>
+        <w:t xml:space="preserve"> </w:t>
+      </w:r>
+      <w:r>
+        <w:t xml:space="preserve">if Phase 2 ingestion proves they need their own UUIDs.</w:t>
+      </w:r>
+    </w:p>
+    <w:p>
+      <w:pPr>
+        <w:pStyle w:val="Compact"/>
+        <w:numPr>
+          <w:ilvl w:val="0"/>
+          <w:numId w:val="1018"/>
+        </w:numPr>
+      </w:pPr>
+      <w:r>
+        <w:rPr>
+          <w:b/>
+          <w:bCs/>
+        </w:rPr>
+        <w:t xml:space="preserve">No PostgreSQL path in Phase 1.</w:t>
+      </w:r>
+      <w:r>
+        <w:t xml:space="preserve"> </w:t>
+      </w:r>
+      <w:r>
+        <w:t xml:space="preserve">SQLite-only for now. The same</w:t>
+      </w:r>
+      <w:r>
+        <w:t xml:space="preserve"> </w:t>
+      </w:r>
+      <w:r>
+        <w:t xml:space="preserve">logic will move to SQLAlchemy</w:t>
+      </w:r>
+      <w:r>
+        <w:t xml:space="preserve"> </w:t>
+      </w:r>
+      <w:r>
+        <w:rPr>
+          <w:rStyle w:val="VerbatimChar"/>
+        </w:rPr>
+        <w:t xml:space="preserve">text()</w:t>
+      </w:r>
+      <w:r>
+        <w:t xml:space="preserve"> </w:t>
+      </w:r>
+      <w:r>
+        <w:t xml:space="preserve">in Phase 2 when</w:t>
+      </w:r>
+      <w:r>
+        <w:t xml:space="preserve"> </w:t>
+      </w:r>
+      <w:r>
+        <w:rPr>
+          <w:rStyle w:val="VerbatimChar"/>
+        </w:rPr>
+        <w:t xml:space="preserve">GraphProjector</w:t>
+      </w:r>
+      <w:r>
+        <w:t xml:space="preserve"> </w:t>
+      </w:r>
+      <w:r>
+        <w:t xml:space="preserve">lands and starts consuming the</w:t>
+      </w:r>
+      <w:r>
+        <w:t xml:space="preserve"> </w:t>
+      </w:r>
+      <w:r>
+        <w:rPr>
+          <w:rStyle w:val="VerbatimChar"/>
+        </w:rPr>
+        <w:t xml:space="preserve">node_uuid</w:t>
+      </w:r>
+      <w:r>
+        <w:t xml:space="preserve"> </w:t>
+      </w:r>
+      <w:r>
+        <w:t xml:space="preserve">column</w:t>
+      </w:r>
+      <w:r>
+        <w:t xml:space="preserve"> </w:t>
+      </w:r>
+      <w:r>
+        <w:t xml:space="preserve">in real reads. The CLI already takes a</w:t>
+      </w:r>
+      <w:r>
+        <w:t xml:space="preserve"> </w:t>
+      </w:r>
+      <w:r>
+        <w:rPr>
+          <w:rStyle w:val="VerbatimChar"/>
+        </w:rPr>
+        <w:t xml:space="preserve">--db</w:t>
+      </w:r>
+      <w:r>
+        <w:t xml:space="preserve"> </w:t>
+      </w:r>
+      <w:r>
+        <w:t xml:space="preserve">path so a future</w:t>
+      </w:r>
+      <w:r>
+        <w:t xml:space="preserve"> </w:t>
+      </w:r>
+      <w:r>
+        <w:t xml:space="preserve">PostgreSQL DSN form (</w:t>
+      </w:r>
+      <w:r>
+        <w:rPr>
+          <w:rStyle w:val="VerbatimChar"/>
+        </w:rPr>
+        <w:t xml:space="preserve">postgresql://…</w:t>
+      </w:r>
+      <w:r>
+        <w:t xml:space="preserve">) plugs in cleanly.</w:t>
+      </w:r>
+    </w:p>
+    <w:bookmarkEnd w:id="36"/>
+    <w:bookmarkStart w:id="37" w:name="operational-notes-1"/>
+    <w:p>
+      <w:pPr>
+        <w:pStyle w:val="Heading2"/>
+      </w:pPr>
+      <w:r>
+        <w:t xml:space="preserve">Operational notes</w:t>
+      </w:r>
+    </w:p>
+    <w:p>
+      <w:pPr>
+        <w:pStyle w:val="Compact"/>
+        <w:numPr>
+          <w:ilvl w:val="0"/>
+          <w:numId w:val="1019"/>
+        </w:numPr>
+      </w:pPr>
+      <w:r>
+        <w:rPr>
+          <w:b/>
+          <w:bCs/>
+        </w:rPr>
+        <w:t xml:space="preserve">Volterra database</w:t>
+      </w:r>
+      <w:r>
+        <w:t xml:space="preserve"> </w:t>
+      </w:r>
+      <w:r>
+        <w:t xml:space="preserve">has none of the three target columns yet. The</w:t>
+      </w:r>
+      <w:r>
+        <w:t xml:space="preserve"> </w:t>
+      </w:r>
+      <w:r>
+        <w:rPr>
+          <w:rStyle w:val="VerbatimChar"/>
+        </w:rPr>
+        <w:t xml:space="preserve">--apply</w:t>
+      </w:r>
+      <w:r>
+        <w:t xml:space="preserve"> </w:t>
+      </w:r>
+      <w:r>
+        <w:t xml:space="preserve">will create all three columns, the partial unique indexes,</w:t>
+      </w:r>
+      <w:r>
+        <w:t xml:space="preserve"> </w:t>
+      </w:r>
+      <w:r>
+        <w:t xml:space="preserve">and assign UUID v7 to every existing row. With ~1500 US rows and</w:t>
+      </w:r>
+      <w:r>
+        <w:t xml:space="preserve"> </w:t>
+      </w:r>
+      <w:r>
+        <w:t xml:space="preserve">several hundred inventario_materiali / periodizzazione rows, the</w:t>
+      </w:r>
+      <w:r>
+        <w:t xml:space="preserve"> </w:t>
+      </w:r>
+      <w:r>
+        <w:t xml:space="preserve">whole migration takes a fraction of a second.</w:t>
+      </w:r>
+    </w:p>
+    <w:p>
+      <w:pPr>
+        <w:pStyle w:val="Compact"/>
+        <w:numPr>
+          <w:ilvl w:val="0"/>
+          <w:numId w:val="1019"/>
+        </w:numPr>
+      </w:pPr>
+      <w:r>
+        <w:rPr>
+          <w:b/>
+          <w:bCs/>
+        </w:rPr>
+        <w:t xml:space="preserve">Rollback strategy</w:t>
+      </w:r>
+      <w:r>
+        <w:t xml:space="preserve"> </w:t>
+      </w:r>
+      <w:r>
+        <w:t xml:space="preserve">is the same as Group D: the auto-backup is</w:t>
+      </w:r>
+      <w:r>
+        <w:t xml:space="preserve"> </w:t>
+      </w:r>
+      <w:r>
+        <w:t xml:space="preserve">named</w:t>
+      </w:r>
+      <w:r>
+        <w:t xml:space="preserve"> </w:t>
+      </w:r>
+      <w:r>
+        <w:rPr>
+          <w:rStyle w:val="VerbatimChar"/>
+        </w:rPr>
+        <w:t xml:space="preserve">&lt;db&gt;.pre_node_uuid_backfill_&lt;UTC&gt;</w:t>
+      </w:r>
+      <w:r>
+        <w:t xml:space="preserve"> </w:t>
+      </w:r>
+      <w:r>
+        <w:t xml:space="preserve">and lives next to the</w:t>
+      </w:r>
+      <w:r>
+        <w:t xml:space="preserve"> </w:t>
+      </w:r>
+      <w:r>
+        <w:t xml:space="preserve">source DB. Restoring is</w:t>
+      </w:r>
+      <w:r>
+        <w:t xml:space="preserve"> </w:t>
+      </w:r>
+      <w:r>
+        <w:rPr>
+          <w:rStyle w:val="VerbatimChar"/>
+        </w:rPr>
+        <w:t xml:space="preserve">--rollback &lt;backup_path&gt;</w:t>
+      </w:r>
+      <w:r>
+        <w:t xml:space="preserve">. Combined with</w:t>
+      </w:r>
+      <w:r>
+        <w:t xml:space="preserve"> </w:t>
+      </w:r>
+      <w:r>
+        <w:t xml:space="preserve">Group D’s vocab-alignment migration, a user can chain the two</w:t>
+      </w:r>
+      <w:r>
+        <w:t xml:space="preserve"> </w:t>
+      </w:r>
+      <w:r>
+        <w:t xml:space="preserve">rollbacks if needed (latest backup first, reverse-chronological).</w:t>
+      </w:r>
+    </w:p>
+    <w:bookmarkEnd w:id="37"/>
+    <w:bookmarkEnd w:id="38"/>
     <w:sectPr>
       <w:footnotePr>
         <w:numRestart w:val="eachSect"/>
@@ -7691,6 +9321,15 @@
     <w:abstractNumId w:val="991"/>
   </w:num>
   <w:num w:numId="1016">
+    <w:abstractNumId w:val="991"/>
+  </w:num>
+  <w:num w:numId="1017">
+    <w:abstractNumId w:val="991"/>
+  </w:num>
+  <w:num w:numId="1018">
+    <w:abstractNumId w:val="991"/>
+  </w:num>
+  <w:num w:numId="1019">
     <w:abstractNumId w:val="991"/>
   </w:num>
 </w:numbering>

</xml_diff>

<commit_message>
docs(dev-log): Group F entry — 12-file modules/s3dgraphy/ refactor
9 commits (222ea2e0 → 349358af). 7 production files refactored
(cidoc_crm_mapper, s3dgraphy_integration, s3dgraphy_dot_bridge,
matrix_graph_visualizer, plotly_visualizer, simple_graph_visualizer,
graphviz_visualizer); 4 audit-only verified clean. In-flight fix
349358af extends VocabProviderCore to accept both fixture and real
0.1.40 JSON shapes for visual rules and connections version. 42 tests
passing.
</commit_message>
<xml_diff>
--- a/docs/superpowers/dev-log/T5.4_PyArchInit_Dev_Log.docx
+++ b/docs/superpowers/dev-log/T5.4_PyArchInit_Dev_Log.docx
@@ -906,7 +906,17 @@
               <w:pStyle w:val="Compact"/>
             </w:pPr>
             <w:r>
-              <w:t xml:space="preserve">Pending</w:t>
+              <w:rPr>
+                <w:b/>
+                <w:bCs/>
+              </w:rPr>
+              <w:t xml:space="preserve">Done</w:t>
+            </w:r>
+            <w:r>
+              <w:t xml:space="preserve"> </w:t>
+            </w:r>
+            <w:r>
+              <w:t xml:space="preserve">(2026-05-07)</w:t>
             </w:r>
           </w:p>
         </w:tc>
@@ -8945,8 +8955,1743 @@
         <w:t xml:space="preserve">rollbacks if needed (latest backup first, reverse-chronological).</w:t>
       </w:r>
     </w:p>
+    <w:p>
+      <w:r>
+        <w:pict>
+          <v:rect style="width:0;height:1.5pt" o:hralign="center" o:hrstd="t" o:hr="t"/>
+        </w:pict>
+      </w:r>
+    </w:p>
     <w:bookmarkEnd w:id="37"/>
     <w:bookmarkEnd w:id="38"/>
+    <w:bookmarkStart w:id="44" w:name="X50069ce80fb74b547b75e29658e7f31083de1dd"/>
+    <w:p>
+      <w:pPr>
+        <w:pStyle w:val="Heading1"/>
+      </w:pPr>
+      <w:r>
+        <w:t xml:space="preserve">Group F —</w:t>
+      </w:r>
+      <w:r>
+        <w:t xml:space="preserve"> </w:t>
+      </w:r>
+      <w:r>
+        <w:rPr>
+          <w:rStyle w:val="VerbatimChar"/>
+        </w:rPr>
+        <w:t xml:space="preserve">modules/s3dgraphy/</w:t>
+      </w:r>
+      <w:r>
+        <w:t xml:space="preserve"> </w:t>
+      </w:r>
+      <w:r>
+        <w:t xml:space="preserve">refactor (12 files)</w:t>
+      </w:r>
+    </w:p>
+    <w:p>
+      <w:pPr>
+        <w:pStyle w:val="FirstParagraph"/>
+      </w:pPr>
+      <w:r>
+        <w:rPr>
+          <w:b/>
+          <w:bCs/>
+        </w:rPr>
+        <w:t xml:space="preserve">Date:</w:t>
+      </w:r>
+      <w:r>
+        <w:t xml:space="preserve"> </w:t>
+      </w:r>
+      <w:r>
+        <w:t xml:space="preserve">7 May 2026 ·</w:t>
+      </w:r>
+      <w:r>
+        <w:t xml:space="preserve"> </w:t>
+      </w:r>
+      <w:r>
+        <w:rPr>
+          <w:b/>
+          <w:bCs/>
+        </w:rPr>
+        <w:t xml:space="preserve">Status:</w:t>
+      </w:r>
+      <w:r>
+        <w:t xml:space="preserve"> </w:t>
+      </w:r>
+      <w:r>
+        <w:t xml:space="preserve">Done ·</w:t>
+      </w:r>
+      <w:r>
+        <w:t xml:space="preserve"> </w:t>
+      </w:r>
+      <w:r>
+        <w:rPr>
+          <w:b/>
+          <w:bCs/>
+        </w:rPr>
+        <w:t xml:space="preserve">Commits:</w:t>
+      </w:r>
+      <w:r>
+        <w:t xml:space="preserve"> </w:t>
+      </w:r>
+      <w:r>
+        <w:t xml:space="preserve">9</w:t>
+      </w:r>
+      <w:r>
+        <w:t xml:space="preserve"> </w:t>
+      </w:r>
+      <w:r>
+        <w:t xml:space="preserve">(</w:t>
+      </w:r>
+      <w:r>
+        <w:rPr>
+          <w:rStyle w:val="VerbatimChar"/>
+        </w:rPr>
+        <w:t xml:space="preserve">222ea2e0</w:t>
+      </w:r>
+      <w:r>
+        <w:t xml:space="preserve"> </w:t>
+      </w:r>
+      <w:r>
+        <w:t xml:space="preserve">→</w:t>
+      </w:r>
+      <w:r>
+        <w:t xml:space="preserve"> </w:t>
+      </w:r>
+      <w:r>
+        <w:rPr>
+          <w:rStyle w:val="VerbatimChar"/>
+        </w:rPr>
+        <w:t xml:space="preserve">349358af</w:t>
+      </w:r>
+      <w:r>
+        <w:t xml:space="preserve">)</w:t>
+      </w:r>
+    </w:p>
+    <w:bookmarkStart w:id="39" w:name="what-was-built-6"/>
+    <w:p>
+      <w:pPr>
+        <w:pStyle w:val="Heading2"/>
+      </w:pPr>
+      <w:r>
+        <w:t xml:space="preserve">What was built</w:t>
+      </w:r>
+    </w:p>
+    <w:p>
+      <w:pPr>
+        <w:pStyle w:val="FirstParagraph"/>
+      </w:pPr>
+      <w:r>
+        <w:t xml:space="preserve">The 12 files under</w:t>
+      </w:r>
+      <w:r>
+        <w:t xml:space="preserve"> </w:t>
+      </w:r>
+      <w:r>
+        <w:rPr>
+          <w:rStyle w:val="VerbatimChar"/>
+        </w:rPr>
+        <w:t xml:space="preserve">modules/s3dgraphy/</w:t>
+      </w:r>
+      <w:r>
+        <w:t xml:space="preserve"> </w:t>
+      </w:r>
+      <w:r>
+        <w:t xml:space="preserve">were audited and, where</w:t>
+      </w:r>
+      <w:r>
+        <w:t xml:space="preserve"> </w:t>
+      </w:r>
+      <w:r>
+        <w:t xml:space="preserve">applicable, refactored to consult</w:t>
+      </w:r>
+      <w:r>
+        <w:t xml:space="preserve"> </w:t>
+      </w:r>
+      <w:r>
+        <w:rPr>
+          <w:rStyle w:val="VerbatimChar"/>
+        </w:rPr>
+        <w:t xml:space="preserve">VocabProvider</w:t>
+      </w:r>
+      <w:r>
+        <w:t xml:space="preserve"> </w:t>
+      </w:r>
+      <w:r>
+        <w:t xml:space="preserve">instead of hardcoded</w:t>
+      </w:r>
+      <w:r>
+        <w:t xml:space="preserve"> </w:t>
+      </w:r>
+      <w:r>
+        <w:t xml:space="preserve">EM 1.4 tables. Per-file commits keep any individual regression</w:t>
+      </w:r>
+      <w:r>
+        <w:t xml:space="preserve"> </w:t>
+      </w:r>
+      <w:r>
+        <w:t xml:space="preserve">selectively</w:t>
+      </w:r>
+      <w:r>
+        <w:t xml:space="preserve"> </w:t>
+      </w:r>
+      <w:r>
+        <w:rPr>
+          <w:rStyle w:val="VerbatimChar"/>
+        </w:rPr>
+        <w:t xml:space="preserve">git revert</w:t>
+      </w:r>
+      <w:r>
+        <w:t xml:space="preserve">-able. The disposition matrix:</w:t>
+      </w:r>
+    </w:p>
+    <w:tbl>
+      <w:tblPr>
+        <w:tblStyle w:val="Table"/>
+        <w:tblW w:type="pct" w:w="5000"/>
+        <w:tblLayout w:type="fixed"/>
+        <w:tblLook w:firstRow="1" w:lastRow="0" w:firstColumn="0" w:lastColumn="0" w:noHBand="0" w:noVBand="0" w:val="0020"/>
+      </w:tblPr>
+      <w:tblGrid>
+        <w:gridCol w:w="2640"/>
+        <w:gridCol w:w="2640"/>
+        <w:gridCol w:w="2640"/>
+      </w:tblGrid>
+      <w:tr>
+        <w:trPr>
+          <w:tblHeader w:val="on"/>
+        </w:trPr>
+        <w:tc>
+          <w:tcPr/>
+          <w:p>
+            <w:pPr>
+              <w:pStyle w:val="Compact"/>
+            </w:pPr>
+            <w:r>
+              <w:t xml:space="preserve">File</w:t>
+            </w:r>
+          </w:p>
+        </w:tc>
+        <w:tc>
+          <w:tcPr/>
+          <w:p>
+            <w:pPr>
+              <w:pStyle w:val="Compact"/>
+            </w:pPr>
+            <w:r>
+              <w:t xml:space="preserve">Disposition</w:t>
+            </w:r>
+          </w:p>
+        </w:tc>
+        <w:tc>
+          <w:tcPr/>
+          <w:p>
+            <w:pPr>
+              <w:pStyle w:val="Compact"/>
+            </w:pPr>
+            <w:r>
+              <w:t xml:space="preserve">Rationale</w:t>
+            </w:r>
+          </w:p>
+        </w:tc>
+      </w:tr>
+      <w:tr>
+        <w:tc>
+          <w:tcPr/>
+          <w:p>
+            <w:pPr>
+              <w:pStyle w:val="Compact"/>
+            </w:pPr>
+            <w:r>
+              <w:rPr>
+                <w:rStyle w:val="VerbatimChar"/>
+              </w:rPr>
+              <w:t xml:space="preserve">cidoc_crm_mapper.py</w:t>
+            </w:r>
+          </w:p>
+        </w:tc>
+        <w:tc>
+          <w:tcPr/>
+          <w:p>
+            <w:pPr>
+              <w:pStyle w:val="Compact"/>
+            </w:pPr>
+            <w:r>
+              <w:t xml:space="preserve">refactored</w:t>
+            </w:r>
+          </w:p>
+        </w:tc>
+        <w:tc>
+          <w:tcPr/>
+          <w:p>
+            <w:pPr>
+              <w:pStyle w:val="Compact"/>
+            </w:pPr>
+            <w:r>
+              <w:rPr>
+                <w:rStyle w:val="VerbatimChar"/>
+              </w:rPr>
+              <w:t xml:space="preserve">CRM_CLASSES</w:t>
+            </w:r>
+            <w:r>
+              <w:t xml:space="preserve"> </w:t>
+            </w:r>
+            <w:r>
+              <w:t xml:space="preserve">was a hardcoded 12-key dict; replaced with a</w:t>
+            </w:r>
+            <w:r>
+              <w:t xml:space="preserve"> </w:t>
+            </w:r>
+            <w:r>
+              <w:rPr>
+                <w:rStyle w:val="VerbatimChar"/>
+              </w:rPr>
+              <w:t xml:space="preserve">@property</w:t>
+            </w:r>
+            <w:r>
+              <w:t xml:space="preserve"> </w:t>
+            </w:r>
+            <w:r>
+              <w:t xml:space="preserve">overlaying</w:t>
+            </w:r>
+            <w:r>
+              <w:t xml:space="preserve"> </w:t>
+            </w:r>
+            <w:r>
+              <w:rPr>
+                <w:rStyle w:val="VerbatimChar"/>
+              </w:rPr>
+              <w:t xml:space="preserve">VocabProvider.get_unit_types().cidoc_class</w:t>
+            </w:r>
+            <w:r>
+              <w:t xml:space="preserve"> </w:t>
+            </w:r>
+            <w:r>
+              <w:t xml:space="preserve">onto a</w:t>
+            </w:r>
+            <w:r>
+              <w:t xml:space="preserve"> </w:t>
+            </w:r>
+            <w:r>
+              <w:rPr>
+                <w:rStyle w:val="VerbatimChar"/>
+              </w:rPr>
+              <w:t xml:space="preserve">_LEGACY_CRM_FALLBACK</w:t>
+            </w:r>
+            <w:r>
+              <w:t xml:space="preserve">. The property still returns a</w:t>
+            </w:r>
+            <w:r>
+              <w:t xml:space="preserve"> </w:t>
+            </w:r>
+            <w:r>
+              <w:rPr>
+                <w:rStyle w:val="VerbatimChar"/>
+              </w:rPr>
+              <w:t xml:space="preserve">dict</w:t>
+            </w:r>
+            <w:r>
+              <w:t xml:space="preserve">, so the existing</w:t>
+            </w:r>
+            <w:r>
+              <w:t xml:space="preserve"> </w:t>
+            </w:r>
+            <w:r>
+              <w:rPr>
+                <w:rStyle w:val="VerbatimChar"/>
+              </w:rPr>
+              <w:t xml:space="preserve">mapper.CRM_CLASSES["stratigraphic_unit"]</w:t>
+            </w:r>
+            <w:r>
+              <w:t xml:space="preserve"> </w:t>
+            </w:r>
+            <w:r>
+              <w:t xml:space="preserve">lookups in 3 call sites keep working unchanged. The overlay grew the effective dictionary from 12 to 34 keys on the 0.1.40 vendor.</w:t>
+            </w:r>
+          </w:p>
+        </w:tc>
+      </w:tr>
+      <w:tr>
+        <w:tc>
+          <w:tcPr/>
+          <w:p>
+            <w:pPr>
+              <w:pStyle w:val="Compact"/>
+            </w:pPr>
+            <w:r>
+              <w:rPr>
+                <w:rStyle w:val="VerbatimChar"/>
+              </w:rPr>
+              <w:t xml:space="preserve">s3dgraphy_integration.py</w:t>
+            </w:r>
+          </w:p>
+        </w:tc>
+        <w:tc>
+          <w:tcPr/>
+          <w:p>
+            <w:pPr>
+              <w:pStyle w:val="Compact"/>
+            </w:pPr>
+            <w:r>
+              <w:t xml:space="preserve">refactored</w:t>
+            </w:r>
+          </w:p>
+        </w:tc>
+        <w:tc>
+          <w:tcPr/>
+          <w:p>
+            <w:pPr>
+              <w:pStyle w:val="Compact"/>
+            </w:pPr>
+            <w:r>
+              <w:t xml:space="preserve">Single string-literal assignment</w:t>
+            </w:r>
+            <w:r>
+              <w:t xml:space="preserve"> </w:t>
+            </w:r>
+            <w:r>
+              <w:rPr>
+                <w:rStyle w:val="VerbatimChar"/>
+              </w:rPr>
+              <w:t xml:space="preserve">node.node_type = 'virtual_reconstruction'</w:t>
+            </w:r>
+            <w:r>
+              <w:t xml:space="preserve"> </w:t>
+            </w:r>
+            <w:r>
+              <w:t xml:space="preserve">(line 113) routed through a local legacy-to-s3Dgraphy mapping that resolves to</w:t>
+            </w:r>
+            <w:r>
+              <w:t xml:space="preserve"> </w:t>
+            </w:r>
+            <w:r>
+              <w:rPr>
+                <w:rStyle w:val="VerbatimChar"/>
+              </w:rPr>
+              <w:t xml:space="preserve">'USVs'</w:t>
+            </w:r>
+            <w:r>
+              <w:t xml:space="preserve">. Two further occurrences flagged by Group 0 (lines 194, 606) are read paths and the</w:t>
+            </w:r>
+            <w:r>
+              <w:t xml:space="preserve"> </w:t>
+            </w:r>
+            <w:r>
+              <w:rPr>
+                <w:rStyle w:val="VerbatimChar"/>
+              </w:rPr>
+              <w:t xml:space="preserve">.get(...)</w:t>
+            </w:r>
+            <w:r>
+              <w:t xml:space="preserve"> </w:t>
+            </w:r>
+            <w:r>
+              <w:t xml:space="preserve">style respectively, so they need no change.</w:t>
+            </w:r>
+          </w:p>
+        </w:tc>
+      </w:tr>
+      <w:tr>
+        <w:tc>
+          <w:tcPr/>
+          <w:p>
+            <w:pPr>
+              <w:pStyle w:val="Compact"/>
+            </w:pPr>
+            <w:r>
+              <w:rPr>
+                <w:rStyle w:val="VerbatimChar"/>
+              </w:rPr>
+              <w:t xml:space="preserve">s3dgraphy_dot_bridge.py</w:t>
+            </w:r>
+          </w:p>
+        </w:tc>
+        <w:tc>
+          <w:tcPr/>
+          <w:p>
+            <w:pPr>
+              <w:pStyle w:val="Compact"/>
+            </w:pPr>
+            <w:r>
+              <w:t xml:space="preserve">refactored</w:t>
+            </w:r>
+          </w:p>
+        </w:tc>
+        <w:tc>
+          <w:tcPr/>
+          <w:p>
+            <w:pPr>
+              <w:pStyle w:val="Compact"/>
+            </w:pPr>
+            <w:r>
+              <w:t xml:space="preserve">The hardcoded 6-entry</w:t>
+            </w:r>
+            <w:r>
+              <w:t xml:space="preserve"> </w:t>
+            </w:r>
+            <w:r>
+              <w:rPr>
+                <w:rStyle w:val="VerbatimChar"/>
+              </w:rPr>
+              <w:t xml:space="preserve">color_map</w:t>
+            </w:r>
+            <w:r>
+              <w:t xml:space="preserve"> </w:t>
+            </w:r>
+            <w:r>
+              <w:t xml:space="preserve">for Graphviz DOT output now consults</w:t>
+            </w:r>
+            <w:r>
+              <w:t xml:space="preserve"> </w:t>
+            </w:r>
+            <w:r>
+              <w:rPr>
+                <w:rStyle w:val="VerbatimChar"/>
+              </w:rPr>
+              <w:t xml:space="preserve">VocabProvider.get_visual_rule()</w:t>
+            </w:r>
+            <w:r>
+              <w:t xml:space="preserve"> </w:t>
+            </w:r>
+            <w:r>
+              <w:t xml:space="preserve">first; legacy values are kept as fallback.</w:t>
+            </w:r>
+          </w:p>
+        </w:tc>
+      </w:tr>
+      <w:tr>
+        <w:tc>
+          <w:tcPr/>
+          <w:p>
+            <w:pPr>
+              <w:pStyle w:val="Compact"/>
+            </w:pPr>
+            <w:r>
+              <w:rPr>
+                <w:rStyle w:val="VerbatimChar"/>
+              </w:rPr>
+              <w:t xml:space="preserve">matrix_graph_visualizer.py</w:t>
+            </w:r>
+          </w:p>
+        </w:tc>
+        <w:tc>
+          <w:tcPr/>
+          <w:p>
+            <w:pPr>
+              <w:pStyle w:val="Compact"/>
+            </w:pPr>
+            <w:r>
+              <w:t xml:space="preserve">refactored</w:t>
+            </w:r>
+          </w:p>
+        </w:tc>
+        <w:tc>
+          <w:tcPr/>
+          <w:p>
+            <w:pPr>
+              <w:pStyle w:val="Compact"/>
+            </w:pPr>
+            <w:r>
+              <w:t xml:space="preserve">Multilingual</w:t>
+            </w:r>
+            <w:r>
+              <w:t xml:space="preserve"> </w:t>
+            </w:r>
+            <w:r>
+              <w:rPr>
+                <w:rStyle w:val="VerbatimChar"/>
+              </w:rPr>
+              <w:t xml:space="preserve">color_map</w:t>
+            </w:r>
+            <w:r>
+              <w:t xml:space="preserve"> </w:t>
+            </w:r>
+            <w:r>
+              <w:t xml:space="preserve">keyed by</w:t>
+            </w:r>
+            <w:r>
+              <w:t xml:space="preserve"> </w:t>
+            </w:r>
+            <w:r>
+              <w:rPr>
+                <w:rStyle w:val="VerbatimChar"/>
+              </w:rPr>
+              <w:t xml:space="preserve">unita_tipo</w:t>
+            </w:r>
+            <w:r>
+              <w:t xml:space="preserve"> </w:t>
+            </w:r>
+            <w:r>
+              <w:t xml:space="preserve">retained as fallback; primary lookup via</w:t>
+            </w:r>
+            <w:r>
+              <w:t xml:space="preserve"> </w:t>
+            </w:r>
+            <w:r>
+              <w:rPr>
+                <w:rStyle w:val="VerbatimChar"/>
+              </w:rPr>
+              <w:t xml:space="preserve">VocabProvider</w:t>
+            </w:r>
+            <w:r>
+              <w:t xml:space="preserve">.</w:t>
+            </w:r>
+          </w:p>
+        </w:tc>
+      </w:tr>
+      <w:tr>
+        <w:tc>
+          <w:tcPr/>
+          <w:p>
+            <w:pPr>
+              <w:pStyle w:val="Compact"/>
+            </w:pPr>
+            <w:r>
+              <w:rPr>
+                <w:rStyle w:val="VerbatimChar"/>
+              </w:rPr>
+              <w:t xml:space="preserve">plotly_visualizer.py</w:t>
+            </w:r>
+          </w:p>
+        </w:tc>
+        <w:tc>
+          <w:tcPr/>
+          <w:p>
+            <w:pPr>
+              <w:pStyle w:val="Compact"/>
+            </w:pPr>
+            <w:r>
+              <w:t xml:space="preserve">refactored</w:t>
+            </w:r>
+          </w:p>
+        </w:tc>
+        <w:tc>
+          <w:tcPr/>
+          <w:p>
+            <w:pPr>
+              <w:pStyle w:val="Compact"/>
+            </w:pPr>
+            <w:r>
+              <w:t xml:space="preserve">Same pattern as</w:t>
+            </w:r>
+            <w:r>
+              <w:t xml:space="preserve"> </w:t>
+            </w:r>
+            <w:r>
+              <w:rPr>
+                <w:rStyle w:val="VerbatimChar"/>
+              </w:rPr>
+              <w:t xml:space="preserve">matrix_graph_visualizer</w:t>
+            </w:r>
+            <w:r>
+              <w:t xml:space="preserve">.</w:t>
+            </w:r>
+          </w:p>
+        </w:tc>
+      </w:tr>
+      <w:tr>
+        <w:tc>
+          <w:tcPr/>
+          <w:p>
+            <w:pPr>
+              <w:pStyle w:val="Compact"/>
+            </w:pPr>
+            <w:r>
+              <w:rPr>
+                <w:rStyle w:val="VerbatimChar"/>
+              </w:rPr>
+              <w:t xml:space="preserve">simple_graph_visualizer.py</w:t>
+            </w:r>
+          </w:p>
+        </w:tc>
+        <w:tc>
+          <w:tcPr/>
+          <w:p>
+            <w:pPr>
+              <w:pStyle w:val="Compact"/>
+            </w:pPr>
+            <w:r>
+              <w:t xml:space="preserve">refactored</w:t>
+            </w:r>
+          </w:p>
+        </w:tc>
+        <w:tc>
+          <w:tcPr/>
+          <w:p>
+            <w:pPr>
+              <w:pStyle w:val="Compact"/>
+            </w:pPr>
+            <w:r>
+              <w:t xml:space="preserve">Originally listed as audit-only in the spec; the audit grep surfaced a 6-entry hardcoded</w:t>
+            </w:r>
+            <w:r>
+              <w:t xml:space="preserve"> </w:t>
+            </w:r>
+            <w:r>
+              <w:rPr>
+                <w:rStyle w:val="VerbatimChar"/>
+              </w:rPr>
+              <w:t xml:space="preserve">color_map</w:t>
+            </w:r>
+            <w:r>
+              <w:t xml:space="preserve">, so it was refactored alongside its peers.</w:t>
+            </w:r>
+          </w:p>
+        </w:tc>
+      </w:tr>
+      <w:tr>
+        <w:tc>
+          <w:tcPr/>
+          <w:p>
+            <w:pPr>
+              <w:pStyle w:val="Compact"/>
+            </w:pPr>
+            <w:r>
+              <w:rPr>
+                <w:rStyle w:val="VerbatimChar"/>
+              </w:rPr>
+              <w:t xml:space="preserve">graphviz_visualizer.py</w:t>
+            </w:r>
+          </w:p>
+        </w:tc>
+        <w:tc>
+          <w:tcPr/>
+          <w:p>
+            <w:pPr>
+              <w:pStyle w:val="Compact"/>
+            </w:pPr>
+            <w:r>
+              <w:t xml:space="preserve">refactored</w:t>
+            </w:r>
+          </w:p>
+        </w:tc>
+        <w:tc>
+          <w:tcPr/>
+          <w:p>
+            <w:pPr>
+              <w:pStyle w:val="Compact"/>
+            </w:pPr>
+            <w:r>
+              <w:t xml:space="preserve">Originally listed as audit-only; same finding as above.</w:t>
+            </w:r>
+          </w:p>
+        </w:tc>
+      </w:tr>
+      <w:tr>
+        <w:tc>
+          <w:tcPr/>
+          <w:p>
+            <w:pPr>
+              <w:pStyle w:val="Compact"/>
+            </w:pPr>
+            <w:r>
+              <w:rPr>
+                <w:rStyle w:val="VerbatimChar"/>
+              </w:rPr>
+              <w:t xml:space="preserve">matrix_visualizer_qgis.py</w:t>
+            </w:r>
+          </w:p>
+        </w:tc>
+        <w:tc>
+          <w:tcPr/>
+          <w:p>
+            <w:pPr>
+              <w:pStyle w:val="Compact"/>
+            </w:pPr>
+            <w:r>
+              <w:t xml:space="preserve">clean (audit-only)</w:t>
+            </w:r>
+          </w:p>
+        </w:tc>
+        <w:tc>
+          <w:tcPr/>
+          <w:p>
+            <w:pPr>
+              <w:pStyle w:val="Compact"/>
+            </w:pPr>
+            <w:r>
+              <w:t xml:space="preserve">Two string literals at lines 273/285 are QGIS rule-renderer filter expressions on the stored</w:t>
+            </w:r>
+            <w:r>
+              <w:t xml:space="preserve"> </w:t>
+            </w:r>
+            <w:r>
+              <w:rPr>
+                <w:rStyle w:val="VerbatimChar"/>
+              </w:rPr>
+              <w:t xml:space="preserve">node_type</w:t>
+            </w:r>
+            <w:r>
+              <w:t xml:space="preserve"> </w:t>
+            </w:r>
+            <w:r>
+              <w:t xml:space="preserve">data column — not a hardcoded family table.</w:t>
+            </w:r>
+          </w:p>
+        </w:tc>
+      </w:tr>
+      <w:tr>
+        <w:tc>
+          <w:tcPr/>
+          <w:p>
+            <w:pPr>
+              <w:pStyle w:val="Compact"/>
+            </w:pPr>
+            <w:r>
+              <w:rPr>
+                <w:rStyle w:val="VerbatimChar"/>
+              </w:rPr>
+              <w:t xml:space="preserve">blender_integration.py</w:t>
+            </w:r>
+          </w:p>
+        </w:tc>
+        <w:tc>
+          <w:tcPr/>
+          <w:p>
+            <w:pPr>
+              <w:pStyle w:val="Compact"/>
+            </w:pPr>
+            <w:r>
+              <w:t xml:space="preserve">clean (audit-only)</w:t>
+            </w:r>
+          </w:p>
+        </w:tc>
+        <w:tc>
+          <w:tcPr/>
+          <w:p>
+            <w:pPr>
+              <w:pStyle w:val="Compact"/>
+            </w:pPr>
+            <w:r>
+              <w:t xml:space="preserve">Per spec §7.3 — Blender export keeps its private tags.</w:t>
+            </w:r>
+          </w:p>
+        </w:tc>
+      </w:tr>
+      <w:tr>
+        <w:tc>
+          <w:tcPr/>
+          <w:p>
+            <w:pPr>
+              <w:pStyle w:val="Compact"/>
+            </w:pPr>
+            <w:r>
+              <w:rPr>
+                <w:rStyle w:val="VerbatimChar"/>
+              </w:rPr>
+              <w:t xml:space="preserve">graphml_spatial_enhancer.py</w:t>
+            </w:r>
+          </w:p>
+        </w:tc>
+        <w:tc>
+          <w:tcPr/>
+          <w:p>
+            <w:pPr>
+              <w:pStyle w:val="Compact"/>
+            </w:pPr>
+            <w:r>
+              <w:t xml:space="preserve">clean (audit-only)</w:t>
+            </w:r>
+          </w:p>
+        </w:tc>
+        <w:tc>
+          <w:tcPr/>
+          <w:p>
+            <w:pPr>
+              <w:pStyle w:val="Compact"/>
+            </w:pPr>
+            <w:r>
+              <w:t xml:space="preserve">No string-tag or hardcoded family table found.</w:t>
+            </w:r>
+          </w:p>
+        </w:tc>
+      </w:tr>
+      <w:tr>
+        <w:tc>
+          <w:tcPr/>
+          <w:p>
+            <w:pPr>
+              <w:pStyle w:val="Compact"/>
+            </w:pPr>
+            <w:r>
+              <w:rPr>
+                <w:rStyle w:val="VerbatimChar"/>
+              </w:rPr>
+              <w:t xml:space="preserve">spatial_grouping_manager.py</w:t>
+            </w:r>
+          </w:p>
+        </w:tc>
+        <w:tc>
+          <w:tcPr/>
+          <w:p>
+            <w:pPr>
+              <w:pStyle w:val="Compact"/>
+            </w:pPr>
+            <w:r>
+              <w:t xml:space="preserve">clean (audit-only)</w:t>
+            </w:r>
+          </w:p>
+        </w:tc>
+        <w:tc>
+          <w:tcPr/>
+          <w:p>
+            <w:pPr>
+              <w:pStyle w:val="Compact"/>
+            </w:pPr>
+            <w:r>
+              <w:t xml:space="preserve">No string-tag or hardcoded family table found.</w:t>
+            </w:r>
+          </w:p>
+        </w:tc>
+      </w:tr>
+      <w:tr>
+        <w:tc>
+          <w:tcPr/>
+          <w:p>
+            <w:pPr>
+              <w:pStyle w:val="Compact"/>
+            </w:pPr>
+            <w:r>
+              <w:rPr>
+                <w:rStyle w:val="VerbatimChar"/>
+              </w:rPr>
+              <w:t xml:space="preserve">__init__.py</w:t>
+            </w:r>
+          </w:p>
+        </w:tc>
+        <w:tc>
+          <w:tcPr/>
+          <w:p>
+            <w:pPr>
+              <w:pStyle w:val="Compact"/>
+            </w:pPr>
+            <w:r>
+              <w:t xml:space="preserve">clean</w:t>
+            </w:r>
+          </w:p>
+        </w:tc>
+        <w:tc>
+          <w:tcPr/>
+          <w:p>
+            <w:pPr>
+              <w:pStyle w:val="Compact"/>
+            </w:pPr>
+            <w:r>
+              <w:t xml:space="preserve">17-line import barrel; no work.</w:t>
+            </w:r>
+          </w:p>
+        </w:tc>
+      </w:tr>
+    </w:tbl>
+    <w:p>
+      <w:pPr>
+        <w:pStyle w:val="BodyText"/>
+      </w:pPr>
+      <w:r>
+        <w:t xml:space="preserve">A single empty audit commit groups the 4 genuinely-clean files (the</w:t>
+      </w:r>
+      <w:r>
+        <w:t xml:space="preserve"> </w:t>
+      </w:r>
+      <w:r>
+        <w:rPr>
+          <w:rStyle w:val="VerbatimChar"/>
+        </w:rPr>
+        <w:t xml:space="preserve">matrix_visualizer_qgis</w:t>
+      </w:r>
+      <w:r>
+        <w:t xml:space="preserve"> </w:t>
+      </w:r>
+      <w:r>
+        <w:t xml:space="preserve">case is included there because its data-column</w:t>
+      </w:r>
+      <w:r>
+        <w:t xml:space="preserve"> </w:t>
+      </w:r>
+      <w:r>
+        <w:t xml:space="preserve">filters are intentional and orthogonal to the refactor).</w:t>
+      </w:r>
+    </w:p>
+    <w:bookmarkEnd w:id="39"/>
+    <w:bookmarkStart w:id="40" w:name="what-was-tested-6"/>
+    <w:p>
+      <w:pPr>
+        <w:pStyle w:val="Heading2"/>
+      </w:pPr>
+      <w:r>
+        <w:t xml:space="preserve">What was tested</w:t>
+      </w:r>
+    </w:p>
+    <w:p>
+      <w:pPr>
+        <w:pStyle w:val="Compact"/>
+        <w:numPr>
+          <w:ilvl w:val="0"/>
+          <w:numId w:val="1020"/>
+        </w:numPr>
+      </w:pPr>
+      <w:r>
+        <w:rPr>
+          <w:b/>
+          <w:bCs/>
+        </w:rPr>
+        <w:t xml:space="preserve">Existing test suite remains green</w:t>
+      </w:r>
+      <w:r>
+        <w:t xml:space="preserve">: 41 passed → 42 passed after</w:t>
+      </w:r>
+      <w:r>
+        <w:t xml:space="preserve"> </w:t>
+      </w:r>
+      <w:r>
+        <w:t xml:space="preserve">Group F (one new smoke test added during the in-flight fix described</w:t>
+      </w:r>
+      <w:r>
+        <w:t xml:space="preserve"> </w:t>
+      </w:r>
+      <w:r>
+        <w:t xml:space="preserve">below).</w:t>
+      </w:r>
+    </w:p>
+    <w:p>
+      <w:pPr>
+        <w:pStyle w:val="Compact"/>
+        <w:numPr>
+          <w:ilvl w:val="0"/>
+          <w:numId w:val="1020"/>
+        </w:numPr>
+      </w:pPr>
+      <w:r>
+        <w:rPr>
+          <w:b/>
+          <w:bCs/>
+        </w:rPr>
+        <w:t xml:space="preserve">Python AST parse smoke</w:t>
+      </w:r>
+      <w:r>
+        <w:t xml:space="preserve"> </w:t>
+      </w:r>
+      <w:r>
+        <w:t xml:space="preserve">confirmed every refactored file still</w:t>
+      </w:r>
+      <w:r>
+        <w:t xml:space="preserve"> </w:t>
+      </w:r>
+      <w:r>
+        <w:t xml:space="preserve">parses cleanly.</w:t>
+      </w:r>
+    </w:p>
+    <w:p>
+      <w:pPr>
+        <w:pStyle w:val="Compact"/>
+        <w:numPr>
+          <w:ilvl w:val="0"/>
+          <w:numId w:val="1020"/>
+        </w:numPr>
+      </w:pPr>
+      <w:r>
+        <w:rPr>
+          <w:b/>
+          <w:bCs/>
+        </w:rPr>
+        <w:t xml:space="preserve">End-to-end smoke test</w:t>
+      </w:r>
+      <w:r>
+        <w:t xml:space="preserve"> </w:t>
+      </w:r>
+      <w:r>
+        <w:t xml:space="preserve">verified that on the real bundled 0.1.40</w:t>
+      </w:r>
+      <w:r>
+        <w:t xml:space="preserve"> </w:t>
+      </w:r>
+      <w:r>
+        <w:t xml:space="preserve">vendor,</w:t>
+      </w:r>
+      <w:r>
+        <w:t xml:space="preserve"> </w:t>
+      </w:r>
+      <w:r>
+        <w:rPr>
+          <w:rStyle w:val="VerbatimChar"/>
+        </w:rPr>
+        <w:t xml:space="preserve">VocabProvider.get_visual_rule("US")</w:t>
+      </w:r>
+      <w:r>
+        <w:t xml:space="preserve"> </w:t>
+      </w:r>
+      <w:r>
+        <w:t xml:space="preserve">now returns the actual</w:t>
+      </w:r>
+      <w:r>
+        <w:t xml:space="preserve"> </w:t>
+      </w:r>
+      <w:r>
+        <w:t xml:space="preserve">fill (</w:t>
+      </w:r>
+      <w:r>
+        <w:rPr>
+          <w:rStyle w:val="VerbatimChar"/>
+        </w:rPr>
+        <w:t xml:space="preserve">#F0F0F0</w:t>
+      </w:r>
+      <w:r>
+        <w:t xml:space="preserve">) and stroke (</w:t>
+      </w:r>
+      <w:r>
+        <w:rPr>
+          <w:rStyle w:val="VerbatimChar"/>
+        </w:rPr>
+        <w:t xml:space="preserve">#540909</w:t>
+      </w:r>
+      <w:r>
+        <w:t xml:space="preserve">) colours from the s3Dgraphy</w:t>
+      </w:r>
+      <w:r>
+        <w:t xml:space="preserve"> </w:t>
+      </w:r>
+      <w:r>
+        <w:rPr>
+          <w:rStyle w:val="VerbatimChar"/>
+        </w:rPr>
+        <w:t xml:space="preserve">node_styles[US].style</w:t>
+      </w:r>
+      <w:r>
+        <w:t xml:space="preserve"> </w:t>
+      </w:r>
+      <w:r>
+        <w:t xml:space="preserve">block, rather than</w:t>
+      </w:r>
+      <w:r>
+        <w:t xml:space="preserve"> </w:t>
+      </w:r>
+      <w:r>
+        <w:rPr>
+          <w:rStyle w:val="VerbatimChar"/>
+        </w:rPr>
+        <w:t xml:space="preserve">None</w:t>
+      </w:r>
+      <w:r>
+        <w:t xml:space="preserve"> </w:t>
+      </w:r>
+      <w:r>
+        <w:t xml:space="preserve">(which would have</w:t>
+      </w:r>
+      <w:r>
+        <w:t xml:space="preserve"> </w:t>
+      </w:r>
+      <w:r>
+        <w:t xml:space="preserve">forced every refactored visualizer to silently fall back to its</w:t>
+      </w:r>
+      <w:r>
+        <w:t xml:space="preserve"> </w:t>
+      </w:r>
+      <w:r>
+        <w:t xml:space="preserve">legacy hardcoded value).</w:t>
+      </w:r>
+    </w:p>
+    <w:bookmarkEnd w:id="40"/>
+    <w:bookmarkStart w:id="41" w:name="Xe3de284784ad6303575dca65e5a8d7b664cec13"/>
+    <w:p>
+      <w:pPr>
+        <w:pStyle w:val="Heading2"/>
+      </w:pPr>
+      <w:r>
+        <w:t xml:space="preserve">In-flight bug fix during Group F (commit</w:t>
+      </w:r>
+      <w:r>
+        <w:t xml:space="preserve"> </w:t>
+      </w:r>
+      <w:r>
+        <w:rPr>
+          <w:rStyle w:val="VerbatimChar"/>
+        </w:rPr>
+        <w:t xml:space="preserve">349358af</w:t>
+      </w:r>
+      <w:r>
+        <w:t xml:space="preserve">)</w:t>
+      </w:r>
+    </w:p>
+    <w:p>
+      <w:pPr>
+        <w:pStyle w:val="FirstParagraph"/>
+      </w:pPr>
+      <w:r>
+        <w:t xml:space="preserve">The visualizer refactors surfaced a real-shape mismatch between the</w:t>
+      </w:r>
+      <w:r>
+        <w:t xml:space="preserve"> </w:t>
+      </w:r>
+      <w:r>
+        <w:t xml:space="preserve">test fixtures and the actual s3Dgraphy 0.1.40 JSON files:</w:t>
+      </w:r>
+    </w:p>
+    <w:p>
+      <w:pPr>
+        <w:pStyle w:val="Compact"/>
+        <w:numPr>
+          <w:ilvl w:val="0"/>
+          <w:numId w:val="1021"/>
+        </w:numPr>
+      </w:pPr>
+      <w:r>
+        <w:t xml:space="preserve">The fixture</w:t>
+      </w:r>
+      <w:r>
+        <w:t xml:space="preserve"> </w:t>
+      </w:r>
+      <w:r>
+        <w:rPr>
+          <w:rStyle w:val="VerbatimChar"/>
+        </w:rPr>
+        <w:t xml:space="preserve">em_visual_rules_sample.json</w:t>
+      </w:r>
+      <w:r>
+        <w:t xml:space="preserve"> </w:t>
+      </w:r>
+      <w:r>
+        <w:t xml:space="preserve">uses a flat shape:</w:t>
+      </w:r>
+      <w:r>
+        <w:t xml:space="preserve"> </w:t>
+      </w:r>
+      <w:r>
+        <w:rPr>
+          <w:rStyle w:val="VerbatimChar"/>
+        </w:rPr>
+        <w:t xml:space="preserve">{"rules": {"&lt;type&gt;": {"icon", "fill", "stroke", "palette"}}}</w:t>
+      </w:r>
+      <w:r>
+        <w:t xml:space="preserve">.</w:t>
+      </w:r>
+    </w:p>
+    <w:p>
+      <w:pPr>
+        <w:pStyle w:val="Compact"/>
+        <w:numPr>
+          <w:ilvl w:val="0"/>
+          <w:numId w:val="1021"/>
+        </w:numPr>
+      </w:pPr>
+      <w:r>
+        <w:t xml:space="preserve">The real</w:t>
+      </w:r>
+      <w:r>
+        <w:t xml:space="preserve"> </w:t>
+      </w:r>
+      <w:r>
+        <w:rPr>
+          <w:rStyle w:val="VerbatimChar"/>
+        </w:rPr>
+        <w:t xml:space="preserve">ext_libs/s3dgraphy/JSON_config/em_visual_rules.json</w:t>
+      </w:r>
+      <w:r>
+        <w:t xml:space="preserve"> </w:t>
+      </w:r>
+      <w:r>
+        <w:t xml:space="preserve">uses</w:t>
+      </w:r>
+      <w:r>
+        <w:t xml:space="preserve"> </w:t>
+      </w:r>
+      <w:r>
+        <w:t xml:space="preserve">a nested shape:</w:t>
+      </w:r>
+      <w:r>
+        <w:t xml:space="preserve"> </w:t>
+      </w:r>
+      <w:r>
+        <w:rPr>
+          <w:rStyle w:val="VerbatimChar"/>
+        </w:rPr>
+        <w:t xml:space="preserve">{"node_styles": {"&lt;type&gt;": {"file_2d", "style": {"fill_color", "border_color", "shape", ...}}}}</w:t>
+      </w:r>
+      <w:r>
+        <w:t xml:space="preserve">.</w:t>
+      </w:r>
+    </w:p>
+    <w:p>
+      <w:pPr>
+        <w:pStyle w:val="Compact"/>
+        <w:numPr>
+          <w:ilvl w:val="0"/>
+          <w:numId w:val="1021"/>
+        </w:numPr>
+      </w:pPr>
+      <w:r>
+        <w:t xml:space="preserve">Similarly, the connections datamodel uses</w:t>
+      </w:r>
+      <w:r>
+        <w:t xml:space="preserve"> </w:t>
+      </w:r>
+      <w:r>
+        <w:rPr>
+          <w:rStyle w:val="VerbatimChar"/>
+        </w:rPr>
+        <w:t xml:space="preserve">s3Dgraphy_connections_model_version</w:t>
+      </w:r>
+      <w:r>
+        <w:t xml:space="preserve"> </w:t>
+      </w:r>
+      <w:r>
+        <w:t xml:space="preserve">rather than the fixture’s</w:t>
+      </w:r>
+      <w:r>
+        <w:t xml:space="preserve"> </w:t>
+      </w:r>
+      <w:r>
+        <w:rPr>
+          <w:rStyle w:val="VerbatimChar"/>
+        </w:rPr>
+        <w:t xml:space="preserve">s3Dgraphy_connections_version</w:t>
+      </w:r>
+      <w:r>
+        <w:t xml:space="preserve">.</w:t>
+      </w:r>
+    </w:p>
+    <w:p>
+      <w:pPr>
+        <w:pStyle w:val="FirstParagraph"/>
+      </w:pPr>
+      <w:r>
+        <w:rPr>
+          <w:rStyle w:val="VerbatimChar"/>
+        </w:rPr>
+        <w:t xml:space="preserve">VocabProviderCore.get_visual_rule()</w:t>
+      </w:r>
+      <w:r>
+        <w:t xml:space="preserve"> </w:t>
+      </w:r>
+      <w:r>
+        <w:t xml:space="preserve">and</w:t>
+      </w:r>
+      <w:r>
+        <w:t xml:space="preserve"> </w:t>
+      </w:r>
+      <w:r>
+        <w:rPr>
+          <w:rStyle w:val="VerbatimChar"/>
+        </w:rPr>
+        <w:t xml:space="preserve">VocabProviderCore.versions</w:t>
+      </w:r>
+      <w:r>
+        <w:t xml:space="preserve"> </w:t>
+      </w:r>
+      <w:r>
+        <w:t xml:space="preserve">were extended to accept BOTH shapes — the flat form for fixtures and</w:t>
+      </w:r>
+      <w:r>
+        <w:t xml:space="preserve"> </w:t>
+      </w:r>
+      <w:r>
+        <w:t xml:space="preserve">the nested form for the real vendor. A new smoke test</w:t>
+      </w:r>
+      <w:r>
+        <w:t xml:space="preserve"> </w:t>
+      </w:r>
+      <w:r>
+        <w:rPr>
+          <w:rStyle w:val="VerbatimChar"/>
+        </w:rPr>
+        <w:t xml:space="preserve">test_real_bundled_visual_rule_for_us</w:t>
+      </w:r>
+      <w:r>
+        <w:t xml:space="preserve"> </w:t>
+      </w:r>
+      <w:r>
+        <w:t xml:space="preserve">asserts that, on the real</w:t>
+      </w:r>
+      <w:r>
+        <w:t xml:space="preserve"> </w:t>
+      </w:r>
+      <w:r>
+        <w:t xml:space="preserve">0.1.40 vendor, the visual rule for</w:t>
+      </w:r>
+      <w:r>
+        <w:t xml:space="preserve"> </w:t>
+      </w:r>
+      <w:r>
+        <w:rPr>
+          <w:rStyle w:val="VerbatimChar"/>
+        </w:rPr>
+        <w:t xml:space="preserve">US</w:t>
+      </w:r>
+      <w:r>
+        <w:t xml:space="preserve"> </w:t>
+      </w:r>
+      <w:r>
+        <w:t xml:space="preserve">returns non-empty</w:t>
+      </w:r>
+      <w:r>
+        <w:t xml:space="preserve"> </w:t>
+      </w:r>
+      <w:r>
+        <w:rPr>
+          <w:rStyle w:val="VerbatimChar"/>
+        </w:rPr>
+        <w:t xml:space="preserve">fill</w:t>
+      </w:r>
+      <w:r>
+        <w:t xml:space="preserve"> </w:t>
+      </w:r>
+      <w:r>
+        <w:t xml:space="preserve">and</w:t>
+      </w:r>
+      <w:r>
+        <w:t xml:space="preserve"> </w:t>
+      </w:r>
+      <w:r>
+        <w:rPr>
+          <w:rStyle w:val="VerbatimChar"/>
+        </w:rPr>
+        <w:t xml:space="preserve">stroke</w:t>
+      </w:r>
+      <w:r>
+        <w:t xml:space="preserve"> </w:t>
+      </w:r>
+      <w:r>
+        <w:t xml:space="preserve">colours. Without this fix, every visualizer refactor in</w:t>
+      </w:r>
+      <w:r>
+        <w:t xml:space="preserve"> </w:t>
+      </w:r>
+      <w:r>
+        <w:t xml:space="preserve">Group F would have silently degraded to legacy hardcoded fallbacks</w:t>
+      </w:r>
+      <w:r>
+        <w:t xml:space="preserve"> </w:t>
+      </w:r>
+      <w:r>
+        <w:t xml:space="preserve">even though the JSON datamodel was being parsed correctly.</w:t>
+      </w:r>
+    </w:p>
+    <w:bookmarkEnd w:id="41"/>
+    <w:bookmarkStart w:id="42" w:name="decisions-taken-6"/>
+    <w:p>
+      <w:pPr>
+        <w:pStyle w:val="Heading2"/>
+      </w:pPr>
+      <w:r>
+        <w:t xml:space="preserve">Decisions taken</w:t>
+      </w:r>
+    </w:p>
+    <w:p>
+      <w:pPr>
+        <w:pStyle w:val="Compact"/>
+        <w:numPr>
+          <w:ilvl w:val="0"/>
+          <w:numId w:val="1022"/>
+        </w:numPr>
+      </w:pPr>
+      <w:r>
+        <w:rPr>
+          <w:b/>
+          <w:bCs/>
+        </w:rPr>
+        <w:t xml:space="preserve">Per-file commits</w:t>
+      </w:r>
+      <w:r>
+        <w:t xml:space="preserve"> </w:t>
+      </w:r>
+      <w:r>
+        <w:t xml:space="preserve">kept the refactor</w:t>
+      </w:r>
+      <w:r>
+        <w:t xml:space="preserve"> </w:t>
+      </w:r>
+      <w:r>
+        <w:rPr>
+          <w:rStyle w:val="VerbatimChar"/>
+        </w:rPr>
+        <w:t xml:space="preserve">git revert</w:t>
+      </w:r>
+      <w:r>
+        <w:t xml:space="preserve">-able file by</w:t>
+      </w:r>
+      <w:r>
+        <w:t xml:space="preserve"> </w:t>
+      </w:r>
+      <w:r>
+        <w:t xml:space="preserve">file. Combined with the rollback tag</w:t>
+      </w:r>
+      <w:r>
+        <w:t xml:space="preserve"> </w:t>
+      </w:r>
+      <w:r>
+        <w:rPr>
+          <w:rStyle w:val="VerbatimChar"/>
+        </w:rPr>
+        <w:t xml:space="preserve">pre-s3dgraphy-040</w:t>
+      </w:r>
+      <w:r>
+        <w:t xml:space="preserve">, any</w:t>
+      </w:r>
+      <w:r>
+        <w:t xml:space="preserve"> </w:t>
+      </w:r>
+      <w:r>
+        <w:t xml:space="preserve">visualizer that turns out to misbehave in field testing can be</w:t>
+      </w:r>
+      <w:r>
+        <w:t xml:space="preserve"> </w:t>
+      </w:r>
+      <w:r>
+        <w:t xml:space="preserve">reverted in isolation without touching the rest of Group F.</w:t>
+      </w:r>
+    </w:p>
+    <w:p>
+      <w:pPr>
+        <w:pStyle w:val="Compact"/>
+        <w:numPr>
+          <w:ilvl w:val="0"/>
+          <w:numId w:val="1022"/>
+        </w:numPr>
+      </w:pPr>
+      <w:r>
+        <w:rPr>
+          <w:b/>
+          <w:bCs/>
+        </w:rPr>
+        <w:t xml:space="preserve">Legacy fallbacks preserved</w:t>
+      </w:r>
+      <w:r>
+        <w:t xml:space="preserve"> </w:t>
+      </w:r>
+      <w:r>
+        <w:t xml:space="preserve">in every refactored file. The new</w:t>
+      </w:r>
+      <w:r>
+        <w:t xml:space="preserve"> </w:t>
+      </w:r>
+      <w:r>
+        <w:t xml:space="preserve">code path is</w:t>
+      </w:r>
+      <w:r>
+        <w:t xml:space="preserve"> </w:t>
+      </w:r>
+      <w:r>
+        <w:t xml:space="preserve">“VocabProvider first; legacy hardcoded value if</w:t>
+      </w:r>
+      <w:r>
+        <w:t xml:space="preserve"> </w:t>
+      </w:r>
+      <w:r>
+        <w:t xml:space="preserve">missing; generic neutral fallback if even that is absent.”</w:t>
+      </w:r>
+      <w:r>
+        <w:t xml:space="preserve"> </w:t>
+      </w:r>
+      <w:r>
+        <w:t xml:space="preserve">This</w:t>
+      </w:r>
+      <w:r>
+        <w:t xml:space="preserve"> </w:t>
+      </w:r>
+      <w:r>
+        <w:t xml:space="preserve">keeps existing screenshots and printouts visually identical until</w:t>
+      </w:r>
+      <w:r>
+        <w:t xml:space="preserve"> </w:t>
+      </w:r>
+      <w:r>
+        <w:t xml:space="preserve">s3Dgraphy ships a different palette.</w:t>
+      </w:r>
+    </w:p>
+    <w:p>
+      <w:pPr>
+        <w:pStyle w:val="Compact"/>
+        <w:numPr>
+          <w:ilvl w:val="0"/>
+          <w:numId w:val="1022"/>
+        </w:numPr>
+      </w:pPr>
+      <w:r>
+        <w:rPr>
+          <w:b/>
+          <w:bCs/>
+        </w:rPr>
+        <w:t xml:space="preserve">The in-flight VocabProvider fix is intentionally permissive</w:t>
+      </w:r>
+      <w:r>
+        <w:t xml:space="preserve">: it</w:t>
+      </w:r>
+      <w:r>
+        <w:t xml:space="preserve"> </w:t>
+      </w:r>
+      <w:r>
+        <w:t xml:space="preserve">accepts both the simplified fixture shape and the real nested</w:t>
+      </w:r>
+      <w:r>
+        <w:t xml:space="preserve"> </w:t>
+      </w:r>
+      <w:r>
+        <w:t xml:space="preserve">shape. This means tests don’t have to mirror s3Dgraphy’s exact</w:t>
+      </w:r>
+      <w:r>
+        <w:t xml:space="preserve"> </w:t>
+      </w:r>
+      <w:r>
+        <w:t xml:space="preserve">on-disk layout (which can evolve between versions) while the real</w:t>
+      </w:r>
+      <w:r>
+        <w:t xml:space="preserve"> </w:t>
+      </w:r>
+      <w:r>
+        <w:t xml:space="preserve">vendor still drives production behaviour. Future smoke tests can</w:t>
+      </w:r>
+      <w:r>
+        <w:t xml:space="preserve"> </w:t>
+      </w:r>
+      <w:r>
+        <w:t xml:space="preserve">pin specific 0.1.40 keys without breaking the fixture-based unit</w:t>
+      </w:r>
+      <w:r>
+        <w:t xml:space="preserve"> </w:t>
+      </w:r>
+      <w:r>
+        <w:t xml:space="preserve">tests.</w:t>
+      </w:r>
+    </w:p>
+    <w:bookmarkEnd w:id="42"/>
+    <w:bookmarkStart w:id="43" w:name="closing-notes"/>
+    <w:p>
+      <w:pPr>
+        <w:pStyle w:val="Heading2"/>
+      </w:pPr>
+      <w:r>
+        <w:t xml:space="preserve">Closing notes</w:t>
+      </w:r>
+    </w:p>
+    <w:p>
+      <w:pPr>
+        <w:pStyle w:val="FirstParagraph"/>
+      </w:pPr>
+      <w:r>
+        <w:t xml:space="preserve">Group F is the largest commit cluster in Phase 1: 9 commits, six of</w:t>
+      </w:r>
+      <w:r>
+        <w:t xml:space="preserve"> </w:t>
+      </w:r>
+      <w:r>
+        <w:t xml:space="preserve">which touch production source code (the three</w:t>
+      </w:r>
+      <w:r>
+        <w:t xml:space="preserve"> </w:t>
+      </w:r>
+      <w:r>
+        <w:t xml:space="preserve">“downgraded”</w:t>
+      </w:r>
+      <w:r>
+        <w:t xml:space="preserve"> </w:t>
+      </w:r>
+      <w:r>
+        <w:t xml:space="preserve">audit-only</w:t>
+      </w:r>
+      <w:r>
+        <w:t xml:space="preserve"> </w:t>
+      </w:r>
+      <w:r>
+        <w:t xml:space="preserve">files were a pleasant surprise — finding hardcoded</w:t>
+      </w:r>
+      <w:r>
+        <w:t xml:space="preserve"> </w:t>
+      </w:r>
+      <w:r>
+        <w:rPr>
+          <w:rStyle w:val="VerbatimChar"/>
+        </w:rPr>
+        <w:t xml:space="preserve">color_map</w:t>
+      </w:r>
+      <w:r>
+        <w:t xml:space="preserve"> </w:t>
+      </w:r>
+      <w:r>
+        <w:t xml:space="preserve">blocks</w:t>
+      </w:r>
+      <w:r>
+        <w:t xml:space="preserve"> </w:t>
+      </w:r>
+      <w:r>
+        <w:t xml:space="preserve">in</w:t>
+      </w:r>
+      <w:r>
+        <w:t xml:space="preserve"> </w:t>
+      </w:r>
+      <w:r>
+        <w:rPr>
+          <w:rStyle w:val="VerbatimChar"/>
+        </w:rPr>
+        <w:t xml:space="preserve">simple_graph_visualizer.py</w:t>
+      </w:r>
+      <w:r>
+        <w:t xml:space="preserve"> </w:t>
+      </w:r>
+      <w:r>
+        <w:t xml:space="preserve">and</w:t>
+      </w:r>
+      <w:r>
+        <w:t xml:space="preserve"> </w:t>
+      </w:r>
+      <w:r>
+        <w:rPr>
+          <w:rStyle w:val="VerbatimChar"/>
+        </w:rPr>
+        <w:t xml:space="preserve">graphviz_visualizer.py</w:t>
+      </w:r>
+      <w:r>
+        <w:t xml:space="preserve"> </w:t>
+      </w:r>
+      <w:r>
+        <w:t xml:space="preserve">means</w:t>
+      </w:r>
+      <w:r>
+        <w:t xml:space="preserve"> </w:t>
+      </w:r>
+      <w:r>
+        <w:t xml:space="preserve">Phase 1 cleared MORE technical debt than the spec anticipated). The</w:t>
+      </w:r>
+      <w:r>
+        <w:t xml:space="preserve"> </w:t>
+      </w:r>
+      <w:r>
+        <w:t xml:space="preserve">remaining work for Phase 1 is Group G: bump</w:t>
+      </w:r>
+      <w:r>
+        <w:t xml:space="preserve"> </w:t>
+      </w:r>
+      <w:r>
+        <w:rPr>
+          <w:rStyle w:val="VerbatimChar"/>
+        </w:rPr>
+        <w:t xml:space="preserve">metadata.txt</w:t>
+      </w:r>
+      <w:r>
+        <w:t xml:space="preserve"> </w:t>
+      </w:r>
+      <w:r>
+        <w:t xml:space="preserve">to</w:t>
+      </w:r>
+      <w:r>
+        <w:t xml:space="preserve"> </w:t>
+      </w:r>
+      <w:r>
+        <w:rPr>
+          <w:rStyle w:val="VerbatimChar"/>
+        </w:rPr>
+        <w:t xml:space="preserve">5.1.0-alpha</w:t>
+      </w:r>
+      <w:r>
+        <w:t xml:space="preserve">, write the bilingual CHANGELOG entry, run the manual</w:t>
+      </w:r>
+      <w:r>
+        <w:t xml:space="preserve"> </w:t>
+      </w:r>
+      <w:r>
+        <w:t xml:space="preserve">smoke gate in QGIS, and tag the release.</w:t>
+      </w:r>
+    </w:p>
+    <w:bookmarkEnd w:id="43"/>
+    <w:bookmarkEnd w:id="44"/>
     <w:sectPr>
       <w:footnotePr>
         <w:numRestart w:val="eachSect"/>
@@ -9330,6 +11075,15 @@
     <w:abstractNumId w:val="991"/>
   </w:num>
   <w:num w:numId="1019">
+    <w:abstractNumId w:val="991"/>
+  </w:num>
+  <w:num w:numId="1020">
+    <w:abstractNumId w:val="991"/>
+  </w:num>
+  <w:num w:numId="1021">
+    <w:abstractNumId w:val="991"/>
+  </w:num>
+  <w:num w:numId="1022">
     <w:abstractNumId w:val="991"/>
   </w:num>
 </w:numbering>

</xml_diff>

<commit_message>
docs(dev-log): Group G partial entry — G.1/G.2/G.3 done, G.4 manual smoke pending
5.1.0-alpha version bumped in metadata.txt + bilingual changelog.
Manual smoke gate (G.4) and tag+push (G.5) pending user action.
</commit_message>
<xml_diff>
--- a/docs/superpowers/dev-log/T5.4_PyArchInit_Dev_Log.docx
+++ b/docs/superpowers/dev-log/T5.4_PyArchInit_Dev_Log.docx
@@ -951,7 +951,7 @@
               <w:pStyle w:val="Compact"/>
             </w:pPr>
             <w:r>
-              <w:t xml:space="preserve">Pending</w:t>
+              <w:t xml:space="preserve">In progress — G.1/G.2/G.3 done; G.4 manual smoke gate pending; G.5 tag+push pending</w:t>
             </w:r>
           </w:p>
         </w:tc>
@@ -10690,8 +10690,799 @@
         <w:t xml:space="preserve">smoke gate in QGIS, and tag the release.</w:t>
       </w:r>
     </w:p>
+    <w:p>
+      <w:r>
+        <w:pict>
+          <v:rect style="width:0;height:1.5pt" o:hralign="center" o:hrstd="t" o:hr="t"/>
+        </w:pict>
+      </w:r>
+    </w:p>
     <w:bookmarkEnd w:id="43"/>
     <w:bookmarkEnd w:id="44"/>
+    <w:bookmarkStart w:id="49" w:name="group-g-release-packaging-5.1.0-alpha"/>
+    <w:p>
+      <w:pPr>
+        <w:pStyle w:val="Heading1"/>
+      </w:pPr>
+      <w:r>
+        <w:t xml:space="preserve">Group G — Release packaging (</w:t>
+      </w:r>
+      <w:r>
+        <w:rPr>
+          <w:rStyle w:val="VerbatimChar"/>
+        </w:rPr>
+        <w:t xml:space="preserve">5.1.0-alpha</w:t>
+      </w:r>
+      <w:r>
+        <w:t xml:space="preserve">)</w:t>
+      </w:r>
+    </w:p>
+    <w:p>
+      <w:pPr>
+        <w:pStyle w:val="FirstParagraph"/>
+      </w:pPr>
+      <w:r>
+        <w:rPr>
+          <w:b/>
+          <w:bCs/>
+        </w:rPr>
+        <w:t xml:space="preserve">Date:</w:t>
+      </w:r>
+      <w:r>
+        <w:t xml:space="preserve"> </w:t>
+      </w:r>
+      <w:r>
+        <w:t xml:space="preserve">7 May 2026 ·</w:t>
+      </w:r>
+      <w:r>
+        <w:t xml:space="preserve"> </w:t>
+      </w:r>
+      <w:r>
+        <w:rPr>
+          <w:b/>
+          <w:bCs/>
+        </w:rPr>
+        <w:t xml:space="preserve">Status:</w:t>
+      </w:r>
+      <w:r>
+        <w:t xml:space="preserve"> </w:t>
+      </w:r>
+      <w:r>
+        <w:t xml:space="preserve">In progress — G.1/G.2/G.3 done, G.4</w:t>
+      </w:r>
+      <w:r>
+        <w:t xml:space="preserve"> </w:t>
+      </w:r>
+      <w:r>
+        <w:t xml:space="preserve">manual smoke gate pending user action in QGIS, G.5 tag + push pending</w:t>
+      </w:r>
+      <w:r>
+        <w:t xml:space="preserve"> </w:t>
+      </w:r>
+      <w:r>
+        <w:t xml:space="preserve">G.4 sign-off.</w:t>
+      </w:r>
+    </w:p>
+    <w:bookmarkStart w:id="45" w:name="X467dd459f61d873dd64462d83f86aac178df3a0"/>
+    <w:p>
+      <w:pPr>
+        <w:pStyle w:val="Heading2"/>
+      </w:pPr>
+      <w:r>
+        <w:t xml:space="preserve">What was done (G.1, G.2, G.3) — commit</w:t>
+      </w:r>
+      <w:r>
+        <w:t xml:space="preserve"> </w:t>
+      </w:r>
+      <w:r>
+        <w:rPr>
+          <w:rStyle w:val="VerbatimChar"/>
+        </w:rPr>
+        <w:t xml:space="preserve">dff6f237</w:t>
+      </w:r>
+    </w:p>
+    <w:p>
+      <w:pPr>
+        <w:pStyle w:val="Compact"/>
+        <w:numPr>
+          <w:ilvl w:val="0"/>
+          <w:numId w:val="1023"/>
+        </w:numPr>
+      </w:pPr>
+      <w:r>
+        <w:rPr>
+          <w:b/>
+          <w:bCs/>
+        </w:rPr>
+        <w:t xml:space="preserve">G.1</w:t>
+      </w:r>
+      <w:r>
+        <w:t xml:space="preserve"> </w:t>
+      </w:r>
+      <w:r>
+        <w:t xml:space="preserve">verified:</w:t>
+      </w:r>
+      <w:r>
+        <w:t xml:space="preserve"> </w:t>
+      </w:r>
+      <w:r>
+        <w:rPr>
+          <w:rStyle w:val="VerbatimChar"/>
+        </w:rPr>
+        <w:t xml:space="preserve">requirements.txt</w:t>
+      </w:r>
+      <w:r>
+        <w:t xml:space="preserve"> </w:t>
+      </w:r>
+      <w:r>
+        <w:t xml:space="preserve">already pins</w:t>
+      </w:r>
+      <w:r>
+        <w:t xml:space="preserve"> </w:t>
+      </w:r>
+      <w:r>
+        <w:rPr>
+          <w:rStyle w:val="VerbatimChar"/>
+        </w:rPr>
+        <w:t xml:space="preserve">s3dgraphy&gt;=0.1.40</w:t>
+      </w:r>
+      <w:r>
+        <w:t xml:space="preserve"> </w:t>
+      </w:r>
+      <w:r>
+        <w:t xml:space="preserve">from Group A’s commit</w:t>
+      </w:r>
+      <w:r>
+        <w:t xml:space="preserve"> </w:t>
+      </w:r>
+      <w:r>
+        <w:rPr>
+          <w:rStyle w:val="VerbatimChar"/>
+        </w:rPr>
+        <w:t xml:space="preserve">5988ed4a</w:t>
+      </w:r>
+      <w:r>
+        <w:t xml:space="preserve">. No change.</w:t>
+      </w:r>
+    </w:p>
+    <w:p>
+      <w:pPr>
+        <w:pStyle w:val="Compact"/>
+        <w:numPr>
+          <w:ilvl w:val="0"/>
+          <w:numId w:val="1023"/>
+        </w:numPr>
+      </w:pPr>
+      <w:r>
+        <w:rPr>
+          <w:b/>
+          <w:bCs/>
+        </w:rPr>
+        <w:t xml:space="preserve">G.2</w:t>
+      </w:r>
+      <w:r>
+        <w:t xml:space="preserve">:</w:t>
+      </w:r>
+      <w:r>
+        <w:t xml:space="preserve"> </w:t>
+      </w:r>
+      <w:r>
+        <w:rPr>
+          <w:rStyle w:val="VerbatimChar"/>
+        </w:rPr>
+        <w:t xml:space="preserve">metadata.txt</w:t>
+      </w:r>
+      <w:r>
+        <w:t xml:space="preserve"> </w:t>
+      </w:r>
+      <w:r>
+        <w:t xml:space="preserve">version line bumped from</w:t>
+      </w:r>
+      <w:r>
+        <w:t xml:space="preserve"> </w:t>
+      </w:r>
+      <w:r>
+        <w:rPr>
+          <w:rStyle w:val="VerbatimChar"/>
+        </w:rPr>
+        <w:t xml:space="preserve">5.0.27-alpha</w:t>
+      </w:r>
+      <w:r>
+        <w:t xml:space="preserve"> </w:t>
+      </w:r>
+      <w:r>
+        <w:t xml:space="preserve">to</w:t>
+      </w:r>
+      <w:r>
+        <w:t xml:space="preserve"> </w:t>
+      </w:r>
+      <w:r>
+        <w:rPr>
+          <w:rStyle w:val="VerbatimChar"/>
+        </w:rPr>
+        <w:t xml:space="preserve">5.1.0-alpha</w:t>
+      </w:r>
+      <w:r>
+        <w:t xml:space="preserve">. The QGIS</w:t>
+      </w:r>
+      <w:r>
+        <w:t xml:space="preserve"> </w:t>
+      </w:r>
+      <w:r>
+        <w:rPr>
+          <w:rStyle w:val="VerbatimChar"/>
+        </w:rPr>
+        <w:t xml:space="preserve">changelog=</w:t>
+      </w:r>
+      <w:r>
+        <w:t xml:space="preserve"> </w:t>
+      </w:r>
+      <w:r>
+        <w:t xml:space="preserve">block was prepended with the</w:t>
+      </w:r>
+      <w:r>
+        <w:t xml:space="preserve"> </w:t>
+      </w:r>
+      <w:r>
+        <w:t xml:space="preserve">Phase 1 entry summarising every deliverable: VocabProvider, vocab</w:t>
+      </w:r>
+      <w:r>
+        <w:t xml:space="preserve"> </w:t>
+      </w:r>
+      <w:r>
+        <w:t xml:space="preserve">alignment migration, UUID v7 backfill, 12-file refactor, and the</w:t>
+      </w:r>
+      <w:r>
+        <w:t xml:space="preserve"> </w:t>
+      </w:r>
+      <w:r>
+        <w:t xml:space="preserve">0.1.30→0.1.40 vendor swap.</w:t>
+      </w:r>
+    </w:p>
+    <w:p>
+      <w:pPr>
+        <w:pStyle w:val="Compact"/>
+        <w:numPr>
+          <w:ilvl w:val="0"/>
+          <w:numId w:val="1023"/>
+        </w:numPr>
+      </w:pPr>
+      <w:r>
+        <w:rPr>
+          <w:b/>
+          <w:bCs/>
+        </w:rPr>
+        <w:t xml:space="preserve">G.3</w:t>
+      </w:r>
+      <w:r>
+        <w:t xml:space="preserve">:</w:t>
+      </w:r>
+      <w:r>
+        <w:t xml:space="preserve"> </w:t>
+      </w:r>
+      <w:r>
+        <w:rPr>
+          <w:rStyle w:val="VerbatimChar"/>
+        </w:rPr>
+        <w:t xml:space="preserve">dev_logs/CHANGELOG.md</w:t>
+      </w:r>
+      <w:r>
+        <w:t xml:space="preserve"> </w:t>
+      </w:r>
+      <w:r>
+        <w:t xml:space="preserve">gets a full bilingual IT/EN section</w:t>
+      </w:r>
+      <w:r>
+        <w:t xml:space="preserve"> </w:t>
+      </w:r>
+      <w:r>
+        <w:t xml:space="preserve">for</w:t>
+      </w:r>
+      <w:r>
+        <w:t xml:space="preserve"> </w:t>
+      </w:r>
+      <w:r>
+        <w:rPr>
+          <w:rStyle w:val="VerbatimChar"/>
+        </w:rPr>
+        <w:t xml:space="preserve">5.1.0-alpha</w:t>
+      </w:r>
+      <w:r>
+        <w:t xml:space="preserve"> </w:t>
+      </w:r>
+      <w:r>
+        <w:t xml:space="preserve">covering all six plan deliverables and the</w:t>
+      </w:r>
+      <w:r>
+        <w:t xml:space="preserve"> </w:t>
+      </w:r>
+      <w:r>
+        <w:t xml:space="preserve">file-level modifications. The section announces the rollback tag</w:t>
+      </w:r>
+      <w:r>
+        <w:t xml:space="preserve"> </w:t>
+      </w:r>
+      <w:r>
+        <w:t xml:space="preserve">(</w:t>
+      </w:r>
+      <w:r>
+        <w:rPr>
+          <w:rStyle w:val="VerbatimChar"/>
+        </w:rPr>
+        <w:t xml:space="preserve">pre-s3dgraphy-040</w:t>
+      </w:r>
+      <w:r>
+        <w:t xml:space="preserve">) and the release tag the user will create after</w:t>
+      </w:r>
+      <w:r>
+        <w:t xml:space="preserve"> </w:t>
+      </w:r>
+      <w:r>
+        <w:t xml:space="preserve">the smoke gate (</w:t>
+      </w:r>
+      <w:r>
+        <w:rPr>
+          <w:rStyle w:val="VerbatimChar"/>
+        </w:rPr>
+        <w:t xml:space="preserve">phase1-foundation-5.1.0-alpha</w:t>
+      </w:r>
+      <w:r>
+        <w:t xml:space="preserve">).</w:t>
+      </w:r>
+    </w:p>
+    <w:p>
+      <w:pPr>
+        <w:pStyle w:val="FirstParagraph"/>
+      </w:pPr>
+      <w:r>
+        <w:t xml:space="preserve">All 42 unit tests still pass post-bump (no regressions from version</w:t>
+      </w:r>
+      <w:r>
+        <w:t xml:space="preserve"> </w:t>
+      </w:r>
+      <w:r>
+        <w:t xml:space="preserve">metadata changes).</w:t>
+      </w:r>
+    </w:p>
+    <w:bookmarkEnd w:id="45"/>
+    <w:bookmarkStart w:id="48" w:name="what-is-pending-g.4-g.5"/>
+    <w:p>
+      <w:pPr>
+        <w:pStyle w:val="Heading2"/>
+      </w:pPr>
+      <w:r>
+        <w:t xml:space="preserve">What is pending (G.4, G.5)</w:t>
+      </w:r>
+    </w:p>
+    <w:bookmarkStart w:id="46" w:name="g.4-manual-smoke-gate-in-qgis"/>
+    <w:p>
+      <w:pPr>
+        <w:pStyle w:val="Heading3"/>
+      </w:pPr>
+      <w:r>
+        <w:t xml:space="preserve">G.4 — Manual smoke gate in QGIS</w:t>
+      </w:r>
+    </w:p>
+    <w:p>
+      <w:pPr>
+        <w:pStyle w:val="FirstParagraph"/>
+      </w:pPr>
+      <w:r>
+        <w:t xml:space="preserve">User-driven; the controller cannot run QGIS. The gate is the spec’s</w:t>
+      </w:r>
+      <w:r>
+        <w:t xml:space="preserve"> </w:t>
+      </w:r>
+      <w:r>
+        <w:t xml:space="preserve">required pre-tag check (§7.4 step 4 + plan §G.4). The user opens QGIS,</w:t>
+      </w:r>
+      <w:r>
+        <w:t xml:space="preserve"> </w:t>
+      </w:r>
+      <w:r>
+        <w:t xml:space="preserve">loads the Volterra project (or any other PyArchInit-managed</w:t>
+      </w:r>
+      <w:r>
+        <w:t xml:space="preserve"> </w:t>
+      </w:r>
+      <w:r>
+        <w:t xml:space="preserve">SQLite/PostgreSQL project), and verifies:</w:t>
+      </w:r>
+    </w:p>
+    <w:p>
+      <w:pPr>
+        <w:pStyle w:val="Compact"/>
+        <w:numPr>
+          <w:ilvl w:val="0"/>
+          <w:numId w:val="1024"/>
+        </w:numPr>
+      </w:pPr>
+      <w:r>
+        <w:t xml:space="preserve">The plugin loads without exceptions in the QGIS message log.</w:t>
+      </w:r>
+    </w:p>
+    <w:p>
+      <w:pPr>
+        <w:pStyle w:val="Compact"/>
+        <w:numPr>
+          <w:ilvl w:val="0"/>
+          <w:numId w:val="1024"/>
+        </w:numPr>
+      </w:pPr>
+      <w:r>
+        <w:t xml:space="preserve">Opening a US/USM record opens the form successfully.</w:t>
+      </w:r>
+    </w:p>
+    <w:p>
+      <w:pPr>
+        <w:pStyle w:val="Compact"/>
+        <w:numPr>
+          <w:ilvl w:val="0"/>
+          <w:numId w:val="1024"/>
+        </w:numPr>
+      </w:pPr>
+      <w:r>
+        <w:t xml:space="preserve">The unit-type combo box (</w:t>
+      </w:r>
+      <w:r>
+        <w:rPr>
+          <w:rStyle w:val="VerbatimChar"/>
+        </w:rPr>
+        <w:t xml:space="preserve">comboBox_unita_tipo</w:t>
+      </w:r>
+      <w:r>
+        <w:t xml:space="preserve">) is populated and</w:t>
+      </w:r>
+      <w:r>
+        <w:t xml:space="preserve"> </w:t>
+      </w:r>
+      <w:r>
+        <w:t xml:space="preserve">includes the EM 1.5 types (</w:t>
+      </w:r>
+      <w:r>
+        <w:rPr>
+          <w:rStyle w:val="VerbatimChar"/>
+        </w:rPr>
+        <w:t xml:space="preserve">USVs</w:t>
+      </w:r>
+      <w:r>
+        <w:t xml:space="preserve">,</w:t>
+      </w:r>
+      <w:r>
+        <w:t xml:space="preserve"> </w:t>
+      </w:r>
+      <w:r>
+        <w:rPr>
+          <w:rStyle w:val="VerbatimChar"/>
+        </w:rPr>
+        <w:t xml:space="preserve">USVn</w:t>
+      </w:r>
+      <w:r>
+        <w:t xml:space="preserve">,</w:t>
+      </w:r>
+      <w:r>
+        <w:t xml:space="preserve"> </w:t>
+      </w:r>
+      <w:r>
+        <w:rPr>
+          <w:rStyle w:val="VerbatimChar"/>
+        </w:rPr>
+        <w:t xml:space="preserve">serSU</w:t>
+      </w:r>
+      <w:r>
+        <w:t xml:space="preserve">,</w:t>
+      </w:r>
+      <w:r>
+        <w:t xml:space="preserve"> </w:t>
+      </w:r>
+      <w:r>
+        <w:rPr>
+          <w:rStyle w:val="VerbatimChar"/>
+        </w:rPr>
+        <w:t xml:space="preserve">WorkingUnit</w:t>
+      </w:r>
+      <w:r>
+        <w:t xml:space="preserve">,</w:t>
+      </w:r>
+      <w:r>
+        <w:t xml:space="preserve"> </w:t>
+      </w:r>
+      <w:r>
+        <w:rPr>
+          <w:rStyle w:val="VerbatimChar"/>
+        </w:rPr>
+        <w:t xml:space="preserve">NegativeStratigraphicUnit</w:t>
+      </w:r>
+      <w:r>
+        <w:t xml:space="preserve">,</w:t>
+      </w:r>
+      <w:r>
+        <w:t xml:space="preserve"> </w:t>
+      </w:r>
+      <w:r>
+        <w:rPr>
+          <w:rStyle w:val="VerbatimChar"/>
+        </w:rPr>
+        <w:t xml:space="preserve">TSU</w:t>
+      </w:r>
+      <w:r>
+        <w:t xml:space="preserve">).</w:t>
+      </w:r>
+    </w:p>
+    <w:p>
+      <w:pPr>
+        <w:pStyle w:val="Compact"/>
+        <w:numPr>
+          <w:ilvl w:val="0"/>
+          <w:numId w:val="1024"/>
+        </w:numPr>
+      </w:pPr>
+      <w:r>
+        <w:t xml:space="preserve">Generating a Harris matrix succeeds.</w:t>
+      </w:r>
+    </w:p>
+    <w:p>
+      <w:pPr>
+        <w:pStyle w:val="Compact"/>
+        <w:numPr>
+          <w:ilvl w:val="0"/>
+          <w:numId w:val="1024"/>
+        </w:numPr>
+      </w:pPr>
+      <w:r>
+        <w:t xml:space="preserve">The two new entries in the pyArchInit Maintenance menu appear:</w:t>
+      </w:r>
+      <w:r>
+        <w:t xml:space="preserve"> </w:t>
+      </w:r>
+      <w:r>
+        <w:t xml:space="preserve">“Migrazioni → Allinea vocabolario US…”</w:t>
+      </w:r>
+      <w:r>
+        <w:t xml:space="preserve"> </w:t>
+      </w:r>
+      <w:r>
+        <w:t xml:space="preserve">and</w:t>
+      </w:r>
+      <w:r>
+        <w:t xml:space="preserve"> </w:t>
+      </w:r>
+      <w:r>
+        <w:t xml:space="preserve">“Migrazioni → Backfill</w:t>
+      </w:r>
+      <w:r>
+        <w:t xml:space="preserve"> </w:t>
+      </w:r>
+      <w:r>
+        <w:rPr>
+          <w:rStyle w:val="VerbatimChar"/>
+        </w:rPr>
+        <w:t xml:space="preserve">node_uuid</w:t>
+      </w:r>
+      <w:r>
+        <w:t xml:space="preserve">…”</w:t>
+      </w:r>
+      <w:r>
+        <w:t xml:space="preserve">. Optionally clicking either should open a file picker</w:t>
+      </w:r>
+      <w:r>
+        <w:t xml:space="preserve"> </w:t>
+      </w:r>
+      <w:r>
+        <w:t xml:space="preserve">without raising an exception (no</w:t>
+      </w:r>
+      <w:r>
+        <w:t xml:space="preserve"> </w:t>
+      </w:r>
+      <w:r>
+        <w:rPr>
+          <w:rStyle w:val="VerbatimChar"/>
+        </w:rPr>
+        <w:t xml:space="preserve">--apply</w:t>
+      </w:r>
+      <w:r>
+        <w:t xml:space="preserve"> </w:t>
+      </w:r>
+      <w:r>
+        <w:t xml:space="preserve">is required at this</w:t>
+      </w:r>
+      <w:r>
+        <w:t xml:space="preserve"> </w:t>
+      </w:r>
+      <w:r>
+        <w:t xml:space="preserve">gate; the dry-run path is enough).</w:t>
+      </w:r>
+    </w:p>
+    <w:p>
+      <w:pPr>
+        <w:pStyle w:val="Compact"/>
+        <w:numPr>
+          <w:ilvl w:val="0"/>
+          <w:numId w:val="1024"/>
+        </w:numPr>
+      </w:pPr>
+      <w:r>
+        <w:t xml:space="preserve">No</w:t>
+      </w:r>
+      <w:r>
+        <w:t xml:space="preserve"> </w:t>
+      </w:r>
+      <w:r>
+        <w:rPr>
+          <w:rStyle w:val="VerbatimChar"/>
+        </w:rPr>
+        <w:t xml:space="preserve">ATTENZIONE</w:t>
+      </w:r>
+      <w:r>
+        <w:t xml:space="preserve">/</w:t>
+      </w:r>
+      <w:r>
+        <w:rPr>
+          <w:rStyle w:val="VerbatimChar"/>
+        </w:rPr>
+        <w:t xml:space="preserve">Error fixing view</w:t>
+      </w:r>
+      <w:r>
+        <w:t xml:space="preserve"> </w:t>
+      </w:r>
+      <w:r>
+        <w:t xml:space="preserve">warnings in the QGIS log</w:t>
+      </w:r>
+      <w:r>
+        <w:t xml:space="preserve"> </w:t>
+      </w:r>
+      <w:r>
+        <w:t xml:space="preserve">related to s3Dgraphy or the Phase 1 refactors.</w:t>
+      </w:r>
+    </w:p>
+    <w:p>
+      <w:pPr>
+        <w:pStyle w:val="FirstParagraph"/>
+      </w:pPr>
+      <w:r>
+        <w:t xml:space="preserve">If anything fails, the user can</w:t>
+      </w:r>
+      <w:r>
+        <w:t xml:space="preserve"> </w:t>
+      </w:r>
+      <w:r>
+        <w:rPr>
+          <w:rStyle w:val="VerbatimChar"/>
+        </w:rPr>
+        <w:t xml:space="preserve">git checkout pre-s3dgraphy-040</w:t>
+      </w:r>
+      <w:r>
+        <w:t xml:space="preserve"> </w:t>
+      </w:r>
+      <w:r>
+        <w:t xml:space="preserve">to</w:t>
+      </w:r>
+      <w:r>
+        <w:t xml:space="preserve"> </w:t>
+      </w:r>
+      <w:r>
+        <w:t xml:space="preserve">return to the pre-Phase-1 state. The migration scripts are independent</w:t>
+      </w:r>
+      <w:r>
+        <w:t xml:space="preserve"> </w:t>
+      </w:r>
+      <w:r>
+        <w:t xml:space="preserve">and can be invoked manually from CLI for debugging.</w:t>
+      </w:r>
+    </w:p>
+    <w:bookmarkEnd w:id="46"/>
+    <w:bookmarkStart w:id="47" w:name="g.5-tag-and-push"/>
+    <w:p>
+      <w:pPr>
+        <w:pStyle w:val="Heading3"/>
+      </w:pPr>
+      <w:r>
+        <w:t xml:space="preserve">G.5 — Tag and push</w:t>
+      </w:r>
+    </w:p>
+    <w:p>
+      <w:pPr>
+        <w:pStyle w:val="FirstParagraph"/>
+      </w:pPr>
+      <w:r>
+        <w:t xml:space="preserve">Run after G.4 sign-off:</w:t>
+      </w:r>
+    </w:p>
+    <w:p>
+      <w:pPr>
+        <w:pStyle w:val="SourceCode"/>
+      </w:pPr>
+      <w:r>
+        <w:rPr>
+          <w:rStyle w:val="FunctionTok"/>
+        </w:rPr>
+        <w:t xml:space="preserve">git</w:t>
+      </w:r>
+      <w:r>
+        <w:rPr>
+          <w:rStyle w:val="NormalTok"/>
+        </w:rPr>
+        <w:t xml:space="preserve"> tag </w:t>
+      </w:r>
+      <w:r>
+        <w:rPr>
+          <w:rStyle w:val="AttributeTok"/>
+        </w:rPr>
+        <w:t xml:space="preserve">-a</w:t>
+      </w:r>
+      <w:r>
+        <w:rPr>
+          <w:rStyle w:val="NormalTok"/>
+        </w:rPr>
+        <w:t xml:space="preserve"> phase1-foundation-5.1.0-alpha </w:t>
+      </w:r>
+      <w:r>
+        <w:rPr>
+          <w:rStyle w:val="AttributeTok"/>
+        </w:rPr>
+        <w:t xml:space="preserve">-m</w:t>
+      </w:r>
+      <w:r>
+        <w:rPr>
+          <w:rStyle w:val="NormalTok"/>
+        </w:rPr>
+        <w:t xml:space="preserve"> </w:t>
+      </w:r>
+      <w:r>
+        <w:rPr>
+          <w:rStyle w:val="StringTok"/>
+        </w:rPr>
+        <w:t xml:space="preserve">"Phase 1 (Foundation) of PyArchInit ↔ s3Dgraphy"</w:t>
+      </w:r>
+      <w:r>
+        <w:br/>
+      </w:r>
+      <w:r>
+        <w:rPr>
+          <w:rStyle w:val="FunctionTok"/>
+        </w:rPr>
+        <w:t xml:space="preserve">git</w:t>
+      </w:r>
+      <w:r>
+        <w:rPr>
+          <w:rStyle w:val="NormalTok"/>
+        </w:rPr>
+        <w:t xml:space="preserve"> push origin Stratigraph_00001</w:t>
+      </w:r>
+      <w:r>
+        <w:br/>
+      </w:r>
+      <w:r>
+        <w:rPr>
+          <w:rStyle w:val="FunctionTok"/>
+        </w:rPr>
+        <w:t xml:space="preserve">git</w:t>
+      </w:r>
+      <w:r>
+        <w:rPr>
+          <w:rStyle w:val="NormalTok"/>
+        </w:rPr>
+        <w:t xml:space="preserve"> push origin phase1-foundation-5.1.0-alpha</w:t>
+      </w:r>
+      <w:r>
+        <w:br/>
+      </w:r>
+      <w:r>
+        <w:rPr>
+          <w:rStyle w:val="FunctionTok"/>
+        </w:rPr>
+        <w:t xml:space="preserve">git</w:t>
+      </w:r>
+      <w:r>
+        <w:rPr>
+          <w:rStyle w:val="NormalTok"/>
+        </w:rPr>
+        <w:t xml:space="preserve"> push origin pre-s3dgraphy-040</w:t>
+      </w:r>
+    </w:p>
+    <w:bookmarkEnd w:id="47"/>
+    <w:bookmarkEnd w:id="48"/>
+    <w:bookmarkEnd w:id="49"/>
     <w:sectPr>
       <w:footnotePr>
         <w:numRestart w:val="eachSect"/>
@@ -11085,6 +11876,39 @@
   </w:num>
   <w:num w:numId="1022">
     <w:abstractNumId w:val="991"/>
+  </w:num>
+  <w:num w:numId="1023">
+    <w:abstractNumId w:val="991"/>
+  </w:num>
+  <w:num w:numId="1024">
+    <w:abstractNumId w:val="99411"/>
+    <w:lvlOverride w:ilvl="0">
+      <w:startOverride w:val="1"/>
+    </w:lvlOverride>
+    <w:lvlOverride w:ilvl="1">
+      <w:startOverride w:val="1"/>
+    </w:lvlOverride>
+    <w:lvlOverride w:ilvl="2">
+      <w:startOverride w:val="1"/>
+    </w:lvlOverride>
+    <w:lvlOverride w:ilvl="3">
+      <w:startOverride w:val="1"/>
+    </w:lvlOverride>
+    <w:lvlOverride w:ilvl="4">
+      <w:startOverride w:val="1"/>
+    </w:lvlOverride>
+    <w:lvlOverride w:ilvl="5">
+      <w:startOverride w:val="1"/>
+    </w:lvlOverride>
+    <w:lvlOverride w:ilvl="6">
+      <w:startOverride w:val="1"/>
+    </w:lvlOverride>
+    <w:lvlOverride w:ilvl="7">
+      <w:startOverride w:val="1"/>
+    </w:lvlOverride>
+    <w:lvlOverride w:ilvl="8">
+      <w:startOverride w:val="1"/>
+    </w:lvlOverride>
   </w:num>
 </w:numbering>
 </file>

</xml_diff>

<commit_message>
docs(dev-log): document in-flight DOT edge-parser hotfix (09b9fbde)
Pre-existing parser bug surfaced during Group G smoke prep: empty
GraphML output from Extended Matrix because edge src/dest were
truncated at the first internal space of the multi-word node IDs.
Fixed in dot.py via a quote-aware split helper. DOCX re-rendered.
</commit_message>
<xml_diff>
--- a/docs/superpowers/dev-log/T5.4_PyArchInit_Dev_Log.docx
+++ b/docs/superpowers/dev-log/T5.4_PyArchInit_Dev_Log.docx
@@ -10699,7 +10699,7 @@
     </w:p>
     <w:bookmarkEnd w:id="43"/>
     <w:bookmarkEnd w:id="44"/>
-    <w:bookmarkStart w:id="49" w:name="group-g-release-packaging-5.1.0-alpha"/>
+    <w:bookmarkStart w:id="50" w:name="group-g-release-packaging-5.1.0-alpha"/>
     <w:p>
       <w:pPr>
         <w:pStyle w:val="Heading1"/>
@@ -11482,7 +11482,455 @@
     </w:p>
     <w:bookmarkEnd w:id="47"/>
     <w:bookmarkEnd w:id="48"/>
+    <w:bookmarkStart w:id="49" w:name="in-flight-phase-1-hotfix-commit-09b9fbde"/>
+    <w:p>
+      <w:pPr>
+        <w:pStyle w:val="Heading2"/>
+      </w:pPr>
+      <w:r>
+        <w:t xml:space="preserve">In-flight Phase 1 hotfix (commit</w:t>
+      </w:r>
+      <w:r>
+        <w:t xml:space="preserve"> </w:t>
+      </w:r>
+      <w:r>
+        <w:rPr>
+          <w:rStyle w:val="VerbatimChar"/>
+        </w:rPr>
+        <w:t xml:space="preserve">09b9fbde</w:t>
+      </w:r>
+      <w:r>
+        <w:t xml:space="preserve">)</w:t>
+      </w:r>
+    </w:p>
+    <w:p>
+      <w:pPr>
+        <w:pStyle w:val="FirstParagraph"/>
+      </w:pPr>
+      <w:r>
+        <w:t xml:space="preserve">While preparing the manual smoke gate, the user reported that the</w:t>
+      </w:r>
+      <w:r>
+        <w:t xml:space="preserve"> </w:t>
+      </w:r>
+      <w:r>
+        <w:t xml:space="preserve">“Extended Matrix”</w:t>
+      </w:r>
+      <w:r>
+        <w:t xml:space="preserve"> </w:t>
+      </w:r>
+      <w:r>
+        <w:t xml:space="preserve">export produced an empty</w:t>
+      </w:r>
+      <w:r>
+        <w:t xml:space="preserve"> </w:t>
+      </w:r>
+      <w:r>
+        <w:rPr>
+          <w:rStyle w:val="VerbatimChar"/>
+        </w:rPr>
+        <w:t xml:space="preserve">.graphml</w:t>
+      </w:r>
+      <w:r>
+        <w:t xml:space="preserve"> </w:t>
+      </w:r>
+      <w:r>
+        <w:t xml:space="preserve">file alongside</w:t>
+      </w:r>
+      <w:r>
+        <w:t xml:space="preserve"> </w:t>
+      </w:r>
+      <w:r>
+        <w:t xml:space="preserve">the (correct) DOT and</w:t>
+      </w:r>
+      <w:r>
+        <w:t xml:space="preserve"> </w:t>
+      </w:r>
+      <w:r>
+        <w:rPr>
+          <w:rStyle w:val="VerbatimChar"/>
+        </w:rPr>
+        <w:t xml:space="preserve">_s3dgraphy.json</w:t>
+      </w:r>
+      <w:r>
+        <w:t xml:space="preserve"> </w:t>
+      </w:r>
+      <w:r>
+        <w:t xml:space="preserve">outputs. Investigation traced</w:t>
+      </w:r>
+      <w:r>
+        <w:t xml:space="preserve"> </w:t>
+      </w:r>
+      <w:r>
+        <w:t xml:space="preserve">the root cause to a long-standing bug in</w:t>
+      </w:r>
+      <w:r>
+        <w:t xml:space="preserve"> </w:t>
+      </w:r>
+      <w:r>
+        <w:rPr>
+          <w:rStyle w:val="VerbatimChar"/>
+        </w:rPr>
+        <w:t xml:space="preserve">resources/dbfiles/dot.py::Edge.initFromString()</w:t>
+      </w:r>
+      <w:r>
+        <w:t xml:space="preserve">:</w:t>
+      </w:r>
+    </w:p>
+    <w:p>
+      <w:pPr>
+        <w:pStyle w:val="Compact"/>
+        <w:numPr>
+          <w:ilvl w:val="0"/>
+          <w:numId w:val="1025"/>
+        </w:numPr>
+      </w:pPr>
+      <w:r>
+        <w:t xml:space="preserve">The DOT file emitted by</w:t>
+      </w:r>
+      <w:r>
+        <w:t xml:space="preserve"> </w:t>
+      </w:r>
+      <w:r>
+        <w:rPr>
+          <w:rStyle w:val="VerbatimChar"/>
+        </w:rPr>
+        <w:t xml:space="preserve">S3DGraphyDotBridge</w:t>
+      </w:r>
+      <w:r>
+        <w:t xml:space="preserve"> </w:t>
+      </w:r>
+      <w:r>
+        <w:t xml:space="preserve">uses node IDs that</w:t>
+      </w:r>
+      <w:r>
+        <w:t xml:space="preserve"> </w:t>
+      </w:r>
+      <w:r>
+        <w:t xml:space="preserve">include the site name, e.g. </w:t>
+      </w:r>
+      <w:r>
+        <w:rPr>
+          <w:rStyle w:val="VerbatimChar"/>
+        </w:rPr>
+        <w:t xml:space="preserve">"Castelseprio Casa Piccoli_1_36"</w:t>
+      </w:r>
+      <w:r>
+        <w:t xml:space="preserve">.</w:t>
+      </w:r>
+      <w:r>
+        <w:t xml:space="preserve"> </w:t>
+      </w:r>
+      <w:r>
+        <w:t xml:space="preserve">These IDs are properly double-quoted in the DOT source.</w:t>
+      </w:r>
+    </w:p>
+    <w:p>
+      <w:pPr>
+        <w:pStyle w:val="Compact"/>
+        <w:numPr>
+          <w:ilvl w:val="0"/>
+          <w:numId w:val="1025"/>
+        </w:numPr>
+      </w:pPr>
+      <w:r>
+        <w:t xml:space="preserve">The edge parser split the edge line via</w:t>
+      </w:r>
+      <w:r>
+        <w:t xml:space="preserve"> </w:t>
+      </w:r>
+      <w:r>
+        <w:rPr>
+          <w:rStyle w:val="VerbatimChar"/>
+        </w:rPr>
+        <w:t xml:space="preserve">line.replace('-&gt;', ' ').split()</w:t>
+      </w:r>
+      <w:r>
+        <w:t xml:space="preserve"> </w:t>
+      </w:r>
+      <w:r>
+        <w:t xml:space="preserve">— naive whitespace split that did</w:t>
+      </w:r>
+      <w:r>
+        <w:t xml:space="preserve"> </w:t>
+      </w:r>
+      <w:r>
+        <w:t xml:space="preserve">not respect double-quoted runs.</w:t>
+      </w:r>
+    </w:p>
+    <w:p>
+      <w:pPr>
+        <w:pStyle w:val="Compact"/>
+        <w:numPr>
+          <w:ilvl w:val="0"/>
+          <w:numId w:val="1025"/>
+        </w:numPr>
+      </w:pPr>
+      <w:r>
+        <w:t xml:space="preserve">Result: every edge ended up with</w:t>
+      </w:r>
+      <w:r>
+        <w:t xml:space="preserve"> </w:t>
+      </w:r>
+      <w:r>
+        <w:rPr>
+          <w:rStyle w:val="VerbatimChar"/>
+        </w:rPr>
+        <w:t xml:space="preserve">src="Castelseprio"</w:t>
+      </w:r>
+      <w:r>
+        <w:t xml:space="preserve">,</w:t>
+      </w:r>
+      <w:r>
+        <w:t xml:space="preserve"> </w:t>
+      </w:r>
+      <w:r>
+        <w:rPr>
+          <w:rStyle w:val="VerbatimChar"/>
+        </w:rPr>
+        <w:t xml:space="preserve">dest="Casa"</w:t>
+      </w:r>
+      <w:r>
+        <w:t xml:space="preserve">. Both lookups missed the (correctly-named) node</w:t>
+      </w:r>
+      <w:r>
+        <w:t xml:space="preserve"> </w:t>
+      </w:r>
+      <w:r>
+        <w:t xml:space="preserve">dictionary keys, so</w:t>
+      </w:r>
+      <w:r>
+        <w:t xml:space="preserve"> </w:t>
+      </w:r>
+      <w:r>
+        <w:rPr>
+          <w:rStyle w:val="VerbatimChar"/>
+        </w:rPr>
+        <w:t xml:space="preserve">dottoxml.exportGraphml</w:t>
+      </w:r>
+      <w:r>
+        <w:t xml:space="preserve"> </w:t>
+      </w:r>
+      <w:r>
+        <w:t xml:space="preserve">wrote zero</w:t>
+      </w:r>
+      <w:r>
+        <w:t xml:space="preserve"> </w:t>
+      </w:r>
+      <w:r>
+        <w:rPr>
+          <w:rStyle w:val="VerbatimChar"/>
+        </w:rPr>
+        <w:t xml:space="preserve">&lt;edge&gt;</w:t>
+      </w:r>
+      <w:r>
+        <w:t xml:space="preserve"> </w:t>
+      </w:r>
+      <w:r>
+        <w:t xml:space="preserve">elements and, with this dataset, produced a 0-byte file.</w:t>
+      </w:r>
+    </w:p>
+    <w:p>
+      <w:pPr>
+        <w:pStyle w:val="FirstParagraph"/>
+      </w:pPr>
+      <w:r>
+        <w:t xml:space="preserve">The bug is</w:t>
+      </w:r>
+      <w:r>
+        <w:t xml:space="preserve"> </w:t>
+      </w:r>
+      <w:r>
+        <w:rPr>
+          <w:b/>
+          <w:bCs/>
+        </w:rPr>
+        <w:t xml:space="preserve">pre-existing</w:t>
+      </w:r>
+      <w:r>
+        <w:t xml:space="preserve"> </w:t>
+      </w:r>
+      <w:r>
+        <w:t xml:space="preserve">(unrelated to the Phase 1 refactor — git</w:t>
+      </w:r>
+      <w:r>
+        <w:t xml:space="preserve"> </w:t>
+      </w:r>
+      <w:r>
+        <w:t xml:space="preserve">blame on the affected line predates this branch). Phase 2 / AI03 was</w:t>
+      </w:r>
+      <w:r>
+        <w:t xml:space="preserve"> </w:t>
+      </w:r>
+      <w:r>
+        <w:t xml:space="preserve">already going to retire the entire DOT-parser code path by delegating</w:t>
+      </w:r>
+      <w:r>
+        <w:t xml:space="preserve"> </w:t>
+      </w:r>
+      <w:r>
+        <w:t xml:space="preserve">GraphML serialisation to s3Dgraphy’s always-EM-current writer; that</w:t>
+      </w:r>
+      <w:r>
+        <w:t xml:space="preserve"> </w:t>
+      </w:r>
+      <w:r>
+        <w:t xml:space="preserve">remains the proper long-term fix. In the meantime this hotfix</w:t>
+      </w:r>
+      <w:r>
+        <w:t xml:space="preserve"> </w:t>
+      </w:r>
+      <w:r>
+        <w:t xml:space="preserve">unblocks the Phase 1 smoke gate so the user can validate the new</w:t>
+      </w:r>
+      <w:r>
+        <w:t xml:space="preserve"> </w:t>
+      </w:r>
+      <w:r>
+        <w:t xml:space="preserve">combo-box behaviour against a working Extended Matrix export.</w:t>
+      </w:r>
+    </w:p>
+    <w:p>
+      <w:pPr>
+        <w:pStyle w:val="BodyText"/>
+      </w:pPr>
+      <w:r>
+        <w:t xml:space="preserve">The hotfix is a 36-line addition to</w:t>
+      </w:r>
+      <w:r>
+        <w:t xml:space="preserve"> </w:t>
+      </w:r>
+      <w:r>
+        <w:rPr>
+          <w:rStyle w:val="VerbatimChar"/>
+        </w:rPr>
+        <w:t xml:space="preserve">dot.py</w:t>
+      </w:r>
+      <w:r>
+        <w:t xml:space="preserve">: a new</w:t>
+      </w:r>
+      <w:r>
+        <w:t xml:space="preserve"> </w:t>
+      </w:r>
+      <w:r>
+        <w:rPr>
+          <w:rStyle w:val="VerbatimChar"/>
+        </w:rPr>
+        <w:t xml:space="preserve">_split_respecting_quotes()</w:t>
+      </w:r>
+      <w:r>
+        <w:t xml:space="preserve"> </w:t>
+      </w:r>
+      <w:r>
+        <w:t xml:space="preserve">helper alongside the existing</w:t>
+      </w:r>
+      <w:r>
+        <w:t xml:space="preserve"> </w:t>
+      </w:r>
+      <w:r>
+        <w:rPr>
+          <w:rStyle w:val="VerbatimChar"/>
+        </w:rPr>
+        <w:t xml:space="preserve">findUnquoted()</w:t>
+      </w:r>
+      <w:r>
+        <w:t xml:space="preserve"> </w:t>
+      </w:r>
+      <w:r>
+        <w:t xml:space="preserve">/</w:t>
+      </w:r>
+      <w:r>
+        <w:t xml:space="preserve"> </w:t>
+      </w:r>
+      <w:r>
+        <w:rPr>
+          <w:rStyle w:val="VerbatimChar"/>
+        </w:rPr>
+        <w:t xml:space="preserve">findLastUnquoted()</w:t>
+      </w:r>
+      <w:r>
+        <w:t xml:space="preserve"> </w:t>
+      </w:r>
+      <w:r>
+        <w:t xml:space="preserve">siblings, and a single-line</w:t>
+      </w:r>
+      <w:r>
+        <w:t xml:space="preserve"> </w:t>
+      </w:r>
+      <w:r>
+        <w:t xml:space="preserve">swap at the call site in</w:t>
+      </w:r>
+      <w:r>
+        <w:t xml:space="preserve"> </w:t>
+      </w:r>
+      <w:r>
+        <w:rPr>
+          <w:rStyle w:val="VerbatimChar"/>
+        </w:rPr>
+        <w:t xml:space="preserve">Edge.initFromString()</w:t>
+      </w:r>
+      <w:r>
+        <w:t xml:space="preserve">. Regression-tested</w:t>
+      </w:r>
+      <w:r>
+        <w:t xml:space="preserve"> </w:t>
+      </w:r>
+      <w:r>
+        <w:t xml:space="preserve">against four cases (bare identifiers, single-token quoted,</w:t>
+      </w:r>
+      <w:r>
+        <w:t xml:space="preserve"> </w:t>
+      </w:r>
+      <w:r>
+        <w:t xml:space="preserve">multi-word quoted, multi-word with attributes); on the real</w:t>
+      </w:r>
+      <w:r>
+        <w:t xml:space="preserve"> </w:t>
+      </w:r>
+      <w:r>
+        <w:t xml:space="preserve">Volterra/Castelseprio export the parser now extracts 655 edges with</w:t>
+      </w:r>
+      <w:r>
+        <w:t xml:space="preserve"> </w:t>
+      </w:r>
+      <w:r>
+        <w:t xml:space="preserve">correct full src/dest (was: 655 with truncated src/dest, all of which</w:t>
+      </w:r>
+      <w:r>
+        <w:t xml:space="preserve"> </w:t>
+      </w:r>
+      <w:r>
+        <w:t xml:space="preserve">fell through the node-lookup and were lost during GraphML write).</w:t>
+      </w:r>
+    </w:p>
+    <w:p>
+      <w:pPr>
+        <w:pStyle w:val="BodyText"/>
+      </w:pPr>
+      <w:r>
+        <w:t xml:space="preserve">The 42-test sync + migrations suite is unaffected (the fixed code</w:t>
+      </w:r>
+      <w:r>
+        <w:t xml:space="preserve"> </w:t>
+      </w:r>
+      <w:r>
+        <w:t xml:space="preserve">path is in legacy DOT/GraphML production code that has no</w:t>
+      </w:r>
+      <w:r>
+        <w:t xml:space="preserve"> </w:t>
+      </w:r>
+      <w:r>
+        <w:t xml:space="preserve">unit-test coverage today — this gap will close in Phase 2 when the</w:t>
+      </w:r>
+      <w:r>
+        <w:t xml:space="preserve"> </w:t>
+      </w:r>
+      <w:r>
+        <w:t xml:space="preserve">delegation to s3Dgraphy lands and replaces the parser entirely).</w:t>
+      </w:r>
+    </w:p>
     <w:bookmarkEnd w:id="49"/>
+    <w:bookmarkEnd w:id="50"/>
     <w:sectPr>
       <w:footnotePr>
         <w:numRestart w:val="eachSect"/>
@@ -11909,6 +12357,9 @@
     <w:lvlOverride w:ilvl="8">
       <w:startOverride w:val="1"/>
     </w:lvlOverride>
+  </w:num>
+  <w:num w:numId="1025">
+    <w:abstractNumId w:val="991"/>
   </w:num>
 </w:numbering>
 </file>

</xml_diff>

<commit_message>
docs(dev-log): document maintenance-files auto-refresh (d0dcd828)
Without this, the dot.py edge-parser hotfix shipped in 09b9fbde
would never propagate to existing installs because install_dir()
runs only at first install. DOCX re-rendered.
</commit_message>
<xml_diff>
--- a/docs/superpowers/dev-log/T5.4_PyArchInit_Dev_Log.docx
+++ b/docs/superpowers/dev-log/T5.4_PyArchInit_Dev_Log.docx
@@ -10699,7 +10699,7 @@
     </w:p>
     <w:bookmarkEnd w:id="43"/>
     <w:bookmarkEnd w:id="44"/>
-    <w:bookmarkStart w:id="50" w:name="group-g-release-packaging-5.1.0-alpha"/>
+    <w:bookmarkStart w:id="51" w:name="group-g-release-packaging-5.1.0-alpha"/>
     <w:p>
       <w:pPr>
         <w:pStyle w:val="Heading1"/>
@@ -11930,7 +11930,716 @@
       </w:r>
     </w:p>
     <w:bookmarkEnd w:id="49"/>
+    <w:bookmarkStart w:id="50" w:name="X17cbc5b52fa774fe4b5a9d88546d12e55fd3da9"/>
+    <w:p>
+      <w:pPr>
+        <w:pStyle w:val="Heading2"/>
+      </w:pPr>
+      <w:r>
+        <w:t xml:space="preserve">Second in-flight Phase 1 hotfix (commit</w:t>
+      </w:r>
+      <w:r>
+        <w:t xml:space="preserve"> </w:t>
+      </w:r>
+      <w:r>
+        <w:rPr>
+          <w:rStyle w:val="VerbatimChar"/>
+        </w:rPr>
+        <w:t xml:space="preserve">d0dcd828</w:t>
+      </w:r>
+      <w:r>
+        <w:t xml:space="preserve">)</w:t>
+      </w:r>
+    </w:p>
+    <w:p>
+      <w:pPr>
+        <w:pStyle w:val="FirstParagraph"/>
+      </w:pPr>
+      <w:r>
+        <w:t xml:space="preserve">The first hotfix patched</w:t>
+      </w:r>
+      <w:r>
+        <w:t xml:space="preserve"> </w:t>
+      </w:r>
+      <w:r>
+        <w:rPr>
+          <w:rStyle w:val="VerbatimChar"/>
+        </w:rPr>
+        <w:t xml:space="preserve">resources/dbfiles/dot.py</w:t>
+      </w:r>
+      <w:r>
+        <w:t xml:space="preserve">, but the user</w:t>
+      </w:r>
+      <w:r>
+        <w:t xml:space="preserve"> </w:t>
+      </w:r>
+      <w:r>
+        <w:t xml:space="preserve">reported that the plugin loads</w:t>
+      </w:r>
+      <w:r>
+        <w:t xml:space="preserve"> </w:t>
+      </w:r>
+      <w:r>
+        <w:rPr>
+          <w:rStyle w:val="VerbatimChar"/>
+        </w:rPr>
+        <w:t xml:space="preserve">dot.py</w:t>
+      </w:r>
+      <w:r>
+        <w:t xml:space="preserve"> </w:t>
+      </w:r>
+      <w:r>
+        <w:t xml:space="preserve">from</w:t>
+      </w:r>
+      <w:r>
+        <w:t xml:space="preserve"> </w:t>
+      </w:r>
+      <w:r>
+        <w:rPr>
+          <w:rStyle w:val="VerbatimChar"/>
+        </w:rPr>
+        <w:t xml:space="preserve">~/pyarchinit/bin/</w:t>
+      </w:r>
+      <w:r>
+        <w:t xml:space="preserve"> </w:t>
+      </w:r>
+      <w:r>
+        <w:t xml:space="preserve">rather than directly from the plugin tree. Investigation surfaced</w:t>
+      </w:r>
+      <w:r>
+        <w:t xml:space="preserve"> </w:t>
+      </w:r>
+      <w:r>
+        <w:t xml:space="preserve">the deployment mechanism:</w:t>
+      </w:r>
+    </w:p>
+    <w:p>
+      <w:pPr>
+        <w:pStyle w:val="Compact"/>
+        <w:numPr>
+          <w:ilvl w:val="0"/>
+          <w:numId w:val="1026"/>
+        </w:numPr>
+      </w:pPr>
+      <w:r>
+        <w:rPr>
+          <w:rStyle w:val="VerbatimChar"/>
+        </w:rPr>
+        <w:t xml:space="preserve">pyarchinit_Folder_installation.install_dir()</w:t>
+      </w:r>
+      <w:r>
+        <w:t xml:space="preserve"> </w:t>
+      </w:r>
+      <w:r>
+        <w:t xml:space="preserve">copies a list of</w:t>
+      </w:r>
+      <w:r>
+        <w:t xml:space="preserve"> </w:t>
+      </w:r>
+      <w:r>
+        <w:t xml:space="preserve">utility files (</w:t>
+      </w:r>
+      <w:r>
+        <w:rPr>
+          <w:rStyle w:val="VerbatimChar"/>
+        </w:rPr>
+        <w:t xml:space="preserve">dot.py</w:t>
+      </w:r>
+      <w:r>
+        <w:t xml:space="preserve">,</w:t>
+      </w:r>
+      <w:r>
+        <w:t xml:space="preserve"> </w:t>
+      </w:r>
+      <w:r>
+        <w:rPr>
+          <w:rStyle w:val="VerbatimChar"/>
+        </w:rPr>
+        <w:t xml:space="preserve">dottoxml.py</w:t>
+      </w:r>
+      <w:r>
+        <w:t xml:space="preserve">,</w:t>
+      </w:r>
+      <w:r>
+        <w:t xml:space="preserve"> </w:t>
+      </w:r>
+      <w:r>
+        <w:rPr>
+          <w:rStyle w:val="VerbatimChar"/>
+        </w:rPr>
+        <w:t xml:space="preserve">X11Colors.py</w:t>
+      </w:r>
+      <w:r>
+        <w:t xml:space="preserve">,</w:t>
+      </w:r>
+      <w:r>
+        <w:t xml:space="preserve"> </w:t>
+      </w:r>
+      <w:r>
+        <w:rPr>
+          <w:rStyle w:val="VerbatimChar"/>
+        </w:rPr>
+        <w:t xml:space="preserve">EM_palette.graphml</w:t>
+      </w:r>
+      <w:r>
+        <w:t xml:space="preserve">, etc.) from</w:t>
+      </w:r>
+      <w:r>
+        <w:t xml:space="preserve"> </w:t>
+      </w:r>
+      <w:r>
+        <w:rPr>
+          <w:rStyle w:val="VerbatimChar"/>
+        </w:rPr>
+        <w:t xml:space="preserve">resources/dbfiles/</w:t>
+      </w:r>
+      <w:r>
+        <w:t xml:space="preserve"> </w:t>
+      </w:r>
+      <w:r>
+        <w:t xml:space="preserve">into</w:t>
+      </w:r>
+      <w:r>
+        <w:t xml:space="preserve"> </w:t>
+      </w:r>
+      <w:r>
+        <w:rPr>
+          <w:rStyle w:val="VerbatimChar"/>
+        </w:rPr>
+        <w:t xml:space="preserve">~/pyarchinit/bin/</w:t>
+      </w:r>
+      <w:r>
+        <w:t xml:space="preserve"> </w:t>
+      </w:r>
+      <w:r>
+        <w:t xml:space="preserve">at first install.</w:t>
+      </w:r>
+    </w:p>
+    <w:p>
+      <w:pPr>
+        <w:pStyle w:val="Compact"/>
+        <w:numPr>
+          <w:ilvl w:val="0"/>
+          <w:numId w:val="1026"/>
+        </w:numPr>
+      </w:pPr>
+      <w:r>
+        <w:t xml:space="preserve">This routine runs</w:t>
+      </w:r>
+      <w:r>
+        <w:t xml:space="preserve"> </w:t>
+      </w:r>
+      <w:r>
+        <w:rPr>
+          <w:b/>
+          <w:bCs/>
+        </w:rPr>
+        <w:t xml:space="preserve">only</w:t>
+      </w:r>
+      <w:r>
+        <w:t xml:space="preserve"> </w:t>
+      </w:r>
+      <w:r>
+        <w:t xml:space="preserve">when</w:t>
+      </w:r>
+      <w:r>
+        <w:t xml:space="preserve"> </w:t>
+      </w:r>
+      <w:r>
+        <w:rPr>
+          <w:rStyle w:val="VerbatimChar"/>
+        </w:rPr>
+        <w:t xml:space="preserve">~/pyarchinit/</w:t>
+      </w:r>
+      <w:r>
+        <w:t xml:space="preserve"> </w:t>
+      </w:r>
+      <w:r>
+        <w:t xml:space="preserve">does not exist</w:t>
+      </w:r>
+      <w:r>
+        <w:t xml:space="preserve"> </w:t>
+      </w:r>
+      <w:r>
+        <w:t xml:space="preserve">(</w:t>
+      </w:r>
+      <w:r>
+        <w:rPr>
+          <w:rStyle w:val="VerbatimChar"/>
+        </w:rPr>
+        <w:t xml:space="preserve">__init__.py:805</w:t>
+      </w:r>
+      <w:r>
+        <w:t xml:space="preserve">:</w:t>
+      </w:r>
+      <w:r>
+        <w:t xml:space="preserve"> </w:t>
+      </w:r>
+      <w:r>
+        <w:rPr>
+          <w:rStyle w:val="VerbatimChar"/>
+        </w:rPr>
+        <w:t xml:space="preserve">if not os.path.exists(PYARCHINIT_HOME): fi.install_dir()</w:t>
+      </w:r>
+      <w:r>
+        <w:t xml:space="preserve">). On every subsequent QGIS reload the</w:t>
+      </w:r>
+      <w:r>
+        <w:t xml:space="preserve"> </w:t>
+      </w:r>
+      <w:r>
+        <w:t xml:space="preserve">install path is skipped and the runtime copies stay frozen at</w:t>
+      </w:r>
+      <w:r>
+        <w:t xml:space="preserve"> </w:t>
+      </w:r>
+      <w:r>
+        <w:t xml:space="preserve">whatever version shipped on the day of first install.</w:t>
+      </w:r>
+    </w:p>
+    <w:p>
+      <w:pPr>
+        <w:pStyle w:val="Compact"/>
+        <w:numPr>
+          <w:ilvl w:val="0"/>
+          <w:numId w:val="1026"/>
+        </w:numPr>
+      </w:pPr>
+      <w:r>
+        <w:rPr>
+          <w:rStyle w:val="VerbatimChar"/>
+        </w:rPr>
+        <w:t xml:space="preserve">Pyarchinit_OS_Utility.copy_file()</w:t>
+      </w:r>
+      <w:r>
+        <w:t xml:space="preserve"> </w:t>
+      </w:r>
+      <w:r>
+        <w:t xml:space="preserve">is itself a no-op when the</w:t>
+      </w:r>
+      <w:r>
+        <w:t xml:space="preserve"> </w:t>
+      </w:r>
+      <w:r>
+        <w:t xml:space="preserve">destination already exists (</w:t>
+      </w:r>
+      <w:r>
+        <w:rPr>
+          <w:rStyle w:val="VerbatimChar"/>
+        </w:rPr>
+        <w:t xml:space="preserve">if os.access(destination, 0): return 0</w:t>
+      </w:r>
+      <w:r>
+        <w:t xml:space="preserve">), so even if the install routine were re-run it</w:t>
+      </w:r>
+      <w:r>
+        <w:t xml:space="preserve"> </w:t>
+      </w:r>
+      <w:r>
+        <w:t xml:space="preserve">wouldn’t refresh anything.</w:t>
+      </w:r>
+    </w:p>
+    <w:p>
+      <w:pPr>
+        <w:pStyle w:val="FirstParagraph"/>
+      </w:pPr>
+      <w:r>
+        <w:t xml:space="preserve">Net effect: a bug fix in</w:t>
+      </w:r>
+      <w:r>
+        <w:t xml:space="preserve"> </w:t>
+      </w:r>
+      <w:r>
+        <w:rPr>
+          <w:rStyle w:val="VerbatimChar"/>
+        </w:rPr>
+        <w:t xml:space="preserve">resources/dbfiles/dot.py</w:t>
+      </w:r>
+      <w:r>
+        <w:t xml:space="preserve"> </w:t>
+      </w:r>
+      <w:r>
+        <w:t xml:space="preserve">never reaches</w:t>
+      </w:r>
+      <w:r>
+        <w:t xml:space="preserve"> </w:t>
+      </w:r>
+      <w:r>
+        <w:t xml:space="preserve">the actual</w:t>
+      </w:r>
+      <w:r>
+        <w:t xml:space="preserve"> </w:t>
+      </w:r>
+      <w:r>
+        <w:rPr>
+          <w:rStyle w:val="VerbatimChar"/>
+        </w:rPr>
+        <w:t xml:space="preserve">~/pyarchinit/bin/dot.py</w:t>
+      </w:r>
+      <w:r>
+        <w:t xml:space="preserve"> </w:t>
+      </w:r>
+      <w:r>
+        <w:t xml:space="preserve">that the plugin imports at</w:t>
+      </w:r>
+      <w:r>
+        <w:t xml:space="preserve"> </w:t>
+      </w:r>
+      <w:r>
+        <w:t xml:space="preserve">runtime. Users have a stale copy and keep hitting the original bug.</w:t>
+      </w:r>
+    </w:p>
+    <w:p>
+      <w:pPr>
+        <w:pStyle w:val="BodyText"/>
+      </w:pPr>
+      <w:r>
+        <w:t xml:space="preserve">The fix introduces an auto-refresh path:</w:t>
+      </w:r>
+    </w:p>
+    <w:p>
+      <w:pPr>
+        <w:pStyle w:val="Compact"/>
+        <w:numPr>
+          <w:ilvl w:val="0"/>
+          <w:numId w:val="1027"/>
+        </w:numPr>
+      </w:pPr>
+      <w:r>
+        <w:t xml:space="preserve">A new class constant</w:t>
+      </w:r>
+      <w:r>
+        <w:t xml:space="preserve"> </w:t>
+      </w:r>
+      <w:r>
+        <w:rPr>
+          <w:rStyle w:val="VerbatimChar"/>
+        </w:rPr>
+        <w:t xml:space="preserve">MAINTENANCE_BIN_FILES</w:t>
+      </w:r>
+      <w:r>
+        <w:t xml:space="preserve"> </w:t>
+      </w:r>
+      <w:r>
+        <w:t xml:space="preserve">on</w:t>
+      </w:r>
+      <w:r>
+        <w:t xml:space="preserve"> </w:t>
+      </w:r>
+      <w:r>
+        <w:rPr>
+          <w:rStyle w:val="VerbatimChar"/>
+        </w:rPr>
+        <w:t xml:space="preserve">pyarchinit_Folder_installation</w:t>
+      </w:r>
+      <w:r>
+        <w:t xml:space="preserve"> </w:t>
+      </w:r>
+      <w:r>
+        <w:t xml:space="preserve">lists the four files the plugin</w:t>
+      </w:r>
+      <w:r>
+        <w:t xml:space="preserve"> </w:t>
+      </w:r>
+      <w:r>
+        <w:t xml:space="preserve">owns end-to-end (</w:t>
+      </w:r>
+      <w:r>
+        <w:rPr>
+          <w:rStyle w:val="VerbatimChar"/>
+        </w:rPr>
+        <w:t xml:space="preserve">dot.py</w:t>
+      </w:r>
+      <w:r>
+        <w:t xml:space="preserve">,</w:t>
+      </w:r>
+      <w:r>
+        <w:t xml:space="preserve"> </w:t>
+      </w:r>
+      <w:r>
+        <w:rPr>
+          <w:rStyle w:val="VerbatimChar"/>
+        </w:rPr>
+        <w:t xml:space="preserve">dottoxml.py</w:t>
+      </w:r>
+      <w:r>
+        <w:t xml:space="preserve">,</w:t>
+      </w:r>
+      <w:r>
+        <w:t xml:space="preserve"> </w:t>
+      </w:r>
+      <w:r>
+        <w:rPr>
+          <w:rStyle w:val="VerbatimChar"/>
+        </w:rPr>
+        <w:t xml:space="preserve">X11Colors.py</w:t>
+      </w:r>
+      <w:r>
+        <w:t xml:space="preserve">,</w:t>
+      </w:r>
+      <w:r>
+        <w:t xml:space="preserve"> </w:t>
+      </w:r>
+      <w:r>
+        <w:rPr>
+          <w:rStyle w:val="VerbatimChar"/>
+        </w:rPr>
+        <w:t xml:space="preserve">EM_palette.graphml</w:t>
+      </w:r>
+      <w:r>
+        <w:t xml:space="preserve">). User-editable assets (</w:t>
+      </w:r>
+      <w:r>
+        <w:rPr>
+          <w:rStyle w:val="VerbatimChar"/>
+        </w:rPr>
+        <w:t xml:space="preserve">epoche_storiche.csv</w:t>
+      </w:r>
+      <w:r>
+        <w:t xml:space="preserve">,</w:t>
+      </w:r>
+      <w:r>
+        <w:t xml:space="preserve"> </w:t>
+      </w:r>
+      <w:r>
+        <w:rPr>
+          <w:rStyle w:val="VerbatimChar"/>
+        </w:rPr>
+        <w:t xml:space="preserve">thesaurus_template.csv</w:t>
+      </w:r>
+      <w:r>
+        <w:t xml:space="preserve">,</w:t>
+      </w:r>
+      <w:r>
+        <w:t xml:space="preserve"> </w:t>
+      </w:r>
+      <w:r>
+        <w:rPr>
+          <w:rStyle w:val="VerbatimChar"/>
+        </w:rPr>
+        <w:t xml:space="preserve">template_report_adarte.docx</w:t>
+      </w:r>
+      <w:r>
+        <w:t xml:space="preserve">) are</w:t>
+      </w:r>
+      <w:r>
+        <w:t xml:space="preserve"> </w:t>
+      </w:r>
+      <w:r>
+        <w:t xml:space="preserve">deliberately excluded so their first-install copy is preserved.</w:t>
+      </w:r>
+    </w:p>
+    <w:p>
+      <w:pPr>
+        <w:pStyle w:val="Compact"/>
+        <w:numPr>
+          <w:ilvl w:val="0"/>
+          <w:numId w:val="1027"/>
+        </w:numPr>
+      </w:pPr>
+      <w:r>
+        <w:t xml:space="preserve">A new method</w:t>
+      </w:r>
+      <w:r>
+        <w:t xml:space="preserve"> </w:t>
+      </w:r>
+      <w:r>
+        <w:rPr>
+          <w:rStyle w:val="VerbatimChar"/>
+        </w:rPr>
+        <w:t xml:space="preserve">install_or_update_maintenance_files()</w:t>
+      </w:r>
+      <w:r>
+        <w:t xml:space="preserve"> </w:t>
+      </w:r>
+      <w:r>
+        <w:t xml:space="preserve">compares</w:t>
+      </w:r>
+      <w:r>
+        <w:t xml:space="preserve"> </w:t>
+      </w:r>
+      <w:r>
+        <w:t xml:space="preserve">mtime + size between the bundled source under</w:t>
+      </w:r>
+      <w:r>
+        <w:t xml:space="preserve"> </w:t>
+      </w:r>
+      <w:r>
+        <w:rPr>
+          <w:rStyle w:val="VerbatimChar"/>
+        </w:rPr>
+        <w:t xml:space="preserve">resources/dbfiles/</w:t>
+      </w:r>
+      <w:r>
+        <w:t xml:space="preserve"> </w:t>
+      </w:r>
+      <w:r>
+        <w:t xml:space="preserve">and the installed copy under</w:t>
+      </w:r>
+      <w:r>
+        <w:t xml:space="preserve"> </w:t>
+      </w:r>
+      <w:r>
+        <w:rPr>
+          <w:rStyle w:val="VerbatimChar"/>
+        </w:rPr>
+        <w:t xml:space="preserve">~/pyarchinit/bin/</w:t>
+      </w:r>
+      <w:r>
+        <w:t xml:space="preserve">, overwriting</w:t>
+      </w:r>
+      <w:r>
+        <w:t xml:space="preserve"> </w:t>
+      </w:r>
+      <w:r>
+        <w:t xml:space="preserve">via</w:t>
+      </w:r>
+      <w:r>
+        <w:t xml:space="preserve"> </w:t>
+      </w:r>
+      <w:r>
+        <w:rPr>
+          <w:rStyle w:val="VerbatimChar"/>
+        </w:rPr>
+        <w:t xml:space="preserve">shutil.copy</w:t>
+      </w:r>
+      <w:r>
+        <w:t xml:space="preserve"> </w:t>
+      </w:r>
+      <w:r>
+        <w:t xml:space="preserve">(force-overwrite) when src is strictly newer</w:t>
+      </w:r>
+      <w:r>
+        <w:t xml:space="preserve"> </w:t>
+      </w:r>
+      <w:r>
+        <w:t xml:space="preserve">or sizes differ. Idempotent on re-runs.</w:t>
+      </w:r>
+    </w:p>
+    <w:p>
+      <w:pPr>
+        <w:pStyle w:val="Compact"/>
+        <w:numPr>
+          <w:ilvl w:val="0"/>
+          <w:numId w:val="1027"/>
+        </w:numPr>
+      </w:pPr>
+      <w:r>
+        <w:rPr>
+          <w:rStyle w:val="VerbatimChar"/>
+        </w:rPr>
+        <w:t xml:space="preserve">__init__.py</w:t>
+      </w:r>
+      <w:r>
+        <w:t xml:space="preserve"> </w:t>
+      </w:r>
+      <w:r>
+        <w:t xml:space="preserve">calls the method on every plugin reload (in the</w:t>
+      </w:r>
+      <w:r>
+        <w:t xml:space="preserve"> </w:t>
+      </w:r>
+      <w:r>
+        <w:t xml:space="preserve">branch where</w:t>
+      </w:r>
+      <w:r>
+        <w:t xml:space="preserve"> </w:t>
+      </w:r>
+      <w:r>
+        <w:rPr>
+          <w:rStyle w:val="VerbatimChar"/>
+        </w:rPr>
+        <w:t xml:space="preserve">~/pyarchinit/</w:t>
+      </w:r>
+      <w:r>
+        <w:t xml:space="preserve"> </w:t>
+      </w:r>
+      <w:r>
+        <w:t xml:space="preserve">already exists), wrapped in</w:t>
+      </w:r>
+      <w:r>
+        <w:t xml:space="preserve"> </w:t>
+      </w:r>
+      <w:r>
+        <w:t xml:space="preserve">try/except so a refresh failure never blocks plugin startup.</w:t>
+      </w:r>
+    </w:p>
+    <w:p>
+      <w:pPr>
+        <w:pStyle w:val="Compact"/>
+        <w:numPr>
+          <w:ilvl w:val="0"/>
+          <w:numId w:val="1027"/>
+        </w:numPr>
+      </w:pPr>
+      <w:r>
+        <w:t xml:space="preserve">The same method is also called at the end of</w:t>
+      </w:r>
+      <w:r>
+        <w:t xml:space="preserve"> </w:t>
+      </w:r>
+      <w:r>
+        <w:rPr>
+          <w:rStyle w:val="VerbatimChar"/>
+        </w:rPr>
+        <w:t xml:space="preserve">installConfigFile()</w:t>
+      </w:r>
+      <w:r>
+        <w:t xml:space="preserve"> </w:t>
+      </w:r>
+      <w:r>
+        <w:t xml:space="preserve">so first installs go through the same code path.</w:t>
+      </w:r>
+    </w:p>
+    <w:p>
+      <w:pPr>
+        <w:pStyle w:val="FirstParagraph"/>
+      </w:pPr>
+      <w:r>
+        <w:t xml:space="preserve">End-to-end tested locally: a stale 1000-byte dot.py was refreshed</w:t>
+      </w:r>
+      <w:r>
+        <w:t xml:space="preserve"> </w:t>
+      </w:r>
+      <w:r>
+        <w:t xml:space="preserve">to the bundled 49920-byte version on first call; the second call</w:t>
+      </w:r>
+      <w:r>
+        <w:t xml:space="preserve"> </w:t>
+      </w:r>
+      <w:r>
+        <w:t xml:space="preserve">was a no-op (mtime + size match). The user’s real</w:t>
+      </w:r>
+      <w:r>
+        <w:t xml:space="preserve"> </w:t>
+      </w:r>
+      <w:r>
+        <w:rPr>
+          <w:rStyle w:val="VerbatimChar"/>
+        </w:rPr>
+        <w:t xml:space="preserve">~/pyarchinit/bin/dot.py</w:t>
+      </w:r>
+      <w:r>
+        <w:t xml:space="preserve"> </w:t>
+      </w:r>
+      <w:r>
+        <w:t xml:space="preserve">was also refreshed in the same run, so</w:t>
+      </w:r>
+      <w:r>
+        <w:t xml:space="preserve"> </w:t>
+      </w:r>
+      <w:r>
+        <w:t xml:space="preserve">the Extended Matrix smoke test can proceed without a manual delete</w:t>
+      </w:r>
+      <w:r>
+        <w:t xml:space="preserve"> </w:t>
+      </w:r>
+      <w:r>
+        <w:t xml:space="preserve">of the old file.</w:t>
+      </w:r>
+    </w:p>
     <w:bookmarkEnd w:id="50"/>
+    <w:bookmarkEnd w:id="51"/>
     <w:sectPr>
       <w:footnotePr>
         <w:numRestart w:val="eachSect"/>
@@ -12359,6 +13068,12 @@
     </w:lvlOverride>
   </w:num>
   <w:num w:numId="1025">
+    <w:abstractNumId w:val="991"/>
+  </w:num>
+  <w:num w:numId="1026">
+    <w:abstractNumId w:val="991"/>
+  </w:num>
+  <w:num w:numId="1027">
     <w:abstractNumId w:val="991"/>
   </w:num>
 </w:numbering>

</xml_diff>

<commit_message>
docs(dev-log): document 4 Extended Matrix limitations as Phase 2 / AI03 backlog
User chose Option A (close Phase 1 with documented limitations,
defer the proper fix to Phase 2). Added a 'Phase 1 known limitations'
section enumerating the 4 issues (empty graphml on grouping flag,
missing period swimlanes, partial edge styling, no transitive
reduction) with their root causes in the legacy DOT pipeline and
how s3dgraphy.GraphMLExporter resolves all of them in one move.

Workaround for users needing EM output now: use the _s3dgraphy.json
companion file (complete, ~300 KB on Volterra) until AI03 lands.

DOCX re-rendered.
</commit_message>
<xml_diff>
--- a/docs/superpowers/dev-log/T5.4_PyArchInit_Dev_Log.docx
+++ b/docs/superpowers/dev-log/T5.4_PyArchInit_Dev_Log.docx
@@ -10699,7 +10699,7 @@
     </w:p>
     <w:bookmarkEnd w:id="43"/>
     <w:bookmarkEnd w:id="44"/>
-    <w:bookmarkStart w:id="51" w:name="group-g-release-packaging-5.1.0-alpha"/>
+    <w:bookmarkStart w:id="53" w:name="group-g-release-packaging-5.1.0-alpha"/>
     <w:p>
       <w:pPr>
         <w:pStyle w:val="Heading1"/>
@@ -12639,7 +12639,1207 @@
       </w:r>
     </w:p>
     <w:bookmarkEnd w:id="50"/>
+    <w:bookmarkStart w:id="52" w:name="X3fab1c3e00ff123f1ab1126a2fcb03530dfcff2"/>
+    <w:p>
+      <w:pPr>
+        <w:pStyle w:val="Heading2"/>
+      </w:pPr>
+      <w:r>
+        <w:t xml:space="preserve">Phase 1 known limitations carried over to Phase 2 / AI03</w:t>
+      </w:r>
+    </w:p>
+    <w:p>
+      <w:pPr>
+        <w:pStyle w:val="FirstParagraph"/>
+      </w:pPr>
+      <w:r>
+        <w:t xml:space="preserve">During Group G smoke preparation the user surfaced four Extended</w:t>
+      </w:r>
+      <w:r>
+        <w:t xml:space="preserve"> </w:t>
+      </w:r>
+      <w:r>
+        <w:t xml:space="preserve">Matrix shortcomings beyond the parser hotfix. After investigation</w:t>
+      </w:r>
+      <w:r>
+        <w:t xml:space="preserve"> </w:t>
+      </w:r>
+      <w:r>
+        <w:t xml:space="preserve">all four are pre-existing limitations of the legacy DOT → GraphML</w:t>
+      </w:r>
+      <w:r>
+        <w:t xml:space="preserve"> </w:t>
+      </w:r>
+      <w:r>
+        <w:t xml:space="preserve">pipeline (</w:t>
+      </w:r>
+      <w:r>
+        <w:rPr>
+          <w:rStyle w:val="VerbatimChar"/>
+        </w:rPr>
+        <w:t xml:space="preserve">s3dgraphy_dot_bridge.S3DGraphyDotBridge.s3dgraphy_to_dot</w:t>
+      </w:r>
+      <w:r>
+        <w:t xml:space="preserve"> </w:t>
+      </w:r>
+      <w:r>
+        <w:t xml:space="preserve">+</w:t>
+      </w:r>
+      <w:r>
+        <w:t xml:space="preserve"> </w:t>
+      </w:r>
+      <w:r>
+        <w:rPr>
+          <w:rStyle w:val="VerbatimChar"/>
+        </w:rPr>
+        <w:t xml:space="preserve">_convert_dot_to_graphml</w:t>
+      </w:r>
+      <w:r>
+        <w:t xml:space="preserve"> </w:t>
+      </w:r>
+      <w:r>
+        <w:t xml:space="preserve">+</w:t>
+      </w:r>
+      <w:r>
+        <w:t xml:space="preserve"> </w:t>
+      </w:r>
+      <w:r>
+        <w:rPr>
+          <w:rStyle w:val="VerbatimChar"/>
+        </w:rPr>
+        <w:t xml:space="preserve">dottoxml.exportGraphml</w:t>
+      </w:r>
+      <w:r>
+        <w:t xml:space="preserve">) and are</w:t>
+      </w:r>
+      <w:r>
+        <w:t xml:space="preserve"> </w:t>
+      </w:r>
+      <w:r>
+        <w:rPr>
+          <w:b/>
+          <w:bCs/>
+        </w:rPr>
+        <w:t xml:space="preserve">out of scope for Phase 1 finalization</w:t>
+      </w:r>
+      <w:r>
+        <w:t xml:space="preserve">. They are tracked here</w:t>
+      </w:r>
+      <w:r>
+        <w:t xml:space="preserve"> </w:t>
+      </w:r>
+      <w:r>
+        <w:t xml:space="preserve">as the input for the Phase 2 plan covering action item AI03.</w:t>
+      </w:r>
+    </w:p>
+    <w:tbl>
+      <w:tblPr>
+        <w:tblStyle w:val="Table"/>
+        <w:tblW w:type="pct" w:w="5000"/>
+        <w:tblLayout w:type="fixed"/>
+        <w:tblLook w:firstRow="1" w:lastRow="0" w:firstColumn="0" w:lastColumn="0" w:noHBand="0" w:noVBand="0" w:val="0020"/>
+      </w:tblPr>
+      <w:tblGrid>
+        <w:gridCol w:w="1980"/>
+        <w:gridCol w:w="1980"/>
+        <w:gridCol w:w="1980"/>
+        <w:gridCol w:w="1980"/>
+      </w:tblGrid>
+      <w:tr>
+        <w:trPr>
+          <w:tblHeader w:val="on"/>
+        </w:trPr>
+        <w:tc>
+          <w:tcPr/>
+          <w:p>
+            <w:pPr>
+              <w:pStyle w:val="Compact"/>
+            </w:pPr>
+            <w:r>
+              <w:t xml:space="preserve">#</w:t>
+            </w:r>
+          </w:p>
+        </w:tc>
+        <w:tc>
+          <w:tcPr/>
+          <w:p>
+            <w:pPr>
+              <w:pStyle w:val="Compact"/>
+            </w:pPr>
+            <w:r>
+              <w:t xml:space="preserve">Issue</w:t>
+            </w:r>
+          </w:p>
+        </w:tc>
+        <w:tc>
+          <w:tcPr/>
+          <w:p>
+            <w:pPr>
+              <w:pStyle w:val="Compact"/>
+            </w:pPr>
+            <w:r>
+              <w:t xml:space="preserve">Root cause</w:t>
+            </w:r>
+          </w:p>
+        </w:tc>
+        <w:tc>
+          <w:tcPr/>
+          <w:p>
+            <w:pPr>
+              <w:pStyle w:val="Compact"/>
+            </w:pPr>
+            <w:r>
+              <w:t xml:space="preserve">Phase 2 / AI03 fix</w:t>
+            </w:r>
+          </w:p>
+        </w:tc>
+      </w:tr>
+      <w:tr>
+        <w:tc>
+          <w:tcPr/>
+          <w:p>
+            <w:pPr>
+              <w:pStyle w:val="Compact"/>
+            </w:pPr>
+            <w:r>
+              <w:t xml:space="preserve">L1</w:t>
+            </w:r>
+          </w:p>
+        </w:tc>
+        <w:tc>
+          <w:tcPr/>
+          <w:p>
+            <w:pPr>
+              <w:pStyle w:val="Compact"/>
+            </w:pPr>
+            <w:r>
+              <w:t xml:space="preserve">The</w:t>
+            </w:r>
+            <w:r>
+              <w:t xml:space="preserve"> </w:t>
+            </w:r>
+            <w:r>
+              <w:rPr>
+                <w:rStyle w:val="VerbatimChar"/>
+              </w:rPr>
+              <w:t xml:space="preserve">Configure spatial/functional groupings</w:t>
+            </w:r>
+            <w:r>
+              <w:t xml:space="preserve"> </w:t>
+            </w:r>
+            <w:r>
+              <w:t xml:space="preserve">checkbox produces an empty</w:t>
+            </w:r>
+            <w:r>
+              <w:t xml:space="preserve"> </w:t>
+            </w:r>
+            <w:r>
+              <w:rPr>
+                <w:rStyle w:val="VerbatimChar"/>
+              </w:rPr>
+              <w:t xml:space="preserve">.graphml</w:t>
+            </w:r>
+          </w:p>
+        </w:tc>
+        <w:tc>
+          <w:tcPr/>
+          <w:p>
+            <w:pPr>
+              <w:pStyle w:val="Compact"/>
+            </w:pPr>
+            <w:r>
+              <w:rPr>
+                <w:rStyle w:val="VerbatimChar"/>
+              </w:rPr>
+              <w:t xml:space="preserve">apply_grouping_to_dot</w:t>
+            </w:r>
+            <w:r>
+              <w:t xml:space="preserve"> </w:t>
+            </w:r>
+            <w:r>
+              <w:t xml:space="preserve">rewrites the DOT in a way that drops nodes not assigned to any group;</w:t>
+            </w:r>
+            <w:r>
+              <w:t xml:space="preserve"> </w:t>
+            </w:r>
+            <w:r>
+              <w:rPr>
+                <w:rStyle w:val="VerbatimChar"/>
+              </w:rPr>
+              <w:t xml:space="preserve">enhance_graphml_with_groups</w:t>
+            </w:r>
+            <w:r>
+              <w:t xml:space="preserve"> </w:t>
+            </w:r>
+            <w:r>
+              <w:t xml:space="preserve">then truncates the file when its yfiles-namespace assumptions don’t match what</w:t>
+            </w:r>
+            <w:r>
+              <w:t xml:space="preserve"> </w:t>
+            </w:r>
+            <w:r>
+              <w:rPr>
+                <w:rStyle w:val="VerbatimChar"/>
+              </w:rPr>
+              <w:t xml:space="preserve">dottoxml.exportGraphml</w:t>
+            </w:r>
+            <w:r>
+              <w:t xml:space="preserve"> </w:t>
+            </w:r>
+            <w:r>
+              <w:t xml:space="preserve">produced</w:t>
+            </w:r>
+          </w:p>
+        </w:tc>
+        <w:tc>
+          <w:tcPr/>
+          <w:p>
+            <w:pPr>
+              <w:pStyle w:val="Compact"/>
+            </w:pPr>
+            <w:r>
+              <w:t xml:space="preserve">s3dgraphy</w:t>
+            </w:r>
+            <w:r>
+              <w:t xml:space="preserve"> </w:t>
+            </w:r>
+            <w:r>
+              <w:rPr>
+                <w:rStyle w:val="VerbatimChar"/>
+              </w:rPr>
+              <w:t xml:space="preserve">GraphMLExporter</w:t>
+            </w:r>
+            <w:r>
+              <w:t xml:space="preserve"> </w:t>
+            </w:r>
+            <w:r>
+              <w:t xml:space="preserve">builds the swimlane structure natively from</w:t>
+            </w:r>
+            <w:r>
+              <w:t xml:space="preserve"> </w:t>
+            </w:r>
+            <w:r>
+              <w:rPr>
+                <w:rStyle w:val="VerbatimChar"/>
+              </w:rPr>
+              <w:t xml:space="preserve">EpochNode</w:t>
+            </w:r>
+            <w:r>
+              <w:t xml:space="preserve"> </w:t>
+            </w:r>
+            <w:r>
+              <w:t xml:space="preserve">instances with a proper TableNode container, so post-hoc grouping is unnecessary</w:t>
+            </w:r>
+          </w:p>
+        </w:tc>
+      </w:tr>
+      <w:tr>
+        <w:tc>
+          <w:tcPr/>
+          <w:p>
+            <w:pPr>
+              <w:pStyle w:val="Compact"/>
+            </w:pPr>
+            <w:r>
+              <w:t xml:space="preserve">L2</w:t>
+            </w:r>
+          </w:p>
+        </w:tc>
+        <w:tc>
+          <w:tcPr/>
+          <w:p>
+            <w:pPr>
+              <w:pStyle w:val="Compact"/>
+            </w:pPr>
+            <w:r>
+              <w:t xml:space="preserve">The</w:t>
+            </w:r>
+            <w:r>
+              <w:t xml:space="preserve"> </w:t>
+            </w:r>
+            <w:r>
+              <w:rPr>
+                <w:rStyle w:val="VerbatimChar"/>
+              </w:rPr>
+              <w:t xml:space="preserve">.graphml</w:t>
+            </w:r>
+            <w:r>
+              <w:t xml:space="preserve"> </w:t>
+            </w:r>
+            <w:r>
+              <w:t xml:space="preserve">is not subdivided in rows by period</w:t>
+            </w:r>
+          </w:p>
+        </w:tc>
+        <w:tc>
+          <w:tcPr/>
+          <w:p>
+            <w:pPr>
+              <w:pStyle w:val="Compact"/>
+            </w:pPr>
+            <w:r>
+              <w:rPr>
+                <w:rStyle w:val="VerbatimChar"/>
+              </w:rPr>
+              <w:t xml:space="preserve">s3dgraphy_to_dot</w:t>
+            </w:r>
+            <w:r>
+              <w:t xml:space="preserve"> </w:t>
+            </w:r>
+            <w:r>
+              <w:t xml:space="preserve">emits a flat DOT with</w:t>
+            </w:r>
+            <w:r>
+              <w:t xml:space="preserve"> </w:t>
+            </w:r>
+            <w:r>
+              <w:rPr>
+                <w:rStyle w:val="VerbatimChar"/>
+              </w:rPr>
+              <w:t xml:space="preserve">rankdir=TB</w:t>
+            </w:r>
+            <w:r>
+              <w:t xml:space="preserve"> </w:t>
+            </w:r>
+            <w:r>
+              <w:t xml:space="preserve">but no</w:t>
+            </w:r>
+            <w:r>
+              <w:t xml:space="preserve"> </w:t>
+            </w:r>
+            <w:r>
+              <w:rPr>
+                <w:rStyle w:val="VerbatimChar"/>
+              </w:rPr>
+              <w:t xml:space="preserve">subgraph cluster_…</w:t>
+            </w:r>
+            <w:r>
+              <w:t xml:space="preserve"> </w:t>
+            </w:r>
+            <w:r>
+              <w:t xml:space="preserve">per</w:t>
+            </w:r>
+            <w:r>
+              <w:t xml:space="preserve"> </w:t>
+            </w:r>
+            <w:r>
+              <w:rPr>
+                <w:rStyle w:val="VerbatimChar"/>
+              </w:rPr>
+              <w:t xml:space="preserve">periodizzazione_table</w:t>
+            </w:r>
+            <w:r>
+              <w:t xml:space="preserve"> </w:t>
+            </w:r>
+            <w:r>
+              <w:t xml:space="preserve">row, no</w:t>
+            </w:r>
+            <w:r>
+              <w:t xml:space="preserve"> </w:t>
+            </w:r>
+            <w:r>
+              <w:rPr>
+                <w:rStyle w:val="VerbatimChar"/>
+              </w:rPr>
+              <w:t xml:space="preserve">rank=same</w:t>
+            </w:r>
+            <w:r>
+              <w:t xml:space="preserve"> </w:t>
+            </w:r>
+            <w:r>
+              <w:t xml:space="preserve">per phase</w:t>
+            </w:r>
+          </w:p>
+        </w:tc>
+        <w:tc>
+          <w:tcPr/>
+          <w:p>
+            <w:pPr>
+              <w:pStyle w:val="Compact"/>
+            </w:pPr>
+            <w:r>
+              <w:t xml:space="preserve">s3dgraphy</w:t>
+            </w:r>
+            <w:r>
+              <w:t xml:space="preserve"> </w:t>
+            </w:r>
+            <w:r>
+              <w:rPr>
+                <w:rStyle w:val="VerbatimChar"/>
+              </w:rPr>
+              <w:t xml:space="preserve">EpochSwimlanesGenerator</w:t>
+            </w:r>
+            <w:r>
+              <w:t xml:space="preserve"> </w:t>
+            </w:r>
+            <w:r>
+              <w:t xml:space="preserve">(in</w:t>
+            </w:r>
+            <w:r>
+              <w:t xml:space="preserve"> </w:t>
+            </w:r>
+            <w:r>
+              <w:rPr>
+                <w:rStyle w:val="VerbatimChar"/>
+              </w:rPr>
+              <w:t xml:space="preserve">exporter/graphml/epoch_generator.py</w:t>
+            </w:r>
+            <w:r>
+              <w:t xml:space="preserve">) calculates per-epoch positions and emits a TableNode swimlane with one row per</w:t>
+            </w:r>
+            <w:r>
+              <w:t xml:space="preserve"> </w:t>
+            </w:r>
+            <w:r>
+              <w:rPr>
+                <w:rStyle w:val="VerbatimChar"/>
+              </w:rPr>
+              <w:t xml:space="preserve">EpochNode</w:t>
+            </w:r>
+          </w:p>
+        </w:tc>
+      </w:tr>
+      <w:tr>
+        <w:tc>
+          <w:tcPr/>
+          <w:p>
+            <w:pPr>
+              <w:pStyle w:val="Compact"/>
+            </w:pPr>
+            <w:r>
+              <w:t xml:space="preserve">L3</w:t>
+            </w:r>
+          </w:p>
+        </w:tc>
+        <w:tc>
+          <w:tcPr/>
+          <w:p>
+            <w:pPr>
+              <w:pStyle w:val="Compact"/>
+            </w:pPr>
+            <w:r>
+              <w:t xml:space="preserve">Edge styles only cover 2 of the 36 EM 1.5 edge types (only</w:t>
+            </w:r>
+            <w:r>
+              <w:t xml:space="preserve"> </w:t>
+            </w:r>
+            <w:r>
+              <w:rPr>
+                <w:rStyle w:val="VerbatimChar"/>
+              </w:rPr>
+              <w:t xml:space="preserve">has_same_time</w:t>
+            </w:r>
+            <w:r>
+              <w:t xml:space="preserve"> </w:t>
+            </w:r>
+            <w:r>
+              <w:t xml:space="preserve">→ dashed,</w:t>
+            </w:r>
+            <w:r>
+              <w:t xml:space="preserve"> </w:t>
+            </w:r>
+            <w:r>
+              <w:rPr>
+                <w:rStyle w:val="VerbatimChar"/>
+              </w:rPr>
+              <w:t xml:space="preserve">generic_connection</w:t>
+            </w:r>
+            <w:r>
+              <w:t xml:space="preserve"> </w:t>
+            </w:r>
+            <w:r>
+              <w:t xml:space="preserve">→ dotted)</w:t>
+            </w:r>
+          </w:p>
+        </w:tc>
+        <w:tc>
+          <w:tcPr/>
+          <w:p>
+            <w:pPr>
+              <w:pStyle w:val="Compact"/>
+            </w:pPr>
+            <w:r>
+              <w:t xml:space="preserve">The DOT generator at</w:t>
+            </w:r>
+            <w:r>
+              <w:t xml:space="preserve"> </w:t>
+            </w:r>
+            <w:r>
+              <w:rPr>
+                <w:rStyle w:val="VerbatimChar"/>
+              </w:rPr>
+              <w:t xml:space="preserve">s3dgraphy_dot_bridge.py:130-134</w:t>
+            </w:r>
+            <w:r>
+              <w:t xml:space="preserve"> </w:t>
+            </w:r>
+            <w:r>
+              <w:t xml:space="preserve">hardcodes a 2-entry mapping and treats every other relation as</w:t>
+            </w:r>
+            <w:r>
+              <w:t xml:space="preserve"> </w:t>
+            </w:r>
+            <w:r>
+              <w:t xml:space="preserve">“no style”</w:t>
+            </w:r>
+          </w:p>
+        </w:tc>
+        <w:tc>
+          <w:tcPr/>
+          <w:p>
+            <w:pPr>
+              <w:pStyle w:val="Compact"/>
+            </w:pPr>
+            <w:r>
+              <w:t xml:space="preserve">s3dgraphy</w:t>
+            </w:r>
+            <w:r>
+              <w:t xml:space="preserve"> </w:t>
+            </w:r>
+            <w:r>
+              <w:rPr>
+                <w:rStyle w:val="VerbatimChar"/>
+              </w:rPr>
+              <w:t xml:space="preserve">EdgeGenerator</w:t>
+            </w:r>
+            <w:r>
+              <w:t xml:space="preserve"> </w:t>
+            </w:r>
+            <w:r>
+              <w:t xml:space="preserve">(in</w:t>
+            </w:r>
+            <w:r>
+              <w:t xml:space="preserve"> </w:t>
+            </w:r>
+            <w:r>
+              <w:rPr>
+                <w:rStyle w:val="VerbatimChar"/>
+              </w:rPr>
+              <w:t xml:space="preserve">exporter/graphml/edge_generator.py</w:t>
+            </w:r>
+            <w:r>
+              <w:t xml:space="preserve">) consults the full vocabulary from</w:t>
+            </w:r>
+            <w:r>
+              <w:t xml:space="preserve"> </w:t>
+            </w:r>
+            <w:r>
+              <w:rPr>
+                <w:rStyle w:val="VerbatimChar"/>
+              </w:rPr>
+              <w:t xml:space="preserve">s3Dgraphy_connections_datamodel.json</w:t>
+            </w:r>
+            <w:r>
+              <w:t xml:space="preserve"> </w:t>
+            </w:r>
+            <w:r>
+              <w:t xml:space="preserve">and writes the correct yEd line style per edge type</w:t>
+            </w:r>
+          </w:p>
+        </w:tc>
+      </w:tr>
+      <w:tr>
+        <w:tc>
+          <w:tcPr/>
+          <w:p>
+            <w:pPr>
+              <w:pStyle w:val="Compact"/>
+            </w:pPr>
+            <w:r>
+              <w:t xml:space="preserve">L4</w:t>
+            </w:r>
+          </w:p>
+        </w:tc>
+        <w:tc>
+          <w:tcPr/>
+          <w:p>
+            <w:pPr>
+              <w:pStyle w:val="Compact"/>
+            </w:pPr>
+            <w:r>
+              <w:t xml:space="preserve">No transitive reduction (Harris Matrix redundancies are kept verbatim)</w:t>
+            </w:r>
+          </w:p>
+        </w:tc>
+        <w:tc>
+          <w:tcPr/>
+          <w:p>
+            <w:pPr>
+              <w:pStyle w:val="Compact"/>
+            </w:pPr>
+            <w:r>
+              <w:t xml:space="preserve">The pipeline never invokes</w:t>
+            </w:r>
+            <w:r>
+              <w:t xml:space="preserve"> </w:t>
+            </w:r>
+            <w:r>
+              <w:rPr>
+                <w:rStyle w:val="VerbatimChar"/>
+              </w:rPr>
+              <w:t xml:space="preserve">tred</w:t>
+            </w:r>
+            <w:r>
+              <w:t xml:space="preserve"> </w:t>
+            </w:r>
+            <w:r>
+              <w:t xml:space="preserve">or any equivalent</w:t>
+            </w:r>
+          </w:p>
+        </w:tc>
+        <w:tc>
+          <w:tcPr/>
+          <w:p>
+            <w:pPr>
+              <w:pStyle w:val="Compact"/>
+            </w:pPr>
+            <w:r>
+              <w:t xml:space="preserve">s3dgraphy</w:t>
+            </w:r>
+            <w:r>
+              <w:t xml:space="preserve"> </w:t>
+            </w:r>
+            <w:r>
+              <w:rPr>
+                <w:rStyle w:val="VerbatimChar"/>
+              </w:rPr>
+              <w:t xml:space="preserve">TemporalInferenceEngine.transitive_reduction()</w:t>
+            </w:r>
+            <w:r>
+              <w:t xml:space="preserve"> </w:t>
+            </w:r>
+            <w:r>
+              <w:t xml:space="preserve">runs at</w:t>
+            </w:r>
+            <w:r>
+              <w:t xml:space="preserve"> </w:t>
+            </w:r>
+            <w:r>
+              <w:rPr>
+                <w:rStyle w:val="VerbatimChar"/>
+              </w:rPr>
+              <w:t xml:space="preserve">graphml_exporter.py:111-119</w:t>
+            </w:r>
+            <w:r>
+              <w:t xml:space="preserve"> </w:t>
+            </w:r>
+            <w:r>
+              <w:t xml:space="preserve">as a built-in step before XML emission</w:t>
+            </w:r>
+          </w:p>
+        </w:tc>
+      </w:tr>
+    </w:tbl>
+    <w:p>
+      <w:pPr>
+        <w:pStyle w:val="BodyText"/>
+      </w:pPr>
+      <w:r>
+        <w:t xml:space="preserve">All four are addressed in one move by</w:t>
+      </w:r>
+      <w:r>
+        <w:t xml:space="preserve"> </w:t>
+      </w:r>
+      <w:r>
+        <w:rPr>
+          <w:b/>
+          <w:bCs/>
+        </w:rPr>
+        <w:t xml:space="preserve">delegating GraphML</w:t>
+      </w:r>
+      <w:r>
+        <w:rPr>
+          <w:b/>
+          <w:bCs/>
+        </w:rPr>
+        <w:t xml:space="preserve"> </w:t>
+      </w:r>
+      <w:r>
+        <w:rPr>
+          <w:b/>
+          <w:bCs/>
+        </w:rPr>
+        <w:t xml:space="preserve">serialisation to</w:t>
+      </w:r>
+      <w:r>
+        <w:rPr>
+          <w:b/>
+          <w:bCs/>
+        </w:rPr>
+        <w:t xml:space="preserve"> </w:t>
+      </w:r>
+      <w:r>
+        <w:rPr>
+          <w:rStyle w:val="VerbatimChar"/>
+          <w:b/>
+          <w:bCs/>
+        </w:rPr>
+        <w:t xml:space="preserve">s3dgraphy.exporter.graphml.GraphMLExporter</w:t>
+      </w:r>
+      <w:r>
+        <w:t xml:space="preserve">.</w:t>
+      </w:r>
+      <w:r>
+        <w:t xml:space="preserve"> </w:t>
+      </w:r>
+      <w:r>
+        <w:t xml:space="preserve">This is the AI03 deliverable already in the spec and was always</w:t>
+      </w:r>
+      <w:r>
+        <w:t xml:space="preserve"> </w:t>
+      </w:r>
+      <w:r>
+        <w:t xml:space="preserve">scheduled for Phase 2; the Phase 1 release ships with the legacy</w:t>
+      </w:r>
+      <w:r>
+        <w:t xml:space="preserve"> </w:t>
+      </w:r>
+      <w:r>
+        <w:t xml:space="preserve">pipeline carrying the limitations above so that the foundation</w:t>
+      </w:r>
+      <w:r>
+        <w:t xml:space="preserve"> </w:t>
+      </w:r>
+      <w:r>
+        <w:t xml:space="preserve">work (VocabProvider, vocab alignment, UUID v7 backfill, 12-file</w:t>
+      </w:r>
+      <w:r>
+        <w:t xml:space="preserve"> </w:t>
+      </w:r>
+      <w:r>
+        <w:t xml:space="preserve">refactor) can ship cleanly without expanding scope.</w:t>
+      </w:r>
+    </w:p>
+    <w:p>
+      <w:pPr>
+        <w:pStyle w:val="BodyText"/>
+      </w:pPr>
+      <w:r>
+        <w:rPr>
+          <w:b/>
+          <w:bCs/>
+        </w:rPr>
+        <w:t xml:space="preserve">Workaround for users who need Extended Matrix output now:</w:t>
+      </w:r>
+      <w:r>
+        <w:t xml:space="preserve"> </w:t>
+      </w:r>
+      <w:r>
+        <w:t xml:space="preserve">the</w:t>
+      </w:r>
+      <w:r>
+        <w:t xml:space="preserve"> </w:t>
+      </w:r>
+      <w:r>
+        <w:rPr>
+          <w:rStyle w:val="VerbatimChar"/>
+        </w:rPr>
+        <w:t xml:space="preserve">_s3dgraphy.json</w:t>
+      </w:r>
+      <w:r>
+        <w:t xml:space="preserve"> </w:t>
+      </w:r>
+      <w:r>
+        <w:t xml:space="preserve">companion file already produced by the green</w:t>
+      </w:r>
+      <w:r>
+        <w:t xml:space="preserve"> </w:t>
+      </w:r>
+      <w:r>
+        <w:t xml:space="preserve">“Extended Matrix”</w:t>
+      </w:r>
+      <w:r>
+        <w:t xml:space="preserve"> </w:t>
+      </w:r>
+      <w:r>
+        <w:t xml:space="preserve">button is complete (~300 KB on a Volterra-size</w:t>
+      </w:r>
+      <w:r>
+        <w:t xml:space="preserve"> </w:t>
+      </w:r>
+      <w:r>
+        <w:t xml:space="preserve">dataset) and contains the full graph with every edge type</w:t>
+      </w:r>
+      <w:r>
+        <w:t xml:space="preserve"> </w:t>
+      </w:r>
+      <w:r>
+        <w:t xml:space="preserve">correctly typed. Any tool that consumes s3dgraphy native JSON can</w:t>
+      </w:r>
+      <w:r>
+        <w:t xml:space="preserve"> </w:t>
+      </w:r>
+      <w:r>
+        <w:t xml:space="preserve">read it directly; the legacy</w:t>
+      </w:r>
+      <w:r>
+        <w:t xml:space="preserve"> </w:t>
+      </w:r>
+      <w:r>
+        <w:rPr>
+          <w:rStyle w:val="VerbatimChar"/>
+        </w:rPr>
+        <w:t xml:space="preserve">.graphml</w:t>
+      </w:r>
+      <w:r>
+        <w:t xml:space="preserve"> </w:t>
+      </w:r>
+      <w:r>
+        <w:t xml:space="preserve">should be treated as a</w:t>
+      </w:r>
+      <w:r>
+        <w:t xml:space="preserve"> </w:t>
+      </w:r>
+      <w:r>
+        <w:t xml:space="preserve">preview rather than the canonical output until AI03 lands.</w:t>
+      </w:r>
+    </w:p>
+    <w:bookmarkStart w:id="51" w:name="phase-2-entry-criteria-informational"/>
+    <w:p>
+      <w:pPr>
+        <w:pStyle w:val="Heading3"/>
+      </w:pPr>
+      <w:r>
+        <w:t xml:space="preserve">Phase 2 entry criteria (informational)</w:t>
+      </w:r>
+    </w:p>
+    <w:p>
+      <w:pPr>
+        <w:pStyle w:val="FirstParagraph"/>
+      </w:pPr>
+      <w:r>
+        <w:t xml:space="preserve">The next plan to write is</w:t>
+      </w:r>
+      <w:r>
+        <w:t xml:space="preserve"> </w:t>
+      </w:r>
+      <w:r>
+        <w:rPr>
+          <w:rStyle w:val="VerbatimChar"/>
+        </w:rPr>
+        <w:t xml:space="preserve">docs/superpowers/plans/2026-MM-DD-phase-2-graphml-delegation.md</w:t>
+      </w:r>
+      <w:r>
+        <w:t xml:space="preserve">,</w:t>
+      </w:r>
+      <w:r>
+        <w:t xml:space="preserve"> </w:t>
+      </w:r>
+      <w:r>
+        <w:t xml:space="preserve">which will cover:</w:t>
+      </w:r>
+    </w:p>
+    <w:p>
+      <w:pPr>
+        <w:pStyle w:val="Compact"/>
+        <w:numPr>
+          <w:ilvl w:val="0"/>
+          <w:numId w:val="1028"/>
+        </w:numPr>
+      </w:pPr>
+      <w:r>
+        <w:t xml:space="preserve">AI03: drop the in-house GraphML writer and delegate to</w:t>
+      </w:r>
+      <w:r>
+        <w:t xml:space="preserve"> </w:t>
+      </w:r>
+      <w:r>
+        <w:rPr>
+          <w:rStyle w:val="VerbatimChar"/>
+        </w:rPr>
+        <w:t xml:space="preserve">s3dgraphy.GraphMLExporter</w:t>
+      </w:r>
+      <w:r>
+        <w:t xml:space="preserve">. Required preparation: refactor</w:t>
+      </w:r>
+      <w:r>
+        <w:t xml:space="preserve"> </w:t>
+      </w:r>
+      <w:r>
+        <w:rPr>
+          <w:rStyle w:val="VerbatimChar"/>
+        </w:rPr>
+        <w:t xml:space="preserve">S3DGraphyIntegration.import_from_pyarchinit()</w:t>
+      </w:r>
+      <w:r>
+        <w:t xml:space="preserve"> </w:t>
+      </w:r>
+      <w:r>
+        <w:t xml:space="preserve">to produce</w:t>
+      </w:r>
+      <w:r>
+        <w:t xml:space="preserve"> </w:t>
+      </w:r>
+      <w:r>
+        <w:t xml:space="preserve">typed</w:t>
+      </w:r>
+      <w:r>
+        <w:t xml:space="preserve"> </w:t>
+      </w:r>
+      <w:r>
+        <w:rPr>
+          <w:rStyle w:val="VerbatimChar"/>
+        </w:rPr>
+        <w:t xml:space="preserve">StratigraphicUnit</w:t>
+      </w:r>
+      <w:r>
+        <w:t xml:space="preserve">/</w:t>
+      </w:r>
+      <w:r>
+        <w:rPr>
+          <w:rStyle w:val="VerbatimChar"/>
+        </w:rPr>
+        <w:t xml:space="preserve">StratigraphicUnitMasonry</w:t>
+      </w:r>
+      <w:r>
+        <w:t xml:space="preserve">/…</w:t>
+      </w:r>
+      <w:r>
+        <w:t xml:space="preserve"> </w:t>
+      </w:r>
+      <w:r>
+        <w:t xml:space="preserve">instances (not generic</w:t>
+      </w:r>
+      <w:r>
+        <w:t xml:space="preserve"> </w:t>
+      </w:r>
+      <w:r>
+        <w:rPr>
+          <w:rStyle w:val="VerbatimChar"/>
+        </w:rPr>
+        <w:t xml:space="preserve">Node</w:t>
+      </w:r>
+      <w:r>
+        <w:t xml:space="preserve">); convert</w:t>
+      </w:r>
+      <w:r>
+        <w:t xml:space="preserve"> </w:t>
+      </w:r>
+      <w:r>
+        <w:rPr>
+          <w:rStyle w:val="VerbatimChar"/>
+        </w:rPr>
+        <w:t xml:space="preserve">periodizzazione_table</w:t>
+      </w:r>
+      <w:r>
+        <w:t xml:space="preserve"> </w:t>
+      </w:r>
+      <w:r>
+        <w:t xml:space="preserve">rows to</w:t>
+      </w:r>
+      <w:r>
+        <w:t xml:space="preserve"> </w:t>
+      </w:r>
+      <w:r>
+        <w:rPr>
+          <w:rStyle w:val="VerbatimChar"/>
+        </w:rPr>
+        <w:t xml:space="preserve">EpochNode</w:t>
+      </w:r>
+      <w:r>
+        <w:t xml:space="preserve"> </w:t>
+      </w:r>
+      <w:r>
+        <w:t xml:space="preserve">with</w:t>
+      </w:r>
+      <w:r>
+        <w:t xml:space="preserve"> </w:t>
+      </w:r>
+      <w:r>
+        <w:rPr>
+          <w:rStyle w:val="VerbatimChar"/>
+        </w:rPr>
+        <w:t xml:space="preserve">has_first_epoch</w:t>
+      </w:r>
+      <w:r>
+        <w:t xml:space="preserve"> </w:t>
+      </w:r>
+      <w:r>
+        <w:t xml:space="preserve">edges; expand the relationship-mapping table</w:t>
+      </w:r>
+      <w:r>
+        <w:t xml:space="preserve"> </w:t>
+      </w:r>
+      <w:r>
+        <w:t xml:space="preserve">to cover the full s3dgraphy edge vocabulary</w:t>
+      </w:r>
+      <w:r>
+        <w:t xml:space="preserve"> </w:t>
+      </w:r>
+      <w:r>
+        <w:t xml:space="preserve">(</w:t>
+      </w:r>
+      <w:r>
+        <w:rPr>
+          <w:rStyle w:val="VerbatimChar"/>
+        </w:rPr>
+        <w:t xml:space="preserve">overlies</w:t>
+      </w:r>
+      <w:r>
+        <w:t xml:space="preserve">,</w:t>
+      </w:r>
+      <w:r>
+        <w:t xml:space="preserve"> </w:t>
+      </w:r>
+      <w:r>
+        <w:rPr>
+          <w:rStyle w:val="VerbatimChar"/>
+        </w:rPr>
+        <w:t xml:space="preserve">cuts</w:t>
+      </w:r>
+      <w:r>
+        <w:t xml:space="preserve">,</w:t>
+      </w:r>
+      <w:r>
+        <w:t xml:space="preserve"> </w:t>
+      </w:r>
+      <w:r>
+        <w:rPr>
+          <w:rStyle w:val="VerbatimChar"/>
+        </w:rPr>
+        <w:t xml:space="preserve">fills</w:t>
+      </w:r>
+      <w:r>
+        <w:t xml:space="preserve">,</w:t>
+      </w:r>
+      <w:r>
+        <w:t xml:space="preserve"> </w:t>
+      </w:r>
+      <w:r>
+        <w:rPr>
+          <w:rStyle w:val="VerbatimChar"/>
+        </w:rPr>
+        <w:t xml:space="preserve">abuts</w:t>
+      </w:r>
+      <w:r>
+        <w:t xml:space="preserve">,</w:t>
+      </w:r>
+      <w:r>
+        <w:t xml:space="preserve"> </w:t>
+      </w:r>
+      <w:r>
+        <w:rPr>
+          <w:rStyle w:val="VerbatimChar"/>
+        </w:rPr>
+        <w:t xml:space="preserve">is_bonded_to</w:t>
+      </w:r>
+      <w:r>
+        <w:t xml:space="preserve">, …) per</w:t>
+      </w:r>
+      <w:r>
+        <w:t xml:space="preserve"> </w:t>
+      </w:r>
+      <w:r>
+        <w:t xml:space="preserve">the JSON datamodel.</w:t>
+      </w:r>
+    </w:p>
+    <w:p>
+      <w:pPr>
+        <w:pStyle w:val="Compact"/>
+        <w:numPr>
+          <w:ilvl w:val="0"/>
+          <w:numId w:val="1028"/>
+        </w:numPr>
+      </w:pPr>
+      <w:r>
+        <w:t xml:space="preserve">AI04: the bidirectional bridge proper —</w:t>
+      </w:r>
+      <w:r>
+        <w:t xml:space="preserve"> </w:t>
+      </w:r>
+      <w:r>
+        <w:rPr>
+          <w:rStyle w:val="VerbatimChar"/>
+        </w:rPr>
+        <w:t xml:space="preserve">populate_graph()</w:t>
+      </w:r>
+      <w:r>
+        <w:t xml:space="preserve"> </w:t>
+      </w:r>
+      <w:r>
+        <w:t xml:space="preserve">and</w:t>
+      </w:r>
+      <w:r>
+        <w:t xml:space="preserve"> </w:t>
+      </w:r>
+      <w:r>
+        <w:rPr>
+          <w:rStyle w:val="VerbatimChar"/>
+        </w:rPr>
+        <w:t xml:space="preserve">populate_list()</w:t>
+      </w:r>
+      <w:r>
+        <w:t xml:space="preserve"> </w:t>
+      </w:r>
+      <w:r>
+        <w:t xml:space="preserve">macro-functions per</w:t>
+      </w:r>
+      <w:r>
+        <w:t xml:space="preserve"> </w:t>
+      </w:r>
+      <w:r>
+        <w:t xml:space="preserve">Reference Document v0.1 §6.</w:t>
+      </w:r>
+    </w:p>
+    <w:p>
+      <w:pPr>
+        <w:pStyle w:val="Compact"/>
+        <w:numPr>
+          <w:ilvl w:val="0"/>
+          <w:numId w:val="1028"/>
+        </w:numPr>
+      </w:pPr>
+      <w:r>
+        <w:t xml:space="preserve">AI05:</w:t>
+      </w:r>
+      <w:r>
+        <w:t xml:space="preserve"> </w:t>
+      </w:r>
+      <w:r>
+        <w:rPr>
+          <w:rStyle w:val="VerbatimChar"/>
+        </w:rPr>
+        <w:t xml:space="preserve">ParadataStore</w:t>
+      </w:r>
+      <w:r>
+        <w:t xml:space="preserve"> </w:t>
+      </w:r>
+      <w:r>
+        <w:t xml:space="preserve">for</w:t>
+      </w:r>
+      <w:r>
+        <w:t xml:space="preserve"> </w:t>
+      </w:r>
+      <w:r>
+        <w:rPr>
+          <w:rStyle w:val="VerbatimChar"/>
+        </w:rPr>
+        <w:t xml:space="preserve">paradata.graphml</w:t>
+      </w:r>
+      <w:r>
+        <w:t xml:space="preserve"> </w:t>
+      </w:r>
+      <w:r>
+        <w:t xml:space="preserve">per project,</w:t>
+      </w:r>
+      <w:r>
+        <w:t xml:space="preserve"> </w:t>
+      </w:r>
+      <w:r>
+        <w:t xml:space="preserve">the editable layer for authors / licenses / virtual nodes.</w:t>
+      </w:r>
+    </w:p>
+    <w:p>
+      <w:pPr>
+        <w:pStyle w:val="FirstParagraph"/>
+      </w:pPr>
+      <w:r>
+        <w:t xml:space="preserve">Estimated effort: 1–2 weeks per the spec’s §11 phasing.</w:t>
+      </w:r>
+    </w:p>
     <w:bookmarkEnd w:id="51"/>
+    <w:bookmarkEnd w:id="52"/>
+    <w:bookmarkEnd w:id="53"/>
     <w:sectPr>
       <w:footnotePr>
         <w:numRestart w:val="eachSect"/>
@@ -13074,6 +14274,9 @@
     <w:abstractNumId w:val="991"/>
   </w:num>
   <w:num w:numId="1027">
+    <w:abstractNumId w:val="991"/>
+  </w:num>
+  <w:num w:numId="1028">
     <w:abstractNumId w:val="991"/>
   </w:num>
 </w:numbering>

</xml_diff>

<commit_message>
docs(dev-log): Phase 1 closed — G.4 smoke OK, G.5 tag+push complete
Manual smoke gate passed in QGIS on Castelseprio dataset (US picker
shows EM 1.5 types, Extended Matrix produces populated graphml,
both Maintenance migrations open cleanly). Tag phase1-foundation-5.1.0-alpha
pushed to origin pointing at 8fceff79; rollback tag pre-s3dgraphy-040
also pushed for partner-facing recovery.

DOCX re-rendered for the next Teams upload.
</commit_message>
<xml_diff>
--- a/docs/superpowers/dev-log/T5.4_PyArchInit_Dev_Log.docx
+++ b/docs/superpowers/dev-log/T5.4_PyArchInit_Dev_Log.docx
@@ -951,7 +951,32 @@
               <w:pStyle w:val="Compact"/>
             </w:pPr>
             <w:r>
-              <w:t xml:space="preserve">In progress — G.1/G.2/G.3 done; G.4 manual smoke gate pending; G.5 tag+push pending</w:t>
+              <w:rPr>
+                <w:b/>
+                <w:bCs/>
+              </w:rPr>
+              <w:t xml:space="preserve">Done</w:t>
+            </w:r>
+            <w:r>
+              <w:t xml:space="preserve"> </w:t>
+            </w:r>
+            <w:r>
+              <w:t xml:space="preserve">(2026-05-07) — tag</w:t>
+            </w:r>
+            <w:r>
+              <w:t xml:space="preserve"> </w:t>
+            </w:r>
+            <w:r>
+              <w:rPr>
+                <w:rStyle w:val="VerbatimChar"/>
+              </w:rPr>
+              <w:t xml:space="preserve">phase1-foundation-5.1.0-alpha</w:t>
+            </w:r>
+            <w:r>
+              <w:t xml:space="preserve"> </w:t>
+            </w:r>
+            <w:r>
+              <w:t xml:space="preserve">pushed</w:t>
             </w:r>
           </w:p>
         </w:tc>
@@ -13837,9 +13862,1280 @@
         <w:t xml:space="preserve">Estimated effort: 1–2 weeks per the spec’s §11 phasing.</w:t>
       </w:r>
     </w:p>
+    <w:p>
+      <w:r>
+        <w:pict>
+          <v:rect style="width:0;height:1.5pt" o:hralign="center" o:hrstd="t" o:hr="t"/>
+        </w:pict>
+      </w:r>
+    </w:p>
     <w:bookmarkEnd w:id="51"/>
     <w:bookmarkEnd w:id="52"/>
     <w:bookmarkEnd w:id="53"/>
+    <w:bookmarkStart w:id="57" w:name="Xa0e97aeca1a122082a6e5afb221b40827e8bb94"/>
+    <w:p>
+      <w:pPr>
+        <w:pStyle w:val="Heading1"/>
+      </w:pPr>
+      <w:r>
+        <w:t xml:space="preserve">Phase 1 closure — manual smoke gate (G.4) + tag (G.5)</w:t>
+      </w:r>
+    </w:p>
+    <w:p>
+      <w:pPr>
+        <w:pStyle w:val="FirstParagraph"/>
+      </w:pPr>
+      <w:r>
+        <w:rPr>
+          <w:b/>
+          <w:bCs/>
+        </w:rPr>
+        <w:t xml:space="preserve">Date:</w:t>
+      </w:r>
+      <w:r>
+        <w:t xml:space="preserve"> </w:t>
+      </w:r>
+      <w:r>
+        <w:t xml:space="preserve">7 May 2026 ·</w:t>
+      </w:r>
+      <w:r>
+        <w:t xml:space="preserve"> </w:t>
+      </w:r>
+      <w:r>
+        <w:rPr>
+          <w:b/>
+          <w:bCs/>
+        </w:rPr>
+        <w:t xml:space="preserve">Status:</w:t>
+      </w:r>
+      <w:r>
+        <w:t xml:space="preserve"> </w:t>
+      </w:r>
+      <w:r>
+        <w:rPr>
+          <w:b/>
+          <w:bCs/>
+        </w:rPr>
+        <w:t xml:space="preserve">Phase 1 complete and tagged.</w:t>
+      </w:r>
+    </w:p>
+    <w:bookmarkStart w:id="54" w:name="g.4-manual-smoke-gate-result"/>
+    <w:p>
+      <w:pPr>
+        <w:pStyle w:val="Heading2"/>
+      </w:pPr>
+      <w:r>
+        <w:t xml:space="preserve">G.4 manual smoke gate result</w:t>
+      </w:r>
+    </w:p>
+    <w:p>
+      <w:pPr>
+        <w:pStyle w:val="FirstParagraph"/>
+      </w:pPr>
+      <w:r>
+        <w:t xml:space="preserve">The user ran the gate in QGIS on</w:t>
+      </w:r>
+      <w:r>
+        <w:t xml:space="preserve"> </w:t>
+      </w:r>
+      <w:r>
+        <w:rPr>
+          <w:rStyle w:val="VerbatimChar"/>
+        </w:rPr>
+        <w:t xml:space="preserve">pyarchinitcs_SCHEDE2024.sqlite</w:t>
+      </w:r>
+      <w:r>
+        <w:t xml:space="preserve"> </w:t>
+      </w:r>
+      <w:r>
+        <w:t xml:space="preserve">(Castelseprio Casa Piccoli) and reported</w:t>
+      </w:r>
+      <w:r>
+        <w:t xml:space="preserve"> </w:t>
+      </w:r>
+      <w:r>
+        <w:rPr>
+          <w:rStyle w:val="VerbatimChar"/>
+          <w:b/>
+          <w:bCs/>
+        </w:rPr>
+        <w:t xml:space="preserve">✅ smoke OK</w:t>
+      </w:r>
+      <w:r>
+        <w:t xml:space="preserve"> </w:t>
+      </w:r>
+      <w:r>
+        <w:t xml:space="preserve">covering</w:t>
+      </w:r>
+      <w:r>
+        <w:t xml:space="preserve"> </w:t>
+      </w:r>
+      <w:r>
+        <w:t xml:space="preserve">every checklist item:</w:t>
+      </w:r>
+    </w:p>
+    <w:p>
+      <w:pPr>
+        <w:pStyle w:val="Compact"/>
+        <w:numPr>
+          <w:ilvl w:val="0"/>
+          <w:numId w:val="1029"/>
+        </w:numPr>
+      </w:pPr>
+      <w:r>
+        <w:t xml:space="preserve">Plugin loaded without exceptions in the QGIS Log Messages panel.</w:t>
+      </w:r>
+    </w:p>
+    <w:p>
+      <w:pPr>
+        <w:pStyle w:val="Compact"/>
+        <w:numPr>
+          <w:ilvl w:val="0"/>
+          <w:numId w:val="1029"/>
+        </w:numPr>
+      </w:pPr>
+      <w:r>
+        <w:t xml:space="preserve">The US/USM unit-type combo box exposes the EM 1.5 vocabulary</w:t>
+      </w:r>
+      <w:r>
+        <w:t xml:space="preserve"> </w:t>
+      </w:r>
+      <w:r>
+        <w:t xml:space="preserve">(</w:t>
+      </w:r>
+      <w:r>
+        <w:rPr>
+          <w:rStyle w:val="VerbatimChar"/>
+        </w:rPr>
+        <w:t xml:space="preserve">USVs</w:t>
+      </w:r>
+      <w:r>
+        <w:t xml:space="preserve">,</w:t>
+      </w:r>
+      <w:r>
+        <w:t xml:space="preserve"> </w:t>
+      </w:r>
+      <w:r>
+        <w:rPr>
+          <w:rStyle w:val="VerbatimChar"/>
+        </w:rPr>
+        <w:t xml:space="preserve">USVn</w:t>
+      </w:r>
+      <w:r>
+        <w:t xml:space="preserve">,</w:t>
+      </w:r>
+      <w:r>
+        <w:t xml:space="preserve"> </w:t>
+      </w:r>
+      <w:r>
+        <w:rPr>
+          <w:rStyle w:val="VerbatimChar"/>
+        </w:rPr>
+        <w:t xml:space="preserve">serSU</w:t>
+      </w:r>
+      <w:r>
+        <w:t xml:space="preserve">,</w:t>
+      </w:r>
+      <w:r>
+        <w:t xml:space="preserve"> </w:t>
+      </w:r>
+      <w:r>
+        <w:rPr>
+          <w:rStyle w:val="VerbatimChar"/>
+        </w:rPr>
+        <w:t xml:space="preserve">UL</w:t>
+      </w:r>
+      <w:r>
+        <w:t xml:space="preserve">,</w:t>
+      </w:r>
+      <w:r>
+        <w:t xml:space="preserve"> </w:t>
+      </w:r>
+      <w:r>
+        <w:rPr>
+          <w:rStyle w:val="VerbatimChar"/>
+        </w:rPr>
+        <w:t xml:space="preserve">USN</w:t>
+      </w:r>
+      <w:r>
+        <w:t xml:space="preserve">,</w:t>
+      </w:r>
+      <w:r>
+        <w:t xml:space="preserve"> </w:t>
+      </w:r>
+      <w:r>
+        <w:rPr>
+          <w:rStyle w:val="VerbatimChar"/>
+        </w:rPr>
+        <w:t xml:space="preserve">TSU</w:t>
+      </w:r>
+      <w:r>
+        <w:t xml:space="preserve">, …) sourced from</w:t>
+      </w:r>
+      <w:r>
+        <w:t xml:space="preserve"> </w:t>
+      </w:r>
+      <w:r>
+        <w:t xml:space="preserve">the s3Dgraphy 0.1.40 JSON datamodel via</w:t>
+      </w:r>
+      <w:r>
+        <w:t xml:space="preserve"> </w:t>
+      </w:r>
+      <w:r>
+        <w:rPr>
+          <w:rStyle w:val="VerbatimChar"/>
+        </w:rPr>
+        <w:t xml:space="preserve">VocabProvider</w:t>
+      </w:r>
+      <w:r>
+        <w:t xml:space="preserve">. Legacy</w:t>
+      </w:r>
+      <w:r>
+        <w:t xml:space="preserve"> </w:t>
+      </w:r>
+      <w:r>
+        <w:rPr>
+          <w:rStyle w:val="VerbatimChar"/>
+        </w:rPr>
+        <w:t xml:space="preserve">USVA</w:t>
+      </w:r>
+      <w:r>
+        <w:t xml:space="preserve">/</w:t>
+      </w:r>
+      <w:r>
+        <w:rPr>
+          <w:rStyle w:val="VerbatimChar"/>
+        </w:rPr>
+        <w:t xml:space="preserve">USVB</w:t>
+      </w:r>
+      <w:r>
+        <w:t xml:space="preserve">/</w:t>
+      </w:r>
+      <w:r>
+        <w:rPr>
+          <w:rStyle w:val="VerbatimChar"/>
+        </w:rPr>
+        <w:t xml:space="preserve">USVC</w:t>
+      </w:r>
+      <w:r>
+        <w:t xml:space="preserve"> </w:t>
+      </w:r>
+      <w:r>
+        <w:t xml:space="preserve">are no longer in the picker.</w:t>
+      </w:r>
+    </w:p>
+    <w:p>
+      <w:pPr>
+        <w:pStyle w:val="Compact"/>
+        <w:numPr>
+          <w:ilvl w:val="0"/>
+          <w:numId w:val="1029"/>
+        </w:numPr>
+      </w:pPr>
+      <w:r>
+        <w:t xml:space="preserve">The green</w:t>
+      </w:r>
+      <w:r>
+        <w:t xml:space="preserve"> </w:t>
+      </w:r>
+      <w:r>
+        <w:t xml:space="preserve">“Extended Matrix”</w:t>
+      </w:r>
+      <w:r>
+        <w:t xml:space="preserve"> </w:t>
+      </w:r>
+      <w:r>
+        <w:t xml:space="preserve">button (without spatial-grouping</w:t>
+      </w:r>
+      <w:r>
+        <w:t xml:space="preserve"> </w:t>
+      </w:r>
+      <w:r>
+        <w:t xml:space="preserve">flag) produces a populated</w:t>
+      </w:r>
+      <w:r>
+        <w:t xml:space="preserve"> </w:t>
+      </w:r>
+      <w:r>
+        <w:rPr>
+          <w:rStyle w:val="VerbatimChar"/>
+        </w:rPr>
+        <w:t xml:space="preserve">.graphml</w:t>
+      </w:r>
+      <w:r>
+        <w:t xml:space="preserve"> </w:t>
+      </w:r>
+      <w:r>
+        <w:t xml:space="preserve">(655 edges + 298 nodes</w:t>
+      </w:r>
+      <w:r>
+        <w:t xml:space="preserve"> </w:t>
+      </w:r>
+      <w:r>
+        <w:t xml:space="preserve">on the Volterra dataset) in addition to the DOT and the two</w:t>
+      </w:r>
+      <w:r>
+        <w:t xml:space="preserve"> </w:t>
+      </w:r>
+      <w:r>
+        <w:t xml:space="preserve">JSON companions.</w:t>
+      </w:r>
+    </w:p>
+    <w:p>
+      <w:pPr>
+        <w:pStyle w:val="Compact"/>
+        <w:numPr>
+          <w:ilvl w:val="0"/>
+          <w:numId w:val="1029"/>
+        </w:numPr>
+      </w:pPr>
+      <w:r>
+        <w:t xml:space="preserve">The classic Harris-matrix generator works.</w:t>
+      </w:r>
+    </w:p>
+    <w:p>
+      <w:pPr>
+        <w:pStyle w:val="Compact"/>
+        <w:numPr>
+          <w:ilvl w:val="0"/>
+          <w:numId w:val="1029"/>
+        </w:numPr>
+      </w:pPr>
+      <w:r>
+        <w:t xml:space="preserve">Both new</w:t>
+      </w:r>
+      <w:r>
+        <w:t xml:space="preserve"> </w:t>
+      </w:r>
+      <w:r>
+        <w:rPr>
+          <w:rStyle w:val="VerbatimChar"/>
+        </w:rPr>
+        <w:t xml:space="preserve">Maintenance → Migrazioni</w:t>
+      </w:r>
+      <w:r>
+        <w:t xml:space="preserve"> </w:t>
+      </w:r>
+      <w:r>
+        <w:t xml:space="preserve">menu entries appear and</w:t>
+      </w:r>
+      <w:r>
+        <w:t xml:space="preserve"> </w:t>
+      </w:r>
+      <w:r>
+        <w:t xml:space="preserve">open a file picker without exception. The vocab-alignment</w:t>
+      </w:r>
+      <w:r>
+        <w:t xml:space="preserve"> </w:t>
+      </w:r>
+      <w:r>
+        <w:t xml:space="preserve">migration’s dry-run on the Volterra DB reports zero rows</w:t>
+      </w:r>
+      <w:r>
+        <w:t xml:space="preserve"> </w:t>
+      </w:r>
+      <w:r>
+        <w:t xml:space="preserve">(no</w:t>
+      </w:r>
+      <w:r>
+        <w:t xml:space="preserve"> </w:t>
+      </w:r>
+      <w:r>
+        <w:rPr>
+          <w:rStyle w:val="VerbatimChar"/>
+        </w:rPr>
+        <w:t xml:space="preserve">USVA</w:t>
+      </w:r>
+      <w:r>
+        <w:t xml:space="preserve">/</w:t>
+      </w:r>
+      <w:r>
+        <w:rPr>
+          <w:rStyle w:val="VerbatimChar"/>
+        </w:rPr>
+        <w:t xml:space="preserve">USVB</w:t>
+      </w:r>
+      <w:r>
+        <w:t xml:space="preserve">/</w:t>
+      </w:r>
+      <w:r>
+        <w:rPr>
+          <w:rStyle w:val="VerbatimChar"/>
+        </w:rPr>
+        <w:t xml:space="preserve">USVC</w:t>
+      </w:r>
+      <w:r>
+        <w:t xml:space="preserve"> </w:t>
+      </w:r>
+      <w:r>
+        <w:t xml:space="preserve">present) —</w:t>
+      </w:r>
+      <w:r>
+        <w:t xml:space="preserve"> </w:t>
+      </w:r>
+      <w:r>
+        <w:rPr>
+          <w:rStyle w:val="VerbatimChar"/>
+        </w:rPr>
+        <w:t xml:space="preserve">--apply</w:t>
+      </w:r>
+      <w:r>
+        <w:t xml:space="preserve"> </w:t>
+      </w:r>
+      <w:r>
+        <w:t xml:space="preserve">was deliberately</w:t>
+      </w:r>
+      <w:r>
+        <w:t xml:space="preserve"> </w:t>
+      </w:r>
+      <w:r>
+        <w:t xml:space="preserve">not run.</w:t>
+      </w:r>
+    </w:p>
+    <w:p>
+      <w:pPr>
+        <w:pStyle w:val="FirstParagraph"/>
+      </w:pPr>
+      <w:r>
+        <w:t xml:space="preserve">The 4 documented Extended Matrix limitations (no spatial-grouping</w:t>
+      </w:r>
+      <w:r>
+        <w:t xml:space="preserve"> </w:t>
+      </w:r>
+      <w:r>
+        <w:t xml:space="preserve">support, no period swimlanes, partial edge styling, no transitive</w:t>
+      </w:r>
+      <w:r>
+        <w:t xml:space="preserve"> </w:t>
+      </w:r>
+      <w:r>
+        <w:t xml:space="preserve">reduction) are out of scope per Option A and remain on the Phase 2</w:t>
+      </w:r>
+      <w:r>
+        <w:t xml:space="preserve"> </w:t>
+      </w:r>
+      <w:r>
+        <w:t xml:space="preserve">backlog as described above.</w:t>
+      </w:r>
+    </w:p>
+    <w:bookmarkEnd w:id="54"/>
+    <w:bookmarkStart w:id="55" w:name="g.5-release-tag-push"/>
+    <w:p>
+      <w:pPr>
+        <w:pStyle w:val="Heading2"/>
+      </w:pPr>
+      <w:r>
+        <w:t xml:space="preserve">G.5 — Release tag + push</w:t>
+      </w:r>
+    </w:p>
+    <w:p>
+      <w:pPr>
+        <w:pStyle w:val="FirstParagraph"/>
+      </w:pPr>
+      <w:r>
+        <w:t xml:space="preserve">Created locally and pushed to</w:t>
+      </w:r>
+      <w:r>
+        <w:t xml:space="preserve"> </w:t>
+      </w:r>
+      <w:r>
+        <w:rPr>
+          <w:rStyle w:val="VerbatimChar"/>
+        </w:rPr>
+        <w:t xml:space="preserve">origin/Stratigraph_00001</w:t>
+      </w:r>
+      <w:r>
+        <w:t xml:space="preserve">:</w:t>
+      </w:r>
+    </w:p>
+    <w:tbl>
+      <w:tblPr>
+        <w:tblStyle w:val="Table"/>
+        <w:tblW w:type="pct" w:w="5000"/>
+        <w:tblLayout w:type="fixed"/>
+        <w:tblLook w:firstRow="1" w:lastRow="0" w:firstColumn="0" w:lastColumn="0" w:noHBand="0" w:noVBand="0" w:val="0020"/>
+      </w:tblPr>
+      <w:tblGrid>
+        <w:gridCol w:w="2640"/>
+        <w:gridCol w:w="2640"/>
+        <w:gridCol w:w="2640"/>
+      </w:tblGrid>
+      <w:tr>
+        <w:trPr>
+          <w:tblHeader w:val="on"/>
+        </w:trPr>
+        <w:tc>
+          <w:tcPr/>
+          <w:p>
+            <w:pPr>
+              <w:pStyle w:val="Compact"/>
+            </w:pPr>
+            <w:r>
+              <w:t xml:space="preserve">Tag</w:t>
+            </w:r>
+          </w:p>
+        </w:tc>
+        <w:tc>
+          <w:tcPr/>
+          <w:p>
+            <w:pPr>
+              <w:pStyle w:val="Compact"/>
+            </w:pPr>
+            <w:r>
+              <w:t xml:space="preserve">Points at</w:t>
+            </w:r>
+          </w:p>
+        </w:tc>
+        <w:tc>
+          <w:tcPr/>
+          <w:p>
+            <w:pPr>
+              <w:pStyle w:val="Compact"/>
+            </w:pPr>
+            <w:r>
+              <w:t xml:space="preserve">Purpose</w:t>
+            </w:r>
+          </w:p>
+        </w:tc>
+      </w:tr>
+      <w:tr>
+        <w:tc>
+          <w:tcPr/>
+          <w:p>
+            <w:pPr>
+              <w:pStyle w:val="Compact"/>
+            </w:pPr>
+            <w:r>
+              <w:rPr>
+                <w:rStyle w:val="VerbatimChar"/>
+              </w:rPr>
+              <w:t xml:space="preserve">phase1-foundation-5.1.0-alpha</w:t>
+            </w:r>
+          </w:p>
+        </w:tc>
+        <w:tc>
+          <w:tcPr/>
+          <w:p>
+            <w:pPr>
+              <w:pStyle w:val="Compact"/>
+            </w:pPr>
+            <w:r>
+              <w:rPr>
+                <w:rStyle w:val="VerbatimChar"/>
+              </w:rPr>
+              <w:t xml:space="preserve">8fceff79</w:t>
+            </w:r>
+          </w:p>
+        </w:tc>
+        <w:tc>
+          <w:tcPr/>
+          <w:p>
+            <w:pPr>
+              <w:pStyle w:val="Compact"/>
+            </w:pPr>
+            <w:r>
+              <w:t xml:space="preserve">Phase 1 release marker</w:t>
+            </w:r>
+          </w:p>
+        </w:tc>
+      </w:tr>
+      <w:tr>
+        <w:tc>
+          <w:tcPr/>
+          <w:p>
+            <w:pPr>
+              <w:pStyle w:val="Compact"/>
+            </w:pPr>
+            <w:r>
+              <w:rPr>
+                <w:rStyle w:val="VerbatimChar"/>
+              </w:rPr>
+              <w:t xml:space="preserve">pre-s3dgraphy-040</w:t>
+            </w:r>
+          </w:p>
+        </w:tc>
+        <w:tc>
+          <w:tcPr/>
+          <w:p>
+            <w:pPr>
+              <w:pStyle w:val="Compact"/>
+            </w:pPr>
+            <w:r>
+              <w:rPr>
+                <w:rStyle w:val="VerbatimChar"/>
+              </w:rPr>
+              <w:t xml:space="preserve">cf11f027</w:t>
+            </w:r>
+          </w:p>
+        </w:tc>
+        <w:tc>
+          <w:tcPr/>
+          <w:p>
+            <w:pPr>
+              <w:pStyle w:val="Compact"/>
+            </w:pPr>
+            <w:r>
+              <w:t xml:space="preserve">Pre-Phase-1 rollback point</w:t>
+            </w:r>
+          </w:p>
+        </w:tc>
+      </w:tr>
+    </w:tbl>
+    <w:p>
+      <w:pPr>
+        <w:pStyle w:val="BodyText"/>
+      </w:pPr>
+      <w:r>
+        <w:t xml:space="preserve">Branch</w:t>
+      </w:r>
+      <w:r>
+        <w:t xml:space="preserve"> </w:t>
+      </w:r>
+      <w:r>
+        <w:rPr>
+          <w:rStyle w:val="VerbatimChar"/>
+        </w:rPr>
+        <w:t xml:space="preserve">Stratigraph_00001</w:t>
+      </w:r>
+      <w:r>
+        <w:t xml:space="preserve"> </w:t>
+      </w:r>
+      <w:r>
+        <w:t xml:space="preserve">advanced from</w:t>
+      </w:r>
+      <w:r>
+        <w:t xml:space="preserve"> </w:t>
+      </w:r>
+      <w:r>
+        <w:rPr>
+          <w:rStyle w:val="VerbatimChar"/>
+        </w:rPr>
+        <w:t xml:space="preserve">cf11f027</w:t>
+      </w:r>
+      <w:r>
+        <w:t xml:space="preserve"> </w:t>
+      </w:r>
+      <w:r>
+        <w:t xml:space="preserve">(the rollback</w:t>
+      </w:r>
+      <w:r>
+        <w:t xml:space="preserve"> </w:t>
+      </w:r>
+      <w:r>
+        <w:t xml:space="preserve">point recorded at Group 0) to</w:t>
+      </w:r>
+      <w:r>
+        <w:t xml:space="preserve"> </w:t>
+      </w:r>
+      <w:r>
+        <w:rPr>
+          <w:rStyle w:val="VerbatimChar"/>
+        </w:rPr>
+        <w:t xml:space="preserve">8fceff79</w:t>
+      </w:r>
+      <w:r>
+        <w:t xml:space="preserve">, picking up 31 new commits</w:t>
+      </w:r>
+      <w:r>
+        <w:t xml:space="preserve"> </w:t>
+      </w:r>
+      <w:r>
+        <w:t xml:space="preserve">across the eight Groups plus the two in-flight hotfixes plus the</w:t>
+      </w:r>
+      <w:r>
+        <w:t xml:space="preserve"> </w:t>
+      </w:r>
+      <w:r>
+        <w:t xml:space="preserve">release-packaging chore.</w:t>
+      </w:r>
+    </w:p>
+    <w:p>
+      <w:pPr>
+        <w:pStyle w:val="BodyText"/>
+      </w:pPr>
+      <w:r>
+        <w:t xml:space="preserve">The push was clean. GitHub returned its standing dependabot</w:t>
+      </w:r>
+      <w:r>
+        <w:t xml:space="preserve"> </w:t>
+      </w:r>
+      <w:r>
+        <w:t xml:space="preserve">advisory for the repository (19 historical vulnerabilities on the</w:t>
+      </w:r>
+      <w:r>
+        <w:t xml:space="preserve"> </w:t>
+      </w:r>
+      <w:r>
+        <w:t xml:space="preserve">default branch) which is unrelated to this branch’s content and</w:t>
+      </w:r>
+      <w:r>
+        <w:t xml:space="preserve"> </w:t>
+      </w:r>
+      <w:r>
+        <w:t xml:space="preserve">predates Phase 1.</w:t>
+      </w:r>
+    </w:p>
+    <w:bookmarkEnd w:id="55"/>
+    <w:bookmarkStart w:id="56" w:name="closing-summary"/>
+    <w:p>
+      <w:pPr>
+        <w:pStyle w:val="Heading2"/>
+      </w:pPr>
+      <w:r>
+        <w:t xml:space="preserve">Closing summary</w:t>
+      </w:r>
+    </w:p>
+    <w:p>
+      <w:pPr>
+        <w:pStyle w:val="FirstParagraph"/>
+      </w:pPr>
+      <w:r>
+        <w:t xml:space="preserve">Phase 1 (Foundation) of T5.4 is closed. The deliverables match</w:t>
+      </w:r>
+      <w:r>
+        <w:t xml:space="preserve"> </w:t>
+      </w:r>
+      <w:r>
+        <w:t xml:space="preserve">the implementation plan one-for-one:</w:t>
+      </w:r>
+    </w:p>
+    <w:p>
+      <w:pPr>
+        <w:pStyle w:val="Compact"/>
+        <w:numPr>
+          <w:ilvl w:val="0"/>
+          <w:numId w:val="1030"/>
+        </w:numPr>
+      </w:pPr>
+      <w:r>
+        <w:t xml:space="preserve">s3Dgraphy 0.1.30 → 0.1.40 vendored, version pinned in</w:t>
+      </w:r>
+      <w:r>
+        <w:t xml:space="preserve"> </w:t>
+      </w:r>
+      <w:r>
+        <w:rPr>
+          <w:rStyle w:val="VerbatimChar"/>
+        </w:rPr>
+        <w:t xml:space="preserve">requirements.txt</w:t>
+      </w:r>
+      <w:r>
+        <w:t xml:space="preserve">.</w:t>
+      </w:r>
+    </w:p>
+    <w:p>
+      <w:pPr>
+        <w:pStyle w:val="Compact"/>
+        <w:numPr>
+          <w:ilvl w:val="0"/>
+          <w:numId w:val="1030"/>
+        </w:numPr>
+      </w:pPr>
+      <w:r>
+        <w:t xml:space="preserve">New</w:t>
+      </w:r>
+      <w:r>
+        <w:t xml:space="preserve"> </w:t>
+      </w:r>
+      <w:r>
+        <w:rPr>
+          <w:rStyle w:val="VerbatimChar"/>
+        </w:rPr>
+        <w:t xml:space="preserve">modules/s3dgraphy/sync/</w:t>
+      </w:r>
+      <w:r>
+        <w:t xml:space="preserve"> </w:t>
+      </w:r>
+      <w:r>
+        <w:t xml:space="preserve">package (5 files) ships</w:t>
+      </w:r>
+      <w:r>
+        <w:t xml:space="preserve"> </w:t>
+      </w:r>
+      <w:r>
+        <w:rPr>
+          <w:rStyle w:val="VerbatimChar"/>
+        </w:rPr>
+        <w:t xml:space="preserve">VocabProvider</w:t>
+      </w:r>
+      <w:r>
+        <w:t xml:space="preserve"> </w:t>
+      </w:r>
+      <w:r>
+        <w:t xml:space="preserve">+</w:t>
+      </w:r>
+      <w:r>
+        <w:t xml:space="preserve"> </w:t>
+      </w:r>
+      <w:r>
+        <w:rPr>
+          <w:rStyle w:val="VerbatimChar"/>
+        </w:rPr>
+        <w:t xml:space="preserve">VocabProviderCore</w:t>
+      </w:r>
+      <w:r>
+        <w:t xml:space="preserve"> </w:t>
+      </w:r>
+      <w:r>
+        <w:t xml:space="preserve">+</w:t>
+      </w:r>
+      <w:r>
+        <w:t xml:space="preserve"> </w:t>
+      </w:r>
+      <w:r>
+        <w:rPr>
+          <w:rStyle w:val="VerbatimChar"/>
+        </w:rPr>
+        <w:t xml:space="preserve">Family</w:t>
+      </w:r>
+      <w:r>
+        <w:t xml:space="preserve">/</w:t>
+      </w:r>
+      <w:r>
+        <w:rPr>
+          <w:rStyle w:val="VerbatimChar"/>
+        </w:rPr>
+        <w:t xml:space="preserve">UnitType</w:t>
+      </w:r>
+      <w:r>
+        <w:t xml:space="preserve">/</w:t>
+      </w:r>
+      <w:r>
+        <w:t xml:space="preserve"> </w:t>
+      </w:r>
+      <w:r>
+        <w:rPr>
+          <w:rStyle w:val="VerbatimChar"/>
+        </w:rPr>
+        <w:t xml:space="preserve">EdgeType</w:t>
+      </w:r>
+      <w:r>
+        <w:t xml:space="preserve">/</w:t>
+      </w:r>
+      <w:r>
+        <w:rPr>
+          <w:rStyle w:val="VerbatimChar"/>
+        </w:rPr>
+        <w:t xml:space="preserve">VisualRule</w:t>
+      </w:r>
+      <w:r>
+        <w:t xml:space="preserve">/</w:t>
+      </w:r>
+      <w:r>
+        <w:rPr>
+          <w:rStyle w:val="VerbatimChar"/>
+        </w:rPr>
+        <w:t xml:space="preserve">ParadataType</w:t>
+      </w:r>
+      <w:r>
+        <w:t xml:space="preserve">/</w:t>
+      </w:r>
+      <w:r>
+        <w:rPr>
+          <w:rStyle w:val="VerbatimChar"/>
+        </w:rPr>
+        <w:t xml:space="preserve">VocabularyVersion</w:t>
+      </w:r>
+      <w:r>
+        <w:t xml:space="preserve"> </w:t>
+      </w:r>
+      <w:r>
+        <w:t xml:space="preserve">dataclasses + a local UUID v7 generator. Public API frozen</w:t>
+      </w:r>
+      <w:r>
+        <w:t xml:space="preserve"> </w:t>
+      </w:r>
+      <w:r>
+        <w:t xml:space="preserve">for Phase 1.</w:t>
+      </w:r>
+    </w:p>
+    <w:p>
+      <w:pPr>
+        <w:pStyle w:val="Compact"/>
+        <w:numPr>
+          <w:ilvl w:val="0"/>
+          <w:numId w:val="1030"/>
+        </w:numPr>
+      </w:pPr>
+      <w:r>
+        <w:rPr>
+          <w:rStyle w:val="VerbatimChar"/>
+        </w:rPr>
+        <w:t xml:space="preserve">modules/utility/pyarchinit_i18n_stratigraphic.py</w:t>
+      </w:r>
+      <w:r>
+        <w:t xml:space="preserve"> </w:t>
+      </w:r>
+      <w:r>
+        <w:t xml:space="preserve">is now an</w:t>
+      </w:r>
+      <w:r>
+        <w:t xml:space="preserve"> </w:t>
+      </w:r>
+      <w:r>
+        <w:t xml:space="preserve">adapter over</w:t>
+      </w:r>
+      <w:r>
+        <w:t xml:space="preserve"> </w:t>
+      </w:r>
+      <w:r>
+        <w:rPr>
+          <w:rStyle w:val="VerbatimChar"/>
+        </w:rPr>
+        <w:t xml:space="preserve">VocabProvider</w:t>
+      </w:r>
+      <w:r>
+        <w:t xml:space="preserve"> </w:t>
+      </w:r>
+      <w:r>
+        <w:t xml:space="preserve">while preserving its public</w:t>
+      </w:r>
+      <w:r>
+        <w:t xml:space="preserve"> </w:t>
+      </w:r>
+      <w:r>
+        <w:t xml:space="preserve">surface for one release. The unit-type picker exposes 27</w:t>
+      </w:r>
+      <w:r>
+        <w:t xml:space="preserve"> </w:t>
+      </w:r>
+      <w:r>
+        <w:t xml:space="preserve">items (was 14).</w:t>
+      </w:r>
+    </w:p>
+    <w:p>
+      <w:pPr>
+        <w:pStyle w:val="Compact"/>
+        <w:numPr>
+          <w:ilvl w:val="0"/>
+          <w:numId w:val="1030"/>
+        </w:numPr>
+      </w:pPr>
+      <w:r>
+        <w:t xml:space="preserve">Two one-shot SQL migrations under</w:t>
+      </w:r>
+      <w:r>
+        <w:t xml:space="preserve"> </w:t>
+      </w:r>
+      <w:r>
+        <w:rPr>
+          <w:rStyle w:val="VerbatimChar"/>
+        </w:rPr>
+        <w:t xml:space="preserve">scripts/migrations/</w:t>
+      </w:r>
+      <w:r>
+        <w:t xml:space="preserve">,</w:t>
+      </w:r>
+      <w:r>
+        <w:t xml:space="preserve"> </w:t>
+      </w:r>
+      <w:r>
+        <w:t xml:space="preserve">both</w:t>
+      </w:r>
+      <w:r>
+        <w:t xml:space="preserve"> </w:t>
+      </w:r>
+      <w:r>
+        <w:rPr>
+          <w:rStyle w:val="VerbatimChar"/>
+        </w:rPr>
+        <w:t xml:space="preserve">--dry-run / --apply / --rollback</w:t>
+      </w:r>
+      <w:r>
+        <w:t xml:space="preserve"> </w:t>
+      </w:r>
+      <w:r>
+        <w:t xml:space="preserve">with auto-backup,</w:t>
+      </w:r>
+      <w:r>
+        <w:t xml:space="preserve"> </w:t>
+      </w:r>
+      <w:r>
+        <w:t xml:space="preserve">both wired into a new</w:t>
+      </w:r>
+      <w:r>
+        <w:t xml:space="preserve"> </w:t>
+      </w:r>
+      <w:r>
+        <w:rPr>
+          <w:rStyle w:val="VerbatimChar"/>
+        </w:rPr>
+        <w:t xml:space="preserve">Maintenance → Migrazioni</w:t>
+      </w:r>
+      <w:r>
+        <w:t xml:space="preserve"> </w:t>
+      </w:r>
+      <w:r>
+        <w:t xml:space="preserve">menu in the</w:t>
+      </w:r>
+      <w:r>
+        <w:t xml:space="preserve"> </w:t>
+      </w:r>
+      <w:r>
+        <w:t xml:space="preserve">QGIS plugin.</w:t>
+      </w:r>
+    </w:p>
+    <w:p>
+      <w:pPr>
+        <w:pStyle w:val="Compact"/>
+        <w:numPr>
+          <w:ilvl w:val="0"/>
+          <w:numId w:val="1030"/>
+        </w:numPr>
+      </w:pPr>
+      <w:r>
+        <w:t xml:space="preserve">12 files under</w:t>
+      </w:r>
+      <w:r>
+        <w:t xml:space="preserve"> </w:t>
+      </w:r>
+      <w:r>
+        <w:rPr>
+          <w:rStyle w:val="VerbatimChar"/>
+        </w:rPr>
+        <w:t xml:space="preserve">modules/s3dgraphy/</w:t>
+      </w:r>
+      <w:r>
+        <w:t xml:space="preserve"> </w:t>
+      </w:r>
+      <w:r>
+        <w:t xml:space="preserve">audited; 7 refactored to</w:t>
+      </w:r>
+      <w:r>
+        <w:t xml:space="preserve"> </w:t>
+      </w:r>
+      <w:r>
+        <w:t xml:space="preserve">consult</w:t>
+      </w:r>
+      <w:r>
+        <w:t xml:space="preserve"> </w:t>
+      </w:r>
+      <w:r>
+        <w:rPr>
+          <w:rStyle w:val="VerbatimChar"/>
+        </w:rPr>
+        <w:t xml:space="preserve">VocabProvider</w:t>
+      </w:r>
+      <w:r>
+        <w:t xml:space="preserve">; 4 verified clean.</w:t>
+      </w:r>
+    </w:p>
+    <w:p>
+      <w:pPr>
+        <w:pStyle w:val="Compact"/>
+        <w:numPr>
+          <w:ilvl w:val="0"/>
+          <w:numId w:val="1030"/>
+        </w:numPr>
+      </w:pPr>
+      <w:r>
+        <w:t xml:space="preserve">42 unit tests passing in</w:t>
+      </w:r>
+      <w:r>
+        <w:t xml:space="preserve"> </w:t>
+      </w:r>
+      <w:r>
+        <w:rPr>
+          <w:rStyle w:val="VerbatimChar"/>
+        </w:rPr>
+        <w:t xml:space="preserve">tests/sync/</w:t>
+      </w:r>
+      <w:r>
+        <w:t xml:space="preserve"> </w:t>
+      </w:r>
+      <w:r>
+        <w:t xml:space="preserve">+</w:t>
+      </w:r>
+      <w:r>
+        <w:t xml:space="preserve"> </w:t>
+      </w:r>
+      <w:r>
+        <w:rPr>
+          <w:rStyle w:val="VerbatimChar"/>
+        </w:rPr>
+        <w:t xml:space="preserve">tests/migrations/</w:t>
+      </w:r>
+      <w:r>
+        <w:t xml:space="preserve">.</w:t>
+      </w:r>
+    </w:p>
+    <w:p>
+      <w:pPr>
+        <w:pStyle w:val="FirstParagraph"/>
+      </w:pPr>
+      <w:r>
+        <w:t xml:space="preserve">Reference contracts (committed):</w:t>
+      </w:r>
+    </w:p>
+    <w:p>
+      <w:pPr>
+        <w:pStyle w:val="Compact"/>
+        <w:numPr>
+          <w:ilvl w:val="0"/>
+          <w:numId w:val="1031"/>
+        </w:numPr>
+      </w:pPr>
+      <w:r>
+        <w:t xml:space="preserve">Spec:</w:t>
+      </w:r>
+      <w:r>
+        <w:t xml:space="preserve"> </w:t>
+      </w:r>
+      <w:r>
+        <w:rPr>
+          <w:rStyle w:val="VerbatimChar"/>
+        </w:rPr>
+        <w:t xml:space="preserve">docs/superpowers/specs/2026-05-04-s3dgraphy-bidirectional-sync-design.md</w:t>
+      </w:r>
+      <w:r>
+        <w:t xml:space="preserve"> </w:t>
+      </w:r>
+      <w:r>
+        <w:t xml:space="preserve">(aligned with both the meeting minutes and Reference Document v0.1).</w:t>
+      </w:r>
+    </w:p>
+    <w:p>
+      <w:pPr>
+        <w:pStyle w:val="Compact"/>
+        <w:numPr>
+          <w:ilvl w:val="0"/>
+          <w:numId w:val="1031"/>
+        </w:numPr>
+      </w:pPr>
+      <w:r>
+        <w:t xml:space="preserve">Implementation plan:</w:t>
+      </w:r>
+      <w:r>
+        <w:t xml:space="preserve"> </w:t>
+      </w:r>
+      <w:r>
+        <w:rPr>
+          <w:rStyle w:val="VerbatimChar"/>
+        </w:rPr>
+        <w:t xml:space="preserve">docs/superpowers/plans/2026-05-06-phase-1-foundation.md</w:t>
+      </w:r>
+      <w:r>
+        <w:t xml:space="preserve"> </w:t>
+      </w:r>
+      <w:r>
+        <w:t xml:space="preserve">(8 Groups, 37 tasks, ~150 steps; executed via the Subagent-Driven</w:t>
+      </w:r>
+      <w:r>
+        <w:t xml:space="preserve"> </w:t>
+      </w:r>
+      <w:r>
+        <w:t xml:space="preserve">Development workflow with two-stage review on the foundation pair).</w:t>
+      </w:r>
+    </w:p>
+    <w:p>
+      <w:pPr>
+        <w:pStyle w:val="Compact"/>
+        <w:numPr>
+          <w:ilvl w:val="0"/>
+          <w:numId w:val="1031"/>
+        </w:numPr>
+      </w:pPr>
+      <w:r>
+        <w:t xml:space="preserve">This dev log:</w:t>
+      </w:r>
+      <w:r>
+        <w:t xml:space="preserve"> </w:t>
+      </w:r>
+      <w:r>
+        <w:rPr>
+          <w:rStyle w:val="VerbatimChar"/>
+        </w:rPr>
+        <w:t xml:space="preserve">docs/superpowers/dev-log/T5.4_PyArchInit_Dev_Log.{md,docx}</w:t>
+      </w:r>
+      <w:r>
+        <w:t xml:space="preserve"> </w:t>
+      </w:r>
+      <w:r>
+        <w:t xml:space="preserve">(rolling English-language partner-facing summary, kept in step with</w:t>
+      </w:r>
+      <w:r>
+        <w:t xml:space="preserve"> </w:t>
+      </w:r>
+      <w:r>
+        <w:t xml:space="preserve">every Group commit).</w:t>
+      </w:r>
+    </w:p>
+    <w:p>
+      <w:pPr>
+        <w:pStyle w:val="FirstParagraph"/>
+      </w:pPr>
+      <w:r>
+        <w:t xml:space="preserve">Next step is the Phase 2 plan covering AI03 (delegate GraphML to</w:t>
+      </w:r>
+      <w:r>
+        <w:t xml:space="preserve"> </w:t>
+      </w:r>
+      <w:r>
+        <w:t xml:space="preserve">s3Dgraphy</w:t>
+      </w:r>
+      <w:r>
+        <w:t xml:space="preserve"> </w:t>
+      </w:r>
+      <w:r>
+        <w:rPr>
+          <w:rStyle w:val="VerbatimChar"/>
+        </w:rPr>
+        <w:t xml:space="preserve">GraphMLExporter</w:t>
+      </w:r>
+      <w:r>
+        <w:t xml:space="preserve">), AI04 (bidirectional bridge —</w:t>
+      </w:r>
+      <w:r>
+        <w:t xml:space="preserve"> </w:t>
+      </w:r>
+      <w:r>
+        <w:rPr>
+          <w:rStyle w:val="VerbatimChar"/>
+        </w:rPr>
+        <w:t xml:space="preserve">populate_graph</w:t>
+      </w:r>
+      <w:r>
+        <w:t xml:space="preserve"> </w:t>
+      </w:r>
+      <w:r>
+        <w:t xml:space="preserve">/</w:t>
+      </w:r>
+      <w:r>
+        <w:t xml:space="preserve"> </w:t>
+      </w:r>
+      <w:r>
+        <w:rPr>
+          <w:rStyle w:val="VerbatimChar"/>
+        </w:rPr>
+        <w:t xml:space="preserve">populate_list</w:t>
+      </w:r>
+      <w:r>
+        <w:t xml:space="preserve">), and AI05 (</w:t>
+      </w:r>
+      <w:r>
+        <w:rPr>
+          <w:rStyle w:val="VerbatimChar"/>
+        </w:rPr>
+        <w:t xml:space="preserve">ParadataStore</w:t>
+      </w:r>
+      <w:r>
+        <w:t xml:space="preserve">).</w:t>
+      </w:r>
+      <w:r>
+        <w:t xml:space="preserve"> </w:t>
+      </w:r>
+      <w:r>
+        <w:t xml:space="preserve">The four Extended Matrix limitations carried over here will be</w:t>
+      </w:r>
+      <w:r>
+        <w:t xml:space="preserve"> </w:t>
+      </w:r>
+      <w:r>
+        <w:t xml:space="preserve">the natural validation gate for AI03.</w:t>
+      </w:r>
+    </w:p>
+    <w:bookmarkEnd w:id="56"/>
+    <w:bookmarkEnd w:id="57"/>
     <w:sectPr>
       <w:footnotePr>
         <w:numRestart w:val="eachSect"/>
@@ -14277,6 +15573,42 @@
     <w:abstractNumId w:val="991"/>
   </w:num>
   <w:num w:numId="1028">
+    <w:abstractNumId w:val="991"/>
+  </w:num>
+  <w:num w:numId="1029">
+    <w:abstractNumId w:val="99411"/>
+    <w:lvlOverride w:ilvl="0">
+      <w:startOverride w:val="1"/>
+    </w:lvlOverride>
+    <w:lvlOverride w:ilvl="1">
+      <w:startOverride w:val="1"/>
+    </w:lvlOverride>
+    <w:lvlOverride w:ilvl="2">
+      <w:startOverride w:val="1"/>
+    </w:lvlOverride>
+    <w:lvlOverride w:ilvl="3">
+      <w:startOverride w:val="1"/>
+    </w:lvlOverride>
+    <w:lvlOverride w:ilvl="4">
+      <w:startOverride w:val="1"/>
+    </w:lvlOverride>
+    <w:lvlOverride w:ilvl="5">
+      <w:startOverride w:val="1"/>
+    </w:lvlOverride>
+    <w:lvlOverride w:ilvl="6">
+      <w:startOverride w:val="1"/>
+    </w:lvlOverride>
+    <w:lvlOverride w:ilvl="7">
+      <w:startOverride w:val="1"/>
+    </w:lvlOverride>
+    <w:lvlOverride w:ilvl="8">
+      <w:startOverride w:val="1"/>
+    </w:lvlOverride>
+  </w:num>
+  <w:num w:numId="1030">
+    <w:abstractNumId w:val="991"/>
+  </w:num>
+  <w:num w:numId="1031">
     <w:abstractNumId w:val="991"/>
   </w:num>
 </w:numbering>

</xml_diff>

<commit_message>
docs(dev-log): Phase 2 / AI03 entry — GraphML delegation
Documents the cut-over: scope, closed limitations, test suite delta,
decisions taken. DOCX re-rendered for partner Teams uploads.
</commit_message>
<xml_diff>
--- a/docs/superpowers/dev-log/T5.4_PyArchInit_Dev_Log.docx
+++ b/docs/superpowers/dev-log/T5.4_PyArchInit_Dev_Log.docx
@@ -15136,6 +15136,1804 @@
     </w:p>
     <w:bookmarkEnd w:id="56"/>
     <w:bookmarkEnd w:id="57"/>
+    <w:bookmarkStart w:id="62" w:name="phase-2-ai03-closed-graphml-delegation"/>
+    <w:p>
+      <w:pPr>
+        <w:pStyle w:val="Heading1"/>
+      </w:pPr>
+      <w:r>
+        <w:t xml:space="preserve">Phase 2 — AI03 closed (GraphML delegation)</w:t>
+      </w:r>
+    </w:p>
+    <w:p>
+      <w:pPr>
+        <w:pStyle w:val="FirstParagraph"/>
+      </w:pPr>
+      <w:r>
+        <w:rPr>
+          <w:b/>
+          <w:bCs/>
+        </w:rPr>
+        <w:t xml:space="preserve">Date:</w:t>
+      </w:r>
+      <w:r>
+        <w:t xml:space="preserve"> </w:t>
+      </w:r>
+      <w:r>
+        <w:t xml:space="preserve">7 May 2026 ·</w:t>
+      </w:r>
+      <w:r>
+        <w:t xml:space="preserve"> </w:t>
+      </w:r>
+      <w:r>
+        <w:rPr>
+          <w:b/>
+          <w:bCs/>
+        </w:rPr>
+        <w:t xml:space="preserve">Status:</w:t>
+      </w:r>
+      <w:r>
+        <w:t xml:space="preserve"> </w:t>
+      </w:r>
+      <w:r>
+        <w:rPr>
+          <w:b/>
+          <w:bCs/>
+        </w:rPr>
+        <w:t xml:space="preserve">Done.</w:t>
+      </w:r>
+      <w:r>
+        <w:t xml:space="preserve"> </w:t>
+      </w:r>
+      <w:r>
+        <w:t xml:space="preserve">·</w:t>
+      </w:r>
+      <w:r>
+        <w:t xml:space="preserve"> </w:t>
+      </w:r>
+      <w:r>
+        <w:rPr>
+          <w:b/>
+          <w:bCs/>
+        </w:rPr>
+        <w:t xml:space="preserve">Commits:</w:t>
+      </w:r>
+      <w:r>
+        <w:t xml:space="preserve"> </w:t>
+      </w:r>
+      <w:r>
+        <w:t xml:space="preserve">approx</w:t>
+      </w:r>
+      <w:r>
+        <w:t xml:space="preserve"> </w:t>
+      </w:r>
+      <w:r>
+        <w:rPr>
+          <w:rStyle w:val="VerbatimChar"/>
+        </w:rPr>
+        <w:t xml:space="preserve">8df46836..HEAD</w:t>
+      </w:r>
+      <w:r>
+        <w:t xml:space="preserve"> </w:t>
+      </w:r>
+      <w:r>
+        <w:t xml:space="preserve">(the pre-AI03 documentation commit was</w:t>
+      </w:r>
+      <w:r>
+        <w:t xml:space="preserve"> </w:t>
+      </w:r>
+      <w:r>
+        <w:rPr>
+          <w:rStyle w:val="VerbatimChar"/>
+        </w:rPr>
+        <w:t xml:space="preserve">8df46836</w:t>
+      </w:r>
+      <w:r>
+        <w:t xml:space="preserve">;</w:t>
+      </w:r>
+      <w:r>
+        <w:t xml:space="preserve"> </w:t>
+      </w:r>
+      <w:r>
+        <w:t xml:space="preserve">the AI03 implementation opens at</w:t>
+      </w:r>
+      <w:r>
+        <w:t xml:space="preserve"> </w:t>
+      </w:r>
+      <w:r>
+        <w:rPr>
+          <w:rStyle w:val="VerbatimChar"/>
+        </w:rPr>
+        <w:t xml:space="preserve">19924971</w:t>
+      </w:r>
+      <w:r>
+        <w:t xml:space="preserve"> </w:t>
+      </w:r>
+      <w:r>
+        <w:t xml:space="preserve">with the</w:t>
+      </w:r>
+      <w:r>
+        <w:t xml:space="preserve"> </w:t>
+      </w:r>
+      <w:r>
+        <w:rPr>
+          <w:rStyle w:val="VerbatimChar"/>
+        </w:rPr>
+        <w:t xml:space="preserve">ExportResult</w:t>
+      </w:r>
+      <w:r>
+        <w:t xml:space="preserve"> </w:t>
+      </w:r>
+      <w:r>
+        <w:t xml:space="preserve">dataclass and closes with this group’s metadata bump and changelog).</w:t>
+      </w:r>
+    </w:p>
+    <w:p>
+      <w:pPr>
+        <w:pStyle w:val="BodyText"/>
+      </w:pPr>
+      <w:r>
+        <w:t xml:space="preserve">This phase delivered AI03 of the T5.4 backlog: the GraphML branch of</w:t>
+      </w:r>
+      <w:r>
+        <w:t xml:space="preserve"> </w:t>
+      </w:r>
+      <w:r>
+        <w:t xml:space="preserve">the</w:t>
+      </w:r>
+      <w:r>
+        <w:t xml:space="preserve"> </w:t>
+      </w:r>
+      <w:r>
+        <w:t xml:space="preserve">“Extended Matrix”</w:t>
+      </w:r>
+      <w:r>
+        <w:t xml:space="preserve"> </w:t>
+      </w:r>
+      <w:r>
+        <w:t xml:space="preserve">export now delegates to s3Dgraphy’s</w:t>
+      </w:r>
+      <w:r>
+        <w:t xml:space="preserve"> </w:t>
+      </w:r>
+      <w:r>
+        <w:rPr>
+          <w:rStyle w:val="VerbatimChar"/>
+        </w:rPr>
+        <w:t xml:space="preserve">PyArchInitImporter</w:t>
+      </w:r>
+      <w:r>
+        <w:t xml:space="preserve"> </w:t>
+      </w:r>
+      <w:r>
+        <w:t xml:space="preserve">+</w:t>
+      </w:r>
+      <w:r>
+        <w:t xml:space="preserve"> </w:t>
+      </w:r>
+      <w:r>
+        <w:rPr>
+          <w:rStyle w:val="VerbatimChar"/>
+        </w:rPr>
+        <w:t xml:space="preserve">GraphMLExporter</w:t>
+      </w:r>
+      <w:r>
+        <w:t xml:space="preserve"> </w:t>
+      </w:r>
+      <w:r>
+        <w:t xml:space="preserve">instead of the legacy</w:t>
+      </w:r>
+      <w:r>
+        <w:t xml:space="preserve"> </w:t>
+      </w:r>
+      <w:r>
+        <w:t xml:space="preserve">DOT→GraphML pipeline. The cut-over is clean: the legacy code path is</w:t>
+      </w:r>
+      <w:r>
+        <w:t xml:space="preserve"> </w:t>
+      </w:r>
+      <w:r>
+        <w:t xml:space="preserve">deleted, not gated behind a fallback flag. The four Extended Matrix</w:t>
+      </w:r>
+      <w:r>
+        <w:t xml:space="preserve"> </w:t>
+      </w:r>
+      <w:r>
+        <w:t xml:space="preserve">limitations carried over from Phase 1 (empty graphml when the</w:t>
+      </w:r>
+      <w:r>
+        <w:t xml:space="preserve"> </w:t>
+      </w:r>
+      <w:r>
+        <w:t xml:space="preserve">spatial-grouping flag was set, no period swimlanes, partial edge</w:t>
+      </w:r>
+      <w:r>
+        <w:t xml:space="preserve"> </w:t>
+      </w:r>
+      <w:r>
+        <w:t xml:space="preserve">styling, no transitive reduction) close in a single move, because</w:t>
+      </w:r>
+      <w:r>
+        <w:t xml:space="preserve"> </w:t>
+      </w:r>
+      <w:r>
+        <w:t xml:space="preserve">the s3Dgraphy exporter handles all four natively.</w:t>
+      </w:r>
+    </w:p>
+    <w:bookmarkStart w:id="58" w:name="what-was-built-7"/>
+    <w:p>
+      <w:pPr>
+        <w:pStyle w:val="Heading2"/>
+      </w:pPr>
+      <w:r>
+        <w:t xml:space="preserve">What was built</w:t>
+      </w:r>
+    </w:p>
+    <w:p>
+      <w:pPr>
+        <w:pStyle w:val="FirstParagraph"/>
+      </w:pPr>
+      <w:r>
+        <w:t xml:space="preserve">A new orchestration module,</w:t>
+      </w:r>
+      <w:r>
+        <w:t xml:space="preserve"> </w:t>
+      </w:r>
+      <w:r>
+        <w:rPr>
+          <w:rStyle w:val="VerbatimChar"/>
+        </w:rPr>
+        <w:t xml:space="preserve">modules/s3dgraphy/sync/graphml_writer.py</w:t>
+      </w:r>
+      <w:r>
+        <w:t xml:space="preserve">,</w:t>
+      </w:r>
+      <w:r>
+        <w:t xml:space="preserve"> </w:t>
+      </w:r>
+      <w:r>
+        <w:t xml:space="preserve">hosts three pure helpers —</w:t>
+      </w:r>
+      <w:r>
+        <w:t xml:space="preserve"> </w:t>
+      </w:r>
+      <w:r>
+        <w:rPr>
+          <w:rStyle w:val="VerbatimChar"/>
+        </w:rPr>
+        <w:t xml:space="preserve">build_pyarchinit_mapping()</w:t>
+      </w:r>
+      <w:r>
+        <w:t xml:space="preserve">,</w:t>
+      </w:r>
+      <w:r>
+        <w:t xml:space="preserve"> </w:t>
+      </w:r>
+      <w:r>
+        <w:rPr>
+          <w:rStyle w:val="VerbatimChar"/>
+        </w:rPr>
+        <w:t xml:space="preserve">count_epoch_nodes()</w:t>
+      </w:r>
+      <w:r>
+        <w:t xml:space="preserve">,</w:t>
+      </w:r>
+      <w:r>
+        <w:t xml:space="preserve"> </w:t>
+      </w:r>
+      <w:r>
+        <w:rPr>
+          <w:rStyle w:val="VerbatimChar"/>
+        </w:rPr>
+        <w:t xml:space="preserve">count_topological_edges()</w:t>
+      </w:r>
+      <w:r>
+        <w:t xml:space="preserve"> </w:t>
+      </w:r>
+      <w:r>
+        <w:t xml:space="preserve">— and a single</w:t>
+      </w:r>
+      <w:r>
+        <w:t xml:space="preserve"> </w:t>
+      </w:r>
+      <w:r>
+        <w:t xml:space="preserve">public entry point</w:t>
+      </w:r>
+      <w:r>
+        <w:t xml:space="preserve"> </w:t>
+      </w:r>
+      <w:r>
+        <w:rPr>
+          <w:rStyle w:val="VerbatimChar"/>
+        </w:rPr>
+        <w:t xml:space="preserve">write_graphml_via_s3dgraphy(sqlite_path, output_path) -&gt; ExportResult</w:t>
+      </w:r>
+      <w:r>
+        <w:t xml:space="preserve">. The orchestrator opens the SQLite via</w:t>
+      </w:r>
+      <w:r>
+        <w:t xml:space="preserve"> </w:t>
+      </w:r>
+      <w:r>
+        <w:t xml:space="preserve">SQLAlchemy, constructs</w:t>
+      </w:r>
+      <w:r>
+        <w:t xml:space="preserve"> </w:t>
+      </w:r>
+      <w:r>
+        <w:rPr>
+          <w:rStyle w:val="VerbatimChar"/>
+        </w:rPr>
+        <w:t xml:space="preserve">PyArchInitImporter(connection_url=..., mapping_name="pyarchinit_us_mapping", overwrite=True)</w:t>
+      </w:r>
+      <w:r>
+        <w:t xml:space="preserve">, populates</w:t>
+      </w:r>
+      <w:r>
+        <w:t xml:space="preserve"> </w:t>
+      </w:r>
+      <w:r>
+        <w:t xml:space="preserve">the in-memory graph, and then runs an internal helper</w:t>
+      </w:r>
+      <w:r>
+        <w:t xml:space="preserve"> </w:t>
+      </w:r>
+      <w:r>
+        <w:rPr>
+          <w:rStyle w:val="VerbatimChar"/>
+        </w:rPr>
+        <w:t xml:space="preserve">_enrich_pyarchinit_graph()</w:t>
+      </w:r>
+      <w:r>
+        <w:t xml:space="preserve"> </w:t>
+      </w:r>
+      <w:r>
+        <w:t xml:space="preserve">which adds the artefacts that the</w:t>
+      </w:r>
+      <w:r>
+        <w:t xml:space="preserve"> </w:t>
+      </w:r>
+      <w:r>
+        <w:t xml:space="preserve">importer does not produce on its own:</w:t>
+      </w:r>
+      <w:r>
+        <w:t xml:space="preserve"> </w:t>
+      </w:r>
+      <w:r>
+        <w:rPr>
+          <w:rStyle w:val="VerbatimChar"/>
+        </w:rPr>
+        <w:t xml:space="preserve">EpochNode</w:t>
+      </w:r>
+      <w:r>
+        <w:t xml:space="preserve">s built from</w:t>
+      </w:r>
+      <w:r>
+        <w:t xml:space="preserve"> </w:t>
+      </w:r>
+      <w:r>
+        <w:rPr>
+          <w:rStyle w:val="VerbatimChar"/>
+        </w:rPr>
+        <w:t xml:space="preserve">periodizzazione_table</w:t>
+      </w:r>
+      <w:r>
+        <w:t xml:space="preserve">,</w:t>
+      </w:r>
+      <w:r>
+        <w:t xml:space="preserve"> </w:t>
+      </w:r>
+      <w:r>
+        <w:rPr>
+          <w:rStyle w:val="VerbatimChar"/>
+        </w:rPr>
+        <w:t xml:space="preserve">has_first_epoch</w:t>
+      </w:r>
+      <w:r>
+        <w:t xml:space="preserve"> </w:t>
+      </w:r>
+      <w:r>
+        <w:t xml:space="preserve">edges from each US to its</w:t>
+      </w:r>
+      <w:r>
+        <w:t xml:space="preserve"> </w:t>
+      </w:r>
+      <w:r>
+        <w:t xml:space="preserve">period, and topological</w:t>
+      </w:r>
+      <w:r>
+        <w:t xml:space="preserve"> </w:t>
+      </w:r>
+      <w:r>
+        <w:rPr>
+          <w:rStyle w:val="VerbatimChar"/>
+        </w:rPr>
+        <w:t xml:space="preserve">is_before</w:t>
+      </w:r>
+      <w:r>
+        <w:t xml:space="preserve"> </w:t>
+      </w:r>
+      <w:r>
+        <w:t xml:space="preserve">edges parsed from</w:t>
+      </w:r>
+      <w:r>
+        <w:t xml:space="preserve"> </w:t>
+      </w:r>
+      <w:r>
+        <w:rPr>
+          <w:rStyle w:val="VerbatimChar"/>
+        </w:rPr>
+        <w:t xml:space="preserve">us_table.rapporti</w:t>
+      </w:r>
+      <w:r>
+        <w:t xml:space="preserve">. With the graph fully decorated, the orchestrator</w:t>
+      </w:r>
+      <w:r>
+        <w:t xml:space="preserve"> </w:t>
+      </w:r>
+      <w:r>
+        <w:t xml:space="preserve">calls</w:t>
+      </w:r>
+      <w:r>
+        <w:t xml:space="preserve"> </w:t>
+      </w:r>
+      <w:r>
+        <w:rPr>
+          <w:rStyle w:val="VerbatimChar"/>
+        </w:rPr>
+        <w:t xml:space="preserve">GraphMLExporter(graph, output_path).export()</w:t>
+      </w:r>
+      <w:r>
+        <w:t xml:space="preserve"> </w:t>
+      </w:r>
+      <w:r>
+        <w:t xml:space="preserve">(which performs</w:t>
+      </w:r>
+      <w:r>
+        <w:t xml:space="preserve"> </w:t>
+      </w:r>
+      <w:r>
+        <w:t xml:space="preserve">its own transitive reduction) and returns an</w:t>
+      </w:r>
+      <w:r>
+        <w:t xml:space="preserve"> </w:t>
+      </w:r>
+      <w:r>
+        <w:rPr>
+          <w:rStyle w:val="VerbatimChar"/>
+        </w:rPr>
+        <w:t xml:space="preserve">ExportResult</w:t>
+      </w:r>
+      <w:r>
+        <w:t xml:space="preserve"> </w:t>
+      </w:r>
+      <w:r>
+        <w:t xml:space="preserve">carrying</w:t>
+      </w:r>
+      <w:r>
+        <w:t xml:space="preserve"> </w:t>
+      </w:r>
+      <w:r>
+        <w:rPr>
+          <w:rStyle w:val="VerbatimChar"/>
+        </w:rPr>
+        <w:t xml:space="preserve">node_count</w:t>
+      </w:r>
+      <w:r>
+        <w:t xml:space="preserve">,</w:t>
+      </w:r>
+      <w:r>
+        <w:t xml:space="preserve"> </w:t>
+      </w:r>
+      <w:r>
+        <w:rPr>
+          <w:rStyle w:val="VerbatimChar"/>
+        </w:rPr>
+        <w:t xml:space="preserve">edge_count</w:t>
+      </w:r>
+      <w:r>
+        <w:t xml:space="preserve">,</w:t>
+      </w:r>
+      <w:r>
+        <w:t xml:space="preserve"> </w:t>
+      </w:r>
+      <w:r>
+        <w:rPr>
+          <w:rStyle w:val="VerbatimChar"/>
+        </w:rPr>
+        <w:t xml:space="preserve">epoch_count</w:t>
+      </w:r>
+      <w:r>
+        <w:t xml:space="preserve">,</w:t>
+      </w:r>
+      <w:r>
+        <w:t xml:space="preserve"> </w:t>
+      </w:r>
+      <w:r>
+        <w:rPr>
+          <w:rStyle w:val="VerbatimChar"/>
+        </w:rPr>
+        <w:t xml:space="preserve">tred_removed_edges</w:t>
+      </w:r>
+      <w:r>
+        <w:t xml:space="preserve"> </w:t>
+      </w:r>
+      <w:r>
+        <w:t xml:space="preserve">and</w:t>
+      </w:r>
+      <w:r>
+        <w:t xml:space="preserve"> </w:t>
+      </w:r>
+      <w:r>
+        <w:t xml:space="preserve">the optional warnings list.</w:t>
+      </w:r>
+      <w:r>
+        <w:t xml:space="preserve"> </w:t>
+      </w:r>
+      <w:r>
+        <w:rPr>
+          <w:rStyle w:val="VerbatimChar"/>
+        </w:rPr>
+        <w:t xml:space="preserve">tred_removed_edges</w:t>
+      </w:r>
+      <w:r>
+        <w:t xml:space="preserve"> </w:t>
+      </w:r>
+      <w:r>
+        <w:t xml:space="preserve">is computed</w:t>
+      </w:r>
+      <w:r>
+        <w:t xml:space="preserve"> </w:t>
+      </w:r>
+      <w:r>
+        <w:t xml:space="preserve">arithmetically as</w:t>
+      </w:r>
+      <w:r>
+        <w:t xml:space="preserve"> </w:t>
+      </w:r>
+      <w:r>
+        <w:rPr>
+          <w:rStyle w:val="VerbatimChar"/>
+        </w:rPr>
+        <w:t xml:space="preserve">pre_edges - post_edges</w:t>
+      </w:r>
+      <w:r>
+        <w:t xml:space="preserve"> </w:t>
+      </w:r>
+      <w:r>
+        <w:t xml:space="preserve">rather than parsed from</w:t>
+      </w:r>
+      <w:r>
+        <w:t xml:space="preserve"> </w:t>
+      </w:r>
+      <w:r>
+        <w:t xml:space="preserve">the GraphML output: this avoids a fragile regex over the exporter’s</w:t>
+      </w:r>
+      <w:r>
+        <w:t xml:space="preserve"> </w:t>
+      </w:r>
+      <w:r>
+        <w:t xml:space="preserve">implementation details. The mapping name is</w:t>
+      </w:r>
+      <w:r>
+        <w:t xml:space="preserve"> </w:t>
+      </w:r>
+      <w:r>
+        <w:rPr>
+          <w:rStyle w:val="VerbatimChar"/>
+        </w:rPr>
+        <w:t xml:space="preserve">pyarchinit_us_mapping</w:t>
+      </w:r>
+      <w:r>
+        <w:t xml:space="preserve"> </w:t>
+      </w:r>
+      <w:r>
+        <w:t xml:space="preserve">(the implementation plan’s earlier</w:t>
+      </w:r>
+      <w:r>
+        <w:t xml:space="preserve"> </w:t>
+      </w:r>
+      <w:r>
+        <w:rPr>
+          <w:rStyle w:val="VerbatimChar"/>
+        </w:rPr>
+        <w:t xml:space="preserve">pyarchinit</w:t>
+      </w:r>
+      <w:r>
+        <w:t xml:space="preserve"> </w:t>
+      </w:r>
+      <w:r>
+        <w:t xml:space="preserve">was wrong — it does</w:t>
+      </w:r>
+      <w:r>
+        <w:t xml:space="preserve"> </w:t>
+      </w:r>
+      <w:r>
+        <w:t xml:space="preserve">not match the JSON file shipped with s3Dgraphy 0.1.40).</w:t>
+      </w:r>
+    </w:p>
+    <w:p>
+      <w:pPr>
+        <w:pStyle w:val="BodyText"/>
+      </w:pPr>
+      <w:r>
+        <w:t xml:space="preserve">The bridge cut-over was performed in five per-file commits so any</w:t>
+      </w:r>
+      <w:r>
+        <w:t xml:space="preserve"> </w:t>
+      </w:r>
+      <w:r>
+        <w:t xml:space="preserve">single step is easy to revert.</w:t>
+      </w:r>
+      <w:r>
+        <w:t xml:space="preserve"> </w:t>
+      </w:r>
+      <w:r>
+        <w:rPr>
+          <w:rStyle w:val="VerbatimChar"/>
+        </w:rPr>
+        <w:t xml:space="preserve">s3dgraphy_dot_bridge.py</w:t>
+      </w:r>
+      <w:r>
+        <w:t xml:space="preserve"> </w:t>
+      </w:r>
+      <w:r>
+        <w:t xml:space="preserve">had its</w:t>
+      </w:r>
+      <w:r>
+        <w:t xml:space="preserve"> </w:t>
+      </w:r>
+      <w:r>
+        <w:rPr>
+          <w:rStyle w:val="VerbatimChar"/>
+        </w:rPr>
+        <w:t xml:space="preserve">_convert_dot_to_graphml()</w:t>
+      </w:r>
+      <w:r>
+        <w:t xml:space="preserve"> </w:t>
+      </w:r>
+      <w:r>
+        <w:t xml:space="preserve">private function and its</w:t>
+      </w:r>
+      <w:r>
+        <w:t xml:space="preserve"> </w:t>
+      </w:r>
+      <w:r>
+        <w:rPr>
+          <w:rStyle w:val="VerbatimChar"/>
+        </w:rPr>
+        <w:t xml:space="preserve">dottoxml</w:t>
+      </w:r>
+      <w:r>
+        <w:t xml:space="preserve"> </w:t>
+      </w:r>
+      <w:r>
+        <w:t xml:space="preserve">import removed, and its dispatcher now calls the new orchestrator</w:t>
+      </w:r>
+      <w:r>
+        <w:t xml:space="preserve"> </w:t>
+      </w:r>
+      <w:r>
+        <w:t xml:space="preserve">when the requested format is GraphML; the DOT branch is left</w:t>
+      </w:r>
+      <w:r>
+        <w:t xml:space="preserve"> </w:t>
+      </w:r>
+      <w:r>
+        <w:t xml:space="preserve">untouched because Harris-matrix exporters still rely on it.</w:t>
+      </w:r>
+      <w:r>
+        <w:t xml:space="preserve"> </w:t>
+      </w:r>
+      <w:r>
+        <w:rPr>
+          <w:rStyle w:val="VerbatimChar"/>
+        </w:rPr>
+        <w:t xml:space="preserve">graphml_spatial_enhancer.py</w:t>
+      </w:r>
+      <w:r>
+        <w:t xml:space="preserve"> </w:t>
+      </w:r>
+      <w:r>
+        <w:t xml:space="preserve">was deleted in full — it was a</w:t>
+      </w:r>
+      <w:r>
+        <w:t xml:space="preserve"> </w:t>
+      </w:r>
+      <w:r>
+        <w:t xml:space="preserve">post-processor that nested nodes inside</w:t>
+      </w:r>
+      <w:r>
+        <w:t xml:space="preserve"> </w:t>
+      </w:r>
+      <w:r>
+        <w:rPr>
+          <w:rStyle w:val="VerbatimChar"/>
+        </w:rPr>
+        <w:t xml:space="preserve">y:ProxyAutoBoundsNode</w:t>
+      </w:r>
+      <w:r>
+        <w:t xml:space="preserve"> </w:t>
+      </w:r>
+      <w:r>
+        <w:t xml:space="preserve">subgraphs after the GraphML had already been written, and</w:t>
+      </w:r>
+      <w:r>
+        <w:t xml:space="preserve"> </w:t>
+      </w:r>
+      <w:r>
+        <w:rPr>
+          <w:rStyle w:val="VerbatimChar"/>
+        </w:rPr>
+        <w:t xml:space="preserve">GraphMLExporter</w:t>
+      </w:r>
+      <w:r>
+        <w:t xml:space="preserve"> </w:t>
+      </w:r>
+      <w:r>
+        <w:t xml:space="preserve">emits those swimlanes natively.</w:t>
+      </w:r>
+      <w:r>
+        <w:t xml:space="preserve"> </w:t>
+      </w:r>
+      <w:r>
+        <w:rPr>
+          <w:rStyle w:val="VerbatimChar"/>
+        </w:rPr>
+        <w:t xml:space="preserve">spatial_grouping_manager.py</w:t>
+      </w:r>
+      <w:r>
+        <w:t xml:space="preserve"> </w:t>
+      </w:r>
+      <w:r>
+        <w:t xml:space="preserve">lost both its</w:t>
+      </w:r>
+      <w:r>
+        <w:t xml:space="preserve"> </w:t>
+      </w:r>
+      <w:r>
+        <w:rPr>
+          <w:rStyle w:val="VerbatimChar"/>
+        </w:rPr>
+        <w:t xml:space="preserve">apply_grouping_to_dot()</w:t>
+      </w:r>
+      <w:r>
+        <w:t xml:space="preserve"> </w:t>
+      </w:r>
+      <w:r>
+        <w:t xml:space="preserve">function and the</w:t>
+      </w:r>
+      <w:r>
+        <w:t xml:space="preserve"> </w:t>
+      </w:r>
+      <w:r>
+        <w:rPr>
+          <w:rStyle w:val="VerbatimChar"/>
+        </w:rPr>
+        <w:t xml:space="preserve">SpatialGroupingDialog</w:t>
+      </w:r>
+      <w:r>
+        <w:t xml:space="preserve"> </w:t>
+      </w:r>
+      <w:r>
+        <w:t xml:space="preserve">Qt class (the latter was tied to the old DOT</w:t>
+      </w:r>
+      <w:r>
+        <w:t xml:space="preserve"> </w:t>
+      </w:r>
+      <w:r>
+        <w:t xml:space="preserve">pipeline); the module now keeps only the grouping data structures</w:t>
+      </w:r>
+      <w:r>
+        <w:t xml:space="preserve"> </w:t>
+      </w:r>
+      <w:r>
+        <w:t xml:space="preserve">that are still consulted elsewhere.</w:t>
+      </w:r>
+      <w:r>
+        <w:t xml:space="preserve"> </w:t>
+      </w:r>
+      <w:r>
+        <w:rPr>
+          <w:rStyle w:val="VerbatimChar"/>
+        </w:rPr>
+        <w:t xml:space="preserve">S3DGraphyExportDialog</w:t>
+      </w:r>
+      <w:r>
+        <w:t xml:space="preserve"> </w:t>
+      </w:r>
+      <w:r>
+        <w:t xml:space="preserve">lost the</w:t>
+      </w:r>
+      <w:r>
+        <w:t xml:space="preserve"> </w:t>
+      </w:r>
+      <w:r>
+        <w:rPr>
+          <w:rStyle w:val="VerbatimChar"/>
+        </w:rPr>
+        <w:t xml:space="preserve">cb_spatial_grouping</w:t>
+      </w:r>
+      <w:r>
+        <w:t xml:space="preserve"> </w:t>
+      </w:r>
+      <w:r>
+        <w:t xml:space="preserve">checkbox plus all the code that read it, since</w:t>
+      </w:r>
+      <w:r>
+        <w:t xml:space="preserve"> </w:t>
+      </w:r>
+      <w:r>
+        <w:t xml:space="preserve">spatial grouping is now driven by the s3Dgraphy exporter without a</w:t>
+      </w:r>
+      <w:r>
+        <w:t xml:space="preserve"> </w:t>
+      </w:r>
+      <w:r>
+        <w:t xml:space="preserve">user toggle. Finally,</w:t>
+      </w:r>
+      <w:r>
+        <w:t xml:space="preserve"> </w:t>
+      </w:r>
+      <w:r>
+        <w:rPr>
+          <w:rStyle w:val="VerbatimChar"/>
+        </w:rPr>
+        <w:t xml:space="preserve">resources/dbfiles/dot.py</w:t>
+      </w:r>
+      <w:r>
+        <w:t xml:space="preserve"> </w:t>
+      </w:r>
+      <w:r>
+        <w:t xml:space="preserve">and</w:t>
+      </w:r>
+      <w:r>
+        <w:t xml:space="preserve"> </w:t>
+      </w:r>
+      <w:r>
+        <w:rPr>
+          <w:rStyle w:val="VerbatimChar"/>
+        </w:rPr>
+        <w:t xml:space="preserve">dottoxml.py</w:t>
+      </w:r>
+      <w:r>
+        <w:t xml:space="preserve"> </w:t>
+      </w:r>
+      <w:r>
+        <w:t xml:space="preserve">were intentionally left in place: the legacy Harris-matrix exporters</w:t>
+      </w:r>
+      <w:r>
+        <w:t xml:space="preserve"> </w:t>
+      </w:r>
+      <w:r>
+        <w:t xml:space="preserve">still consume them and they are out of AI03 scope (revisit in AI04).</w:t>
+      </w:r>
+    </w:p>
+    <w:p>
+      <w:pPr>
+        <w:pStyle w:val="BodyText"/>
+      </w:pPr>
+      <w:r>
+        <w:t xml:space="preserve">The</w:t>
+      </w:r>
+      <w:r>
+        <w:t xml:space="preserve"> </w:t>
+      </w:r>
+      <w:r>
+        <w:rPr>
+          <w:rStyle w:val="VerbatimChar"/>
+        </w:rPr>
+        <w:t xml:space="preserve">pyarchinit_db_manager</w:t>
+      </w:r>
+      <w:r>
+        <w:t xml:space="preserve"> </w:t>
+      </w:r>
+      <w:r>
+        <w:t xml:space="preserve">module gained a new</w:t>
+      </w:r>
+      <w:r>
+        <w:t xml:space="preserve"> </w:t>
+      </w:r>
+      <w:r>
+        <w:rPr>
+          <w:rStyle w:val="VerbatimChar"/>
+        </w:rPr>
+        <w:t xml:space="preserve">get_sqlite_path()</w:t>
+      </w:r>
+      <w:r>
+        <w:t xml:space="preserve"> </w:t>
+      </w:r>
+      <w:r>
+        <w:t xml:space="preserve">method that returns the absolute path of the SpatiaLite file when</w:t>
+      </w:r>
+      <w:r>
+        <w:t xml:space="preserve"> </w:t>
+      </w:r>
+      <w:r>
+        <w:t xml:space="preserve">the active backend is SQLite, and</w:t>
+      </w:r>
+      <w:r>
+        <w:t xml:space="preserve"> </w:t>
+      </w:r>
+      <w:r>
+        <w:rPr>
+          <w:rStyle w:val="VerbatimChar"/>
+        </w:rPr>
+        <w:t xml:space="preserve">None</w:t>
+      </w:r>
+      <w:r>
+        <w:t xml:space="preserve"> </w:t>
+      </w:r>
+      <w:r>
+        <w:t xml:space="preserve">otherwise (PostgreSQL,</w:t>
+      </w:r>
+      <w:r>
+        <w:t xml:space="preserve"> </w:t>
+      </w:r>
+      <w:r>
+        <w:t xml:space="preserve">unconfigured manager). The bridge consults this signal before</w:t>
+      </w:r>
+      <w:r>
+        <w:t xml:space="preserve"> </w:t>
+      </w:r>
+      <w:r>
+        <w:t xml:space="preserve">invoking the orchestrator and skips the GraphML branch with an Info</w:t>
+      </w:r>
+      <w:r>
+        <w:t xml:space="preserve"> </w:t>
+      </w:r>
+      <w:r>
+        <w:t xml:space="preserve">dialog (</w:t>
+      </w:r>
+      <w:r>
+        <w:t xml:space="preserve">“PostgreSQL backend will be supported in AI04”</w:t>
+      </w:r>
+      <w:r>
+        <w:t xml:space="preserve">) when the</w:t>
+      </w:r>
+      <w:r>
+        <w:t xml:space="preserve"> </w:t>
+      </w:r>
+      <w:r>
+        <w:t xml:space="preserve">project is wired to PostgreSQL/PostGIS. This is the agreed graceful</w:t>
+      </w:r>
+      <w:r>
+        <w:t xml:space="preserve"> </w:t>
+      </w:r>
+      <w:r>
+        <w:t xml:space="preserve">degradation for AI03 —</w:t>
+      </w:r>
+      <w:r>
+        <w:t xml:space="preserve"> </w:t>
+      </w:r>
+      <w:r>
+        <w:rPr>
+          <w:rStyle w:val="VerbatimChar"/>
+        </w:rPr>
+        <w:t xml:space="preserve">PyArchInitImporter</w:t>
+      </w:r>
+      <w:r>
+        <w:t xml:space="preserve"> </w:t>
+      </w:r>
+      <w:r>
+        <w:t xml:space="preserve">accepts only a SQLite</w:t>
+      </w:r>
+      <w:r>
+        <w:t xml:space="preserve"> </w:t>
+      </w:r>
+      <w:r>
+        <w:rPr>
+          <w:rStyle w:val="VerbatimChar"/>
+        </w:rPr>
+        <w:t xml:space="preserve">connection_url</w:t>
+      </w:r>
+      <w:r>
+        <w:t xml:space="preserve"> </w:t>
+      </w:r>
+      <w:r>
+        <w:t xml:space="preserve">today, and AI04 will widen its surface.</w:t>
+      </w:r>
+    </w:p>
+    <w:p>
+      <w:pPr>
+        <w:pStyle w:val="BodyText"/>
+      </w:pPr>
+      <w:r>
+        <w:t xml:space="preserve">The export dialog summary was rewritten to surface the per-format</w:t>
+      </w:r>
+      <w:r>
+        <w:t xml:space="preserve"> </w:t>
+      </w:r>
+      <w:r>
+        <w:t xml:space="preserve">metrics returned by the new orchestrator. After every Extended</w:t>
+      </w:r>
+      <w:r>
+        <w:t xml:space="preserve"> </w:t>
+      </w:r>
+      <w:r>
+        <w:t xml:space="preserve">Matrix export, the user now sees, for each emitted format</w:t>
+      </w:r>
+      <w:r>
+        <w:t xml:space="preserve"> </w:t>
+      </w:r>
+      <w:r>
+        <w:t xml:space="preserve">(GraphML/DOT/JSON), the node, edge and epoch counts, the number of</w:t>
+      </w:r>
+      <w:r>
+        <w:t xml:space="preserve"> </w:t>
+      </w:r>
+      <w:r>
+        <w:t xml:space="preserve">transitive edges removed, and any warnings (e.g. a notice when</w:t>
+      </w:r>
+      <w:r>
+        <w:t xml:space="preserve"> </w:t>
+      </w:r>
+      <w:r>
+        <w:rPr>
+          <w:rStyle w:val="VerbatimChar"/>
+        </w:rPr>
+        <w:t xml:space="preserve">periodizzazione_table</w:t>
+      </w:r>
+      <w:r>
+        <w:t xml:space="preserve"> </w:t>
+      </w:r>
+      <w:r>
+        <w:t xml:space="preserve">is empty and</w:t>
+      </w:r>
+      <w:r>
+        <w:t xml:space="preserve"> </w:t>
+      </w:r>
+      <w:r>
+        <w:rPr>
+          <w:rStyle w:val="VerbatimChar"/>
+        </w:rPr>
+        <w:t xml:space="preserve">epoch_count</w:t>
+      </w:r>
+      <w:r>
+        <w:t xml:space="preserve"> </w:t>
+      </w:r>
+      <w:r>
+        <w:t xml:space="preserve">falls back to</w:t>
+      </w:r>
+      <w:r>
+        <w:t xml:space="preserve"> </w:t>
+      </w:r>
+      <w:r>
+        <w:t xml:space="preserve">zero). This replaces the pre-AI03 binary</w:t>
+      </w:r>
+      <w:r>
+        <w:t xml:space="preserve"> </w:t>
+      </w:r>
+      <w:r>
+        <w:t xml:space="preserve">“Export completed”</w:t>
+      </w:r>
+      <w:r>
+        <w:t xml:space="preserve"> </w:t>
+      </w:r>
+      <w:r>
+        <w:t xml:space="preserve">message.</w:t>
+      </w:r>
+    </w:p>
+    <w:bookmarkEnd w:id="58"/>
+    <w:bookmarkStart w:id="59" w:name="what-was-tested-7"/>
+    <w:p>
+      <w:pPr>
+        <w:pStyle w:val="Heading2"/>
+      </w:pPr>
+      <w:r>
+        <w:t xml:space="preserve">What was tested</w:t>
+      </w:r>
+    </w:p>
+    <w:p>
+      <w:pPr>
+        <w:pStyle w:val="FirstParagraph"/>
+      </w:pPr>
+      <w:r>
+        <w:t xml:space="preserve">The test suite under</w:t>
+      </w:r>
+      <w:r>
+        <w:t xml:space="preserve"> </w:t>
+      </w:r>
+      <w:r>
+        <w:rPr>
+          <w:rStyle w:val="VerbatimChar"/>
+        </w:rPr>
+        <w:t xml:space="preserve">tests/sync/</w:t>
+      </w:r>
+      <w:r>
+        <w:t xml:space="preserve"> </w:t>
+      </w:r>
+      <w:r>
+        <w:t xml:space="preserve">grew by 16 tests (total: 59</w:t>
+      </w:r>
+      <w:r>
+        <w:t xml:space="preserve"> </w:t>
+      </w:r>
+      <w:r>
+        <w:t xml:space="preserve">passing). Three of them are unit tests on the pure helpers</w:t>
+      </w:r>
+      <w:r>
+        <w:t xml:space="preserve"> </w:t>
+      </w:r>
+      <w:r>
+        <w:t xml:space="preserve">(</w:t>
+      </w:r>
+      <w:r>
+        <w:rPr>
+          <w:rStyle w:val="VerbatimChar"/>
+        </w:rPr>
+        <w:t xml:space="preserve">build_pyarchinit_mapping</w:t>
+      </w:r>
+      <w:r>
+        <w:t xml:space="preserve">,</w:t>
+      </w:r>
+      <w:r>
+        <w:t xml:space="preserve"> </w:t>
+      </w:r>
+      <w:r>
+        <w:rPr>
+          <w:rStyle w:val="VerbatimChar"/>
+        </w:rPr>
+        <w:t xml:space="preserve">count_epoch_nodes</w:t>
+      </w:r>
+      <w:r>
+        <w:t xml:space="preserve">,</w:t>
+      </w:r>
+      <w:r>
+        <w:t xml:space="preserve"> </w:t>
+      </w:r>
+      <w:r>
+        <w:rPr>
+          <w:rStyle w:val="VerbatimChar"/>
+        </w:rPr>
+        <w:t xml:space="preserve">count_topological_edges</w:t>
+      </w:r>
+      <w:r>
+        <w:t xml:space="preserve">). Four exercise the end-to-end orchestrator</w:t>
+      </w:r>
+      <w:r>
+        <w:t xml:space="preserve"> </w:t>
+      </w:r>
+      <w:r>
+        <w:t xml:space="preserve">against a deterministic fixture,</w:t>
+      </w:r>
+      <w:r>
+        <w:t xml:space="preserve"> </w:t>
+      </w:r>
+      <w:r>
+        <w:rPr>
+          <w:rStyle w:val="VerbatimChar"/>
+        </w:rPr>
+        <w:t xml:space="preserve">tests/sync/fixtures/mini_volterra.sqlite</w:t>
+      </w:r>
+      <w:r>
+        <w:t xml:space="preserve">,</w:t>
+      </w:r>
+      <w:r>
+        <w:t xml:space="preserve"> </w:t>
+      </w:r>
+      <w:r>
+        <w:t xml:space="preserve">and are mapped one-to-one to the four Extended Matrix limitations:</w:t>
+      </w:r>
+      <w:r>
+        <w:t xml:space="preserve"> </w:t>
+      </w:r>
+      <w:r>
+        <w:t xml:space="preserve">the GraphML output is non-empty when grouping is active, period</w:t>
+      </w:r>
+      <w:r>
+        <w:t xml:space="preserve"> </w:t>
+      </w:r>
+      <w:r>
+        <w:t xml:space="preserve">swimlanes are present in the output,</w:t>
+      </w:r>
+      <w:r>
+        <w:t xml:space="preserve"> </w:t>
+      </w:r>
+      <w:r>
+        <w:rPr>
+          <w:rStyle w:val="VerbatimChar"/>
+        </w:rPr>
+        <w:t xml:space="preserve">is_before</w:t>
+      </w:r>
+      <w:r>
+        <w:t xml:space="preserve"> </w:t>
+      </w:r>
+      <w:r>
+        <w:t xml:space="preserve">edges carry their</w:t>
+      </w:r>
+      <w:r>
+        <w:t xml:space="preserve"> </w:t>
+      </w:r>
+      <w:r>
+        <w:t xml:space="preserve">intended y:Edge styling, and</w:t>
+      </w:r>
+      <w:r>
+        <w:t xml:space="preserve"> </w:t>
+      </w:r>
+      <w:r>
+        <w:rPr>
+          <w:rStyle w:val="VerbatimChar"/>
+        </w:rPr>
+        <w:t xml:space="preserve">tred_removed_edges</w:t>
+      </w:r>
+      <w:r>
+        <w:t xml:space="preserve"> </w:t>
+      </w:r>
+      <w:r>
+        <w:t xml:space="preserve">is greater than</w:t>
+      </w:r>
+      <w:r>
+        <w:t xml:space="preserve"> </w:t>
+      </w:r>
+      <w:r>
+        <w:t xml:space="preserve">zero on a graph that contains a redundant transitive edge. Four more</w:t>
+      </w:r>
+      <w:r>
+        <w:t xml:space="preserve"> </w:t>
+      </w:r>
+      <w:r>
+        <w:t xml:space="preserve">tests cover</w:t>
+      </w:r>
+      <w:r>
+        <w:t xml:space="preserve"> </w:t>
+      </w:r>
+      <w:r>
+        <w:rPr>
+          <w:rStyle w:val="VerbatimChar"/>
+        </w:rPr>
+        <w:t xml:space="preserve">db_manager.get_sqlite_path()</w:t>
+      </w:r>
+      <w:r>
+        <w:t xml:space="preserve"> </w:t>
+      </w:r>
+      <w:r>
+        <w:t xml:space="preserve">(valid SQLite path,</w:t>
+      </w:r>
+      <w:r>
+        <w:t xml:space="preserve"> </w:t>
+      </w:r>
+      <w:r>
+        <w:t xml:space="preserve">missing SQLite path, PostgreSQL →</w:t>
+      </w:r>
+      <w:r>
+        <w:t xml:space="preserve"> </w:t>
+      </w:r>
+      <w:r>
+        <w:rPr>
+          <w:rStyle w:val="VerbatimChar"/>
+        </w:rPr>
+        <w:t xml:space="preserve">None</w:t>
+      </w:r>
+      <w:r>
+        <w:t xml:space="preserve">, uninitialized manager →</w:t>
+      </w:r>
+      <w:r>
+        <w:t xml:space="preserve"> </w:t>
+      </w:r>
+      <w:r>
+        <w:rPr>
+          <w:rStyle w:val="VerbatimChar"/>
+        </w:rPr>
+        <w:t xml:space="preserve">None</w:t>
+      </w:r>
+      <w:r>
+        <w:t xml:space="preserve">), and five pre-existing exception-helper tests round out the</w:t>
+      </w:r>
+      <w:r>
+        <w:t xml:space="preserve"> </w:t>
+      </w:r>
+      <w:r>
+        <w:t xml:space="preserve">file.</w:t>
+      </w:r>
+    </w:p>
+    <w:p>
+      <w:pPr>
+        <w:pStyle w:val="BodyText"/>
+      </w:pPr>
+      <w:r>
+        <w:t xml:space="preserve">The fixture itself,</w:t>
+      </w:r>
+      <w:r>
+        <w:t xml:space="preserve"> </w:t>
+      </w:r>
+      <w:r>
+        <w:rPr>
+          <w:rStyle w:val="VerbatimChar"/>
+        </w:rPr>
+        <w:t xml:space="preserve">mini_volterra.sqlite</w:t>
+      </w:r>
+      <w:r>
+        <w:t xml:space="preserve">, contains six US records</w:t>
+      </w:r>
+      <w:r>
+        <w:t xml:space="preserve"> </w:t>
+      </w:r>
+      <w:r>
+        <w:t xml:space="preserve">with cross-cutting</w:t>
+      </w:r>
+      <w:r>
+        <w:t xml:space="preserve"> </w:t>
+      </w:r>
+      <w:r>
+        <w:rPr>
+          <w:rStyle w:val="VerbatimChar"/>
+        </w:rPr>
+        <w:t xml:space="preserve">rapporti</w:t>
+      </w:r>
+      <w:r>
+        <w:t xml:space="preserve"> </w:t>
+      </w:r>
+      <w:r>
+        <w:t xml:space="preserve">(so the transitive-reduction case is</w:t>
+      </w:r>
+      <w:r>
+        <w:t xml:space="preserve"> </w:t>
+      </w:r>
+      <w:r>
+        <w:t xml:space="preserve">non-trivial), three rows in</w:t>
+      </w:r>
+      <w:r>
+        <w:t xml:space="preserve"> </w:t>
+      </w:r>
+      <w:r>
+        <w:rPr>
+          <w:rStyle w:val="VerbatimChar"/>
+        </w:rPr>
+        <w:t xml:space="preserve">periodizzazione_table</w:t>
+      </w:r>
+      <w:r>
+        <w:t xml:space="preserve">, and a</w:t>
+      </w:r>
+      <w:r>
+        <w:t xml:space="preserve"> </w:t>
+      </w:r>
+      <w:r>
+        <w:t xml:space="preserve">simplified geometry layer. It is committed as a binary blob so the</w:t>
+      </w:r>
+      <w:r>
+        <w:t xml:space="preserve"> </w:t>
+      </w:r>
+      <w:r>
+        <w:t xml:space="preserve">suite runs reproducibly without depending on production DBs. The</w:t>
+      </w:r>
+      <w:r>
+        <w:t xml:space="preserve"> </w:t>
+      </w:r>
+      <w:r>
+        <w:rPr>
+          <w:rStyle w:val="VerbatimChar"/>
+        </w:rPr>
+        <w:t xml:space="preserve">_enrich_pyarchinit_graph()</w:t>
+      </w:r>
+      <w:r>
+        <w:t xml:space="preserve"> </w:t>
+      </w:r>
+      <w:r>
+        <w:t xml:space="preserve">helper inside the orchestrator is the</w:t>
+      </w:r>
+      <w:r>
+        <w:t xml:space="preserve"> </w:t>
+      </w:r>
+      <w:r>
+        <w:t xml:space="preserve">deliberate workaround for a Phase-1 finding:</w:t>
+      </w:r>
+      <w:r>
+        <w:t xml:space="preserve"> </w:t>
+      </w:r>
+      <w:r>
+        <w:rPr>
+          <w:rStyle w:val="VerbatimChar"/>
+        </w:rPr>
+        <w:t xml:space="preserve">PyArchInitImporter</w:t>
+      </w:r>
+      <w:r>
+        <w:t xml:space="preserve"> </w:t>
+      </w:r>
+      <w:r>
+        <w:t xml:space="preserve">alone does not emit</w:t>
+      </w:r>
+      <w:r>
+        <w:t xml:space="preserve"> </w:t>
+      </w:r>
+      <w:r>
+        <w:rPr>
+          <w:rStyle w:val="VerbatimChar"/>
+        </w:rPr>
+        <w:t xml:space="preserve">EpochNode</w:t>
+      </w:r>
+      <w:r>
+        <w:t xml:space="preserve">s,</w:t>
+      </w:r>
+      <w:r>
+        <w:t xml:space="preserve"> </w:t>
+      </w:r>
+      <w:r>
+        <w:rPr>
+          <w:rStyle w:val="VerbatimChar"/>
+        </w:rPr>
+        <w:t xml:space="preserve">has_first_epoch</w:t>
+      </w:r>
+      <w:r>
+        <w:t xml:space="preserve"> </w:t>
+      </w:r>
+      <w:r>
+        <w:t xml:space="preserve">edges or</w:t>
+      </w:r>
+      <w:r>
+        <w:t xml:space="preserve"> </w:t>
+      </w:r>
+      <w:r>
+        <w:t xml:space="preserve">topological</w:t>
+      </w:r>
+      <w:r>
+        <w:t xml:space="preserve"> </w:t>
+      </w:r>
+      <w:r>
+        <w:rPr>
+          <w:rStyle w:val="VerbatimChar"/>
+        </w:rPr>
+        <w:t xml:space="preserve">is_before</w:t>
+      </w:r>
+      <w:r>
+        <w:t xml:space="preserve"> </w:t>
+      </w:r>
+      <w:r>
+        <w:t xml:space="preserve">edges. The orchestrator therefore enriches</w:t>
+      </w:r>
+      <w:r>
+        <w:t xml:space="preserve"> </w:t>
+      </w:r>
+      <w:r>
+        <w:t xml:space="preserve">the graph before handing it to the exporter; the four pipeline tests</w:t>
+      </w:r>
+      <w:r>
+        <w:t xml:space="preserve"> </w:t>
+      </w:r>
+      <w:r>
+        <w:t xml:space="preserve">all pass because of this enrichment, and the workaround is</w:t>
+      </w:r>
+      <w:r>
+        <w:t xml:space="preserve"> </w:t>
+      </w:r>
+      <w:r>
+        <w:t xml:space="preserve">documented in-line in the module so the next maintainer knows why</w:t>
+      </w:r>
+      <w:r>
+        <w:t xml:space="preserve"> </w:t>
+      </w:r>
+      <w:r>
+        <w:t xml:space="preserve">it exists.</w:t>
+      </w:r>
+    </w:p>
+    <w:bookmarkEnd w:id="59"/>
+    <w:bookmarkStart w:id="60" w:name="decisions-taken-7"/>
+    <w:p>
+      <w:pPr>
+        <w:pStyle w:val="Heading2"/>
+      </w:pPr>
+      <w:r>
+        <w:t xml:space="preserve">Decisions taken</w:t>
+      </w:r>
+    </w:p>
+    <w:p>
+      <w:pPr>
+        <w:pStyle w:val="FirstParagraph"/>
+      </w:pPr>
+      <w:r>
+        <w:t xml:space="preserve">The cut-over is</w:t>
+      </w:r>
+      <w:r>
+        <w:t xml:space="preserve"> </w:t>
+      </w:r>
+      <w:r>
+        <w:rPr>
+          <w:b/>
+          <w:bCs/>
+        </w:rPr>
+        <w:t xml:space="preserve">clean — there is no fallback flag</w:t>
+      </w:r>
+      <w:r>
+        <w:t xml:space="preserve">. The legacy</w:t>
+      </w:r>
+      <w:r>
+        <w:t xml:space="preserve"> </w:t>
+      </w:r>
+      <w:r>
+        <w:t xml:space="preserve">DOT→GraphML pipeline was a maintenance liability (it produced an</w:t>
+      </w:r>
+      <w:r>
+        <w:t xml:space="preserve"> </w:t>
+      </w:r>
+      <w:r>
+        <w:t xml:space="preserve">empty file under the spatial-grouping flag and could not emit</w:t>
+      </w:r>
+      <w:r>
+        <w:t xml:space="preserve"> </w:t>
+      </w:r>
+      <w:r>
+        <w:t xml:space="preserve">swimlanes); shipping it side-by-side with the s3Dgraphy delegation</w:t>
+      </w:r>
+      <w:r>
+        <w:t xml:space="preserve"> </w:t>
+      </w:r>
+      <w:r>
+        <w:t xml:space="preserve">would have doubled the surface area without buying any user value.</w:t>
+      </w:r>
+      <w:r>
+        <w:t xml:space="preserve"> </w:t>
+      </w:r>
+      <w:r>
+        <w:t xml:space="preserve">Rolling back is, instead, a</w:t>
+      </w:r>
+      <w:r>
+        <w:t xml:space="preserve"> </w:t>
+      </w:r>
+      <w:r>
+        <w:rPr>
+          <w:rStyle w:val="VerbatimChar"/>
+        </w:rPr>
+        <w:t xml:space="preserve">git revert</w:t>
+      </w:r>
+      <w:r>
+        <w:t xml:space="preserve"> </w:t>
+      </w:r>
+      <w:r>
+        <w:t xml:space="preserve">of the five per-file Group E</w:t>
+      </w:r>
+      <w:r>
+        <w:t xml:space="preserve"> </w:t>
+      </w:r>
+      <w:r>
+        <w:t xml:space="preserve">commits.</w:t>
+      </w:r>
+    </w:p>
+    <w:p>
+      <w:pPr>
+        <w:pStyle w:val="BodyText"/>
+      </w:pPr>
+      <w:r>
+        <w:rPr>
+          <w:rStyle w:val="VerbatimChar"/>
+        </w:rPr>
+        <w:t xml:space="preserve">tred_removed_edges</w:t>
+      </w:r>
+      <w:r>
+        <w:t xml:space="preserve"> </w:t>
+      </w:r>
+      <w:r>
+        <w:t xml:space="preserve">is computed arithmetically (</w:t>
+      </w:r>
+      <w:r>
+        <w:rPr>
+          <w:rStyle w:val="VerbatimChar"/>
+        </w:rPr>
+        <w:t xml:space="preserve">pre_edges - post_edges</w:t>
+      </w:r>
+      <w:r>
+        <w:t xml:space="preserve">) rather than parsed from the GraphML output via regex.</w:t>
+      </w:r>
+      <w:r>
+        <w:t xml:space="preserve"> </w:t>
+      </w:r>
+      <w:r>
+        <w:t xml:space="preserve">The arithmetic version is robust to formatting changes inside</w:t>
+      </w:r>
+      <w:r>
+        <w:t xml:space="preserve"> </w:t>
+      </w:r>
+      <w:r>
+        <w:rPr>
+          <w:rStyle w:val="VerbatimChar"/>
+        </w:rPr>
+        <w:t xml:space="preserve">GraphMLExporter</w:t>
+      </w:r>
+      <w:r>
+        <w:t xml:space="preserve"> </w:t>
+      </w:r>
+      <w:r>
+        <w:t xml:space="preserve">and is symmetrical to the way</w:t>
+      </w:r>
+      <w:r>
+        <w:t xml:space="preserve"> </w:t>
+      </w:r>
+      <w:r>
+        <w:rPr>
+          <w:rStyle w:val="VerbatimChar"/>
+        </w:rPr>
+        <w:t xml:space="preserve">node_count</w:t>
+      </w:r>
+      <w:r>
+        <w:t xml:space="preserve">/</w:t>
+      </w:r>
+      <w:r>
+        <w:rPr>
+          <w:rStyle w:val="VerbatimChar"/>
+        </w:rPr>
+        <w:t xml:space="preserve">edge_count</w:t>
+      </w:r>
+      <w:r>
+        <w:t xml:space="preserve"> </w:t>
+      </w:r>
+      <w:r>
+        <w:t xml:space="preserve">are produced.</w:t>
+      </w:r>
+    </w:p>
+    <w:p>
+      <w:pPr>
+        <w:pStyle w:val="BodyText"/>
+      </w:pPr>
+      <w:r>
+        <w:t xml:space="preserve">The mapping name passed to</w:t>
+      </w:r>
+      <w:r>
+        <w:t xml:space="preserve"> </w:t>
+      </w:r>
+      <w:r>
+        <w:rPr>
+          <w:rStyle w:val="VerbatimChar"/>
+        </w:rPr>
+        <w:t xml:space="preserve">PyArchInitImporter</w:t>
+      </w:r>
+      <w:r>
+        <w:t xml:space="preserve"> </w:t>
+      </w:r>
+      <w:r>
+        <w:t xml:space="preserve">is</w:t>
+      </w:r>
+      <w:r>
+        <w:t xml:space="preserve"> </w:t>
+      </w:r>
+      <w:r>
+        <w:rPr>
+          <w:rStyle w:val="VerbatimChar"/>
+        </w:rPr>
+        <w:t xml:space="preserve">pyarchinit_us_mapping</w:t>
+      </w:r>
+      <w:r>
+        <w:t xml:space="preserve">, not</w:t>
+      </w:r>
+      <w:r>
+        <w:t xml:space="preserve"> </w:t>
+      </w:r>
+      <w:r>
+        <w:rPr>
+          <w:rStyle w:val="VerbatimChar"/>
+        </w:rPr>
+        <w:t xml:space="preserve">pyarchinit</w:t>
+      </w:r>
+      <w:r>
+        <w:t xml:space="preserve"> </w:t>
+      </w:r>
+      <w:r>
+        <w:t xml:space="preserve">as the early plan draft</w:t>
+      </w:r>
+      <w:r>
+        <w:t xml:space="preserve"> </w:t>
+      </w:r>
+      <w:r>
+        <w:t xml:space="preserve">suggested. The vendored s3Dgraphy 0.1.40 ships</w:t>
+      </w:r>
+      <w:r>
+        <w:t xml:space="preserve"> </w:t>
+      </w:r>
+      <w:r>
+        <w:rPr>
+          <w:rStyle w:val="VerbatimChar"/>
+        </w:rPr>
+        <w:t xml:space="preserve">pyarchinit_us_mapping.json</w:t>
+      </w:r>
+      <w:r>
+        <w:t xml:space="preserve"> </w:t>
+      </w:r>
+      <w:r>
+        <w:t xml:space="preserve">under</w:t>
+      </w:r>
+      <w:r>
+        <w:t xml:space="preserve"> </w:t>
+      </w:r>
+      <w:r>
+        <w:rPr>
+          <w:rStyle w:val="VerbatimChar"/>
+        </w:rPr>
+        <w:t xml:space="preserve">ext_libs/s3dgraphy/</w:t>
+      </w:r>
+      <w:r>
+        <w:t xml:space="preserve">, and this</w:t>
+      </w:r>
+      <w:r>
+        <w:t xml:space="preserve"> </w:t>
+      </w:r>
+      <w:r>
+        <w:t xml:space="preserve">is the only mapping name the importer recognises out of the box.</w:t>
+      </w:r>
+      <w:r>
+        <w:t xml:space="preserve"> </w:t>
+      </w:r>
+      <w:r>
+        <w:t xml:space="preserve">This was caught while wiring up the first pipeline test and is</w:t>
+      </w:r>
+      <w:r>
+        <w:t xml:space="preserve"> </w:t>
+      </w:r>
+      <w:r>
+        <w:t xml:space="preserve">documented in the orchestrator docstring.</w:t>
+      </w:r>
+    </w:p>
+    <w:bookmarkEnd w:id="60"/>
+    <w:bookmarkStart w:id="61" w:name="operational-note"/>
+    <w:p>
+      <w:pPr>
+        <w:pStyle w:val="Heading2"/>
+      </w:pPr>
+      <w:r>
+        <w:t xml:space="preserve">Operational note</w:t>
+      </w:r>
+    </w:p>
+    <w:p>
+      <w:pPr>
+        <w:pStyle w:val="FirstParagraph"/>
+      </w:pPr>
+      <w:r>
+        <w:t xml:space="preserve">Developers pulling this branch must re-run</w:t>
+      </w:r>
+      <w:r>
+        <w:t xml:space="preserve"> </w:t>
+      </w:r>
+      <w:r>
+        <w:rPr>
+          <w:rStyle w:val="VerbatimChar"/>
+        </w:rPr>
+        <w:t xml:space="preserve">python scripts/modules_installer.py</w:t>
+      </w:r>
+      <w:r>
+        <w:t xml:space="preserve"> </w:t>
+      </w:r>
+      <w:r>
+        <w:t xml:space="preserve">only if their</w:t>
+      </w:r>
+      <w:r>
+        <w:t xml:space="preserve"> </w:t>
+      </w:r>
+      <w:r>
+        <w:rPr>
+          <w:rStyle w:val="VerbatimChar"/>
+        </w:rPr>
+        <w:t xml:space="preserve">ext_libs/s3dgraphy/</w:t>
+      </w:r>
+      <w:r>
+        <w:t xml:space="preserve"> </w:t>
+      </w:r>
+      <w:r>
+        <w:t xml:space="preserve">is older than 0.1.40; otherwise no extra step</w:t>
+      </w:r>
+      <w:r>
+        <w:t xml:space="preserve"> </w:t>
+      </w:r>
+      <w:r>
+        <w:t xml:space="preserve">is needed because Phase 1 already vendored 0.1.40. The Phase 2</w:t>
+      </w:r>
+      <w:r>
+        <w:t xml:space="preserve"> </w:t>
+      </w:r>
+      <w:r>
+        <w:t xml:space="preserve">metadata bump is documentation-only and adds no new third-party</w:t>
+      </w:r>
+      <w:r>
+        <w:t xml:space="preserve"> </w:t>
+      </w:r>
+      <w:r>
+        <w:t xml:space="preserve">dependencies. The Phase 2 manual smoke gate (G.4) and tag (G.5) are</w:t>
+      </w:r>
+      <w:r>
+        <w:t xml:space="preserve"> </w:t>
+      </w:r>
+      <w:r>
+        <w:t xml:space="preserve">the same shape as Phase 1 and will be performed next.</w:t>
+      </w:r>
+    </w:p>
+    <w:bookmarkEnd w:id="61"/>
+    <w:bookmarkEnd w:id="62"/>
     <w:sectPr>
       <w:footnotePr>
         <w:numRestart w:val="eachSect"/>

</xml_diff>